<commit_message>
Evidencia del patron Builder
</commit_message>
<xml_diff>
--- a/Sistema de Gestion de Cadenas de Suministro.docx
+++ b/Sistema de Gestion de Cadenas de Suministro.docx
@@ -3548,8 +3548,8 @@
       <w:pPr>
         <w:pStyle w:val="Ttulo3"/>
       </w:pPr>
-      <w:bookmarkStart w:id="25" w:name="_Toc239179237"/>
-      <w:bookmarkStart w:id="26" w:name="_Toc239179238"/>
+      <w:bookmarkStart w:id="25" w:name="_Toc239179238"/>
+      <w:bookmarkStart w:id="26" w:name="_Toc239179237"/>
       <w:r>
         <w:t xml:space="preserve">Como </w:t>
       </w:r>
@@ -3565,284 +3565,284 @@
       <w:r>
         <w:t>ste Patrón al Proyecto</w:t>
       </w:r>
+      <w:bookmarkEnd w:id="25"/>
+    </w:p>
+    <w:p>
+      <w:r>
+        <w:t xml:space="preserve">Para entender como este patrón está colaborando con nuestro proyecto, primeramente, hay que irnos a los conceptos fundamentales del </w:t>
+      </w:r>
+      <w:proofErr w:type="spellStart"/>
+      <w:r>
+        <w:t>framework</w:t>
+      </w:r>
+      <w:proofErr w:type="spellEnd"/>
+      <w:r>
+        <w:t xml:space="preserve"> que estamos utilizando. El </w:t>
+      </w:r>
+      <w:proofErr w:type="spellStart"/>
+      <w:r>
+        <w:t>framework</w:t>
+      </w:r>
+      <w:proofErr w:type="spellEnd"/>
+      <w:r>
+        <w:t xml:space="preserve"> que nosotros estamos usando para este proyecto, es </w:t>
+      </w:r>
+      <w:r>
+        <w:rPr>
+          <w:b/>
+          <w:bCs/>
+        </w:rPr>
+        <w:t>Spring Framework</w:t>
+      </w:r>
+      <w:r>
+        <w:t xml:space="preserve">, es un </w:t>
+      </w:r>
+      <w:proofErr w:type="spellStart"/>
+      <w:r>
+        <w:t>framework</w:t>
+      </w:r>
+      <w:proofErr w:type="spellEnd"/>
+      <w:r>
+        <w:t xml:space="preserve"> de Java que en conjunto con la herramienta </w:t>
+      </w:r>
+      <w:r>
+        <w:rPr>
+          <w:b/>
+          <w:bCs/>
+        </w:rPr>
+        <w:t xml:space="preserve">Spring </w:t>
+      </w:r>
+      <w:proofErr w:type="spellStart"/>
+      <w:r>
+        <w:rPr>
+          <w:b/>
+          <w:bCs/>
+        </w:rPr>
+        <w:t>Boot</w:t>
+      </w:r>
+      <w:proofErr w:type="spellEnd"/>
+      <w:r>
+        <w:rPr>
+          <w:b/>
+          <w:bCs/>
+        </w:rPr>
+        <w:t xml:space="preserve"> </w:t>
+      </w:r>
+      <w:r>
+        <w:t xml:space="preserve">ayudan a crear muchos tipos diferentes de sistemas de una manera sencilla. </w:t>
+      </w:r>
+      <w:r>
+        <w:rPr>
+          <w:b/>
+          <w:bCs/>
+        </w:rPr>
+        <w:t>Spring</w:t>
+      </w:r>
+      <w:r>
+        <w:t xml:space="preserve">, internamente maneja </w:t>
+      </w:r>
+      <w:proofErr w:type="spellStart"/>
+      <w:r>
+        <w:rPr>
+          <w:b/>
+          <w:bCs/>
+        </w:rPr>
+        <w:t>Beans</w:t>
+      </w:r>
+      <w:proofErr w:type="spellEnd"/>
+      <w:r>
+        <w:t xml:space="preserve">, los cuales son objetos que son instanciados, configurados y gestionados por un contenedor llamado </w:t>
+      </w:r>
+      <w:r>
+        <w:rPr>
+          <w:b/>
+          <w:bCs/>
+        </w:rPr>
+        <w:t>Inversión de Control (</w:t>
+      </w:r>
+      <w:proofErr w:type="spellStart"/>
+      <w:r>
+        <w:rPr>
+          <w:b/>
+          <w:bCs/>
+        </w:rPr>
+        <w:t>IoC</w:t>
+      </w:r>
+      <w:proofErr w:type="spellEnd"/>
+      <w:r>
+        <w:rPr>
+          <w:b/>
+          <w:bCs/>
+        </w:rPr>
+        <w:t>)</w:t>
+      </w:r>
+      <w:r>
+        <w:t xml:space="preserve">. Estos </w:t>
+      </w:r>
+      <w:proofErr w:type="spellStart"/>
+      <w:r>
+        <w:rPr>
+          <w:b/>
+          <w:bCs/>
+        </w:rPr>
+        <w:t>Beans</w:t>
+      </w:r>
+      <w:proofErr w:type="spellEnd"/>
+      <w:r>
+        <w:rPr>
+          <w:b/>
+          <w:bCs/>
+        </w:rPr>
+        <w:t xml:space="preserve"> </w:t>
+      </w:r>
+      <w:r>
+        <w:t xml:space="preserve">pueden estar divididos en diferentes tipos según el uso que se le vaya a dar, para este caso, tenemos los </w:t>
+      </w:r>
+      <w:r>
+        <w:rPr>
+          <w:b/>
+          <w:bCs/>
+        </w:rPr>
+        <w:t>@RestControllers, @Services</w:t>
+      </w:r>
+      <w:r>
+        <w:t xml:space="preserve"> y </w:t>
+      </w:r>
+      <w:r>
+        <w:rPr>
+          <w:b/>
+          <w:bCs/>
+        </w:rPr>
+        <w:t>@Component</w:t>
+      </w:r>
+      <w:r>
+        <w:t xml:space="preserve">. El contenedor </w:t>
+      </w:r>
+      <w:proofErr w:type="spellStart"/>
+      <w:r>
+        <w:rPr>
+          <w:b/>
+          <w:bCs/>
+        </w:rPr>
+        <w:t>IoC</w:t>
+      </w:r>
+      <w:proofErr w:type="spellEnd"/>
+      <w:r>
+        <w:t xml:space="preserve"> internamente </w:t>
+      </w:r>
+      <w:r>
+        <w:rPr>
+          <w:b/>
+          <w:bCs/>
+        </w:rPr>
+        <w:t xml:space="preserve">aplica el patrón </w:t>
+      </w:r>
+      <w:proofErr w:type="spellStart"/>
+      <w:r>
+        <w:rPr>
+          <w:b/>
+          <w:bCs/>
+        </w:rPr>
+        <w:t>singleton</w:t>
+      </w:r>
+      <w:proofErr w:type="spellEnd"/>
+      <w:r>
+        <w:t xml:space="preserve"> para dar una </w:t>
+      </w:r>
+      <w:r>
+        <w:rPr>
+          <w:b/>
+          <w:bCs/>
+        </w:rPr>
+        <w:t>mayor eficiencia de memoria</w:t>
+      </w:r>
+      <w:r>
+        <w:t xml:space="preserve"> haciendo que para cada </w:t>
+      </w:r>
+      <w:proofErr w:type="spellStart"/>
+      <w:r>
+        <w:rPr>
+          <w:b/>
+          <w:bCs/>
+        </w:rPr>
+        <w:t>Bean</w:t>
+      </w:r>
+      <w:proofErr w:type="spellEnd"/>
+      <w:r>
+        <w:t xml:space="preserve"> que se vaya a instanciar y gestionar, se maneje una </w:t>
+      </w:r>
+      <w:r>
+        <w:rPr>
+          <w:b/>
+          <w:bCs/>
+        </w:rPr>
+        <w:t>única instancia compartida</w:t>
+      </w:r>
+      <w:r>
+        <w:t xml:space="preserve"> y que también por medio de ello se pueda aplicar el patrón de diseño de </w:t>
+      </w:r>
+      <w:r>
+        <w:rPr>
+          <w:b/>
+          <w:bCs/>
+        </w:rPr>
+        <w:t>inyección de dependencias.</w:t>
+      </w:r>
+    </w:p>
+    <w:p>
+      <w:r>
+        <w:t xml:space="preserve">Aplicar este patrón aquí es muy importante ya que como dijimos anteriormente, permite tener una mayor eficiencia de memoria, aplicar principios como la inyección de dependencias (lo cual es muy importante en Spring) y otras cosas como tener una mayor velocidad de respuesta y que el </w:t>
+      </w:r>
+      <w:proofErr w:type="spellStart"/>
+      <w:r>
+        <w:rPr>
+          <w:b/>
+          <w:bCs/>
+        </w:rPr>
+        <w:t>Garbage</w:t>
+      </w:r>
+      <w:proofErr w:type="spellEnd"/>
+      <w:r>
+        <w:rPr>
+          <w:b/>
+          <w:bCs/>
+        </w:rPr>
+        <w:t xml:space="preserve"> </w:t>
+      </w:r>
+      <w:proofErr w:type="spellStart"/>
+      <w:r>
+        <w:rPr>
+          <w:b/>
+          <w:bCs/>
+        </w:rPr>
+        <w:t>Collection</w:t>
+      </w:r>
+      <w:proofErr w:type="spellEnd"/>
+      <w:r>
+        <w:rPr>
+          <w:b/>
+          <w:bCs/>
+        </w:rPr>
+        <w:t xml:space="preserve"> </w:t>
+      </w:r>
+      <w:r>
+        <w:t>de Java trabaje de una manera mucho más eficiente mejorando el rendimiento global.</w:t>
+      </w:r>
+    </w:p>
+    <w:p>
+      <w:pPr>
+        <w:pStyle w:val="Ttulo3"/>
+      </w:pPr>
+      <w:r>
+        <w:t>Evidencia</w:t>
+      </w:r>
+      <w:r>
+        <w:t>s</w:t>
+      </w:r>
+      <w:r>
+        <w:t xml:space="preserve"> de Uso</w:t>
+      </w:r>
       <w:bookmarkEnd w:id="26"/>
-    </w:p>
-    <w:p>
-      <w:r>
-        <w:t xml:space="preserve">Para entender como este patrón está colaborando con nuestro proyecto, primeramente, hay que irnos a los conceptos fundamentales del </w:t>
-      </w:r>
-      <w:proofErr w:type="spellStart"/>
-      <w:r>
-        <w:t>framework</w:t>
-      </w:r>
-      <w:proofErr w:type="spellEnd"/>
-      <w:r>
-        <w:t xml:space="preserve"> que estamos utilizando. El </w:t>
-      </w:r>
-      <w:proofErr w:type="spellStart"/>
-      <w:r>
-        <w:t>framework</w:t>
-      </w:r>
-      <w:proofErr w:type="spellEnd"/>
-      <w:r>
-        <w:t xml:space="preserve"> que nosotros estamos usando para este proyecto, es </w:t>
-      </w:r>
-      <w:r>
-        <w:rPr>
-          <w:b/>
-          <w:bCs/>
-        </w:rPr>
-        <w:t>Spring Framework</w:t>
-      </w:r>
-      <w:r>
-        <w:t xml:space="preserve">, es un </w:t>
-      </w:r>
-      <w:proofErr w:type="spellStart"/>
-      <w:r>
-        <w:t>framework</w:t>
-      </w:r>
-      <w:proofErr w:type="spellEnd"/>
-      <w:r>
-        <w:t xml:space="preserve"> de Java que en conjunto con la herramienta </w:t>
-      </w:r>
-      <w:r>
-        <w:rPr>
-          <w:b/>
-          <w:bCs/>
-        </w:rPr>
-        <w:t xml:space="preserve">Spring </w:t>
-      </w:r>
-      <w:proofErr w:type="spellStart"/>
-      <w:r>
-        <w:rPr>
-          <w:b/>
-          <w:bCs/>
-        </w:rPr>
-        <w:t>Boot</w:t>
-      </w:r>
-      <w:proofErr w:type="spellEnd"/>
-      <w:r>
-        <w:rPr>
-          <w:b/>
-          <w:bCs/>
-        </w:rPr>
-        <w:t xml:space="preserve"> </w:t>
-      </w:r>
-      <w:r>
-        <w:t xml:space="preserve">ayudan a crear muchos tipos diferentes de sistemas de una manera sencilla. </w:t>
-      </w:r>
-      <w:r>
-        <w:rPr>
-          <w:b/>
-          <w:bCs/>
-        </w:rPr>
-        <w:t>Spring</w:t>
-      </w:r>
-      <w:r>
-        <w:t xml:space="preserve">, internamente maneja </w:t>
-      </w:r>
-      <w:proofErr w:type="spellStart"/>
-      <w:r>
-        <w:rPr>
-          <w:b/>
-          <w:bCs/>
-        </w:rPr>
-        <w:t>Beans</w:t>
-      </w:r>
-      <w:proofErr w:type="spellEnd"/>
-      <w:r>
-        <w:t xml:space="preserve">, los cuales son objetos que son instanciados, configurados y gestionados por un contenedor llamado </w:t>
-      </w:r>
-      <w:r>
-        <w:rPr>
-          <w:b/>
-          <w:bCs/>
-        </w:rPr>
-        <w:t>Inversión de Control (</w:t>
-      </w:r>
-      <w:proofErr w:type="spellStart"/>
-      <w:r>
-        <w:rPr>
-          <w:b/>
-          <w:bCs/>
-        </w:rPr>
-        <w:t>IoC</w:t>
-      </w:r>
-      <w:proofErr w:type="spellEnd"/>
-      <w:r>
-        <w:rPr>
-          <w:b/>
-          <w:bCs/>
-        </w:rPr>
-        <w:t>)</w:t>
-      </w:r>
-      <w:r>
-        <w:t xml:space="preserve">. Estos </w:t>
-      </w:r>
-      <w:proofErr w:type="spellStart"/>
-      <w:r>
-        <w:rPr>
-          <w:b/>
-          <w:bCs/>
-        </w:rPr>
-        <w:t>Beans</w:t>
-      </w:r>
-      <w:proofErr w:type="spellEnd"/>
-      <w:r>
-        <w:rPr>
-          <w:b/>
-          <w:bCs/>
-        </w:rPr>
-        <w:t xml:space="preserve"> </w:t>
-      </w:r>
-      <w:r>
-        <w:t xml:space="preserve">pueden estar divididos en diferentes tipos según el uso que se le vaya a dar, para este caso, tenemos los </w:t>
-      </w:r>
-      <w:r>
-        <w:rPr>
-          <w:b/>
-          <w:bCs/>
-        </w:rPr>
-        <w:t>@RestControllers, @Services</w:t>
-      </w:r>
-      <w:r>
-        <w:t xml:space="preserve"> y </w:t>
-      </w:r>
-      <w:r>
-        <w:rPr>
-          <w:b/>
-          <w:bCs/>
-        </w:rPr>
-        <w:t>@Component</w:t>
-      </w:r>
-      <w:r>
-        <w:t xml:space="preserve">. El contenedor </w:t>
-      </w:r>
-      <w:proofErr w:type="spellStart"/>
-      <w:r>
-        <w:rPr>
-          <w:b/>
-          <w:bCs/>
-        </w:rPr>
-        <w:t>IoC</w:t>
-      </w:r>
-      <w:proofErr w:type="spellEnd"/>
-      <w:r>
-        <w:t xml:space="preserve"> internamente </w:t>
-      </w:r>
-      <w:r>
-        <w:rPr>
-          <w:b/>
-          <w:bCs/>
-        </w:rPr>
-        <w:t xml:space="preserve">aplica el patrón </w:t>
-      </w:r>
-      <w:proofErr w:type="spellStart"/>
-      <w:r>
-        <w:rPr>
-          <w:b/>
-          <w:bCs/>
-        </w:rPr>
-        <w:t>singleton</w:t>
-      </w:r>
-      <w:proofErr w:type="spellEnd"/>
-      <w:r>
-        <w:t xml:space="preserve"> para dar una </w:t>
-      </w:r>
-      <w:r>
-        <w:rPr>
-          <w:b/>
-          <w:bCs/>
-        </w:rPr>
-        <w:t>mayor eficiencia de memoria</w:t>
-      </w:r>
-      <w:r>
-        <w:t xml:space="preserve"> haciendo que para cada </w:t>
-      </w:r>
-      <w:proofErr w:type="spellStart"/>
-      <w:r>
-        <w:rPr>
-          <w:b/>
-          <w:bCs/>
-        </w:rPr>
-        <w:t>Bean</w:t>
-      </w:r>
-      <w:proofErr w:type="spellEnd"/>
-      <w:r>
-        <w:t xml:space="preserve"> que se vaya a instanciar y gestionar, se maneje una </w:t>
-      </w:r>
-      <w:r>
-        <w:rPr>
-          <w:b/>
-          <w:bCs/>
-        </w:rPr>
-        <w:t>única instancia compartida</w:t>
-      </w:r>
-      <w:r>
-        <w:t xml:space="preserve"> y que también por medio de ello se pueda aplicar el patrón de diseño de </w:t>
-      </w:r>
-      <w:r>
-        <w:rPr>
-          <w:b/>
-          <w:bCs/>
-        </w:rPr>
-        <w:t>inyección de dependencias.</w:t>
-      </w:r>
-    </w:p>
-    <w:p>
-      <w:r>
-        <w:t xml:space="preserve">Aplicar este patrón aquí es muy importante ya que como dijimos anteriormente, permite tener una mayor eficiencia de memoria, aplicar principios como la inyección de dependencias (lo cual es muy importante en Spring) y otras cosas como tener una mayor velocidad de respuesta y que el </w:t>
-      </w:r>
-      <w:proofErr w:type="spellStart"/>
-      <w:r>
-        <w:rPr>
-          <w:b/>
-          <w:bCs/>
-        </w:rPr>
-        <w:t>Garbage</w:t>
-      </w:r>
-      <w:proofErr w:type="spellEnd"/>
-      <w:r>
-        <w:rPr>
-          <w:b/>
-          <w:bCs/>
-        </w:rPr>
-        <w:t xml:space="preserve"> </w:t>
-      </w:r>
-      <w:proofErr w:type="spellStart"/>
-      <w:r>
-        <w:rPr>
-          <w:b/>
-          <w:bCs/>
-        </w:rPr>
-        <w:t>Collection</w:t>
-      </w:r>
-      <w:proofErr w:type="spellEnd"/>
-      <w:r>
-        <w:rPr>
-          <w:b/>
-          <w:bCs/>
-        </w:rPr>
-        <w:t xml:space="preserve"> </w:t>
-      </w:r>
-      <w:r>
-        <w:t>de Java trabaje de una manera mucho más eficiente mejorando el rendimiento global.</w:t>
-      </w:r>
-    </w:p>
-    <w:p>
-      <w:pPr>
-        <w:pStyle w:val="Ttulo3"/>
-      </w:pPr>
-      <w:r>
-        <w:t>Evidencia</w:t>
-      </w:r>
-      <w:r>
-        <w:t>s</w:t>
-      </w:r>
-      <w:r>
-        <w:t xml:space="preserve"> de Uso</w:t>
-      </w:r>
-      <w:bookmarkEnd w:id="25"/>
     </w:p>
     <w:p>
       <w:r>
@@ -4612,6 +4612,7 @@
         <w:rPr>
           <w:b/>
           <w:bCs/>
+          <w:noProof/>
         </w:rPr>
         <w:drawing>
           <wp:inline distT="0" distB="0" distL="0" distR="0" wp14:anchorId="3534E270" wp14:editId="48DFBBED">
@@ -4679,6 +4680,7 @@
         <w:rPr>
           <w:b/>
           <w:bCs/>
+          <w:noProof/>
         </w:rPr>
         <w:drawing>
           <wp:inline distT="0" distB="0" distL="0" distR="0" wp14:anchorId="5967A4D5" wp14:editId="4D982305">
@@ -4745,6 +4747,7 @@
         <w:rPr>
           <w:b/>
           <w:bCs/>
+          <w:noProof/>
         </w:rPr>
         <w:drawing>
           <wp:inline distT="0" distB="0" distL="0" distR="0" wp14:anchorId="2CE39E17" wp14:editId="11D974B8">
@@ -4795,6 +4798,7 @@
         <w:rPr>
           <w:b/>
           <w:bCs/>
+          <w:noProof/>
         </w:rPr>
         <w:lastRenderedPageBreak/>
         <w:drawing>
@@ -4863,6 +4867,7 @@
         <w:rPr>
           <w:b/>
           <w:bCs/>
+          <w:noProof/>
         </w:rPr>
         <w:drawing>
           <wp:inline distT="0" distB="0" distL="0" distR="0" wp14:anchorId="1769BF1D" wp14:editId="649C17E9">
@@ -5198,19 +5203,7 @@
       </w:r>
       <w:proofErr w:type="spellEnd"/>
       <w:r>
-        <w:t xml:space="preserve">, </w:t>
-      </w:r>
-      <w:r>
-        <w:t>demostrando,</w:t>
-      </w:r>
-      <w:r>
-        <w:t xml:space="preserve"> así </w:t>
-      </w:r>
-      <w:r>
-        <w:t>como</w:t>
-      </w:r>
-      <w:r>
-        <w:t xml:space="preserve"> el Factory Method ayuda a reducir el acoplamiento entre ambos componentes.</w:t>
+        <w:t>, demostrando, así como el Factory Method ayuda a reducir el acoplamiento entre ambos componentes.</w:t>
       </w:r>
     </w:p>
     <w:p>
@@ -5305,6 +5298,9 @@
     </w:p>
     <w:p>
       <w:r>
+        <w:rPr>
+          <w:noProof/>
+        </w:rPr>
         <w:drawing>
           <wp:inline distT="0" distB="0" distL="0" distR="0" wp14:anchorId="280B21E2" wp14:editId="2AE3C75A">
             <wp:extent cx="5943600" cy="338455"/>
@@ -5387,6 +5383,9 @@
     </w:p>
     <w:p>
       <w:r>
+        <w:rPr>
+          <w:noProof/>
+        </w:rPr>
         <w:drawing>
           <wp:inline distT="0" distB="0" distL="0" distR="0" wp14:anchorId="53F81A13" wp14:editId="3D487E8D">
             <wp:extent cx="6170320" cy="2886075"/>
@@ -5425,6 +5424,12 @@
       </w:r>
     </w:p>
     <w:p>
+      <w:pPr>
+        <w:rPr>
+          <w:b/>
+          <w:bCs/>
+        </w:rPr>
+      </w:pPr>
       <w:r>
         <w:lastRenderedPageBreak/>
         <w:t xml:space="preserve">Exitosamente la </w:t>
@@ -5455,6 +5460,795 @@
           <w:bCs/>
         </w:rPr>
         <w:t>éxito.</w:t>
+      </w:r>
+    </w:p>
+    <w:p>
+      <w:pPr>
+        <w:pStyle w:val="Ttulo2"/>
+      </w:pPr>
+      <w:r>
+        <w:t>Aplicación del Patrón Builder</w:t>
+      </w:r>
+    </w:p>
+    <w:p>
+      <w:pPr>
+        <w:pStyle w:val="Ttulo3"/>
+      </w:pPr>
+      <w:r>
+        <w:t>Como está Colaborando</w:t>
+      </w:r>
+    </w:p>
+    <w:p>
+      <w:r>
+        <w:t xml:space="preserve">En el proceso de autenticación, el patrón Builder se utiliza para construir el token JWT que posteriormente será entregado al usuario. El token requiere varios datos de configuración, entre ellos el nombre de usuario, el rol, la fecha de emisión, la fecha de expiración y la firma criptográfica.  </w:t>
+      </w:r>
+    </w:p>
+    <w:p>
+      <w:pPr>
+        <w:pStyle w:val="Ttulo3"/>
+      </w:pPr>
+      <w:r>
+        <w:t>Diagrama de Clases UML</w:t>
+      </w:r>
+    </w:p>
+    <w:p>
+      <w:pPr>
+        <w:jc w:val="center"/>
+      </w:pPr>
+      <w:r>
+        <w:drawing>
+          <wp:inline distT="0" distB="0" distL="0" distR="0" wp14:anchorId="136B7C85" wp14:editId="5B981A99">
+            <wp:extent cx="5153025" cy="3668227"/>
+            <wp:effectExtent l="0" t="0" r="0" b="8890"/>
+            <wp:docPr id="26" name="Imagen 26"/>
+            <wp:cNvGraphicFramePr>
+              <a:graphicFrameLocks xmlns:a="http://schemas.openxmlformats.org/drawingml/2006/main" noChangeAspect="1"/>
+            </wp:cNvGraphicFramePr>
+            <a:graphic xmlns:a="http://schemas.openxmlformats.org/drawingml/2006/main">
+              <a:graphicData uri="http://schemas.openxmlformats.org/drawingml/2006/picture">
+                <pic:pic xmlns:pic="http://schemas.openxmlformats.org/drawingml/2006/picture">
+                  <pic:nvPicPr>
+                    <pic:cNvPr id="1" name=""/>
+                    <pic:cNvPicPr/>
+                  </pic:nvPicPr>
+                  <pic:blipFill>
+                    <a:blip r:embed="rId21"/>
+                    <a:stretch>
+                      <a:fillRect/>
+                    </a:stretch>
+                  </pic:blipFill>
+                  <pic:spPr>
+                    <a:xfrm>
+                      <a:off x="0" y="0"/>
+                      <a:ext cx="5155104" cy="3669707"/>
+                    </a:xfrm>
+                    <a:prstGeom prst="rect">
+                      <a:avLst/>
+                    </a:prstGeom>
+                  </pic:spPr>
+                </pic:pic>
+              </a:graphicData>
+            </a:graphic>
+          </wp:inline>
+        </w:drawing>
+      </w:r>
+    </w:p>
+    <w:p>
+      <w:pPr>
+        <w:pStyle w:val="Ttulo3"/>
+      </w:pPr>
+      <w:r>
+        <w:t>Código</w:t>
+      </w:r>
+    </w:p>
+    <w:p>
+      <w:pPr>
+        <w:rPr>
+          <w:b/>
+          <w:bCs/>
+        </w:rPr>
+      </w:pPr>
+      <w:r>
+        <w:rPr>
+          <w:b/>
+          <w:bCs/>
+        </w:rPr>
+        <w:t>Client / Director</w:t>
+      </w:r>
+    </w:p>
+    <w:p>
+      <w:pPr>
+        <w:jc w:val="center"/>
+      </w:pPr>
+      <w:r>
+        <w:lastRenderedPageBreak/>
+        <w:drawing>
+          <wp:inline distT="0" distB="0" distL="0" distR="0" wp14:anchorId="352844FC" wp14:editId="769BDC22">
+            <wp:extent cx="4448175" cy="2416082"/>
+            <wp:effectExtent l="0" t="0" r="0" b="3810"/>
+            <wp:docPr id="25" name="Imagen 25"/>
+            <wp:cNvGraphicFramePr>
+              <a:graphicFrameLocks xmlns:a="http://schemas.openxmlformats.org/drawingml/2006/main" noChangeAspect="1"/>
+            </wp:cNvGraphicFramePr>
+            <a:graphic xmlns:a="http://schemas.openxmlformats.org/drawingml/2006/main">
+              <a:graphicData uri="http://schemas.openxmlformats.org/drawingml/2006/picture">
+                <pic:pic xmlns:pic="http://schemas.openxmlformats.org/drawingml/2006/picture">
+                  <pic:nvPicPr>
+                    <pic:cNvPr id="1" name=""/>
+                    <pic:cNvPicPr/>
+                  </pic:nvPicPr>
+                  <pic:blipFill>
+                    <a:blip r:embed="rId22"/>
+                    <a:stretch>
+                      <a:fillRect/>
+                    </a:stretch>
+                  </pic:blipFill>
+                  <pic:spPr>
+                    <a:xfrm>
+                      <a:off x="0" y="0"/>
+                      <a:ext cx="4453506" cy="2418978"/>
+                    </a:xfrm>
+                    <a:prstGeom prst="rect">
+                      <a:avLst/>
+                    </a:prstGeom>
+                  </pic:spPr>
+                </pic:pic>
+              </a:graphicData>
+            </a:graphic>
+          </wp:inline>
+        </w:drawing>
+      </w:r>
+    </w:p>
+    <w:p>
+      <w:pPr>
+        <w:jc w:val="left"/>
+        <w:rPr>
+          <w:b/>
+          <w:bCs/>
+        </w:rPr>
+      </w:pPr>
+      <w:r>
+        <w:rPr>
+          <w:b/>
+          <w:bCs/>
+        </w:rPr>
+        <w:t>Interface</w:t>
+      </w:r>
+    </w:p>
+    <w:p>
+      <w:pPr>
+        <w:jc w:val="center"/>
+      </w:pPr>
+      <w:r>
+        <w:drawing>
+          <wp:inline distT="0" distB="0" distL="0" distR="0" wp14:anchorId="34DC3B85" wp14:editId="15BE933A">
+            <wp:extent cx="5062655" cy="3762375"/>
+            <wp:effectExtent l="0" t="0" r="5080" b="0"/>
+            <wp:docPr id="17" name="Imagen 17"/>
+            <wp:cNvGraphicFramePr>
+              <a:graphicFrameLocks xmlns:a="http://schemas.openxmlformats.org/drawingml/2006/main" noChangeAspect="1"/>
+            </wp:cNvGraphicFramePr>
+            <a:graphic xmlns:a="http://schemas.openxmlformats.org/drawingml/2006/main">
+              <a:graphicData uri="http://schemas.openxmlformats.org/drawingml/2006/picture">
+                <pic:pic xmlns:pic="http://schemas.openxmlformats.org/drawingml/2006/picture">
+                  <pic:nvPicPr>
+                    <pic:cNvPr id="1" name=""/>
+                    <pic:cNvPicPr/>
+                  </pic:nvPicPr>
+                  <pic:blipFill>
+                    <a:blip r:embed="rId23"/>
+                    <a:stretch>
+                      <a:fillRect/>
+                    </a:stretch>
+                  </pic:blipFill>
+                  <pic:spPr>
+                    <a:xfrm>
+                      <a:off x="0" y="0"/>
+                      <a:ext cx="5070931" cy="3768525"/>
+                    </a:xfrm>
+                    <a:prstGeom prst="rect">
+                      <a:avLst/>
+                    </a:prstGeom>
+                  </pic:spPr>
+                </pic:pic>
+              </a:graphicData>
+            </a:graphic>
+          </wp:inline>
+        </w:drawing>
+      </w:r>
+    </w:p>
+    <w:p>
+      <w:pPr>
+        <w:jc w:val="center"/>
+      </w:pPr>
+      <w:r>
+        <w:lastRenderedPageBreak/>
+        <w:drawing>
+          <wp:inline distT="0" distB="0" distL="0" distR="0" wp14:anchorId="52FF695D" wp14:editId="1F2ABA3C">
+            <wp:extent cx="4819650" cy="2053500"/>
+            <wp:effectExtent l="0" t="0" r="0" b="4445"/>
+            <wp:docPr id="18" name="Imagen 18"/>
+            <wp:cNvGraphicFramePr>
+              <a:graphicFrameLocks xmlns:a="http://schemas.openxmlformats.org/drawingml/2006/main" noChangeAspect="1"/>
+            </wp:cNvGraphicFramePr>
+            <a:graphic xmlns:a="http://schemas.openxmlformats.org/drawingml/2006/main">
+              <a:graphicData uri="http://schemas.openxmlformats.org/drawingml/2006/picture">
+                <pic:pic xmlns:pic="http://schemas.openxmlformats.org/drawingml/2006/picture">
+                  <pic:nvPicPr>
+                    <pic:cNvPr id="1" name=""/>
+                    <pic:cNvPicPr/>
+                  </pic:nvPicPr>
+                  <pic:blipFill>
+                    <a:blip r:embed="rId24"/>
+                    <a:stretch>
+                      <a:fillRect/>
+                    </a:stretch>
+                  </pic:blipFill>
+                  <pic:spPr>
+                    <a:xfrm>
+                      <a:off x="0" y="0"/>
+                      <a:ext cx="4827343" cy="2056778"/>
+                    </a:xfrm>
+                    <a:prstGeom prst="rect">
+                      <a:avLst/>
+                    </a:prstGeom>
+                  </pic:spPr>
+                </pic:pic>
+              </a:graphicData>
+            </a:graphic>
+          </wp:inline>
+        </w:drawing>
+      </w:r>
+    </w:p>
+    <w:p>
+      <w:pPr>
+        <w:jc w:val="center"/>
+      </w:pPr>
+      <w:r>
+        <w:drawing>
+          <wp:inline distT="0" distB="0" distL="0" distR="0" wp14:anchorId="2474CBC7" wp14:editId="16CB14E7">
+            <wp:extent cx="4886325" cy="1970713"/>
+            <wp:effectExtent l="0" t="0" r="0" b="0"/>
+            <wp:docPr id="19" name="Imagen 19"/>
+            <wp:cNvGraphicFramePr>
+              <a:graphicFrameLocks xmlns:a="http://schemas.openxmlformats.org/drawingml/2006/main" noChangeAspect="1"/>
+            </wp:cNvGraphicFramePr>
+            <a:graphic xmlns:a="http://schemas.openxmlformats.org/drawingml/2006/main">
+              <a:graphicData uri="http://schemas.openxmlformats.org/drawingml/2006/picture">
+                <pic:pic xmlns:pic="http://schemas.openxmlformats.org/drawingml/2006/picture">
+                  <pic:nvPicPr>
+                    <pic:cNvPr id="1" name=""/>
+                    <pic:cNvPicPr/>
+                  </pic:nvPicPr>
+                  <pic:blipFill>
+                    <a:blip r:embed="rId25"/>
+                    <a:stretch>
+                      <a:fillRect/>
+                    </a:stretch>
+                  </pic:blipFill>
+                  <pic:spPr>
+                    <a:xfrm>
+                      <a:off x="0" y="0"/>
+                      <a:ext cx="4899076" cy="1975856"/>
+                    </a:xfrm>
+                    <a:prstGeom prst="rect">
+                      <a:avLst/>
+                    </a:prstGeom>
+                  </pic:spPr>
+                </pic:pic>
+              </a:graphicData>
+            </a:graphic>
+          </wp:inline>
+        </w:drawing>
+      </w:r>
+    </w:p>
+    <w:p>
+      <w:pPr>
+        <w:jc w:val="center"/>
+      </w:pPr>
+      <w:r>
+        <w:drawing>
+          <wp:inline distT="0" distB="0" distL="0" distR="0" wp14:anchorId="6E0BFF47" wp14:editId="6104B3A6">
+            <wp:extent cx="4879792" cy="2257425"/>
+            <wp:effectExtent l="0" t="0" r="0" b="0"/>
+            <wp:docPr id="20" name="Imagen 20"/>
+            <wp:cNvGraphicFramePr>
+              <a:graphicFrameLocks xmlns:a="http://schemas.openxmlformats.org/drawingml/2006/main" noChangeAspect="1"/>
+            </wp:cNvGraphicFramePr>
+            <a:graphic xmlns:a="http://schemas.openxmlformats.org/drawingml/2006/main">
+              <a:graphicData uri="http://schemas.openxmlformats.org/drawingml/2006/picture">
+                <pic:pic xmlns:pic="http://schemas.openxmlformats.org/drawingml/2006/picture">
+                  <pic:nvPicPr>
+                    <pic:cNvPr id="1" name=""/>
+                    <pic:cNvPicPr/>
+                  </pic:nvPicPr>
+                  <pic:blipFill>
+                    <a:blip r:embed="rId26"/>
+                    <a:stretch>
+                      <a:fillRect/>
+                    </a:stretch>
+                  </pic:blipFill>
+                  <pic:spPr>
+                    <a:xfrm>
+                      <a:off x="0" y="0"/>
+                      <a:ext cx="4884419" cy="2259566"/>
+                    </a:xfrm>
+                    <a:prstGeom prst="rect">
+                      <a:avLst/>
+                    </a:prstGeom>
+                  </pic:spPr>
+                </pic:pic>
+              </a:graphicData>
+            </a:graphic>
+          </wp:inline>
+        </w:drawing>
+      </w:r>
+    </w:p>
+    <w:p>
+      <w:pPr>
+        <w:jc w:val="left"/>
+        <w:rPr>
+          <w:b/>
+          <w:bCs/>
+        </w:rPr>
+      </w:pPr>
+      <w:r>
+        <w:rPr>
+          <w:b/>
+          <w:bCs/>
+        </w:rPr>
+        <w:t>Concrete Builder</w:t>
+      </w:r>
+    </w:p>
+    <w:p>
+      <w:r>
+        <w:lastRenderedPageBreak/>
+        <w:drawing>
+          <wp:inline distT="0" distB="0" distL="0" distR="0" wp14:anchorId="5B52A8C3" wp14:editId="25DA4955">
+            <wp:extent cx="5943600" cy="2004695"/>
+            <wp:effectExtent l="0" t="0" r="0" b="0"/>
+            <wp:docPr id="22" name="Imagen 22"/>
+            <wp:cNvGraphicFramePr>
+              <a:graphicFrameLocks xmlns:a="http://schemas.openxmlformats.org/drawingml/2006/main" noChangeAspect="1"/>
+            </wp:cNvGraphicFramePr>
+            <a:graphic xmlns:a="http://schemas.openxmlformats.org/drawingml/2006/main">
+              <a:graphicData uri="http://schemas.openxmlformats.org/drawingml/2006/picture">
+                <pic:pic xmlns:pic="http://schemas.openxmlformats.org/drawingml/2006/picture">
+                  <pic:nvPicPr>
+                    <pic:cNvPr id="1" name=""/>
+                    <pic:cNvPicPr/>
+                  </pic:nvPicPr>
+                  <pic:blipFill>
+                    <a:blip r:embed="rId27"/>
+                    <a:stretch>
+                      <a:fillRect/>
+                    </a:stretch>
+                  </pic:blipFill>
+                  <pic:spPr>
+                    <a:xfrm>
+                      <a:off x="0" y="0"/>
+                      <a:ext cx="5943600" cy="2004695"/>
+                    </a:xfrm>
+                    <a:prstGeom prst="rect">
+                      <a:avLst/>
+                    </a:prstGeom>
+                  </pic:spPr>
+                </pic:pic>
+              </a:graphicData>
+            </a:graphic>
+          </wp:inline>
+        </w:drawing>
+      </w:r>
+    </w:p>
+    <w:p>
+      <w:pPr>
+        <w:jc w:val="center"/>
+      </w:pPr>
+      <w:r>
+        <w:drawing>
+          <wp:inline distT="0" distB="0" distL="0" distR="0" wp14:anchorId="03986789" wp14:editId="4BA28EE2">
+            <wp:extent cx="4676775" cy="851913"/>
+            <wp:effectExtent l="0" t="0" r="0" b="5715"/>
+            <wp:docPr id="23" name="Imagen 23"/>
+            <wp:cNvGraphicFramePr>
+              <a:graphicFrameLocks xmlns:a="http://schemas.openxmlformats.org/drawingml/2006/main" noChangeAspect="1"/>
+            </wp:cNvGraphicFramePr>
+            <a:graphic xmlns:a="http://schemas.openxmlformats.org/drawingml/2006/main">
+              <a:graphicData uri="http://schemas.openxmlformats.org/drawingml/2006/picture">
+                <pic:pic xmlns:pic="http://schemas.openxmlformats.org/drawingml/2006/picture">
+                  <pic:nvPicPr>
+                    <pic:cNvPr id="1" name=""/>
+                    <pic:cNvPicPr/>
+                  </pic:nvPicPr>
+                  <pic:blipFill>
+                    <a:blip r:embed="rId28"/>
+                    <a:stretch>
+                      <a:fillRect/>
+                    </a:stretch>
+                  </pic:blipFill>
+                  <pic:spPr>
+                    <a:xfrm>
+                      <a:off x="0" y="0"/>
+                      <a:ext cx="4694262" cy="855098"/>
+                    </a:xfrm>
+                    <a:prstGeom prst="rect">
+                      <a:avLst/>
+                    </a:prstGeom>
+                  </pic:spPr>
+                </pic:pic>
+              </a:graphicData>
+            </a:graphic>
+          </wp:inline>
+        </w:drawing>
+      </w:r>
+    </w:p>
+    <w:p>
+      <w:pPr>
+        <w:jc w:val="center"/>
+      </w:pPr>
+      <w:r>
+        <w:drawing>
+          <wp:inline distT="0" distB="0" distL="0" distR="0" wp14:anchorId="6409BE82" wp14:editId="14230D7D">
+            <wp:extent cx="4498141" cy="3019425"/>
+            <wp:effectExtent l="0" t="0" r="0" b="0"/>
+            <wp:docPr id="24" name="Imagen 24"/>
+            <wp:cNvGraphicFramePr>
+              <a:graphicFrameLocks xmlns:a="http://schemas.openxmlformats.org/drawingml/2006/main" noChangeAspect="1"/>
+            </wp:cNvGraphicFramePr>
+            <a:graphic xmlns:a="http://schemas.openxmlformats.org/drawingml/2006/main">
+              <a:graphicData uri="http://schemas.openxmlformats.org/drawingml/2006/picture">
+                <pic:pic xmlns:pic="http://schemas.openxmlformats.org/drawingml/2006/picture">
+                  <pic:nvPicPr>
+                    <pic:cNvPr id="1" name=""/>
+                    <pic:cNvPicPr/>
+                  </pic:nvPicPr>
+                  <pic:blipFill>
+                    <a:blip r:embed="rId29"/>
+                    <a:stretch>
+                      <a:fillRect/>
+                    </a:stretch>
+                  </pic:blipFill>
+                  <pic:spPr>
+                    <a:xfrm>
+                      <a:off x="0" y="0"/>
+                      <a:ext cx="4502754" cy="3022522"/>
+                    </a:xfrm>
+                    <a:prstGeom prst="rect">
+                      <a:avLst/>
+                    </a:prstGeom>
+                  </pic:spPr>
+                </pic:pic>
+              </a:graphicData>
+            </a:graphic>
+          </wp:inline>
+        </w:drawing>
+      </w:r>
+    </w:p>
+    <w:p>
+      <w:pPr>
+        <w:pStyle w:val="Ttulo3"/>
+      </w:pPr>
+      <w:r>
+        <w:t xml:space="preserve">Explicación y </w:t>
+      </w:r>
+      <w:r>
+        <w:t>Prueba de que Funciona</w:t>
+      </w:r>
+    </w:p>
+    <w:p>
+      <w:pPr>
+        <w:pStyle w:val="Ttulo4"/>
+      </w:pPr>
+      <w:r>
+        <w:t>JwtService (Client</w:t>
+      </w:r>
+      <w:r>
+        <w:rPr>
+          <w:lang w:val="en-US"/>
+        </w:rPr>
+        <w:t>/Director</w:t>
+      </w:r>
+      <w:r>
+        <w:t>)</w:t>
+      </w:r>
+    </w:p>
+    <w:p>
+      <w:r>
+        <w:t xml:space="preserve">La clase </w:t>
+      </w:r>
+      <w:r>
+        <w:rPr>
+          <w:b/>
+          <w:bCs/>
+        </w:rPr>
+        <w:t>JwtService</w:t>
+      </w:r>
+      <w:r>
+        <w:t xml:space="preserve"> actúa como cliente y director contextual, ya que define los pasos de construcción</w:t>
+      </w:r>
+      <w:r>
+        <w:t xml:space="preserve"> del token JWT</w:t>
+      </w:r>
+      <w:r>
+        <w:t xml:space="preserve">. </w:t>
+      </w:r>
+    </w:p>
+    <w:p>
+      <w:pPr>
+        <w:pStyle w:val="Ttulo4"/>
+      </w:pPr>
+      <w:r>
+        <w:lastRenderedPageBreak/>
+        <w:t>JwtBuilder (Interfaz)</w:t>
+      </w:r>
+    </w:p>
+    <w:p>
+      <w:r>
+        <w:rPr>
+          <w:b/>
+          <w:bCs/>
+        </w:rPr>
+        <w:t>JwtBuilder</w:t>
+      </w:r>
+      <w:r>
+        <w:t xml:space="preserve"> representa el Builder</w:t>
+      </w:r>
+      <w:r>
+        <w:t>, donde se</w:t>
+      </w:r>
+      <w:r>
+        <w:t xml:space="preserve"> define el contrato de métodos que deberán utilizar los Builders concretos posteriormente, entre ellos los utilizados como </w:t>
+      </w:r>
+      <w:proofErr w:type="gramStart"/>
+      <w:r>
+        <w:rPr>
+          <w:b/>
+          <w:bCs/>
+        </w:rPr>
+        <w:t>subject(</w:t>
+      </w:r>
+      <w:proofErr w:type="gramEnd"/>
+      <w:r>
+        <w:rPr>
+          <w:b/>
+          <w:bCs/>
+        </w:rPr>
+        <w:t xml:space="preserve">), </w:t>
+      </w:r>
+      <w:proofErr w:type="spellStart"/>
+      <w:r>
+        <w:rPr>
+          <w:b/>
+          <w:bCs/>
+        </w:rPr>
+        <w:t>claim</w:t>
+      </w:r>
+      <w:proofErr w:type="spellEnd"/>
+      <w:r>
+        <w:rPr>
+          <w:b/>
+          <w:bCs/>
+        </w:rPr>
+        <w:t xml:space="preserve">(), </w:t>
+      </w:r>
+      <w:proofErr w:type="spellStart"/>
+      <w:r>
+        <w:rPr>
+          <w:b/>
+          <w:bCs/>
+        </w:rPr>
+        <w:t>issuedAt</w:t>
+      </w:r>
+      <w:proofErr w:type="spellEnd"/>
+      <w:r>
+        <w:rPr>
+          <w:b/>
+          <w:bCs/>
+        </w:rPr>
+        <w:t xml:space="preserve">(), </w:t>
+      </w:r>
+      <w:proofErr w:type="spellStart"/>
+      <w:r>
+        <w:rPr>
+          <w:b/>
+          <w:bCs/>
+        </w:rPr>
+        <w:t>expiration</w:t>
+      </w:r>
+      <w:proofErr w:type="spellEnd"/>
+      <w:r>
+        <w:rPr>
+          <w:b/>
+          <w:bCs/>
+        </w:rPr>
+        <w:t xml:space="preserve">(), </w:t>
+      </w:r>
+      <w:proofErr w:type="spellStart"/>
+      <w:r>
+        <w:rPr>
+          <w:b/>
+          <w:bCs/>
+        </w:rPr>
+        <w:t>signWith</w:t>
+      </w:r>
+      <w:proofErr w:type="spellEnd"/>
+      <w:r>
+        <w:rPr>
+          <w:b/>
+          <w:bCs/>
+        </w:rPr>
+        <w:t xml:space="preserve">() </w:t>
+      </w:r>
+      <w:r>
+        <w:t>y</w:t>
+      </w:r>
+      <w:r>
+        <w:rPr>
+          <w:b/>
+          <w:bCs/>
+        </w:rPr>
+        <w:t xml:space="preserve"> compact().</w:t>
+      </w:r>
+    </w:p>
+    <w:p>
+      <w:pPr>
+        <w:pStyle w:val="Ttulo4"/>
+      </w:pPr>
+      <w:r>
+        <w:t>DefaultJwtBuilder (Concrete Builder)</w:t>
+      </w:r>
+    </w:p>
+    <w:p>
+      <w:r>
+        <w:rPr>
+          <w:b/>
+          <w:bCs/>
+        </w:rPr>
+        <w:t>DefaultJwtBuilder</w:t>
+      </w:r>
+      <w:r>
+        <w:t xml:space="preserve">, proporcionado internamente por la librería </w:t>
+      </w:r>
+      <w:r>
+        <w:rPr>
+          <w:b/>
+          <w:bCs/>
+        </w:rPr>
+        <w:t>JJWT</w:t>
+      </w:r>
+      <w:r>
+        <w:t>, es el Builder concreto</w:t>
+      </w:r>
+      <w:r>
+        <w:t xml:space="preserve"> donde se implementa la interfaz </w:t>
+      </w:r>
+      <w:r>
+        <w:rPr>
+          <w:b/>
+          <w:bCs/>
+        </w:rPr>
+        <w:t xml:space="preserve">JwtBuilder </w:t>
+      </w:r>
+      <w:r>
+        <w:t>y se asigna comportamiento a sus métodos</w:t>
+      </w:r>
+      <w:r>
+        <w:t>.</w:t>
+      </w:r>
+      <w:r>
+        <w:t xml:space="preserve"> </w:t>
+      </w:r>
+      <w:r>
+        <w:t xml:space="preserve">Finalmente, el método </w:t>
+      </w:r>
+      <w:proofErr w:type="gramStart"/>
+      <w:r>
+        <w:rPr>
+          <w:b/>
+          <w:bCs/>
+        </w:rPr>
+        <w:t>compact(</w:t>
+      </w:r>
+      <w:proofErr w:type="gramEnd"/>
+      <w:r>
+        <w:rPr>
+          <w:b/>
+          <w:bCs/>
+        </w:rPr>
+        <w:t>)</w:t>
+      </w:r>
+      <w:r>
+        <w:t xml:space="preserve"> genera el producto terminado: un token JWT firmado en formato </w:t>
+      </w:r>
+      <w:r>
+        <w:rPr>
+          <w:b/>
+          <w:bCs/>
+        </w:rPr>
+        <w:t>String</w:t>
+      </w:r>
+      <w:r>
+        <w:t>.</w:t>
+      </w:r>
+    </w:p>
+    <w:p>
+      <w:pPr>
+        <w:pStyle w:val="Ttulo4"/>
+      </w:pPr>
+      <w:r>
+        <w:t>Funcionamiento</w:t>
+      </w:r>
+    </w:p>
+    <w:p>
+      <w:r>
+        <w:t>Cuando nosotros iniciamos sesión internamente con un usuario</w:t>
+      </w:r>
+      <w:r>
+        <w:t>, la API REST nos devuelve como respuesta un token JWT para gestionar la sesión del usuario como mensaje de éxito. A continuación se muestra un ejemplo:</w:t>
+      </w:r>
+    </w:p>
+    <w:p>
+      <w:r>
+        <w:drawing>
+          <wp:inline distT="0" distB="0" distL="0" distR="0" wp14:anchorId="009FAAB2" wp14:editId="7118C825">
+            <wp:extent cx="5943600" cy="2818765"/>
+            <wp:effectExtent l="0" t="0" r="0" b="635"/>
+            <wp:docPr id="27" name="Imagen 27"/>
+            <wp:cNvGraphicFramePr>
+              <a:graphicFrameLocks xmlns:a="http://schemas.openxmlformats.org/drawingml/2006/main" noChangeAspect="1"/>
+            </wp:cNvGraphicFramePr>
+            <a:graphic xmlns:a="http://schemas.openxmlformats.org/drawingml/2006/main">
+              <a:graphicData uri="http://schemas.openxmlformats.org/drawingml/2006/picture">
+                <pic:pic xmlns:pic="http://schemas.openxmlformats.org/drawingml/2006/picture">
+                  <pic:nvPicPr>
+                    <pic:cNvPr id="1" name=""/>
+                    <pic:cNvPicPr/>
+                  </pic:nvPicPr>
+                  <pic:blipFill>
+                    <a:blip r:embed="rId30"/>
+                    <a:stretch>
+                      <a:fillRect/>
+                    </a:stretch>
+                  </pic:blipFill>
+                  <pic:spPr>
+                    <a:xfrm>
+                      <a:off x="0" y="0"/>
+                      <a:ext cx="5943600" cy="2818765"/>
+                    </a:xfrm>
+                    <a:prstGeom prst="rect">
+                      <a:avLst/>
+                    </a:prstGeom>
+                  </pic:spPr>
+                </pic:pic>
+              </a:graphicData>
+            </a:graphic>
+          </wp:inline>
+        </w:drawing>
+      </w:r>
+    </w:p>
+    <w:p>
+      <w:r>
+        <w:t xml:space="preserve">Este token fue generado mediante un flujo interno de validación y verificación de credenciales donde posteriormente llego al </w:t>
+      </w:r>
+      <w:r>
+        <w:rPr>
+          <w:b/>
+          <w:bCs/>
+        </w:rPr>
+        <w:t>JwtService</w:t>
+      </w:r>
+      <w:r>
+        <w:t xml:space="preserve"> donde se gestionó la creación del token por medio de la librería </w:t>
+      </w:r>
+      <w:r>
+        <w:rPr>
+          <w:b/>
+          <w:bCs/>
+        </w:rPr>
+        <w:t xml:space="preserve">JJWT. </w:t>
+      </w:r>
+      <w:r>
+        <w:t>Utilizando el concepto de patrón Builder.</w:t>
       </w:r>
     </w:p>
     <w:p/>
@@ -5471,7 +6265,7 @@
     <w:p/>
     <w:p/>
     <w:sectPr>
-      <w:headerReference w:type="default" r:id="rId21"/>
+      <w:headerReference w:type="default" r:id="rId31"/>
       <w:pgSz w:w="12240" w:h="15840"/>
       <w:pgMar w:top="1440" w:right="1440" w:bottom="1440" w:left="1440" w:header="709" w:footer="709" w:gutter="0"/>
       <w:cols w:space="720"/>
@@ -5907,6 +6701,119 @@
     </w:lvl>
   </w:abstractNum>
   <w:abstractNum w:abstractNumId="3" w15:restartNumberingAfterBreak="0">
+    <w:nsid w:val="44203CB7"/>
+    <w:multiLevelType w:val="hybridMultilevel"/>
+    <w:tmpl w:val="02B65AE2"/>
+    <w:lvl w:ilvl="0" w:tplc="240A0001">
+      <w:start w:val="1"/>
+      <w:numFmt w:val="bullet"/>
+      <w:lvlText w:val=""/>
+      <w:lvlJc w:val="left"/>
+      <w:pPr>
+        <w:ind w:left="720" w:hanging="360"/>
+      </w:pPr>
+      <w:rPr>
+        <w:rFonts w:ascii="Symbol" w:hAnsi="Symbol" w:hint="default"/>
+      </w:rPr>
+    </w:lvl>
+    <w:lvl w:ilvl="1" w:tplc="240A0003" w:tentative="1">
+      <w:start w:val="1"/>
+      <w:numFmt w:val="bullet"/>
+      <w:lvlText w:val="o"/>
+      <w:lvlJc w:val="left"/>
+      <w:pPr>
+        <w:ind w:left="1440" w:hanging="360"/>
+      </w:pPr>
+      <w:rPr>
+        <w:rFonts w:ascii="Courier New" w:hAnsi="Courier New" w:cs="Courier New" w:hint="default"/>
+      </w:rPr>
+    </w:lvl>
+    <w:lvl w:ilvl="2" w:tplc="240A0005" w:tentative="1">
+      <w:start w:val="1"/>
+      <w:numFmt w:val="bullet"/>
+      <w:lvlText w:val=""/>
+      <w:lvlJc w:val="left"/>
+      <w:pPr>
+        <w:ind w:left="2160" w:hanging="360"/>
+      </w:pPr>
+      <w:rPr>
+        <w:rFonts w:ascii="Wingdings" w:hAnsi="Wingdings" w:hint="default"/>
+      </w:rPr>
+    </w:lvl>
+    <w:lvl w:ilvl="3" w:tplc="240A0001" w:tentative="1">
+      <w:start w:val="1"/>
+      <w:numFmt w:val="bullet"/>
+      <w:lvlText w:val=""/>
+      <w:lvlJc w:val="left"/>
+      <w:pPr>
+        <w:ind w:left="2880" w:hanging="360"/>
+      </w:pPr>
+      <w:rPr>
+        <w:rFonts w:ascii="Symbol" w:hAnsi="Symbol" w:hint="default"/>
+      </w:rPr>
+    </w:lvl>
+    <w:lvl w:ilvl="4" w:tplc="240A0003" w:tentative="1">
+      <w:start w:val="1"/>
+      <w:numFmt w:val="bullet"/>
+      <w:lvlText w:val="o"/>
+      <w:lvlJc w:val="left"/>
+      <w:pPr>
+        <w:ind w:left="3600" w:hanging="360"/>
+      </w:pPr>
+      <w:rPr>
+        <w:rFonts w:ascii="Courier New" w:hAnsi="Courier New" w:cs="Courier New" w:hint="default"/>
+      </w:rPr>
+    </w:lvl>
+    <w:lvl w:ilvl="5" w:tplc="240A0005" w:tentative="1">
+      <w:start w:val="1"/>
+      <w:numFmt w:val="bullet"/>
+      <w:lvlText w:val=""/>
+      <w:lvlJc w:val="left"/>
+      <w:pPr>
+        <w:ind w:left="4320" w:hanging="360"/>
+      </w:pPr>
+      <w:rPr>
+        <w:rFonts w:ascii="Wingdings" w:hAnsi="Wingdings" w:hint="default"/>
+      </w:rPr>
+    </w:lvl>
+    <w:lvl w:ilvl="6" w:tplc="240A0001" w:tentative="1">
+      <w:start w:val="1"/>
+      <w:numFmt w:val="bullet"/>
+      <w:lvlText w:val=""/>
+      <w:lvlJc w:val="left"/>
+      <w:pPr>
+        <w:ind w:left="5040" w:hanging="360"/>
+      </w:pPr>
+      <w:rPr>
+        <w:rFonts w:ascii="Symbol" w:hAnsi="Symbol" w:hint="default"/>
+      </w:rPr>
+    </w:lvl>
+    <w:lvl w:ilvl="7" w:tplc="240A0003" w:tentative="1">
+      <w:start w:val="1"/>
+      <w:numFmt w:val="bullet"/>
+      <w:lvlText w:val="o"/>
+      <w:lvlJc w:val="left"/>
+      <w:pPr>
+        <w:ind w:left="5760" w:hanging="360"/>
+      </w:pPr>
+      <w:rPr>
+        <w:rFonts w:ascii="Courier New" w:hAnsi="Courier New" w:cs="Courier New" w:hint="default"/>
+      </w:rPr>
+    </w:lvl>
+    <w:lvl w:ilvl="8" w:tplc="240A0005" w:tentative="1">
+      <w:start w:val="1"/>
+      <w:numFmt w:val="bullet"/>
+      <w:lvlText w:val=""/>
+      <w:lvlJc w:val="left"/>
+      <w:pPr>
+        <w:ind w:left="6480" w:hanging="360"/>
+      </w:pPr>
+      <w:rPr>
+        <w:rFonts w:ascii="Wingdings" w:hAnsi="Wingdings" w:hint="default"/>
+      </w:rPr>
+    </w:lvl>
+  </w:abstractNum>
+  <w:abstractNum w:abstractNumId="4" w15:restartNumberingAfterBreak="0">
     <w:nsid w:val="60933C7B"/>
     <w:multiLevelType w:val="multilevel"/>
     <w:tmpl w:val="60933C7B"/>
@@ -6019,7 +6926,7 @@
       </w:rPr>
     </w:lvl>
   </w:abstractNum>
-  <w:abstractNum w:abstractNumId="4" w15:restartNumberingAfterBreak="0">
+  <w:abstractNum w:abstractNumId="5" w15:restartNumberingAfterBreak="0">
     <w:nsid w:val="6D17503D"/>
     <w:multiLevelType w:val="multilevel"/>
     <w:tmpl w:val="6D17503D"/>
@@ -6142,10 +7049,13 @@
     <w:abstractNumId w:val="1"/>
   </w:num>
   <w:num w:numId="4">
-    <w:abstractNumId w:val="3"/>
+    <w:abstractNumId w:val="4"/>
   </w:num>
   <w:num w:numId="5">
-    <w:abstractNumId w:val="4"/>
+    <w:abstractNumId w:val="5"/>
+  </w:num>
+  <w:num w:numId="6">
+    <w:abstractNumId w:val="3"/>
   </w:num>
 </w:numbering>
 </file>

</xml_diff>

<commit_message>
Se agregaron los diagramas UML al patron singleton y Factory Method
</commit_message>
<xml_diff>
--- a/Sistema de Gestion de Cadenas de Suministro.docx
+++ b/Sistema de Gestion de Cadenas de Suministro.docx
@@ -3834,26 +3834,17 @@
         <w:pStyle w:val="Ttulo3"/>
       </w:pPr>
       <w:r>
-        <w:t>Evidencia</w:t>
-      </w:r>
-      <w:r>
-        <w:t>s</w:t>
-      </w:r>
-      <w:r>
-        <w:t xml:space="preserve"> de Uso</w:t>
-      </w:r>
-      <w:bookmarkEnd w:id="26"/>
-    </w:p>
-    <w:p>
-      <w:r>
-        <w:rPr>
-          <w:noProof/>
-        </w:rPr>
+        <w:lastRenderedPageBreak/>
+        <w:t>Diagrama de Clases UML</w:t>
+      </w:r>
+    </w:p>
+    <w:p>
+      <w:r>
         <w:drawing>
-          <wp:inline distT="0" distB="0" distL="0" distR="0" wp14:anchorId="47FBE2A2" wp14:editId="4CCE7D5F">
-            <wp:extent cx="5943600" cy="1791970"/>
-            <wp:effectExtent l="0" t="0" r="0" b="0"/>
-            <wp:docPr id="3" name="Imagen 3"/>
+          <wp:inline distT="0" distB="0" distL="0" distR="0" wp14:anchorId="54E0EE1B" wp14:editId="633C600E">
+            <wp:extent cx="5943600" cy="3764915"/>
+            <wp:effectExtent l="0" t="0" r="0" b="6985"/>
+            <wp:docPr id="16" name="Imagen 16"/>
             <wp:cNvGraphicFramePr>
               <a:graphicFrameLocks xmlns:a="http://schemas.openxmlformats.org/drawingml/2006/main" noChangeAspect="1"/>
             </wp:cNvGraphicFramePr>
@@ -3873,7 +3864,7 @@
                   <pic:spPr>
                     <a:xfrm>
                       <a:off x="0" y="0"/>
-                      <a:ext cx="5943600" cy="1791970"/>
+                      <a:ext cx="5943600" cy="3764915"/>
                     </a:xfrm>
                     <a:prstGeom prst="rect">
                       <a:avLst/>
@@ -3886,17 +3877,25 @@
         </w:drawing>
       </w:r>
     </w:p>
+    <w:bookmarkEnd w:id="26"/>
+    <w:p>
+      <w:pPr>
+        <w:pStyle w:val="Ttulo3"/>
+      </w:pPr>
+      <w:r>
+        <w:t>Código</w:t>
+      </w:r>
+    </w:p>
     <w:p>
       <w:r>
         <w:rPr>
           <w:noProof/>
         </w:rPr>
-        <w:lastRenderedPageBreak/>
         <w:drawing>
-          <wp:inline distT="0" distB="0" distL="0" distR="0" wp14:anchorId="7B191849" wp14:editId="486E0DED">
-            <wp:extent cx="5943600" cy="2027555"/>
+          <wp:inline distT="0" distB="0" distL="0" distR="0" wp14:anchorId="47FBE2A2" wp14:editId="4CCE7D5F">
+            <wp:extent cx="5943600" cy="1791970"/>
             <wp:effectExtent l="0" t="0" r="0" b="0"/>
-            <wp:docPr id="4" name="Imagen 4"/>
+            <wp:docPr id="3" name="Imagen 3"/>
             <wp:cNvGraphicFramePr>
               <a:graphicFrameLocks xmlns:a="http://schemas.openxmlformats.org/drawingml/2006/main" noChangeAspect="1"/>
             </wp:cNvGraphicFramePr>
@@ -3916,7 +3915,7 @@
                   <pic:spPr>
                     <a:xfrm>
                       <a:off x="0" y="0"/>
-                      <a:ext cx="5943600" cy="2027555"/>
+                      <a:ext cx="5943600" cy="1791970"/>
                     </a:xfrm>
                     <a:prstGeom prst="rect">
                       <a:avLst/>
@@ -3934,11 +3933,12 @@
         <w:rPr>
           <w:noProof/>
         </w:rPr>
+        <w:lastRenderedPageBreak/>
         <w:drawing>
-          <wp:inline distT="0" distB="0" distL="0" distR="0" wp14:anchorId="667BBF95" wp14:editId="7E5F0459">
-            <wp:extent cx="5943600" cy="2758440"/>
-            <wp:effectExtent l="0" t="0" r="0" b="3810"/>
-            <wp:docPr id="5" name="Imagen 5"/>
+          <wp:inline distT="0" distB="0" distL="0" distR="0" wp14:anchorId="7B191849" wp14:editId="486E0DED">
+            <wp:extent cx="5943600" cy="2027555"/>
+            <wp:effectExtent l="0" t="0" r="0" b="0"/>
+            <wp:docPr id="4" name="Imagen 4"/>
             <wp:cNvGraphicFramePr>
               <a:graphicFrameLocks xmlns:a="http://schemas.openxmlformats.org/drawingml/2006/main" noChangeAspect="1"/>
             </wp:cNvGraphicFramePr>
@@ -3958,7 +3958,7 @@
                   <pic:spPr>
                     <a:xfrm>
                       <a:off x="0" y="0"/>
-                      <a:ext cx="5943600" cy="2758440"/>
+                      <a:ext cx="5943600" cy="2027555"/>
                     </a:xfrm>
                     <a:prstGeom prst="rect">
                       <a:avLst/>
@@ -3972,350 +3972,15 @@
       </w:r>
     </w:p>
     <w:p>
-      <w:pPr>
-        <w:pStyle w:val="Ttulo3"/>
-      </w:pPr>
-      <w:bookmarkStart w:id="27" w:name="_Toc239179239"/>
-      <w:r>
-        <w:t xml:space="preserve">Explicación y </w:t>
-      </w:r>
-      <w:r>
-        <w:t>Prueba de que Funciona</w:t>
-      </w:r>
-      <w:bookmarkEnd w:id="27"/>
-    </w:p>
-    <w:p>
-      <w:r>
-        <w:t xml:space="preserve">Bueno, </w:t>
-      </w:r>
-      <w:r>
-        <w:t>primeramente,</w:t>
-      </w:r>
-      <w:r>
-        <w:t xml:space="preserve"> daremos una breve explicación de que hace cada parte de la evidencia que adjuntamos en el apartado </w:t>
-      </w:r>
-      <w:r>
-        <w:rPr>
-          <w:b/>
-          <w:bCs/>
-        </w:rPr>
-        <w:t>8.1.</w:t>
-      </w:r>
-      <w:r>
-        <w:rPr>
-          <w:b/>
-          <w:bCs/>
-        </w:rPr>
-        <w:t>2</w:t>
-      </w:r>
-      <w:r>
-        <w:rPr>
-          <w:b/>
-          <w:bCs/>
-        </w:rPr>
-        <w:t xml:space="preserve">. </w:t>
-      </w:r>
-      <w:r>
-        <w:t xml:space="preserve">Es importante resaltar que esta evidencia adjunta </w:t>
-      </w:r>
-      <w:r>
-        <w:t>está</w:t>
-      </w:r>
-      <w:r>
-        <w:t xml:space="preserve"> ubicada en la funcionalidad de </w:t>
-      </w:r>
-      <w:r>
-        <w:rPr>
-          <w:b/>
-          <w:bCs/>
-        </w:rPr>
-        <w:t>creación de proveedores</w:t>
-      </w:r>
-      <w:r>
-        <w:t xml:space="preserve"> en el </w:t>
-      </w:r>
-      <w:proofErr w:type="spellStart"/>
-      <w:r>
-        <w:rPr>
-          <w:b/>
-          <w:bCs/>
-        </w:rPr>
-        <w:t>backend</w:t>
-      </w:r>
-      <w:proofErr w:type="spellEnd"/>
-      <w:r>
-        <w:t xml:space="preserve">. Sin embargo, este patrón </w:t>
-      </w:r>
-      <w:r>
-        <w:t>está</w:t>
-      </w:r>
-      <w:r>
-        <w:t xml:space="preserve"> siendo utilizado en muchas otras partes también. Las evidencias que adjuntamos solo son una parte de todo lo que es esta funcionalidad, pero es, por así decirlo, el núcleo para que funcione.</w:t>
-      </w:r>
-    </w:p>
-    <w:p>
-      <w:pPr>
-        <w:pStyle w:val="Ttulo4"/>
-        <w:rPr>
-          <w:lang w:val="en-US"/>
-        </w:rPr>
-      </w:pPr>
-      <w:r>
-        <w:rPr>
-          <w:lang w:val="en-US"/>
-        </w:rPr>
-        <w:t xml:space="preserve">@RestController </w:t>
-      </w:r>
-      <w:proofErr w:type="spellStart"/>
-      <w:r>
-        <w:rPr>
-          <w:lang w:val="en-US"/>
-        </w:rPr>
-        <w:t>SupplierController</w:t>
-      </w:r>
-      <w:proofErr w:type="spellEnd"/>
-    </w:p>
-    <w:p>
-      <w:r>
-        <w:t xml:space="preserve">Este componente es el </w:t>
-      </w:r>
-      <w:r>
-        <w:t xml:space="preserve">encargado de recibir la petición del usuario por medio del </w:t>
-      </w:r>
-      <w:proofErr w:type="spellStart"/>
-      <w:r>
-        <w:t>endpoint</w:t>
-      </w:r>
-      <w:proofErr w:type="spellEnd"/>
-      <w:r>
-        <w:t xml:space="preserve"> </w:t>
-      </w:r>
-      <w:r>
-        <w:rPr>
-          <w:b/>
-          <w:bCs/>
-        </w:rPr>
-        <w:t>“/api/</w:t>
-      </w:r>
-      <w:proofErr w:type="spellStart"/>
-      <w:r>
-        <w:rPr>
-          <w:b/>
-          <w:bCs/>
-        </w:rPr>
-        <w:t>supplier</w:t>
-      </w:r>
-      <w:proofErr w:type="spellEnd"/>
-      <w:r>
-        <w:rPr>
-          <w:b/>
-          <w:bCs/>
-        </w:rPr>
-        <w:t>”</w:t>
-      </w:r>
-      <w:r>
-        <w:rPr>
-          <w:b/>
-          <w:bCs/>
-        </w:rPr>
-        <w:t xml:space="preserve"> </w:t>
-      </w:r>
-      <w:r>
-        <w:t xml:space="preserve">y dirigir la información al </w:t>
-      </w:r>
-      <w:r>
-        <w:rPr>
-          <w:b/>
-          <w:bCs/>
-        </w:rPr>
-        <w:t>@Service</w:t>
-      </w:r>
-      <w:r>
-        <w:rPr>
-          <w:b/>
-          <w:bCs/>
-        </w:rPr>
-        <w:t xml:space="preserve"> </w:t>
-      </w:r>
-      <w:r>
-        <w:t xml:space="preserve">que se encargara de orquestar el flujo de creación del proveedor. </w:t>
-      </w:r>
-      <w:r>
-        <w:lastRenderedPageBreak/>
-        <w:t>Asimismo, él se encarga también de devolverle la correspondiente respuesta al usuario cuando el proveedor haya sido creado.</w:t>
-      </w:r>
-    </w:p>
-    <w:p>
-      <w:pPr>
-        <w:pStyle w:val="Ttulo4"/>
-        <w:rPr>
-          <w:lang w:val="en-US"/>
-        </w:rPr>
-      </w:pPr>
-      <w:r>
-        <w:rPr>
-          <w:lang w:val="en-US"/>
-        </w:rPr>
-        <w:t xml:space="preserve">@Service </w:t>
-      </w:r>
-      <w:proofErr w:type="spellStart"/>
-      <w:r>
-        <w:rPr>
-          <w:lang w:val="en-US"/>
-        </w:rPr>
-        <w:t>SupplierService</w:t>
-      </w:r>
-      <w:proofErr w:type="spellEnd"/>
-    </w:p>
-    <w:p>
-      <w:pPr>
-        <w:rPr>
-          <w:b/>
-          <w:bCs/>
-        </w:rPr>
-      </w:pPr>
-      <w:r>
-        <w:t xml:space="preserve">Aquí se maneja la </w:t>
-      </w:r>
-      <w:r>
-        <w:t xml:space="preserve">orquestación del flujo de creación del proveedor, donde se capturan los datos que llegan, se hacen su correspondiente mapeo a entidad de dominio (estamos usando arquitectura hexagonal) y posteriormente se le pasa al </w:t>
-      </w:r>
-      <w:r>
-        <w:rPr>
-          <w:b/>
-          <w:bCs/>
-        </w:rPr>
-        <w:t xml:space="preserve">@Component </w:t>
-      </w:r>
-      <w:r>
-        <w:t xml:space="preserve">encargado de manejar la persistencia en la base de datos. Asimismo, cuando se obtiene una respuesta, se la envía al </w:t>
-      </w:r>
-      <w:r>
-        <w:rPr>
-          <w:b/>
-          <w:bCs/>
-        </w:rPr>
-        <w:t>@RestController</w:t>
-      </w:r>
-    </w:p>
-    <w:p>
-      <w:pPr>
-        <w:pStyle w:val="Ttulo4"/>
-      </w:pPr>
-      <w:r>
-        <w:t xml:space="preserve">@Component </w:t>
-      </w:r>
-      <w:proofErr w:type="spellStart"/>
-      <w:r>
-        <w:t>SupplierAdapterPersistence</w:t>
-      </w:r>
-      <w:proofErr w:type="spellEnd"/>
-    </w:p>
-    <w:p>
-      <w:r>
-        <w:t xml:space="preserve">En este apartado se maneja lo que es la comunicación con el componente interno que se encarga de recibir los datos para persistirlos definitivamente en la base de datos mediante </w:t>
-      </w:r>
-      <w:r>
-        <w:rPr>
-          <w:b/>
-          <w:bCs/>
-        </w:rPr>
-        <w:t xml:space="preserve">JPA e </w:t>
-      </w:r>
-      <w:proofErr w:type="spellStart"/>
-      <w:r>
-        <w:rPr>
-          <w:b/>
-          <w:bCs/>
-        </w:rPr>
-        <w:t>Hibernate</w:t>
-      </w:r>
-      <w:proofErr w:type="spellEnd"/>
-      <w:r>
-        <w:rPr>
-          <w:b/>
-          <w:bCs/>
-        </w:rPr>
-        <w:t xml:space="preserve">. </w:t>
-      </w:r>
-      <w:r>
-        <w:t xml:space="preserve">Primeramente, se reciben los datos que llegan del </w:t>
-      </w:r>
-      <w:r>
-        <w:rPr>
-          <w:b/>
-          <w:bCs/>
-        </w:rPr>
-        <w:t xml:space="preserve">@Service </w:t>
-      </w:r>
-      <w:r>
-        <w:t xml:space="preserve">y se envían al repositorio para guardarlos, después de ello, se envía la respuesta obtenida al </w:t>
-      </w:r>
-      <w:r>
-        <w:rPr>
-          <w:b/>
-          <w:bCs/>
-        </w:rPr>
-        <w:t xml:space="preserve">@Service </w:t>
-      </w:r>
-      <w:r>
-        <w:t>nuevamente.</w:t>
-      </w:r>
-    </w:p>
-    <w:p>
-      <w:pPr>
-        <w:pStyle w:val="Ttulo4"/>
-      </w:pPr>
-      <w:r>
-        <w:t>Funcionamiento</w:t>
-      </w:r>
-    </w:p>
-    <w:p>
-      <w:r>
-        <w:t xml:space="preserve">Ahora sí, para la prueba de funcionamiento, ya que todavía no contamos con una interfaz gráfica en el </w:t>
-      </w:r>
-      <w:proofErr w:type="spellStart"/>
-      <w:r>
-        <w:rPr>
-          <w:b/>
-          <w:bCs/>
-        </w:rPr>
-        <w:t>frontend</w:t>
-      </w:r>
-      <w:proofErr w:type="spellEnd"/>
-      <w:r>
-        <w:t xml:space="preserve">, utilizamos la herramienta </w:t>
-      </w:r>
-      <w:proofErr w:type="spellStart"/>
-      <w:r>
-        <w:rPr>
-          <w:b/>
-          <w:bCs/>
-        </w:rPr>
-        <w:t>Postman</w:t>
-      </w:r>
-      <w:proofErr w:type="spellEnd"/>
-      <w:r>
-        <w:t xml:space="preserve">, en la cual mandamos la siguiente petición a la </w:t>
-      </w:r>
-      <w:r>
-        <w:rPr>
-          <w:b/>
-          <w:bCs/>
-        </w:rPr>
-        <w:t>API.</w:t>
-      </w:r>
-    </w:p>
-    <w:p>
       <w:r>
         <w:rPr>
           <w:noProof/>
         </w:rPr>
         <w:drawing>
-          <wp:inline distT="0" distB="0" distL="0" distR="0" wp14:anchorId="6BCB94B5" wp14:editId="31381EAD">
-            <wp:extent cx="5943600" cy="2371090"/>
-            <wp:effectExtent l="0" t="0" r="0" b="0"/>
-            <wp:docPr id="6" name="Imagen 6"/>
+          <wp:inline distT="0" distB="0" distL="0" distR="0" wp14:anchorId="667BBF95" wp14:editId="7E5F0459">
+            <wp:extent cx="5943600" cy="2758440"/>
+            <wp:effectExtent l="0" t="0" r="0" b="3810"/>
+            <wp:docPr id="5" name="Imagen 5"/>
             <wp:cNvGraphicFramePr>
               <a:graphicFrameLocks xmlns:a="http://schemas.openxmlformats.org/drawingml/2006/main" noChangeAspect="1"/>
             </wp:cNvGraphicFramePr>
@@ -4335,7 +4000,7 @@
                   <pic:spPr>
                     <a:xfrm>
                       <a:off x="0" y="0"/>
-                      <a:ext cx="5943600" cy="2371090"/>
+                      <a:ext cx="5943600" cy="2758440"/>
                     </a:xfrm>
                     <a:prstGeom prst="rect">
                       <a:avLst/>
@@ -4349,16 +4014,338 @@
       </w:r>
     </w:p>
     <w:p>
-      <w:r>
-        <w:t xml:space="preserve">Una vez enviada la petición, automáticamente se </w:t>
+      <w:pPr>
+        <w:pStyle w:val="Ttulo3"/>
+      </w:pPr>
+      <w:bookmarkStart w:id="27" w:name="_Toc239179239"/>
+      <w:r>
+        <w:t xml:space="preserve">Explicación y </w:t>
+      </w:r>
+      <w:r>
+        <w:t>Prueba de que Funciona</w:t>
+      </w:r>
+      <w:bookmarkEnd w:id="27"/>
+    </w:p>
+    <w:p>
+      <w:r>
+        <w:t xml:space="preserve">Bueno, </w:t>
+      </w:r>
+      <w:r>
+        <w:t>primeramente,</w:t>
+      </w:r>
+      <w:r>
+        <w:t xml:space="preserve"> daremos una breve explicación de que hace cada parte de la evidencia que adjuntamos en el apartado </w:t>
+      </w:r>
+      <w:r>
+        <w:rPr>
+          <w:b/>
+          <w:bCs/>
+        </w:rPr>
+        <w:t>8.1.</w:t>
+      </w:r>
+      <w:r>
+        <w:rPr>
+          <w:b/>
+          <w:bCs/>
+        </w:rPr>
+        <w:t>2</w:t>
+      </w:r>
+      <w:r>
+        <w:rPr>
+          <w:b/>
+          <w:bCs/>
+        </w:rPr>
+        <w:t xml:space="preserve">. </w:t>
+      </w:r>
+      <w:r>
+        <w:t xml:space="preserve">Es importante resaltar que esta evidencia adjunta </w:t>
+      </w:r>
+      <w:r>
+        <w:t>está</w:t>
+      </w:r>
+      <w:r>
+        <w:t xml:space="preserve"> ubicada en la funcionalidad de </w:t>
+      </w:r>
+      <w:r>
+        <w:rPr>
+          <w:b/>
+          <w:bCs/>
+        </w:rPr>
+        <w:t>creación de proveedores</w:t>
+      </w:r>
+      <w:r>
+        <w:t xml:space="preserve"> en el </w:t>
       </w:r>
       <w:proofErr w:type="spellStart"/>
       <w:r>
-        <w:t>creo</w:t>
+        <w:rPr>
+          <w:b/>
+          <w:bCs/>
+        </w:rPr>
+        <w:t>backend</w:t>
       </w:r>
       <w:proofErr w:type="spellEnd"/>
       <w:r>
-        <w:t xml:space="preserve"> el proveedor en la base de datos:</w:t>
+        <w:t xml:space="preserve">. Sin embargo, este patrón </w:t>
+      </w:r>
+      <w:r>
+        <w:t>está</w:t>
+      </w:r>
+      <w:r>
+        <w:t xml:space="preserve"> siendo utilizado en muchas otras partes también. Las evidencias que adjuntamos solo son una parte de todo lo que es esta funcionalidad, pero es, por así decirlo, el núcleo para que funcione.</w:t>
+      </w:r>
+    </w:p>
+    <w:p>
+      <w:pPr>
+        <w:pStyle w:val="Ttulo4"/>
+        <w:rPr>
+          <w:lang w:val="en-US"/>
+        </w:rPr>
+      </w:pPr>
+      <w:r>
+        <w:rPr>
+          <w:lang w:val="en-US"/>
+        </w:rPr>
+        <w:t xml:space="preserve">@RestController </w:t>
+      </w:r>
+      <w:proofErr w:type="spellStart"/>
+      <w:r>
+        <w:rPr>
+          <w:lang w:val="en-US"/>
+        </w:rPr>
+        <w:t>SupplierController</w:t>
+      </w:r>
+      <w:proofErr w:type="spellEnd"/>
+    </w:p>
+    <w:p>
+      <w:r>
+        <w:t xml:space="preserve">Este componente es el </w:t>
+      </w:r>
+      <w:r>
+        <w:t xml:space="preserve">encargado de recibir la petición del usuario por medio del </w:t>
+      </w:r>
+      <w:proofErr w:type="spellStart"/>
+      <w:r>
+        <w:t>endpoint</w:t>
+      </w:r>
+      <w:proofErr w:type="spellEnd"/>
+      <w:r>
+        <w:t xml:space="preserve"> </w:t>
+      </w:r>
+      <w:r>
+        <w:rPr>
+          <w:b/>
+          <w:bCs/>
+        </w:rPr>
+        <w:t>“/api/</w:t>
+      </w:r>
+      <w:proofErr w:type="spellStart"/>
+      <w:r>
+        <w:rPr>
+          <w:b/>
+          <w:bCs/>
+        </w:rPr>
+        <w:t>supplier</w:t>
+      </w:r>
+      <w:proofErr w:type="spellEnd"/>
+      <w:r>
+        <w:rPr>
+          <w:b/>
+          <w:bCs/>
+        </w:rPr>
+        <w:t>”</w:t>
+      </w:r>
+      <w:r>
+        <w:rPr>
+          <w:b/>
+          <w:bCs/>
+        </w:rPr>
+        <w:t xml:space="preserve"> </w:t>
+      </w:r>
+      <w:r>
+        <w:t xml:space="preserve">y dirigir la información al </w:t>
+      </w:r>
+      <w:r>
+        <w:rPr>
+          <w:b/>
+          <w:bCs/>
+        </w:rPr>
+        <w:t>@Service</w:t>
+      </w:r>
+      <w:r>
+        <w:rPr>
+          <w:b/>
+          <w:bCs/>
+        </w:rPr>
+        <w:t xml:space="preserve"> </w:t>
+      </w:r>
+      <w:r>
+        <w:t xml:space="preserve">que se encargara de orquestar el flujo de creación del proveedor. </w:t>
+      </w:r>
+      <w:r>
+        <w:lastRenderedPageBreak/>
+        <w:t>Asimismo, él se encarga también de devolverle la correspondiente respuesta al usuario cuando el proveedor haya sido creado.</w:t>
+      </w:r>
+    </w:p>
+    <w:p>
+      <w:pPr>
+        <w:pStyle w:val="Ttulo4"/>
+        <w:rPr>
+          <w:lang w:val="en-US"/>
+        </w:rPr>
+      </w:pPr>
+      <w:r>
+        <w:rPr>
+          <w:lang w:val="en-US"/>
+        </w:rPr>
+        <w:t xml:space="preserve">@Service </w:t>
+      </w:r>
+      <w:proofErr w:type="spellStart"/>
+      <w:r>
+        <w:rPr>
+          <w:lang w:val="en-US"/>
+        </w:rPr>
+        <w:t>SupplierService</w:t>
+      </w:r>
+      <w:proofErr w:type="spellEnd"/>
+    </w:p>
+    <w:p>
+      <w:pPr>
+        <w:rPr>
+          <w:b/>
+          <w:bCs/>
+        </w:rPr>
+      </w:pPr>
+      <w:r>
+        <w:t xml:space="preserve">Aquí se maneja la </w:t>
+      </w:r>
+      <w:r>
+        <w:t xml:space="preserve">orquestación del flujo de creación del proveedor, donde se capturan los datos que llegan, se hacen su correspondiente mapeo a entidad de dominio (estamos usando arquitectura hexagonal) y posteriormente se le pasa al </w:t>
+      </w:r>
+      <w:r>
+        <w:rPr>
+          <w:b/>
+          <w:bCs/>
+        </w:rPr>
+        <w:t xml:space="preserve">@Component </w:t>
+      </w:r>
+      <w:r>
+        <w:t xml:space="preserve">encargado de manejar la persistencia en la base de datos. Asimismo, cuando se obtiene una respuesta, se la envía al </w:t>
+      </w:r>
+      <w:r>
+        <w:rPr>
+          <w:b/>
+          <w:bCs/>
+        </w:rPr>
+        <w:t>@RestController</w:t>
+      </w:r>
+    </w:p>
+    <w:p>
+      <w:pPr>
+        <w:pStyle w:val="Ttulo4"/>
+      </w:pPr>
+      <w:r>
+        <w:t xml:space="preserve">@Component </w:t>
+      </w:r>
+      <w:proofErr w:type="spellStart"/>
+      <w:r>
+        <w:t>SupplierAdapterPersistence</w:t>
+      </w:r>
+      <w:proofErr w:type="spellEnd"/>
+    </w:p>
+    <w:p>
+      <w:r>
+        <w:t xml:space="preserve">En este apartado se maneja lo que es la comunicación con el componente interno que se encarga de recibir los datos para persistirlos definitivamente en la base de datos mediante </w:t>
+      </w:r>
+      <w:r>
+        <w:rPr>
+          <w:b/>
+          <w:bCs/>
+        </w:rPr>
+        <w:t xml:space="preserve">JPA e </w:t>
+      </w:r>
+      <w:proofErr w:type="spellStart"/>
+      <w:r>
+        <w:rPr>
+          <w:b/>
+          <w:bCs/>
+        </w:rPr>
+        <w:t>Hibernate</w:t>
+      </w:r>
+      <w:proofErr w:type="spellEnd"/>
+      <w:r>
+        <w:rPr>
+          <w:b/>
+          <w:bCs/>
+        </w:rPr>
+        <w:t xml:space="preserve">. </w:t>
+      </w:r>
+      <w:r>
+        <w:t xml:space="preserve">Primeramente, se reciben los datos que llegan del </w:t>
+      </w:r>
+      <w:r>
+        <w:rPr>
+          <w:b/>
+          <w:bCs/>
+        </w:rPr>
+        <w:t xml:space="preserve">@Service </w:t>
+      </w:r>
+      <w:r>
+        <w:t xml:space="preserve">y se envían al repositorio para guardarlos, después de ello, se envía la respuesta obtenida al </w:t>
+      </w:r>
+      <w:r>
+        <w:rPr>
+          <w:b/>
+          <w:bCs/>
+        </w:rPr>
+        <w:t xml:space="preserve">@Service </w:t>
+      </w:r>
+      <w:r>
+        <w:t>nuevamente.</w:t>
+      </w:r>
+    </w:p>
+    <w:p>
+      <w:pPr>
+        <w:pStyle w:val="Ttulo4"/>
+      </w:pPr>
+      <w:r>
+        <w:t>Funcionamiento</w:t>
+      </w:r>
+    </w:p>
+    <w:p>
+      <w:r>
+        <w:t xml:space="preserve">Ahora sí, para la prueba de funcionamiento, ya que todavía no contamos con una interfaz gráfica en el </w:t>
+      </w:r>
+      <w:proofErr w:type="spellStart"/>
+      <w:r>
+        <w:rPr>
+          <w:b/>
+          <w:bCs/>
+        </w:rPr>
+        <w:t>frontend</w:t>
+      </w:r>
+      <w:proofErr w:type="spellEnd"/>
+      <w:r>
+        <w:t xml:space="preserve">, utilizamos la herramienta </w:t>
+      </w:r>
+      <w:proofErr w:type="spellStart"/>
+      <w:r>
+        <w:rPr>
+          <w:b/>
+          <w:bCs/>
+        </w:rPr>
+        <w:t>Postman</w:t>
+      </w:r>
+      <w:proofErr w:type="spellEnd"/>
+      <w:r>
+        <w:t xml:space="preserve">, en la cual mandamos la siguiente petición a la </w:t>
+      </w:r>
+      <w:r>
+        <w:rPr>
+          <w:b/>
+          <w:bCs/>
+        </w:rPr>
+        <w:t>API.</w:t>
       </w:r>
     </w:p>
     <w:p>
@@ -4367,10 +4354,10 @@
           <w:noProof/>
         </w:rPr>
         <w:drawing>
-          <wp:inline distT="0" distB="0" distL="0" distR="0" wp14:anchorId="631896AF" wp14:editId="70BEF2E4">
-            <wp:extent cx="5943600" cy="358140"/>
-            <wp:effectExtent l="0" t="0" r="0" b="3810"/>
-            <wp:docPr id="7" name="Imagen 7"/>
+          <wp:inline distT="0" distB="0" distL="0" distR="0" wp14:anchorId="6BCB94B5" wp14:editId="31381EAD">
+            <wp:extent cx="5943600" cy="2371090"/>
+            <wp:effectExtent l="0" t="0" r="0" b="0"/>
+            <wp:docPr id="6" name="Imagen 6"/>
             <wp:cNvGraphicFramePr>
               <a:graphicFrameLocks xmlns:a="http://schemas.openxmlformats.org/drawingml/2006/main" noChangeAspect="1"/>
             </wp:cNvGraphicFramePr>
@@ -4390,7 +4377,7 @@
                   <pic:spPr>
                     <a:xfrm>
                       <a:off x="0" y="0"/>
-                      <a:ext cx="5943600" cy="358140"/>
+                      <a:ext cx="5943600" cy="2371090"/>
                     </a:xfrm>
                     <a:prstGeom prst="rect">
                       <a:avLst/>
@@ -4405,14 +4392,15 @@
     </w:p>
     <w:p>
       <w:r>
-        <w:lastRenderedPageBreak/>
-        <w:t xml:space="preserve">Y se </w:t>
-      </w:r>
-      <w:r>
-        <w:t>retornó</w:t>
-      </w:r>
-      <w:r>
-        <w:t xml:space="preserve"> la respuesta de que el registro fue guardado:</w:t>
+        <w:t xml:space="preserve">Una vez enviada la petición, automáticamente se </w:t>
+      </w:r>
+      <w:proofErr w:type="spellStart"/>
+      <w:r>
+        <w:t>creo</w:t>
+      </w:r>
+      <w:proofErr w:type="spellEnd"/>
+      <w:r>
+        <w:t xml:space="preserve"> el proveedor en la base de datos:</w:t>
       </w:r>
     </w:p>
     <w:p>
@@ -4421,10 +4409,10 @@
           <w:noProof/>
         </w:rPr>
         <w:drawing>
-          <wp:inline distT="0" distB="0" distL="0" distR="0" wp14:anchorId="33858230" wp14:editId="77026256">
-            <wp:extent cx="5943600" cy="1595120"/>
-            <wp:effectExtent l="0" t="0" r="0" b="5080"/>
-            <wp:docPr id="9" name="Imagen 9"/>
+          <wp:inline distT="0" distB="0" distL="0" distR="0" wp14:anchorId="631896AF" wp14:editId="70BEF2E4">
+            <wp:extent cx="5943600" cy="358140"/>
+            <wp:effectExtent l="0" t="0" r="0" b="3810"/>
+            <wp:docPr id="7" name="Imagen 7"/>
             <wp:cNvGraphicFramePr>
               <a:graphicFrameLocks xmlns:a="http://schemas.openxmlformats.org/drawingml/2006/main" noChangeAspect="1"/>
             </wp:cNvGraphicFramePr>
@@ -4444,7 +4432,7 @@
                   <pic:spPr>
                     <a:xfrm>
                       <a:off x="0" y="0"/>
-                      <a:ext cx="5943600" cy="1595120"/>
+                      <a:ext cx="5943600" cy="358140"/>
                     </a:xfrm>
                     <a:prstGeom prst="rect">
                       <a:avLst/>
@@ -4458,167 +4446,27 @@
       </w:r>
     </w:p>
     <w:p>
-      <w:pPr>
-        <w:pStyle w:val="Ttulo2"/>
-      </w:pPr>
-      <w:r>
-        <w:t>Aplicación del Patrón Factory Method</w:t>
-      </w:r>
-    </w:p>
-    <w:p>
-      <w:pPr>
-        <w:pStyle w:val="Ttulo3"/>
-      </w:pPr>
-      <w:r>
-        <w:t>Como está Colaborando este Patrón al Proyecto</w:t>
-      </w:r>
-    </w:p>
-    <w:p>
-      <w:r>
-        <w:t xml:space="preserve">En nuestro proyecto utilizamos Spring Framework, el cual cuenta con un contenedor de </w:t>
-      </w:r>
-      <w:r>
-        <w:rPr>
-          <w:b/>
-          <w:bCs/>
-        </w:rPr>
-        <w:t>Inversión de Control (</w:t>
-      </w:r>
-      <w:proofErr w:type="spellStart"/>
-      <w:r>
-        <w:rPr>
-          <w:b/>
-          <w:bCs/>
-        </w:rPr>
-        <w:t>IoC</w:t>
-      </w:r>
-      <w:proofErr w:type="spellEnd"/>
-      <w:r>
-        <w:rPr>
-          <w:b/>
-          <w:bCs/>
-        </w:rPr>
-        <w:t xml:space="preserve">) </w:t>
-      </w:r>
-      <w:r>
-        <w:t xml:space="preserve">encargado de crear y gestionar los objetos utilizados por la aplicación. Spring permite definir métodos de creación mediante la anotación </w:t>
-      </w:r>
-      <w:r>
-        <w:rPr>
-          <w:b/>
-          <w:bCs/>
-        </w:rPr>
-        <w:t>@Bean</w:t>
-      </w:r>
-      <w:r>
-        <w:t xml:space="preserve">, los cuales funcionan como un mecanismo de </w:t>
-      </w:r>
-      <w:r>
-        <w:rPr>
-          <w:b/>
-          <w:bCs/>
-        </w:rPr>
-        <w:t>Factory Method</w:t>
-      </w:r>
-      <w:r>
-        <w:t>, ya que encapsulan la creación de una instancia y permiten trabajar con una abstracción sin depender directamente de su implementación.</w:t>
-      </w:r>
-    </w:p>
-    <w:p>
-      <w:r>
-        <w:t xml:space="preserve">En nuestro caso, este patrón se utiliza principalmente en Spring Security para la creación de </w:t>
-      </w:r>
-      <w:proofErr w:type="spellStart"/>
-      <w:r>
-        <w:rPr>
-          <w:b/>
-          <w:bCs/>
-        </w:rPr>
-        <w:t>PasswordEncoder</w:t>
-      </w:r>
-      <w:proofErr w:type="spellEnd"/>
-      <w:r>
-        <w:t xml:space="preserve">, cuya implementación concreta es </w:t>
-      </w:r>
-      <w:proofErr w:type="spellStart"/>
-      <w:r>
-        <w:rPr>
-          <w:b/>
-          <w:bCs/>
-        </w:rPr>
-        <w:t>BCryptPasswordEncoder</w:t>
-      </w:r>
-      <w:proofErr w:type="spellEnd"/>
-      <w:r>
-        <w:t xml:space="preserve">. Esto permite que los componentes que necesitan procesar contraseñas dependan de </w:t>
-      </w:r>
-      <w:proofErr w:type="spellStart"/>
-      <w:r>
-        <w:rPr>
-          <w:b/>
-          <w:bCs/>
-        </w:rPr>
-        <w:t>PasswordEncoder</w:t>
-      </w:r>
-      <w:proofErr w:type="spellEnd"/>
-      <w:r>
-        <w:t xml:space="preserve"> y no directamente de </w:t>
-      </w:r>
-      <w:proofErr w:type="spellStart"/>
-      <w:r>
-        <w:rPr>
-          <w:b/>
-          <w:bCs/>
-        </w:rPr>
-        <w:t>BCrypt</w:t>
-      </w:r>
-      <w:proofErr w:type="spellEnd"/>
-      <w:r>
-        <w:t>, reduciendo el acoplamiento y facilitando un posible cambio de implementación. Además, al combinarse con la inyección de dependencias de Spring, la creación y gestión de estos componentes queda centralizada y facilita el mantenimiento del proyecto.</w:t>
-      </w:r>
-    </w:p>
-    <w:p>
-      <w:pPr>
-        <w:pStyle w:val="Ttulo3"/>
-      </w:pPr>
-      <w:r>
-        <w:t>Evidencias de Uso</w:t>
-      </w:r>
-    </w:p>
-    <w:p>
-      <w:pPr>
-        <w:rPr>
-          <w:b/>
-          <w:bCs/>
-        </w:rPr>
-      </w:pPr>
-      <w:r>
-        <w:rPr>
-          <w:b/>
-          <w:bCs/>
-        </w:rPr>
-        <w:t>Fabrica</w:t>
-      </w:r>
-    </w:p>
-    <w:p>
-      <w:pPr>
-        <w:jc w:val="center"/>
-        <w:rPr>
-          <w:b/>
-          <w:bCs/>
-        </w:rPr>
-      </w:pPr>
-      <w:r>
-        <w:rPr>
-          <w:b/>
-          <w:bCs/>
+      <w:r>
+        <w:lastRenderedPageBreak/>
+        <w:t xml:space="preserve">Y se </w:t>
+      </w:r>
+      <w:r>
+        <w:t>retornó</w:t>
+      </w:r>
+      <w:r>
+        <w:t xml:space="preserve"> la respuesta de que el registro fue guardado:</w:t>
+      </w:r>
+    </w:p>
+    <w:p>
+      <w:r>
+        <w:rPr>
           <w:noProof/>
         </w:rPr>
         <w:drawing>
-          <wp:inline distT="0" distB="0" distL="0" distR="0" wp14:anchorId="3534E270" wp14:editId="48DFBBED">
-            <wp:extent cx="2772162" cy="876422"/>
-            <wp:effectExtent l="0" t="0" r="9525" b="0"/>
-            <wp:docPr id="8" name="Imagen 8"/>
+          <wp:inline distT="0" distB="0" distL="0" distR="0" wp14:anchorId="33858230" wp14:editId="77026256">
+            <wp:extent cx="5943600" cy="1595120"/>
+            <wp:effectExtent l="0" t="0" r="0" b="5080"/>
+            <wp:docPr id="9" name="Imagen 9"/>
             <wp:cNvGraphicFramePr>
               <a:graphicFrameLocks xmlns:a="http://schemas.openxmlformats.org/drawingml/2006/main" noChangeAspect="1"/>
             </wp:cNvGraphicFramePr>
@@ -4638,7 +4486,7 @@
                   <pic:spPr>
                     <a:xfrm>
                       <a:off x="0" y="0"/>
-                      <a:ext cx="2772162" cy="876422"/>
+                      <a:ext cx="5943600" cy="1595120"/>
                     </a:xfrm>
                     <a:prstGeom prst="rect">
                       <a:avLst/>
@@ -4653,40 +4501,148 @@
     </w:p>
     <w:p>
       <w:pPr>
-        <w:jc w:val="left"/>
-        <w:rPr>
-          <w:b/>
-          <w:bCs/>
-        </w:rPr>
-      </w:pPr>
-      <w:r>
-        <w:rPr>
-          <w:b/>
-          <w:bCs/>
-        </w:rPr>
+        <w:pStyle w:val="Ttulo2"/>
+      </w:pPr>
+      <w:r>
+        <w:t>Aplicación del Patrón Factory Method</w:t>
+      </w:r>
+    </w:p>
+    <w:p>
+      <w:pPr>
+        <w:pStyle w:val="Ttulo3"/>
+      </w:pPr>
+      <w:r>
+        <w:t>Como está Colaborando este Patrón al Proyecto</w:t>
+      </w:r>
+    </w:p>
+    <w:p>
+      <w:r>
+        <w:t xml:space="preserve">En nuestro proyecto utilizamos Spring Framework, el cual cuenta con un contenedor de </w:t>
+      </w:r>
+      <w:r>
+        <w:rPr>
+          <w:b/>
+          <w:bCs/>
+        </w:rPr>
+        <w:t>Inversión de Control (</w:t>
+      </w:r>
+      <w:proofErr w:type="spellStart"/>
+      <w:r>
+        <w:rPr>
+          <w:b/>
+          <w:bCs/>
+        </w:rPr>
+        <w:t>IoC</w:t>
+      </w:r>
+      <w:proofErr w:type="spellEnd"/>
+      <w:r>
+        <w:rPr>
+          <w:b/>
+          <w:bCs/>
+        </w:rPr>
+        <w:t xml:space="preserve">) </w:t>
+      </w:r>
+      <w:r>
+        <w:t xml:space="preserve">encargado de crear y gestionar los objetos utilizados por la aplicación. Spring permite definir métodos de creación mediante la anotación </w:t>
+      </w:r>
+      <w:r>
+        <w:rPr>
+          <w:b/>
+          <w:bCs/>
+        </w:rPr>
+        <w:t>@Bean</w:t>
+      </w:r>
+      <w:r>
+        <w:t xml:space="preserve">, los cuales funcionan como un mecanismo de </w:t>
+      </w:r>
+      <w:r>
+        <w:rPr>
+          <w:b/>
+          <w:bCs/>
+        </w:rPr>
+        <w:t>Factory Method</w:t>
+      </w:r>
+      <w:r>
+        <w:t>, ya que encapsulan la creación de una instancia y permiten trabajar con una abstracción sin depender directamente de su implementación.</w:t>
+      </w:r>
+    </w:p>
+    <w:p>
+      <w:r>
+        <w:t xml:space="preserve">En nuestro caso, este patrón se utiliza principalmente en Spring Security para la creación de </w:t>
+      </w:r>
+      <w:proofErr w:type="spellStart"/>
+      <w:r>
+        <w:rPr>
+          <w:b/>
+          <w:bCs/>
+        </w:rPr>
+        <w:t>PasswordEncoder</w:t>
+      </w:r>
+      <w:proofErr w:type="spellEnd"/>
+      <w:r>
+        <w:t xml:space="preserve">, cuya implementación concreta es </w:t>
+      </w:r>
+      <w:proofErr w:type="spellStart"/>
+      <w:r>
+        <w:rPr>
+          <w:b/>
+          <w:bCs/>
+        </w:rPr>
+        <w:t>BCryptPasswordEncoder</w:t>
+      </w:r>
+      <w:proofErr w:type="spellEnd"/>
+      <w:r>
+        <w:t xml:space="preserve">. Esto permite que los componentes que necesitan procesar contraseñas dependan de </w:t>
+      </w:r>
+      <w:proofErr w:type="spellStart"/>
+      <w:r>
+        <w:rPr>
+          <w:b/>
+          <w:bCs/>
+        </w:rPr>
+        <w:t>PasswordEncoder</w:t>
+      </w:r>
+      <w:proofErr w:type="spellEnd"/>
+      <w:r>
+        <w:t xml:space="preserve"> y no directamente de </w:t>
+      </w:r>
+      <w:proofErr w:type="spellStart"/>
+      <w:r>
+        <w:rPr>
+          <w:b/>
+          <w:bCs/>
+        </w:rPr>
+        <w:t>BCrypt</w:t>
+      </w:r>
+      <w:proofErr w:type="spellEnd"/>
+      <w:r>
+        <w:t>, reduciendo el acoplamiento y facilitando un posible cambio de implementación. Además, al combinarse con la inyección de dependencias de Spring, la creación y gestión de estos componentes queda centralizada y facilita el mantenimiento del proyecto.</w:t>
+      </w:r>
+    </w:p>
+    <w:p>
+      <w:pPr>
+        <w:pStyle w:val="Ttulo3"/>
+      </w:pPr>
+      <w:r>
         <w:lastRenderedPageBreak/>
-        <w:t>Producto</w:t>
-      </w:r>
-    </w:p>
-    <w:p>
-      <w:pPr>
-        <w:jc w:val="center"/>
-        <w:rPr>
-          <w:b/>
-          <w:bCs/>
-        </w:rPr>
-      </w:pPr>
-      <w:r>
-        <w:rPr>
-          <w:b/>
-          <w:bCs/>
-          <w:noProof/>
+        <w:t>Diagrama de Clases UML</w:t>
+      </w:r>
+    </w:p>
+    <w:p>
+      <w:pPr>
+        <w:rPr>
+          <w:lang w:val="en-US"/>
+        </w:rPr>
+      </w:pPr>
+      <w:r>
+        <w:rPr>
+          <w:lang w:val="en-US"/>
         </w:rPr>
         <w:drawing>
-          <wp:inline distT="0" distB="0" distL="0" distR="0" wp14:anchorId="5967A4D5" wp14:editId="4D982305">
-            <wp:extent cx="5943600" cy="2326005"/>
+          <wp:inline distT="0" distB="0" distL="0" distR="0" wp14:anchorId="0D43FD4E" wp14:editId="2A28B20B">
+            <wp:extent cx="5943600" cy="2309495"/>
             <wp:effectExtent l="0" t="0" r="0" b="0"/>
-            <wp:docPr id="10" name="Imagen 10"/>
+            <wp:docPr id="21" name="Imagen 21"/>
             <wp:cNvGraphicFramePr>
               <a:graphicFrameLocks xmlns:a="http://schemas.openxmlformats.org/drawingml/2006/main" noChangeAspect="1"/>
             </wp:cNvGraphicFramePr>
@@ -4706,7 +4662,7 @@
                   <pic:spPr>
                     <a:xfrm>
                       <a:off x="0" y="0"/>
-                      <a:ext cx="5943600" cy="2326005"/>
+                      <a:ext cx="5943600" cy="2309495"/>
                     </a:xfrm>
                     <a:prstGeom prst="rect">
                       <a:avLst/>
@@ -4721,23 +4677,30 @@
     </w:p>
     <w:p>
       <w:pPr>
-        <w:jc w:val="left"/>
-        <w:rPr>
-          <w:b/>
-          <w:bCs/>
-        </w:rPr>
-      </w:pPr>
-      <w:r>
-        <w:rPr>
-          <w:b/>
-          <w:bCs/>
-        </w:rPr>
-        <w:t>Producto Concreto</w:t>
-      </w:r>
-    </w:p>
-    <w:p>
-      <w:pPr>
-        <w:jc w:val="left"/>
+        <w:pStyle w:val="Ttulo3"/>
+      </w:pPr>
+      <w:r>
+        <w:t>Código</w:t>
+      </w:r>
+    </w:p>
+    <w:p>
+      <w:pPr>
+        <w:rPr>
+          <w:b/>
+          <w:bCs/>
+        </w:rPr>
+      </w:pPr>
+      <w:r>
+        <w:rPr>
+          <w:b/>
+          <w:bCs/>
+        </w:rPr>
+        <w:t>Fabrica</w:t>
+      </w:r>
+    </w:p>
+    <w:p>
+      <w:pPr>
+        <w:jc w:val="center"/>
         <w:rPr>
           <w:b/>
           <w:bCs/>
@@ -4750,10 +4713,10 @@
           <w:noProof/>
         </w:rPr>
         <w:drawing>
-          <wp:inline distT="0" distB="0" distL="0" distR="0" wp14:anchorId="2CE39E17" wp14:editId="11D974B8">
-            <wp:extent cx="5943600" cy="4246880"/>
-            <wp:effectExtent l="0" t="0" r="0" b="1270"/>
-            <wp:docPr id="11" name="Imagen 11"/>
+          <wp:inline distT="0" distB="0" distL="0" distR="0" wp14:anchorId="3534E270" wp14:editId="48DFBBED">
+            <wp:extent cx="2772162" cy="876422"/>
+            <wp:effectExtent l="0" t="0" r="9525" b="0"/>
+            <wp:docPr id="8" name="Imagen 8"/>
             <wp:cNvGraphicFramePr>
               <a:graphicFrameLocks xmlns:a="http://schemas.openxmlformats.org/drawingml/2006/main" noChangeAspect="1"/>
             </wp:cNvGraphicFramePr>
@@ -4773,7 +4736,7 @@
                   <pic:spPr>
                     <a:xfrm>
                       <a:off x="0" y="0"/>
-                      <a:ext cx="5943600" cy="4246880"/>
+                      <a:ext cx="2772162" cy="876422"/>
                     </a:xfrm>
                     <a:prstGeom prst="rect">
                       <a:avLst/>
@@ -4798,14 +4761,29 @@
         <w:rPr>
           <w:b/>
           <w:bCs/>
+        </w:rPr>
+        <w:t>Producto</w:t>
+      </w:r>
+    </w:p>
+    <w:p>
+      <w:pPr>
+        <w:jc w:val="center"/>
+        <w:rPr>
+          <w:b/>
+          <w:bCs/>
+        </w:rPr>
+      </w:pPr>
+      <w:r>
+        <w:rPr>
+          <w:b/>
+          <w:bCs/>
           <w:noProof/>
         </w:rPr>
-        <w:lastRenderedPageBreak/>
         <w:drawing>
-          <wp:inline distT="0" distB="0" distL="0" distR="0" wp14:anchorId="2FF49B68" wp14:editId="45726220">
-            <wp:extent cx="5943600" cy="1198245"/>
-            <wp:effectExtent l="0" t="0" r="0" b="1905"/>
-            <wp:docPr id="12" name="Imagen 12"/>
+          <wp:inline distT="0" distB="0" distL="0" distR="0" wp14:anchorId="5967A4D5" wp14:editId="4D982305">
+            <wp:extent cx="5943600" cy="2326005"/>
+            <wp:effectExtent l="0" t="0" r="0" b="0"/>
+            <wp:docPr id="10" name="Imagen 10"/>
             <wp:cNvGraphicFramePr>
               <a:graphicFrameLocks xmlns:a="http://schemas.openxmlformats.org/drawingml/2006/main" noChangeAspect="1"/>
             </wp:cNvGraphicFramePr>
@@ -4825,7 +4803,7 @@
                   <pic:spPr>
                     <a:xfrm>
                       <a:off x="0" y="0"/>
-                      <a:ext cx="5943600" cy="1198245"/>
+                      <a:ext cx="5943600" cy="2326005"/>
                     </a:xfrm>
                     <a:prstGeom prst="rect">
                       <a:avLst/>
@@ -4844,15 +4822,14 @@
         <w:rPr>
           <w:b/>
           <w:bCs/>
-          <w:lang w:val="en-US"/>
-        </w:rPr>
-      </w:pPr>
-      <w:r>
-        <w:rPr>
-          <w:b/>
-          <w:bCs/>
-        </w:rPr>
-        <w:t>Consumidor</w:t>
+        </w:rPr>
+      </w:pPr>
+      <w:r>
+        <w:rPr>
+          <w:b/>
+          <w:bCs/>
+        </w:rPr>
+        <w:t>Producto Concreto</w:t>
       </w:r>
     </w:p>
     <w:p>
@@ -4869,11 +4846,12 @@
           <w:bCs/>
           <w:noProof/>
         </w:rPr>
+        <w:lastRenderedPageBreak/>
         <w:drawing>
-          <wp:inline distT="0" distB="0" distL="0" distR="0" wp14:anchorId="1769BF1D" wp14:editId="649C17E9">
-            <wp:extent cx="5943600" cy="1065530"/>
+          <wp:inline distT="0" distB="0" distL="0" distR="0" wp14:anchorId="2CE39E17" wp14:editId="11D974B8">
+            <wp:extent cx="5943600" cy="4246880"/>
             <wp:effectExtent l="0" t="0" r="0" b="1270"/>
-            <wp:docPr id="13" name="Imagen 13"/>
+            <wp:docPr id="11" name="Imagen 11"/>
             <wp:cNvGraphicFramePr>
               <a:graphicFrameLocks xmlns:a="http://schemas.openxmlformats.org/drawingml/2006/main" noChangeAspect="1"/>
             </wp:cNvGraphicFramePr>
@@ -4893,7 +4871,7 @@
                   <pic:spPr>
                     <a:xfrm>
                       <a:off x="0" y="0"/>
-                      <a:ext cx="5943600" cy="1065530"/>
+                      <a:ext cx="5943600" cy="4246880"/>
                     </a:xfrm>
                     <a:prstGeom prst="rect">
                       <a:avLst/>
@@ -4908,404 +4886,23 @@
     </w:p>
     <w:p>
       <w:pPr>
-        <w:pStyle w:val="Ttulo3"/>
-      </w:pPr>
-      <w:r>
-        <w:t>Explicación y Prueba de que Funciona</w:t>
-      </w:r>
-    </w:p>
-    <w:p>
-      <w:pPr>
-        <w:pStyle w:val="Ttulo4"/>
-      </w:pPr>
-      <w:proofErr w:type="spellStart"/>
-      <w:r>
-        <w:t>PasswordEncoder</w:t>
-      </w:r>
-      <w:proofErr w:type="spellEnd"/>
-      <w:r>
-        <w:t xml:space="preserve"> </w:t>
-      </w:r>
-      <w:r>
-        <w:rPr>
-          <w:lang w:val="en-US"/>
-        </w:rPr>
-        <w:t>(</w:t>
-      </w:r>
-      <w:r>
-        <w:t>Producto</w:t>
-      </w:r>
-      <w:r>
-        <w:t>)</w:t>
-      </w:r>
-    </w:p>
-    <w:p>
-      <w:r>
-        <w:t xml:space="preserve">Este componente representa el </w:t>
-      </w:r>
-      <w:r>
-        <w:rPr>
-          <w:b/>
-          <w:bCs/>
-        </w:rPr>
-        <w:t>producto</w:t>
-      </w:r>
-      <w:r>
-        <w:t xml:space="preserve"> dentro del patrón </w:t>
-      </w:r>
-      <w:r>
-        <w:rPr>
-          <w:b/>
-          <w:bCs/>
-        </w:rPr>
-        <w:t>Factory Method</w:t>
-      </w:r>
-      <w:r>
-        <w:t xml:space="preserve">. </w:t>
-      </w:r>
-      <w:proofErr w:type="spellStart"/>
-      <w:r>
-        <w:rPr>
-          <w:b/>
-          <w:bCs/>
-        </w:rPr>
-        <w:t>PasswordEncoder</w:t>
-      </w:r>
-      <w:proofErr w:type="spellEnd"/>
-      <w:r>
-        <w:t xml:space="preserve"> es una abstracción proporcionada por Spring Security que define las operaciones necesarias para trabajar con las contraseñas. Al utilizar esta abstracción, el resto del sistema no necesita conocer qué algoritmo concreto se está utilizando para realizar el cifrado.</w:t>
-      </w:r>
-    </w:p>
-    <w:p>
-      <w:pPr>
-        <w:pStyle w:val="Ttulo4"/>
-      </w:pPr>
-      <w:proofErr w:type="spellStart"/>
-      <w:r>
-        <w:t>BCryptPasswordEncoder</w:t>
-      </w:r>
-      <w:proofErr w:type="spellEnd"/>
-      <w:r>
-        <w:t xml:space="preserve"> </w:t>
-      </w:r>
-      <w:r>
-        <w:t>(</w:t>
-      </w:r>
-      <w:r>
-        <w:t>Producto Concreto</w:t>
-      </w:r>
-      <w:r>
-        <w:t>)</w:t>
-      </w:r>
-    </w:p>
-    <w:p>
-      <w:r>
-        <w:t xml:space="preserve">Esta clase representa el </w:t>
-      </w:r>
-      <w:r>
-        <w:rPr>
-          <w:b/>
-          <w:bCs/>
-        </w:rPr>
-        <w:t>producto concreto</w:t>
-      </w:r>
-      <w:r>
-        <w:t xml:space="preserve">, ya que es una implementación específica de </w:t>
-      </w:r>
-      <w:proofErr w:type="spellStart"/>
-      <w:r>
-        <w:rPr>
-          <w:b/>
-          <w:bCs/>
-        </w:rPr>
-        <w:t>PasswordEncoder</w:t>
-      </w:r>
-      <w:proofErr w:type="spellEnd"/>
-      <w:r>
-        <w:t xml:space="preserve">. En nuestro proyecto utilizamos </w:t>
-      </w:r>
-      <w:proofErr w:type="spellStart"/>
-      <w:r>
-        <w:rPr>
-          <w:b/>
-          <w:bCs/>
-        </w:rPr>
-        <w:t>BCrypt</w:t>
-      </w:r>
-      <w:proofErr w:type="spellEnd"/>
-      <w:r>
-        <w:t xml:space="preserve"> para realizar el procesamiento seguro de las contraseñas, pero gracias a que trabajamos con la abstracción </w:t>
-      </w:r>
-      <w:proofErr w:type="spellStart"/>
-      <w:r>
-        <w:rPr>
-          <w:b/>
-          <w:bCs/>
-        </w:rPr>
-        <w:t>PasswordEncoder</w:t>
-      </w:r>
-      <w:proofErr w:type="spellEnd"/>
-      <w:r>
-        <w:t>, esta implementación podría ser reemplazada por otra sin modificar los componentes que la utilizan.</w:t>
-      </w:r>
-    </w:p>
-    <w:p>
-      <w:pPr>
-        <w:pStyle w:val="Ttulo4"/>
-      </w:pPr>
-      <w:proofErr w:type="spellStart"/>
-      <w:r>
-        <w:t>SecurityConfig</w:t>
-      </w:r>
-      <w:proofErr w:type="spellEnd"/>
-      <w:r>
-        <w:t xml:space="preserve"> </w:t>
-      </w:r>
-      <w:r>
-        <w:t>(</w:t>
-      </w:r>
-      <w:r>
-        <w:t>Fábrica</w:t>
-      </w:r>
-      <w:r>
-        <w:t>)</w:t>
-      </w:r>
-    </w:p>
-    <w:p>
-      <w:r>
-        <w:t xml:space="preserve">En esta clase se encuentra la </w:t>
-      </w:r>
-      <w:r>
-        <w:rPr>
-          <w:b/>
-          <w:bCs/>
-        </w:rPr>
-        <w:t>fábrica del patrón</w:t>
-      </w:r>
-      <w:r>
-        <w:t xml:space="preserve">, ya que mediante el contenedor de Spring se define el método encargado de crear el </w:t>
-      </w:r>
-      <w:proofErr w:type="spellStart"/>
-      <w:r>
-        <w:rPr>
-          <w:b/>
-          <w:bCs/>
-        </w:rPr>
-        <w:t>PasswordEncoder</w:t>
-      </w:r>
-      <w:proofErr w:type="spellEnd"/>
-      <w:r>
-        <w:t xml:space="preserve">. Spring toma el objeto creado mediante este método y lo registra como un </w:t>
-      </w:r>
-      <w:proofErr w:type="spellStart"/>
-      <w:r>
-        <w:rPr>
-          <w:b/>
-          <w:bCs/>
-        </w:rPr>
-        <w:t>Bean</w:t>
-      </w:r>
-      <w:proofErr w:type="spellEnd"/>
-      <w:r>
-        <w:t>, permitiendo posteriormente que sea utilizado mediante inyección de dependencias en los componentes que lo necesiten.</w:t>
-      </w:r>
-    </w:p>
-    <w:p>
-      <w:pPr>
-        <w:pStyle w:val="Ttulo4"/>
-      </w:pPr>
-      <w:proofErr w:type="spellStart"/>
-      <w:r>
-        <w:lastRenderedPageBreak/>
-        <w:t>AuthenticationManager</w:t>
-      </w:r>
-      <w:proofErr w:type="spellEnd"/>
-      <w:r>
-        <w:t xml:space="preserve"> </w:t>
-      </w:r>
-      <w:r>
-        <w:t>(</w:t>
-      </w:r>
-      <w:r>
-        <w:t>Consumidor</w:t>
-      </w:r>
-      <w:r>
-        <w:t>)</w:t>
-      </w:r>
-    </w:p>
-    <w:p>
-      <w:r>
-        <w:t xml:space="preserve">Este componente representa el </w:t>
-      </w:r>
-      <w:r>
-        <w:rPr>
-          <w:b/>
-          <w:bCs/>
-        </w:rPr>
-        <w:t>consumidor</w:t>
-      </w:r>
-      <w:r>
-        <w:t xml:space="preserve"> del </w:t>
-      </w:r>
-      <w:r>
-        <w:rPr>
-          <w:b/>
-          <w:bCs/>
-        </w:rPr>
-        <w:t>producto</w:t>
-      </w:r>
-      <w:r>
-        <w:t xml:space="preserve">, ya que necesita un </w:t>
-      </w:r>
-      <w:proofErr w:type="spellStart"/>
-      <w:r>
-        <w:rPr>
-          <w:b/>
-          <w:bCs/>
-        </w:rPr>
-        <w:t>PasswordEncoder</w:t>
-      </w:r>
-      <w:proofErr w:type="spellEnd"/>
-      <w:r>
-        <w:t xml:space="preserve"> para realizar el proceso de autenticación. Lo importante es que </w:t>
-      </w:r>
-      <w:proofErr w:type="spellStart"/>
-      <w:r>
-        <w:rPr>
-          <w:b/>
-          <w:bCs/>
-        </w:rPr>
-        <w:t>AuthenticationManager</w:t>
-      </w:r>
-      <w:proofErr w:type="spellEnd"/>
-      <w:r>
-        <w:t xml:space="preserve"> trabaja con la abstracción </w:t>
-      </w:r>
-      <w:proofErr w:type="spellStart"/>
-      <w:r>
-        <w:rPr>
-          <w:b/>
-          <w:bCs/>
-        </w:rPr>
-        <w:t>PasswordEncoder</w:t>
-      </w:r>
-      <w:proofErr w:type="spellEnd"/>
-      <w:r>
-        <w:t xml:space="preserve"> y no necesita conocer directamente a </w:t>
-      </w:r>
-      <w:proofErr w:type="spellStart"/>
-      <w:r>
-        <w:rPr>
-          <w:b/>
-          <w:bCs/>
-        </w:rPr>
-        <w:t>BCryptPasswordEncoder</w:t>
-      </w:r>
-      <w:proofErr w:type="spellEnd"/>
-      <w:r>
-        <w:t>, demostrando, así como el Factory Method ayuda a reducir el acoplamiento entre ambos componentes.</w:t>
-      </w:r>
-    </w:p>
-    <w:p>
-      <w:pPr>
-        <w:pStyle w:val="Ttulo4"/>
-      </w:pPr>
-      <w:r>
-        <w:t>Funcionamiento</w:t>
-      </w:r>
-    </w:p>
-    <w:p>
-      <w:r>
-        <w:t xml:space="preserve">Ahora sí, para la prueba de funcionamiento, ya que todavía no contamos con una interfaz gráfica en el </w:t>
-      </w:r>
-      <w:proofErr w:type="spellStart"/>
-      <w:r>
-        <w:rPr>
-          <w:b/>
-          <w:bCs/>
-        </w:rPr>
-        <w:t>frontend</w:t>
-      </w:r>
-      <w:proofErr w:type="spellEnd"/>
-      <w:r>
-        <w:t xml:space="preserve">, utilizamos la herramienta </w:t>
-      </w:r>
-      <w:proofErr w:type="spellStart"/>
-      <w:r>
-        <w:rPr>
-          <w:b/>
-          <w:bCs/>
-        </w:rPr>
-        <w:t>Postman</w:t>
-      </w:r>
-      <w:proofErr w:type="spellEnd"/>
-      <w:r>
-        <w:t xml:space="preserve">, en la cual mandamos la siguiente petición a la </w:t>
-      </w:r>
-      <w:r>
-        <w:rPr>
-          <w:b/>
-          <w:bCs/>
-        </w:rPr>
-        <w:t>API.</w:t>
-      </w:r>
-    </w:p>
-    <w:p>
-      <w:r>
-        <w:rPr>
-          <w:b/>
-          <w:bCs/>
-        </w:rPr>
-        <w:t xml:space="preserve">NOTA: </w:t>
-      </w:r>
-      <w:r>
-        <w:t xml:space="preserve">Cabe resaltar que para esta prueba de autenticación del usuario </w:t>
-      </w:r>
-      <w:r>
-        <w:t>ya había un usuario creado en base de datos y trabajamos con</w:t>
-      </w:r>
-      <w:r>
-        <w:rPr>
-          <w:b/>
-          <w:bCs/>
-        </w:rPr>
-        <w:t xml:space="preserve"> </w:t>
-      </w:r>
-      <w:proofErr w:type="spellStart"/>
-      <w:r>
-        <w:rPr>
-          <w:b/>
-          <w:bCs/>
-        </w:rPr>
-        <w:t>Json</w:t>
-      </w:r>
-      <w:proofErr w:type="spellEnd"/>
-      <w:r>
-        <w:rPr>
-          <w:b/>
-          <w:bCs/>
-        </w:rPr>
-        <w:t xml:space="preserve"> Web Tokens </w:t>
-      </w:r>
-      <w:r>
-        <w:t>además de Spring Security.</w:t>
-      </w:r>
-    </w:p>
-    <w:p>
-      <w:r>
-        <w:t>El usuario creado en la base de datos es el siguiente:</w:t>
-      </w:r>
-    </w:p>
-    <w:p>
-      <w:r>
-        <w:rPr>
+        <w:jc w:val="left"/>
+        <w:rPr>
+          <w:b/>
+          <w:bCs/>
+        </w:rPr>
+      </w:pPr>
+      <w:r>
+        <w:rPr>
+          <w:b/>
+          <w:bCs/>
           <w:noProof/>
         </w:rPr>
         <w:drawing>
-          <wp:inline distT="0" distB="0" distL="0" distR="0" wp14:anchorId="280B21E2" wp14:editId="2AE3C75A">
-            <wp:extent cx="5943600" cy="338455"/>
-            <wp:effectExtent l="0" t="0" r="0" b="4445"/>
-            <wp:docPr id="15" name="Imagen 15"/>
+          <wp:inline distT="0" distB="0" distL="0" distR="0" wp14:anchorId="2FF49B68" wp14:editId="45726220">
+            <wp:extent cx="5943600" cy="1198245"/>
+            <wp:effectExtent l="0" t="0" r="0" b="1905"/>
+            <wp:docPr id="12" name="Imagen 12"/>
             <wp:cNvGraphicFramePr>
               <a:graphicFrameLocks xmlns:a="http://schemas.openxmlformats.org/drawingml/2006/main" noChangeAspect="1"/>
             </wp:cNvGraphicFramePr>
@@ -5325,7 +4922,7 @@
                   <pic:spPr>
                     <a:xfrm>
                       <a:off x="0" y="0"/>
-                      <a:ext cx="5943600" cy="338455"/>
+                      <a:ext cx="5943600" cy="1198245"/>
                     </a:xfrm>
                     <a:prstGeom prst="rect">
                       <a:avLst/>
@@ -5339,58 +4936,41 @@
       </w:r>
     </w:p>
     <w:p>
-      <w:r>
-        <w:t xml:space="preserve">Como podemos ver, la contraseña del usuario ya se encuentra encriptada desde su creación, así que, para poder autenticar al usuario en el sistema, el </w:t>
-      </w:r>
-      <w:proofErr w:type="spellStart"/>
-      <w:r>
-        <w:rPr>
-          <w:b/>
-          <w:bCs/>
-        </w:rPr>
-        <w:t>AuthenticationManager</w:t>
-      </w:r>
-      <w:proofErr w:type="spellEnd"/>
-      <w:r>
-        <w:rPr>
-          <w:b/>
-          <w:bCs/>
-        </w:rPr>
-        <w:t xml:space="preserve"> </w:t>
-      </w:r>
-      <w:r>
-        <w:t xml:space="preserve">de Spring Security deberá utilizar a </w:t>
-      </w:r>
-      <w:proofErr w:type="spellStart"/>
-      <w:r>
-        <w:rPr>
-          <w:b/>
-          <w:bCs/>
-        </w:rPr>
-        <w:t>BCryptPasswordEncoder</w:t>
-      </w:r>
-      <w:proofErr w:type="spellEnd"/>
-      <w:r>
-        <w:rPr>
-          <w:b/>
-          <w:bCs/>
-        </w:rPr>
-        <w:t xml:space="preserve"> </w:t>
-      </w:r>
-      <w:r>
-        <w:t>para ver si la contraseña ingresada por el usuario es igual a la de la base de datos. El resultado fue el siguiente:</w:t>
-      </w:r>
-    </w:p>
-    <w:p>
-      <w:r>
-        <w:rPr>
+      <w:pPr>
+        <w:jc w:val="left"/>
+        <w:rPr>
+          <w:b/>
+          <w:bCs/>
+          <w:lang w:val="en-US"/>
+        </w:rPr>
+      </w:pPr>
+      <w:r>
+        <w:rPr>
+          <w:b/>
+          <w:bCs/>
+        </w:rPr>
+        <w:t>Consumidor</w:t>
+      </w:r>
+    </w:p>
+    <w:p>
+      <w:pPr>
+        <w:jc w:val="left"/>
+        <w:rPr>
+          <w:b/>
+          <w:bCs/>
+        </w:rPr>
+      </w:pPr>
+      <w:r>
+        <w:rPr>
+          <w:b/>
+          <w:bCs/>
           <w:noProof/>
         </w:rPr>
         <w:drawing>
-          <wp:inline distT="0" distB="0" distL="0" distR="0" wp14:anchorId="53F81A13" wp14:editId="3D487E8D">
-            <wp:extent cx="6170320" cy="2886075"/>
-            <wp:effectExtent l="0" t="0" r="1905" b="0"/>
-            <wp:docPr id="14" name="Imagen 14"/>
+          <wp:inline distT="0" distB="0" distL="0" distR="0" wp14:anchorId="1769BF1D" wp14:editId="649C17E9">
+            <wp:extent cx="5943600" cy="1065530"/>
+            <wp:effectExtent l="0" t="0" r="0" b="1270"/>
+            <wp:docPr id="13" name="Imagen 13"/>
             <wp:cNvGraphicFramePr>
               <a:graphicFrameLocks xmlns:a="http://schemas.openxmlformats.org/drawingml/2006/main" noChangeAspect="1"/>
             </wp:cNvGraphicFramePr>
@@ -5410,7 +4990,7 @@
                   <pic:spPr>
                     <a:xfrm>
                       <a:off x="0" y="0"/>
-                      <a:ext cx="6172583" cy="2887133"/>
+                      <a:ext cx="5943600" cy="1065530"/>
                     </a:xfrm>
                     <a:prstGeom prst="rect">
                       <a:avLst/>
@@ -5425,82 +5005,405 @@
     </w:p>
     <w:p>
       <w:pPr>
-        <w:rPr>
-          <w:b/>
-          <w:bCs/>
-        </w:rPr>
+        <w:pStyle w:val="Ttulo3"/>
       </w:pPr>
       <w:r>
         <w:lastRenderedPageBreak/>
-        <w:t xml:space="preserve">Exitosamente la </w:t>
-      </w:r>
-      <w:r>
-        <w:rPr>
-          <w:b/>
-          <w:bCs/>
-        </w:rPr>
-        <w:t>API REST</w:t>
-      </w:r>
-      <w:r>
-        <w:t xml:space="preserve"> responde con código </w:t>
-      </w:r>
-      <w:r>
-        <w:rPr>
-          <w:b/>
-          <w:bCs/>
-        </w:rPr>
-        <w:t>http 200</w:t>
-      </w:r>
-      <w:r>
-        <w:t xml:space="preserve"> y con el cuerpo de la respuesta indicando el token JWT generado después de la autenticación. Por lo que indica que el proceso de encriptar la contraseña y compararla con la de la base de datos fue un </w:t>
-      </w:r>
-      <w:r>
-        <w:rPr>
-          <w:b/>
-          <w:bCs/>
-        </w:rPr>
-        <w:t>éxito.</w:t>
-      </w:r>
-    </w:p>
-    <w:p>
-      <w:pPr>
-        <w:pStyle w:val="Ttulo2"/>
-      </w:pPr>
-      <w:r>
-        <w:t>Aplicación del Patrón Builder</w:t>
-      </w:r>
-    </w:p>
-    <w:p>
-      <w:pPr>
-        <w:pStyle w:val="Ttulo3"/>
-      </w:pPr>
-      <w:r>
-        <w:t>Como está Colaborando</w:t>
-      </w:r>
-    </w:p>
-    <w:p>
-      <w:r>
-        <w:t xml:space="preserve">En el proceso de autenticación, el patrón Builder se utiliza para construir el token JWT que posteriormente será entregado al usuario. El token requiere varios datos de configuración, entre ellos el nombre de usuario, el rol, la fecha de emisión, la fecha de expiración y la firma criptográfica.  </w:t>
-      </w:r>
-    </w:p>
-    <w:p>
-      <w:pPr>
-        <w:pStyle w:val="Ttulo3"/>
-      </w:pPr>
-      <w:r>
-        <w:t>Diagrama de Clases UML</w:t>
-      </w:r>
-    </w:p>
-    <w:p>
-      <w:pPr>
-        <w:jc w:val="center"/>
-      </w:pPr>
-      <w:r>
+        <w:t>Explicación y Prueba de que Funciona</w:t>
+      </w:r>
+    </w:p>
+    <w:p>
+      <w:pPr>
+        <w:pStyle w:val="Ttulo4"/>
+      </w:pPr>
+      <w:proofErr w:type="spellStart"/>
+      <w:r>
+        <w:t>PasswordEncoder</w:t>
+      </w:r>
+      <w:proofErr w:type="spellEnd"/>
+      <w:r>
+        <w:t xml:space="preserve"> </w:t>
+      </w:r>
+      <w:r>
+        <w:rPr>
+          <w:lang w:val="en-US"/>
+        </w:rPr>
+        <w:t>(</w:t>
+      </w:r>
+      <w:r>
+        <w:t>Producto</w:t>
+      </w:r>
+      <w:r>
+        <w:t>)</w:t>
+      </w:r>
+    </w:p>
+    <w:p>
+      <w:r>
+        <w:t xml:space="preserve">Este componente representa el </w:t>
+      </w:r>
+      <w:r>
+        <w:rPr>
+          <w:b/>
+          <w:bCs/>
+        </w:rPr>
+        <w:t>producto</w:t>
+      </w:r>
+      <w:r>
+        <w:t xml:space="preserve"> dentro del patrón </w:t>
+      </w:r>
+      <w:r>
+        <w:rPr>
+          <w:b/>
+          <w:bCs/>
+        </w:rPr>
+        <w:t>Factory Method</w:t>
+      </w:r>
+      <w:r>
+        <w:t xml:space="preserve">. </w:t>
+      </w:r>
+      <w:proofErr w:type="spellStart"/>
+      <w:r>
+        <w:rPr>
+          <w:b/>
+          <w:bCs/>
+        </w:rPr>
+        <w:t>PasswordEncoder</w:t>
+      </w:r>
+      <w:proofErr w:type="spellEnd"/>
+      <w:r>
+        <w:t xml:space="preserve"> es una abstracción proporcionada por Spring Security que define las operaciones necesarias para trabajar con las contraseñas. Al utilizar esta abstracción, el resto del sistema no necesita conocer qué algoritmo concreto se está utilizando para realizar el cifrado.</w:t>
+      </w:r>
+    </w:p>
+    <w:p>
+      <w:pPr>
+        <w:pStyle w:val="Ttulo4"/>
+      </w:pPr>
+      <w:proofErr w:type="spellStart"/>
+      <w:r>
+        <w:t>BCryptPasswordEncoder</w:t>
+      </w:r>
+      <w:proofErr w:type="spellEnd"/>
+      <w:r>
+        <w:t xml:space="preserve"> </w:t>
+      </w:r>
+      <w:r>
+        <w:t>(</w:t>
+      </w:r>
+      <w:r>
+        <w:t>Producto Concreto</w:t>
+      </w:r>
+      <w:r>
+        <w:t>)</w:t>
+      </w:r>
+    </w:p>
+    <w:p>
+      <w:r>
+        <w:t xml:space="preserve">Esta clase representa el </w:t>
+      </w:r>
+      <w:r>
+        <w:rPr>
+          <w:b/>
+          <w:bCs/>
+        </w:rPr>
+        <w:t>producto concreto</w:t>
+      </w:r>
+      <w:r>
+        <w:t xml:space="preserve">, ya que es una implementación específica de </w:t>
+      </w:r>
+      <w:proofErr w:type="spellStart"/>
+      <w:r>
+        <w:rPr>
+          <w:b/>
+          <w:bCs/>
+        </w:rPr>
+        <w:t>PasswordEncoder</w:t>
+      </w:r>
+      <w:proofErr w:type="spellEnd"/>
+      <w:r>
+        <w:t xml:space="preserve">. En nuestro proyecto utilizamos </w:t>
+      </w:r>
+      <w:proofErr w:type="spellStart"/>
+      <w:r>
+        <w:rPr>
+          <w:b/>
+          <w:bCs/>
+        </w:rPr>
+        <w:t>BCrypt</w:t>
+      </w:r>
+      <w:proofErr w:type="spellEnd"/>
+      <w:r>
+        <w:t xml:space="preserve"> para realizar el procesamiento seguro de las contraseñas, pero gracias a que trabajamos con la abstracción </w:t>
+      </w:r>
+      <w:proofErr w:type="spellStart"/>
+      <w:r>
+        <w:rPr>
+          <w:b/>
+          <w:bCs/>
+        </w:rPr>
+        <w:t>PasswordEncoder</w:t>
+      </w:r>
+      <w:proofErr w:type="spellEnd"/>
+      <w:r>
+        <w:t>, esta implementación podría ser reemplazada por otra sin modificar los componentes que la utilizan.</w:t>
+      </w:r>
+    </w:p>
+    <w:p>
+      <w:pPr>
+        <w:pStyle w:val="Ttulo4"/>
+      </w:pPr>
+      <w:proofErr w:type="spellStart"/>
+      <w:r>
+        <w:t>SecurityConfig</w:t>
+      </w:r>
+      <w:proofErr w:type="spellEnd"/>
+      <w:r>
+        <w:t xml:space="preserve"> </w:t>
+      </w:r>
+      <w:r>
+        <w:t>(</w:t>
+      </w:r>
+      <w:r>
+        <w:t>Fábrica</w:t>
+      </w:r>
+      <w:r>
+        <w:t>)</w:t>
+      </w:r>
+    </w:p>
+    <w:p>
+      <w:r>
+        <w:t xml:space="preserve">En esta clase se encuentra la </w:t>
+      </w:r>
+      <w:r>
+        <w:rPr>
+          <w:b/>
+          <w:bCs/>
+        </w:rPr>
+        <w:t>fábrica del patrón</w:t>
+      </w:r>
+      <w:r>
+        <w:t xml:space="preserve">, ya que mediante el contenedor de Spring se define el método encargado de crear el </w:t>
+      </w:r>
+      <w:proofErr w:type="spellStart"/>
+      <w:r>
+        <w:rPr>
+          <w:b/>
+          <w:bCs/>
+        </w:rPr>
+        <w:t>PasswordEncoder</w:t>
+      </w:r>
+      <w:proofErr w:type="spellEnd"/>
+      <w:r>
+        <w:t xml:space="preserve">. Spring toma el objeto creado mediante este método y lo registra como un </w:t>
+      </w:r>
+      <w:proofErr w:type="spellStart"/>
+      <w:r>
+        <w:rPr>
+          <w:b/>
+          <w:bCs/>
+        </w:rPr>
+        <w:t>Bean</w:t>
+      </w:r>
+      <w:proofErr w:type="spellEnd"/>
+      <w:r>
+        <w:t>, permitiendo posteriormente que sea utilizado mediante inyección de dependencias en los componentes que lo necesiten.</w:t>
+      </w:r>
+    </w:p>
+    <w:p>
+      <w:pPr>
+        <w:pStyle w:val="Ttulo4"/>
+      </w:pPr>
+      <w:proofErr w:type="spellStart"/>
+      <w:r>
+        <w:t>AuthenticationManager</w:t>
+      </w:r>
+      <w:proofErr w:type="spellEnd"/>
+      <w:r>
+        <w:t xml:space="preserve"> </w:t>
+      </w:r>
+      <w:r>
+        <w:t>(</w:t>
+      </w:r>
+      <w:r>
+        <w:t>Consumidor</w:t>
+      </w:r>
+      <w:r>
+        <w:t>)</w:t>
+      </w:r>
+    </w:p>
+    <w:p>
+      <w:r>
+        <w:t xml:space="preserve">Este componente representa el </w:t>
+      </w:r>
+      <w:r>
+        <w:rPr>
+          <w:b/>
+          <w:bCs/>
+        </w:rPr>
+        <w:t>consumidor</w:t>
+      </w:r>
+      <w:r>
+        <w:t xml:space="preserve"> del </w:t>
+      </w:r>
+      <w:r>
+        <w:rPr>
+          <w:b/>
+          <w:bCs/>
+        </w:rPr>
+        <w:t>producto</w:t>
+      </w:r>
+      <w:r>
+        <w:t xml:space="preserve">, ya que necesita un </w:t>
+      </w:r>
+      <w:proofErr w:type="spellStart"/>
+      <w:r>
+        <w:rPr>
+          <w:b/>
+          <w:bCs/>
+        </w:rPr>
+        <w:t>PasswordEncoder</w:t>
+      </w:r>
+      <w:proofErr w:type="spellEnd"/>
+      <w:r>
+        <w:t xml:space="preserve"> para realizar el proceso de autenticación. Lo importante es que </w:t>
+      </w:r>
+      <w:proofErr w:type="spellStart"/>
+      <w:r>
+        <w:rPr>
+          <w:b/>
+          <w:bCs/>
+        </w:rPr>
+        <w:t>AuthenticationManager</w:t>
+      </w:r>
+      <w:proofErr w:type="spellEnd"/>
+      <w:r>
+        <w:t xml:space="preserve"> trabaja con la abstracción </w:t>
+      </w:r>
+      <w:proofErr w:type="spellStart"/>
+      <w:r>
+        <w:rPr>
+          <w:b/>
+          <w:bCs/>
+        </w:rPr>
+        <w:t>PasswordEncoder</w:t>
+      </w:r>
+      <w:proofErr w:type="spellEnd"/>
+      <w:r>
+        <w:t xml:space="preserve"> y no necesita conocer directamente a </w:t>
+      </w:r>
+      <w:proofErr w:type="spellStart"/>
+      <w:r>
+        <w:rPr>
+          <w:b/>
+          <w:bCs/>
+        </w:rPr>
+        <w:t>BCryptPasswordEncoder</w:t>
+      </w:r>
+      <w:proofErr w:type="spellEnd"/>
+      <w:r>
+        <w:t>, demostrando, así como el Factory Method ayuda a reducir el acoplamiento entre ambos componentes.</w:t>
+      </w:r>
+    </w:p>
+    <w:p>
+      <w:pPr>
+        <w:pStyle w:val="Ttulo4"/>
+      </w:pPr>
+      <w:r>
+        <w:t>Funcionamiento</w:t>
+      </w:r>
+    </w:p>
+    <w:p>
+      <w:r>
+        <w:t xml:space="preserve">Ahora sí, para la prueba de funcionamiento, ya que todavía no contamos con una interfaz gráfica en el </w:t>
+      </w:r>
+      <w:proofErr w:type="spellStart"/>
+      <w:r>
+        <w:rPr>
+          <w:b/>
+          <w:bCs/>
+        </w:rPr>
+        <w:t>frontend</w:t>
+      </w:r>
+      <w:proofErr w:type="spellEnd"/>
+      <w:r>
+        <w:t xml:space="preserve">, utilizamos la herramienta </w:t>
+      </w:r>
+      <w:proofErr w:type="spellStart"/>
+      <w:r>
+        <w:rPr>
+          <w:b/>
+          <w:bCs/>
+        </w:rPr>
+        <w:t>Postman</w:t>
+      </w:r>
+      <w:proofErr w:type="spellEnd"/>
+      <w:r>
+        <w:t xml:space="preserve">, en la cual mandamos la siguiente petición a la </w:t>
+      </w:r>
+      <w:r>
+        <w:rPr>
+          <w:b/>
+          <w:bCs/>
+        </w:rPr>
+        <w:t>API.</w:t>
+      </w:r>
+    </w:p>
+    <w:p>
+      <w:r>
+        <w:rPr>
+          <w:b/>
+          <w:bCs/>
+        </w:rPr>
+        <w:t xml:space="preserve">NOTA: </w:t>
+      </w:r>
+      <w:r>
+        <w:t xml:space="preserve">Cabe resaltar que para esta prueba de autenticación del usuario </w:t>
+      </w:r>
+      <w:r>
+        <w:t>ya había un usuario creado en base de datos y trabajamos con</w:t>
+      </w:r>
+      <w:r>
+        <w:rPr>
+          <w:b/>
+          <w:bCs/>
+        </w:rPr>
+        <w:t xml:space="preserve"> </w:t>
+      </w:r>
+      <w:proofErr w:type="spellStart"/>
+      <w:r>
+        <w:rPr>
+          <w:b/>
+          <w:bCs/>
+        </w:rPr>
+        <w:t>Json</w:t>
+      </w:r>
+      <w:proofErr w:type="spellEnd"/>
+      <w:r>
+        <w:rPr>
+          <w:b/>
+          <w:bCs/>
+        </w:rPr>
+        <w:t xml:space="preserve"> Web Tokens </w:t>
+      </w:r>
+      <w:r>
+        <w:t>además de Spring Security.</w:t>
+      </w:r>
+    </w:p>
+    <w:p>
+      <w:r>
+        <w:lastRenderedPageBreak/>
+        <w:t>El usuario creado en la base de datos es el siguiente:</w:t>
+      </w:r>
+    </w:p>
+    <w:p>
+      <w:r>
+        <w:rPr>
+          <w:noProof/>
+        </w:rPr>
         <w:drawing>
-          <wp:inline distT="0" distB="0" distL="0" distR="0" wp14:anchorId="136B7C85" wp14:editId="5B981A99">
-            <wp:extent cx="5153025" cy="3668227"/>
-            <wp:effectExtent l="0" t="0" r="0" b="8890"/>
-            <wp:docPr id="26" name="Imagen 26"/>
+          <wp:inline distT="0" distB="0" distL="0" distR="0" wp14:anchorId="280B21E2" wp14:editId="2AE3C75A">
+            <wp:extent cx="5943600" cy="338455"/>
+            <wp:effectExtent l="0" t="0" r="0" b="4445"/>
+            <wp:docPr id="15" name="Imagen 15"/>
             <wp:cNvGraphicFramePr>
               <a:graphicFrameLocks xmlns:a="http://schemas.openxmlformats.org/drawingml/2006/main" noChangeAspect="1"/>
             </wp:cNvGraphicFramePr>
@@ -5520,7 +5423,7 @@
                   <pic:spPr>
                     <a:xfrm>
                       <a:off x="0" y="0"/>
-                      <a:ext cx="5155104" cy="3669707"/>
+                      <a:ext cx="5943600" cy="338455"/>
                     </a:xfrm>
                     <a:prstGeom prst="rect">
                       <a:avLst/>
@@ -5534,39 +5437,58 @@
       </w:r>
     </w:p>
     <w:p>
-      <w:pPr>
-        <w:pStyle w:val="Ttulo3"/>
-      </w:pPr>
-      <w:r>
-        <w:t>Código</w:t>
-      </w:r>
-    </w:p>
-    <w:p>
-      <w:pPr>
-        <w:rPr>
-          <w:b/>
-          <w:bCs/>
-        </w:rPr>
-      </w:pPr>
-      <w:r>
-        <w:rPr>
-          <w:b/>
-          <w:bCs/>
-        </w:rPr>
-        <w:t>Client / Director</w:t>
-      </w:r>
-    </w:p>
-    <w:p>
-      <w:pPr>
-        <w:jc w:val="center"/>
-      </w:pPr>
-      <w:r>
-        <w:lastRenderedPageBreak/>
+      <w:r>
+        <w:t xml:space="preserve">Como podemos ver, la contraseña del usuario ya se encuentra encriptada desde su creación, así que, para poder autenticar al usuario en el sistema, el </w:t>
+      </w:r>
+      <w:proofErr w:type="spellStart"/>
+      <w:r>
+        <w:rPr>
+          <w:b/>
+          <w:bCs/>
+        </w:rPr>
+        <w:t>AuthenticationManager</w:t>
+      </w:r>
+      <w:proofErr w:type="spellEnd"/>
+      <w:r>
+        <w:rPr>
+          <w:b/>
+          <w:bCs/>
+        </w:rPr>
+        <w:t xml:space="preserve"> </w:t>
+      </w:r>
+      <w:r>
+        <w:t xml:space="preserve">de Spring Security deberá utilizar a </w:t>
+      </w:r>
+      <w:proofErr w:type="spellStart"/>
+      <w:r>
+        <w:rPr>
+          <w:b/>
+          <w:bCs/>
+        </w:rPr>
+        <w:t>BCryptPasswordEncoder</w:t>
+      </w:r>
+      <w:proofErr w:type="spellEnd"/>
+      <w:r>
+        <w:rPr>
+          <w:b/>
+          <w:bCs/>
+        </w:rPr>
+        <w:t xml:space="preserve"> </w:t>
+      </w:r>
+      <w:r>
+        <w:t>para ver si la contraseña ingresada por el usuario es igual a la de la base de datos. El resultado fue el siguiente:</w:t>
+      </w:r>
+    </w:p>
+    <w:p>
+      <w:r>
+        <w:rPr>
+          <w:noProof/>
+        </w:rPr>
         <w:drawing>
-          <wp:inline distT="0" distB="0" distL="0" distR="0" wp14:anchorId="352844FC" wp14:editId="769BDC22">
-            <wp:extent cx="4448175" cy="2416082"/>
-            <wp:effectExtent l="0" t="0" r="0" b="3810"/>
-            <wp:docPr id="25" name="Imagen 25"/>
+          <wp:inline distT="0" distB="0" distL="0" distR="0" wp14:anchorId="53F81A13" wp14:editId="3D487E8D">
+            <wp:extent cx="6170320" cy="2886075"/>
+            <wp:effectExtent l="0" t="0" r="1905" b="0"/>
+            <wp:docPr id="14" name="Imagen 14"/>
             <wp:cNvGraphicFramePr>
               <a:graphicFrameLocks xmlns:a="http://schemas.openxmlformats.org/drawingml/2006/main" noChangeAspect="1"/>
             </wp:cNvGraphicFramePr>
@@ -5586,7 +5508,7 @@
                   <pic:spPr>
                     <a:xfrm>
                       <a:off x="0" y="0"/>
-                      <a:ext cx="4453506" cy="2418978"/>
+                      <a:ext cx="6172583" cy="2887133"/>
                     </a:xfrm>
                     <a:prstGeom prst="rect">
                       <a:avLst/>
@@ -5601,18 +5523,70 @@
     </w:p>
     <w:p>
       <w:pPr>
-        <w:jc w:val="left"/>
-        <w:rPr>
-          <w:b/>
-          <w:bCs/>
-        </w:rPr>
-      </w:pPr>
-      <w:r>
-        <w:rPr>
-          <w:b/>
-          <w:bCs/>
-        </w:rPr>
-        <w:t>Interface</w:t>
+        <w:rPr>
+          <w:b/>
+          <w:bCs/>
+        </w:rPr>
+      </w:pPr>
+      <w:r>
+        <w:t xml:space="preserve">Exitosamente la </w:t>
+      </w:r>
+      <w:r>
+        <w:rPr>
+          <w:b/>
+          <w:bCs/>
+        </w:rPr>
+        <w:t>API REST</w:t>
+      </w:r>
+      <w:r>
+        <w:t xml:space="preserve"> responde con código </w:t>
+      </w:r>
+      <w:r>
+        <w:rPr>
+          <w:b/>
+          <w:bCs/>
+        </w:rPr>
+        <w:t>http 200</w:t>
+      </w:r>
+      <w:r>
+        <w:t xml:space="preserve"> y con el cuerpo de la respuesta indicando el token JWT generado después de la autenticación. Por lo que indica que el proceso de encriptar la contraseña y compararla con la de la base de datos fue un </w:t>
+      </w:r>
+      <w:r>
+        <w:rPr>
+          <w:b/>
+          <w:bCs/>
+        </w:rPr>
+        <w:t>éxito.</w:t>
+      </w:r>
+    </w:p>
+    <w:p>
+      <w:pPr>
+        <w:pStyle w:val="Ttulo2"/>
+      </w:pPr>
+      <w:r>
+        <w:t>Aplicación del Patrón Builder</w:t>
+      </w:r>
+    </w:p>
+    <w:p>
+      <w:pPr>
+        <w:pStyle w:val="Ttulo3"/>
+      </w:pPr>
+      <w:r>
+        <w:t>Como está Colaborando</w:t>
+      </w:r>
+    </w:p>
+    <w:p>
+      <w:r>
+        <w:t xml:space="preserve">En el proceso de autenticación, el patrón Builder se utiliza para construir el token JWT que posteriormente será entregado al usuario. El token requiere varios datos de configuración, entre ellos el nombre de usuario, el rol, la fecha de emisión, la fecha de expiración y la firma criptográfica.  </w:t>
+      </w:r>
+    </w:p>
+    <w:p>
+      <w:pPr>
+        <w:pStyle w:val="Ttulo3"/>
+      </w:pPr>
+      <w:r>
+        <w:lastRenderedPageBreak/>
+        <w:t>Diagrama de Clases UML</w:t>
       </w:r>
     </w:p>
     <w:p>
@@ -5620,11 +5594,14 @@
         <w:jc w:val="center"/>
       </w:pPr>
       <w:r>
+        <w:rPr>
+          <w:noProof/>
+        </w:rPr>
         <w:drawing>
-          <wp:inline distT="0" distB="0" distL="0" distR="0" wp14:anchorId="34DC3B85" wp14:editId="15BE933A">
-            <wp:extent cx="5062655" cy="3762375"/>
-            <wp:effectExtent l="0" t="0" r="5080" b="0"/>
-            <wp:docPr id="17" name="Imagen 17"/>
+          <wp:inline distT="0" distB="0" distL="0" distR="0" wp14:anchorId="136B7C85" wp14:editId="5B981A99">
+            <wp:extent cx="5153025" cy="3668227"/>
+            <wp:effectExtent l="0" t="0" r="0" b="8890"/>
+            <wp:docPr id="26" name="Imagen 26"/>
             <wp:cNvGraphicFramePr>
               <a:graphicFrameLocks xmlns:a="http://schemas.openxmlformats.org/drawingml/2006/main" noChangeAspect="1"/>
             </wp:cNvGraphicFramePr>
@@ -5644,7 +5621,7 @@
                   <pic:spPr>
                     <a:xfrm>
                       <a:off x="0" y="0"/>
-                      <a:ext cx="5070931" cy="3768525"/>
+                      <a:ext cx="5155104" cy="3669707"/>
                     </a:xfrm>
                     <a:prstGeom prst="rect">
                       <a:avLst/>
@@ -5659,15 +5636,40 @@
     </w:p>
     <w:p>
       <w:pPr>
+        <w:pStyle w:val="Ttulo3"/>
+      </w:pPr>
+      <w:r>
+        <w:t>Código</w:t>
+      </w:r>
+    </w:p>
+    <w:p>
+      <w:pPr>
+        <w:rPr>
+          <w:b/>
+          <w:bCs/>
+        </w:rPr>
+      </w:pPr>
+      <w:r>
+        <w:rPr>
+          <w:b/>
+          <w:bCs/>
+        </w:rPr>
+        <w:t>Client / Director</w:t>
+      </w:r>
+    </w:p>
+    <w:p>
+      <w:pPr>
         <w:jc w:val="center"/>
       </w:pPr>
       <w:r>
-        <w:lastRenderedPageBreak/>
+        <w:rPr>
+          <w:noProof/>
+        </w:rPr>
         <w:drawing>
-          <wp:inline distT="0" distB="0" distL="0" distR="0" wp14:anchorId="52FF695D" wp14:editId="1F2ABA3C">
-            <wp:extent cx="4819650" cy="2053500"/>
-            <wp:effectExtent l="0" t="0" r="0" b="4445"/>
-            <wp:docPr id="18" name="Imagen 18"/>
+          <wp:inline distT="0" distB="0" distL="0" distR="0" wp14:anchorId="352844FC" wp14:editId="769BDC22">
+            <wp:extent cx="4448175" cy="2416082"/>
+            <wp:effectExtent l="0" t="0" r="0" b="3810"/>
+            <wp:docPr id="25" name="Imagen 25"/>
             <wp:cNvGraphicFramePr>
               <a:graphicFrameLocks xmlns:a="http://schemas.openxmlformats.org/drawingml/2006/main" noChangeAspect="1"/>
             </wp:cNvGraphicFramePr>
@@ -5687,7 +5689,7 @@
                   <pic:spPr>
                     <a:xfrm>
                       <a:off x="0" y="0"/>
-                      <a:ext cx="4827343" cy="2056778"/>
+                      <a:ext cx="4453506" cy="2418978"/>
                     </a:xfrm>
                     <a:prstGeom prst="rect">
                       <a:avLst/>
@@ -5702,14 +5704,34 @@
     </w:p>
     <w:p>
       <w:pPr>
+        <w:jc w:val="left"/>
+        <w:rPr>
+          <w:b/>
+          <w:bCs/>
+        </w:rPr>
+      </w:pPr>
+      <w:r>
+        <w:rPr>
+          <w:b/>
+          <w:bCs/>
+        </w:rPr>
+        <w:t>Interface</w:t>
+      </w:r>
+    </w:p>
+    <w:p>
+      <w:pPr>
         <w:jc w:val="center"/>
       </w:pPr>
       <w:r>
+        <w:rPr>
+          <w:noProof/>
+        </w:rPr>
+        <w:lastRenderedPageBreak/>
         <w:drawing>
-          <wp:inline distT="0" distB="0" distL="0" distR="0" wp14:anchorId="2474CBC7" wp14:editId="16CB14E7">
-            <wp:extent cx="4886325" cy="1970713"/>
-            <wp:effectExtent l="0" t="0" r="0" b="0"/>
-            <wp:docPr id="19" name="Imagen 19"/>
+          <wp:inline distT="0" distB="0" distL="0" distR="0" wp14:anchorId="34DC3B85" wp14:editId="15BE933A">
+            <wp:extent cx="5062655" cy="3762375"/>
+            <wp:effectExtent l="0" t="0" r="5080" b="0"/>
+            <wp:docPr id="17" name="Imagen 17"/>
             <wp:cNvGraphicFramePr>
               <a:graphicFrameLocks xmlns:a="http://schemas.openxmlformats.org/drawingml/2006/main" noChangeAspect="1"/>
             </wp:cNvGraphicFramePr>
@@ -5729,7 +5751,7 @@
                   <pic:spPr>
                     <a:xfrm>
                       <a:off x="0" y="0"/>
-                      <a:ext cx="4899076" cy="1975856"/>
+                      <a:ext cx="5070931" cy="3768525"/>
                     </a:xfrm>
                     <a:prstGeom prst="rect">
                       <a:avLst/>
@@ -5747,11 +5769,14 @@
         <w:jc w:val="center"/>
       </w:pPr>
       <w:r>
+        <w:rPr>
+          <w:noProof/>
+        </w:rPr>
         <w:drawing>
-          <wp:inline distT="0" distB="0" distL="0" distR="0" wp14:anchorId="6E0BFF47" wp14:editId="6104B3A6">
-            <wp:extent cx="4879792" cy="2257425"/>
-            <wp:effectExtent l="0" t="0" r="0" b="0"/>
-            <wp:docPr id="20" name="Imagen 20"/>
+          <wp:inline distT="0" distB="0" distL="0" distR="0" wp14:anchorId="52FF695D" wp14:editId="1F2ABA3C">
+            <wp:extent cx="4819650" cy="2053500"/>
+            <wp:effectExtent l="0" t="0" r="0" b="4445"/>
+            <wp:docPr id="18" name="Imagen 18"/>
             <wp:cNvGraphicFramePr>
               <a:graphicFrameLocks xmlns:a="http://schemas.openxmlformats.org/drawingml/2006/main" noChangeAspect="1"/>
             </wp:cNvGraphicFramePr>
@@ -5771,7 +5796,7 @@
                   <pic:spPr>
                     <a:xfrm>
                       <a:off x="0" y="0"/>
-                      <a:ext cx="4884419" cy="2259566"/>
+                      <a:ext cx="4827343" cy="2056778"/>
                     </a:xfrm>
                     <a:prstGeom prst="rect">
                       <a:avLst/>
@@ -5786,28 +5811,18 @@
     </w:p>
     <w:p>
       <w:pPr>
-        <w:jc w:val="left"/>
-        <w:rPr>
-          <w:b/>
-          <w:bCs/>
-        </w:rPr>
-      </w:pPr>
-      <w:r>
-        <w:rPr>
-          <w:b/>
-          <w:bCs/>
-        </w:rPr>
-        <w:t>Concrete Builder</w:t>
-      </w:r>
-    </w:p>
-    <w:p>
-      <w:r>
+        <w:jc w:val="center"/>
+      </w:pPr>
+      <w:r>
+        <w:rPr>
+          <w:noProof/>
+        </w:rPr>
         <w:lastRenderedPageBreak/>
         <w:drawing>
-          <wp:inline distT="0" distB="0" distL="0" distR="0" wp14:anchorId="5B52A8C3" wp14:editId="25DA4955">
-            <wp:extent cx="5943600" cy="2004695"/>
+          <wp:inline distT="0" distB="0" distL="0" distR="0" wp14:anchorId="2474CBC7" wp14:editId="16CB14E7">
+            <wp:extent cx="4886325" cy="1970713"/>
             <wp:effectExtent l="0" t="0" r="0" b="0"/>
-            <wp:docPr id="22" name="Imagen 22"/>
+            <wp:docPr id="19" name="Imagen 19"/>
             <wp:cNvGraphicFramePr>
               <a:graphicFrameLocks xmlns:a="http://schemas.openxmlformats.org/drawingml/2006/main" noChangeAspect="1"/>
             </wp:cNvGraphicFramePr>
@@ -5827,7 +5842,7 @@
                   <pic:spPr>
                     <a:xfrm>
                       <a:off x="0" y="0"/>
-                      <a:ext cx="5943600" cy="2004695"/>
+                      <a:ext cx="4899076" cy="1975856"/>
                     </a:xfrm>
                     <a:prstGeom prst="rect">
                       <a:avLst/>
@@ -5845,11 +5860,14 @@
         <w:jc w:val="center"/>
       </w:pPr>
       <w:r>
+        <w:rPr>
+          <w:noProof/>
+        </w:rPr>
         <w:drawing>
-          <wp:inline distT="0" distB="0" distL="0" distR="0" wp14:anchorId="03986789" wp14:editId="4BA28EE2">
-            <wp:extent cx="4676775" cy="851913"/>
-            <wp:effectExtent l="0" t="0" r="0" b="5715"/>
-            <wp:docPr id="23" name="Imagen 23"/>
+          <wp:inline distT="0" distB="0" distL="0" distR="0" wp14:anchorId="6E0BFF47" wp14:editId="6104B3A6">
+            <wp:extent cx="4879792" cy="2257425"/>
+            <wp:effectExtent l="0" t="0" r="0" b="0"/>
+            <wp:docPr id="20" name="Imagen 20"/>
             <wp:cNvGraphicFramePr>
               <a:graphicFrameLocks xmlns:a="http://schemas.openxmlformats.org/drawingml/2006/main" noChangeAspect="1"/>
             </wp:cNvGraphicFramePr>
@@ -5869,7 +5887,7 @@
                   <pic:spPr>
                     <a:xfrm>
                       <a:off x="0" y="0"/>
-                      <a:ext cx="4694262" cy="855098"/>
+                      <a:ext cx="4884419" cy="2259566"/>
                     </a:xfrm>
                     <a:prstGeom prst="rect">
                       <a:avLst/>
@@ -5884,14 +5902,30 @@
     </w:p>
     <w:p>
       <w:pPr>
-        <w:jc w:val="center"/>
-      </w:pPr>
-      <w:r>
+        <w:jc w:val="left"/>
+        <w:rPr>
+          <w:b/>
+          <w:bCs/>
+        </w:rPr>
+      </w:pPr>
+      <w:r>
+        <w:rPr>
+          <w:b/>
+          <w:bCs/>
+        </w:rPr>
+        <w:t>Concrete Builder</w:t>
+      </w:r>
+    </w:p>
+    <w:p>
+      <w:r>
+        <w:rPr>
+          <w:noProof/>
+        </w:rPr>
         <w:drawing>
-          <wp:inline distT="0" distB="0" distL="0" distR="0" wp14:anchorId="6409BE82" wp14:editId="14230D7D">
-            <wp:extent cx="4498141" cy="3019425"/>
+          <wp:inline distT="0" distB="0" distL="0" distR="0" wp14:anchorId="5B52A8C3" wp14:editId="25DA4955">
+            <wp:extent cx="5943600" cy="2004695"/>
             <wp:effectExtent l="0" t="0" r="0" b="0"/>
-            <wp:docPr id="24" name="Imagen 24"/>
+            <wp:docPr id="22" name="Imagen 22"/>
             <wp:cNvGraphicFramePr>
               <a:graphicFrameLocks xmlns:a="http://schemas.openxmlformats.org/drawingml/2006/main" noChangeAspect="1"/>
             </wp:cNvGraphicFramePr>
@@ -5911,7 +5945,7 @@
                   <pic:spPr>
                     <a:xfrm>
                       <a:off x="0" y="0"/>
-                      <a:ext cx="4502754" cy="3022522"/>
+                      <a:ext cx="5943600" cy="2004695"/>
                     </a:xfrm>
                     <a:prstGeom prst="rect">
                       <a:avLst/>
@@ -5926,274 +5960,17 @@
     </w:p>
     <w:p>
       <w:pPr>
-        <w:pStyle w:val="Ttulo3"/>
-      </w:pPr>
-      <w:r>
-        <w:t xml:space="preserve">Explicación y </w:t>
-      </w:r>
-      <w:r>
-        <w:t>Prueba de que Funciona</w:t>
-      </w:r>
-    </w:p>
-    <w:p>
-      <w:pPr>
-        <w:pStyle w:val="Ttulo4"/>
-      </w:pPr>
-      <w:r>
-        <w:t>JwtService (Client</w:t>
-      </w:r>
-      <w:r>
-        <w:rPr>
-          <w:lang w:val="en-US"/>
-        </w:rPr>
-        <w:t>/Director</w:t>
-      </w:r>
-      <w:r>
-        <w:t>)</w:t>
-      </w:r>
-    </w:p>
-    <w:p>
-      <w:r>
-        <w:t xml:space="preserve">La clase </w:t>
-      </w:r>
-      <w:r>
-        <w:rPr>
-          <w:b/>
-          <w:bCs/>
-        </w:rPr>
-        <w:t>JwtService</w:t>
-      </w:r>
-      <w:r>
-        <w:t xml:space="preserve"> actúa como cliente y director contextual, ya que define los pasos de construcción</w:t>
-      </w:r>
-      <w:r>
-        <w:t xml:space="preserve"> del token JWT</w:t>
-      </w:r>
-      <w:r>
-        <w:t xml:space="preserve">. </w:t>
-      </w:r>
-    </w:p>
-    <w:p>
-      <w:pPr>
-        <w:pStyle w:val="Ttulo4"/>
-      </w:pPr>
-      <w:r>
-        <w:lastRenderedPageBreak/>
-        <w:t>JwtBuilder (Interfaz)</w:t>
-      </w:r>
-    </w:p>
-    <w:p>
-      <w:r>
-        <w:rPr>
-          <w:b/>
-          <w:bCs/>
-        </w:rPr>
-        <w:t>JwtBuilder</w:t>
-      </w:r>
-      <w:r>
-        <w:t xml:space="preserve"> representa el Builder</w:t>
-      </w:r>
-      <w:r>
-        <w:t>, donde se</w:t>
-      </w:r>
-      <w:r>
-        <w:t xml:space="preserve"> define el contrato de métodos que deberán utilizar los Builders concretos posteriormente, entre ellos los utilizados como </w:t>
-      </w:r>
-      <w:proofErr w:type="gramStart"/>
-      <w:r>
-        <w:rPr>
-          <w:b/>
-          <w:bCs/>
-        </w:rPr>
-        <w:t>subject(</w:t>
-      </w:r>
-      <w:proofErr w:type="gramEnd"/>
-      <w:r>
-        <w:rPr>
-          <w:b/>
-          <w:bCs/>
-        </w:rPr>
-        <w:t xml:space="preserve">), </w:t>
-      </w:r>
-      <w:proofErr w:type="spellStart"/>
-      <w:r>
-        <w:rPr>
-          <w:b/>
-          <w:bCs/>
-        </w:rPr>
-        <w:t>claim</w:t>
-      </w:r>
-      <w:proofErr w:type="spellEnd"/>
-      <w:r>
-        <w:rPr>
-          <w:b/>
-          <w:bCs/>
-        </w:rPr>
-        <w:t xml:space="preserve">(), </w:t>
-      </w:r>
-      <w:proofErr w:type="spellStart"/>
-      <w:r>
-        <w:rPr>
-          <w:b/>
-          <w:bCs/>
-        </w:rPr>
-        <w:t>issuedAt</w:t>
-      </w:r>
-      <w:proofErr w:type="spellEnd"/>
-      <w:r>
-        <w:rPr>
-          <w:b/>
-          <w:bCs/>
-        </w:rPr>
-        <w:t xml:space="preserve">(), </w:t>
-      </w:r>
-      <w:proofErr w:type="spellStart"/>
-      <w:r>
-        <w:rPr>
-          <w:b/>
-          <w:bCs/>
-        </w:rPr>
-        <w:t>expiration</w:t>
-      </w:r>
-      <w:proofErr w:type="spellEnd"/>
-      <w:r>
-        <w:rPr>
-          <w:b/>
-          <w:bCs/>
-        </w:rPr>
-        <w:t xml:space="preserve">(), </w:t>
-      </w:r>
-      <w:proofErr w:type="spellStart"/>
-      <w:r>
-        <w:rPr>
-          <w:b/>
-          <w:bCs/>
-        </w:rPr>
-        <w:t>signWith</w:t>
-      </w:r>
-      <w:proofErr w:type="spellEnd"/>
-      <w:r>
-        <w:rPr>
-          <w:b/>
-          <w:bCs/>
-        </w:rPr>
-        <w:t xml:space="preserve">() </w:t>
-      </w:r>
-      <w:r>
-        <w:t>y</w:t>
-      </w:r>
-      <w:r>
-        <w:rPr>
-          <w:b/>
-          <w:bCs/>
-        </w:rPr>
-        <w:t xml:space="preserve"> compact().</w:t>
-      </w:r>
-    </w:p>
-    <w:p>
-      <w:pPr>
-        <w:pStyle w:val="Ttulo4"/>
-      </w:pPr>
-      <w:r>
-        <w:t>DefaultJwtBuilder (Concrete Builder)</w:t>
-      </w:r>
-    </w:p>
-    <w:p>
-      <w:r>
-        <w:rPr>
-          <w:b/>
-          <w:bCs/>
-        </w:rPr>
-        <w:t>DefaultJwtBuilder</w:t>
-      </w:r>
-      <w:r>
-        <w:t xml:space="preserve">, proporcionado internamente por la librería </w:t>
-      </w:r>
-      <w:r>
-        <w:rPr>
-          <w:b/>
-          <w:bCs/>
-        </w:rPr>
-        <w:t>JJWT</w:t>
-      </w:r>
-      <w:r>
-        <w:t>, es el Builder concreto</w:t>
-      </w:r>
-      <w:r>
-        <w:t xml:space="preserve"> donde se implementa la interfaz </w:t>
-      </w:r>
-      <w:r>
-        <w:rPr>
-          <w:b/>
-          <w:bCs/>
-        </w:rPr>
-        <w:t xml:space="preserve">JwtBuilder </w:t>
-      </w:r>
-      <w:r>
-        <w:t>y se asigna comportamiento a sus métodos</w:t>
-      </w:r>
-      <w:r>
-        <w:t>.</w:t>
-      </w:r>
-      <w:r>
-        <w:t xml:space="preserve"> </w:t>
-      </w:r>
-      <w:r>
-        <w:t xml:space="preserve">Finalmente, el método </w:t>
-      </w:r>
-      <w:proofErr w:type="gramStart"/>
-      <w:r>
-        <w:rPr>
-          <w:b/>
-          <w:bCs/>
-        </w:rPr>
-        <w:t>compact(</w:t>
-      </w:r>
-      <w:proofErr w:type="gramEnd"/>
-      <w:r>
-        <w:rPr>
-          <w:b/>
-          <w:bCs/>
-        </w:rPr>
-        <w:t>)</w:t>
-      </w:r>
-      <w:r>
-        <w:t xml:space="preserve"> genera el producto terminado: un token JWT firmado en formato </w:t>
-      </w:r>
-      <w:r>
-        <w:rPr>
-          <w:b/>
-          <w:bCs/>
-        </w:rPr>
-        <w:t>String</w:t>
-      </w:r>
-      <w:r>
-        <w:t>.</w:t>
-      </w:r>
-    </w:p>
-    <w:p>
-      <w:pPr>
-        <w:pStyle w:val="Ttulo4"/>
-      </w:pPr>
-      <w:r>
-        <w:t>Funcionamiento</w:t>
-      </w:r>
-    </w:p>
-    <w:p>
-      <w:r>
-        <w:t>Cuando nosotros iniciamos sesión internamente con un usuario</w:t>
-      </w:r>
-      <w:r>
-        <w:t>, la API REST nos devuelve como respuesta un token JWT para gestionar la sesión del usuario como mensaje de éxito. A continuación se muestra un ejemplo:</w:t>
-      </w:r>
-    </w:p>
-    <w:p>
-      <w:r>
+        <w:jc w:val="center"/>
+      </w:pPr>
+      <w:r>
+        <w:rPr>
+          <w:noProof/>
+        </w:rPr>
         <w:drawing>
-          <wp:inline distT="0" distB="0" distL="0" distR="0" wp14:anchorId="009FAAB2" wp14:editId="7118C825">
-            <wp:extent cx="5943600" cy="2818765"/>
-            <wp:effectExtent l="0" t="0" r="0" b="635"/>
-            <wp:docPr id="27" name="Imagen 27"/>
+          <wp:inline distT="0" distB="0" distL="0" distR="0" wp14:anchorId="03986789" wp14:editId="4BA28EE2">
+            <wp:extent cx="4676775" cy="851913"/>
+            <wp:effectExtent l="0" t="0" r="0" b="5715"/>
+            <wp:docPr id="23" name="Imagen 23"/>
             <wp:cNvGraphicFramePr>
               <a:graphicFrameLocks xmlns:a="http://schemas.openxmlformats.org/drawingml/2006/main" noChangeAspect="1"/>
             </wp:cNvGraphicFramePr>
@@ -6213,6 +5990,345 @@
                   <pic:spPr>
                     <a:xfrm>
                       <a:off x="0" y="0"/>
+                      <a:ext cx="4694262" cy="855098"/>
+                    </a:xfrm>
+                    <a:prstGeom prst="rect">
+                      <a:avLst/>
+                    </a:prstGeom>
+                  </pic:spPr>
+                </pic:pic>
+              </a:graphicData>
+            </a:graphic>
+          </wp:inline>
+        </w:drawing>
+      </w:r>
+    </w:p>
+    <w:p>
+      <w:pPr>
+        <w:jc w:val="center"/>
+      </w:pPr>
+      <w:r>
+        <w:rPr>
+          <w:noProof/>
+        </w:rPr>
+        <w:lastRenderedPageBreak/>
+        <w:drawing>
+          <wp:inline distT="0" distB="0" distL="0" distR="0" wp14:anchorId="6409BE82" wp14:editId="14230D7D">
+            <wp:extent cx="4498141" cy="3019425"/>
+            <wp:effectExtent l="0" t="0" r="0" b="0"/>
+            <wp:docPr id="24" name="Imagen 24"/>
+            <wp:cNvGraphicFramePr>
+              <a:graphicFrameLocks xmlns:a="http://schemas.openxmlformats.org/drawingml/2006/main" noChangeAspect="1"/>
+            </wp:cNvGraphicFramePr>
+            <a:graphic xmlns:a="http://schemas.openxmlformats.org/drawingml/2006/main">
+              <a:graphicData uri="http://schemas.openxmlformats.org/drawingml/2006/picture">
+                <pic:pic xmlns:pic="http://schemas.openxmlformats.org/drawingml/2006/picture">
+                  <pic:nvPicPr>
+                    <pic:cNvPr id="1" name=""/>
+                    <pic:cNvPicPr/>
+                  </pic:nvPicPr>
+                  <pic:blipFill>
+                    <a:blip r:embed="rId31"/>
+                    <a:stretch>
+                      <a:fillRect/>
+                    </a:stretch>
+                  </pic:blipFill>
+                  <pic:spPr>
+                    <a:xfrm>
+                      <a:off x="0" y="0"/>
+                      <a:ext cx="4502754" cy="3022522"/>
+                    </a:xfrm>
+                    <a:prstGeom prst="rect">
+                      <a:avLst/>
+                    </a:prstGeom>
+                  </pic:spPr>
+                </pic:pic>
+              </a:graphicData>
+            </a:graphic>
+          </wp:inline>
+        </w:drawing>
+      </w:r>
+    </w:p>
+    <w:p>
+      <w:pPr>
+        <w:pStyle w:val="Ttulo3"/>
+      </w:pPr>
+      <w:r>
+        <w:t xml:space="preserve">Explicación y </w:t>
+      </w:r>
+      <w:r>
+        <w:t>Prueba de que Funciona</w:t>
+      </w:r>
+    </w:p>
+    <w:p>
+      <w:pPr>
+        <w:pStyle w:val="Ttulo4"/>
+      </w:pPr>
+      <w:r>
+        <w:t>JwtService (Client</w:t>
+      </w:r>
+      <w:r>
+        <w:rPr>
+          <w:lang w:val="en-US"/>
+        </w:rPr>
+        <w:t>/Director</w:t>
+      </w:r>
+      <w:r>
+        <w:t>)</w:t>
+      </w:r>
+    </w:p>
+    <w:p>
+      <w:r>
+        <w:t xml:space="preserve">La clase </w:t>
+      </w:r>
+      <w:r>
+        <w:rPr>
+          <w:b/>
+          <w:bCs/>
+        </w:rPr>
+        <w:t>JwtService</w:t>
+      </w:r>
+      <w:r>
+        <w:t xml:space="preserve"> actúa como cliente y director contextual, ya que define los pasos de construcción del token JWT. </w:t>
+      </w:r>
+    </w:p>
+    <w:p>
+      <w:pPr>
+        <w:pStyle w:val="Ttulo4"/>
+      </w:pPr>
+      <w:r>
+        <w:t>JwtBuilder (Interfaz)</w:t>
+      </w:r>
+    </w:p>
+    <w:p>
+      <w:r>
+        <w:rPr>
+          <w:b/>
+          <w:bCs/>
+        </w:rPr>
+        <w:t>JwtBuilder</w:t>
+      </w:r>
+      <w:r>
+        <w:t xml:space="preserve"> representa el Builder, donde se</w:t>
+      </w:r>
+      <w:r>
+        <w:t xml:space="preserve"> define el contrato de métodos que deberán utilizar los Builders concretos posteriormente, entre ellos los utilizados como </w:t>
+      </w:r>
+      <w:proofErr w:type="spellStart"/>
+      <w:proofErr w:type="gramStart"/>
+      <w:r>
+        <w:rPr>
+          <w:b/>
+          <w:bCs/>
+        </w:rPr>
+        <w:t>subject</w:t>
+      </w:r>
+      <w:proofErr w:type="spellEnd"/>
+      <w:r>
+        <w:rPr>
+          <w:b/>
+          <w:bCs/>
+        </w:rPr>
+        <w:t>(</w:t>
+      </w:r>
+      <w:proofErr w:type="gramEnd"/>
+      <w:r>
+        <w:rPr>
+          <w:b/>
+          <w:bCs/>
+        </w:rPr>
+        <w:t xml:space="preserve">), </w:t>
+      </w:r>
+      <w:proofErr w:type="spellStart"/>
+      <w:r>
+        <w:rPr>
+          <w:b/>
+          <w:bCs/>
+        </w:rPr>
+        <w:t>claim</w:t>
+      </w:r>
+      <w:proofErr w:type="spellEnd"/>
+      <w:r>
+        <w:rPr>
+          <w:b/>
+          <w:bCs/>
+        </w:rPr>
+        <w:t xml:space="preserve">(), </w:t>
+      </w:r>
+      <w:proofErr w:type="spellStart"/>
+      <w:r>
+        <w:rPr>
+          <w:b/>
+          <w:bCs/>
+        </w:rPr>
+        <w:t>issuedAt</w:t>
+      </w:r>
+      <w:proofErr w:type="spellEnd"/>
+      <w:r>
+        <w:rPr>
+          <w:b/>
+          <w:bCs/>
+        </w:rPr>
+        <w:t xml:space="preserve">(), </w:t>
+      </w:r>
+      <w:proofErr w:type="spellStart"/>
+      <w:r>
+        <w:rPr>
+          <w:b/>
+          <w:bCs/>
+        </w:rPr>
+        <w:t>expiration</w:t>
+      </w:r>
+      <w:proofErr w:type="spellEnd"/>
+      <w:r>
+        <w:rPr>
+          <w:b/>
+          <w:bCs/>
+        </w:rPr>
+        <w:t xml:space="preserve">(), </w:t>
+      </w:r>
+      <w:proofErr w:type="spellStart"/>
+      <w:r>
+        <w:rPr>
+          <w:b/>
+          <w:bCs/>
+        </w:rPr>
+        <w:t>signWith</w:t>
+      </w:r>
+      <w:proofErr w:type="spellEnd"/>
+      <w:r>
+        <w:rPr>
+          <w:b/>
+          <w:bCs/>
+        </w:rPr>
+        <w:t xml:space="preserve">() </w:t>
+      </w:r>
+      <w:r>
+        <w:t>y</w:t>
+      </w:r>
+      <w:r>
+        <w:rPr>
+          <w:b/>
+          <w:bCs/>
+        </w:rPr>
+        <w:t xml:space="preserve"> compact().</w:t>
+      </w:r>
+    </w:p>
+    <w:p>
+      <w:pPr>
+        <w:pStyle w:val="Ttulo4"/>
+      </w:pPr>
+      <w:r>
+        <w:t>DefaultJwtBuilder (Concrete Builder)</w:t>
+      </w:r>
+    </w:p>
+    <w:p>
+      <w:r>
+        <w:rPr>
+          <w:b/>
+          <w:bCs/>
+        </w:rPr>
+        <w:t>DefaultJwtBuilder</w:t>
+      </w:r>
+      <w:r>
+        <w:t xml:space="preserve">, proporcionado internamente por la librería </w:t>
+      </w:r>
+      <w:r>
+        <w:rPr>
+          <w:b/>
+          <w:bCs/>
+        </w:rPr>
+        <w:t>JJWT</w:t>
+      </w:r>
+      <w:r>
+        <w:t xml:space="preserve">, es el Builder concreto donde se implementa la interfaz </w:t>
+      </w:r>
+      <w:r>
+        <w:rPr>
+          <w:b/>
+          <w:bCs/>
+        </w:rPr>
+        <w:t xml:space="preserve">JwtBuilder </w:t>
+      </w:r>
+      <w:r>
+        <w:t xml:space="preserve">y se asigna comportamiento a sus métodos. Finalmente, el método </w:t>
+      </w:r>
+      <w:proofErr w:type="gramStart"/>
+      <w:r>
+        <w:rPr>
+          <w:b/>
+          <w:bCs/>
+        </w:rPr>
+        <w:t>compact(</w:t>
+      </w:r>
+      <w:proofErr w:type="gramEnd"/>
+      <w:r>
+        <w:rPr>
+          <w:b/>
+          <w:bCs/>
+        </w:rPr>
+        <w:t>)</w:t>
+      </w:r>
+      <w:r>
+        <w:t xml:space="preserve"> genera el producto terminado: un token JWT firmado en formato </w:t>
+      </w:r>
+      <w:r>
+        <w:rPr>
+          <w:b/>
+          <w:bCs/>
+        </w:rPr>
+        <w:t>String</w:t>
+      </w:r>
+      <w:r>
+        <w:t>.</w:t>
+      </w:r>
+    </w:p>
+    <w:p>
+      <w:pPr>
+        <w:pStyle w:val="Ttulo4"/>
+      </w:pPr>
+      <w:r>
+        <w:lastRenderedPageBreak/>
+        <w:t>Funcionamiento</w:t>
+      </w:r>
+    </w:p>
+    <w:p>
+      <w:r>
+        <w:t>Cuando nosotros iniciamos sesión internamente con un usuario</w:t>
+      </w:r>
+      <w:r>
+        <w:t>, la API REST nos devuelve como respuesta un token JWT para gestionar la sesión del usuario como mensaje de éxito. A continuación se muestra un ejemplo:</w:t>
+      </w:r>
+    </w:p>
+    <w:p>
+      <w:r>
+        <w:rPr>
+          <w:noProof/>
+        </w:rPr>
+        <w:drawing>
+          <wp:inline distT="0" distB="0" distL="0" distR="0" wp14:anchorId="009FAAB2" wp14:editId="7118C825">
+            <wp:extent cx="5943600" cy="2818765"/>
+            <wp:effectExtent l="0" t="0" r="0" b="635"/>
+            <wp:docPr id="27" name="Imagen 27"/>
+            <wp:cNvGraphicFramePr>
+              <a:graphicFrameLocks xmlns:a="http://schemas.openxmlformats.org/drawingml/2006/main" noChangeAspect="1"/>
+            </wp:cNvGraphicFramePr>
+            <a:graphic xmlns:a="http://schemas.openxmlformats.org/drawingml/2006/main">
+              <a:graphicData uri="http://schemas.openxmlformats.org/drawingml/2006/picture">
+                <pic:pic xmlns:pic="http://schemas.openxmlformats.org/drawingml/2006/picture">
+                  <pic:nvPicPr>
+                    <pic:cNvPr id="1" name=""/>
+                    <pic:cNvPicPr/>
+                  </pic:nvPicPr>
+                  <pic:blipFill>
+                    <a:blip r:embed="rId32"/>
+                    <a:stretch>
+                      <a:fillRect/>
+                    </a:stretch>
+                  </pic:blipFill>
+                  <pic:spPr>
+                    <a:xfrm>
+                      <a:off x="0" y="0"/>
                       <a:ext cx="5943600" cy="2818765"/>
                     </a:xfrm>
                     <a:prstGeom prst="rect">
@@ -6265,7 +6381,7 @@
     <w:p/>
     <w:p/>
     <w:sectPr>
-      <w:headerReference w:type="default" r:id="rId31"/>
+      <w:headerReference w:type="default" r:id="rId33"/>
       <w:pgSz w:w="12240" w:h="15840"/>
       <w:pgMar w:top="1440" w:right="1440" w:bottom="1440" w:left="1440" w:header="709" w:footer="709" w:gutter="0"/>
       <w:cols w:space="720"/>

</xml_diff>

<commit_message>
Implementacion de una breve introduccion a los patrones de diseño antes de evidenciarlos
</commit_message>
<xml_diff>
--- a/Sistema de Gestion de Cadenas de Suministro.docx
+++ b/Sistema de Gestion de Cadenas de Suministro.docx
@@ -3538,6 +3538,196 @@
       <w:pPr>
         <w:pStyle w:val="Ttulo2"/>
       </w:pPr>
+      <w:r>
+        <w:t>Introducción a los Patrones de Diseño</w:t>
+      </w:r>
+    </w:p>
+    <w:p>
+      <w:pPr>
+        <w:pStyle w:val="Ttulo3"/>
+      </w:pPr>
+      <w:r>
+        <w:t>Concepto</w:t>
+      </w:r>
+    </w:p>
+    <w:p>
+      <w:r>
+        <w:t xml:space="preserve">Los </w:t>
+      </w:r>
+      <w:r>
+        <w:rPr>
+          <w:b/>
+          <w:bCs/>
+        </w:rPr>
+        <w:t>patrones de diseño</w:t>
+      </w:r>
+      <w:r>
+        <w:t xml:space="preserve"> son soluciones generales y reutilizables para problemas comunes que se presentan durante el desarrollo de software. Estos permiten establecer una estructura organizada para las </w:t>
+      </w:r>
+      <w:r>
+        <w:rPr>
+          <w:b/>
+          <w:bCs/>
+        </w:rPr>
+        <w:t>clases y objetos</w:t>
+      </w:r>
+      <w:r>
+        <w:t>, facilitando aspectos como la reutilización, el mantenimiento y la flexibilidad del código.</w:t>
+      </w:r>
+    </w:p>
+    <w:p>
+      <w:pPr>
+        <w:pStyle w:val="Ttulo3"/>
+      </w:pPr>
+      <w:r>
+        <w:t>Familias de Patrones de Diseño que Existen</w:t>
+      </w:r>
+    </w:p>
+    <w:p>
+      <w:r>
+        <w:t xml:space="preserve">Según el catálogo </w:t>
+      </w:r>
+      <w:proofErr w:type="spellStart"/>
+      <w:r>
+        <w:rPr>
+          <w:b/>
+          <w:bCs/>
+        </w:rPr>
+        <w:t>GoF</w:t>
+      </w:r>
+      <w:proofErr w:type="spellEnd"/>
+      <w:r>
+        <w:rPr>
+          <w:b/>
+          <w:bCs/>
+        </w:rPr>
+        <w:t xml:space="preserve"> (</w:t>
+      </w:r>
+      <w:proofErr w:type="spellStart"/>
+      <w:r>
+        <w:rPr>
+          <w:b/>
+          <w:bCs/>
+        </w:rPr>
+        <w:t>Gang</w:t>
+      </w:r>
+      <w:proofErr w:type="spellEnd"/>
+      <w:r>
+        <w:rPr>
+          <w:b/>
+          <w:bCs/>
+        </w:rPr>
+        <w:t xml:space="preserve"> </w:t>
+      </w:r>
+      <w:proofErr w:type="spellStart"/>
+      <w:r>
+        <w:rPr>
+          <w:b/>
+          <w:bCs/>
+        </w:rPr>
+        <w:t>of</w:t>
+      </w:r>
+      <w:proofErr w:type="spellEnd"/>
+      <w:r>
+        <w:rPr>
+          <w:b/>
+          <w:bCs/>
+        </w:rPr>
+        <w:t xml:space="preserve"> </w:t>
+      </w:r>
+      <w:proofErr w:type="spellStart"/>
+      <w:r>
+        <w:rPr>
+          <w:b/>
+          <w:bCs/>
+        </w:rPr>
+        <w:t>Four</w:t>
+      </w:r>
+      <w:proofErr w:type="spellEnd"/>
+      <w:r>
+        <w:rPr>
+          <w:b/>
+          <w:bCs/>
+        </w:rPr>
+        <w:t>)</w:t>
+      </w:r>
+      <w:r>
+        <w:t>, los patrones de diseño se agrupan en tres familias principales, dependiendo del tipo de problema que buscan solucionar:</w:t>
+      </w:r>
+    </w:p>
+    <w:p>
+      <w:pPr>
+        <w:pStyle w:val="Ttulo4"/>
+      </w:pPr>
+      <w:r>
+        <w:t>Patrones Creacionales</w:t>
+      </w:r>
+    </w:p>
+    <w:p>
+      <w:r>
+        <w:t xml:space="preserve">Se enfocan en la </w:t>
+      </w:r>
+      <w:r>
+        <w:rPr>
+          <w:b/>
+          <w:bCs/>
+        </w:rPr>
+        <w:t>creación de objetos</w:t>
+      </w:r>
+      <w:r>
+        <w:t>, definiendo mecanismos que permiten controlar, simplificar y organizar la forma en que estos son instanciados dentro del sistema.</w:t>
+      </w:r>
+    </w:p>
+    <w:p>
+      <w:pPr>
+        <w:pStyle w:val="Ttulo4"/>
+      </w:pPr>
+      <w:r>
+        <w:t>Patrones Estructurales</w:t>
+      </w:r>
+    </w:p>
+    <w:p>
+      <w:r>
+        <w:t xml:space="preserve">Se enfocan en la </w:t>
+      </w:r>
+      <w:r>
+        <w:rPr>
+          <w:b/>
+          <w:bCs/>
+        </w:rPr>
+        <w:t>composición y organización de clases y objetos</w:t>
+      </w:r>
+      <w:r>
+        <w:t>, estableciendo formas de relacionarlos para construir estructuras más flexibles y facilitar su reutilización.</w:t>
+      </w:r>
+    </w:p>
+    <w:p>
+      <w:pPr>
+        <w:pStyle w:val="Ttulo4"/>
+      </w:pPr>
+      <w:r>
+        <w:t>Patrones de Comportamiento</w:t>
+      </w:r>
+    </w:p>
+    <w:p>
+      <w:r>
+        <w:t xml:space="preserve">Se enfocan en la </w:t>
+      </w:r>
+      <w:r>
+        <w:rPr>
+          <w:b/>
+          <w:bCs/>
+        </w:rPr>
+        <w:t>interacción entre los objetos y la distribución de responsabilidades</w:t>
+      </w:r>
+      <w:r>
+        <w:t>, estableciendo mecanismos para organizar su comunicación y comportamiento dentro del sistema.</w:t>
+      </w:r>
+    </w:p>
+    <w:p>
+      <w:pPr>
+        <w:pStyle w:val="Ttulo2"/>
+      </w:pPr>
       <w:bookmarkStart w:id="24" w:name="_Toc239179236"/>
       <w:r>
         <w:t>Aplicación del Patrón Singleton</w:t>
@@ -3585,7 +3775,11 @@
       </w:r>
       <w:proofErr w:type="spellEnd"/>
       <w:r>
-        <w:t xml:space="preserve"> que nosotros estamos usando para este proyecto, es </w:t>
+        <w:t xml:space="preserve"> que nosotros estamos </w:t>
+      </w:r>
+      <w:r>
+        <w:lastRenderedPageBreak/>
+        <w:t xml:space="preserve">usando para este proyecto, es </w:t>
       </w:r>
       <w:r>
         <w:rPr>
@@ -3834,12 +4028,14 @@
         <w:pStyle w:val="Ttulo3"/>
       </w:pPr>
       <w:r>
-        <w:lastRenderedPageBreak/>
         <w:t>Diagrama de Clases UML</w:t>
       </w:r>
     </w:p>
     <w:p>
       <w:r>
+        <w:rPr>
+          <w:noProof/>
+        </w:rPr>
         <w:drawing>
           <wp:inline distT="0" distB="0" distL="0" distR="0" wp14:anchorId="54E0EE1B" wp14:editId="633C600E">
             <wp:extent cx="5943600" cy="3764915"/>
@@ -3883,6 +4079,7 @@
         <w:pStyle w:val="Ttulo3"/>
       </w:pPr>
       <w:r>
+        <w:lastRenderedPageBreak/>
         <w:t>Código</w:t>
       </w:r>
     </w:p>
@@ -3933,7 +4130,6 @@
         <w:rPr>
           <w:noProof/>
         </w:rPr>
-        <w:lastRenderedPageBreak/>
         <w:drawing>
           <wp:inline distT="0" distB="0" distL="0" distR="0" wp14:anchorId="7B191849" wp14:editId="486E0DED">
             <wp:extent cx="5943600" cy="2027555"/>
@@ -4019,6 +4215,7 @@
       </w:pPr>
       <w:bookmarkStart w:id="27" w:name="_Toc239179239"/>
       <w:r>
+        <w:lastRenderedPageBreak/>
         <w:t xml:space="preserve">Explicación y </w:t>
       </w:r>
       <w:r>
@@ -4180,179 +4377,176 @@
         <w:t xml:space="preserve"> </w:t>
       </w:r>
       <w:r>
-        <w:t xml:space="preserve">que se encargara de orquestar el flujo de creación del proveedor. </w:t>
-      </w:r>
-      <w:r>
+        <w:t>que se encargara de orquestar el flujo de creación del proveedor. Asimismo, él se encarga también de devolverle la correspondiente respuesta al usuario cuando el proveedor haya sido creado.</w:t>
+      </w:r>
+    </w:p>
+    <w:p>
+      <w:pPr>
+        <w:pStyle w:val="Ttulo4"/>
+        <w:rPr>
+          <w:lang w:val="en-US"/>
+        </w:rPr>
+      </w:pPr>
+      <w:r>
+        <w:rPr>
+          <w:lang w:val="en-US"/>
+        </w:rPr>
+        <w:t xml:space="preserve">@Service </w:t>
+      </w:r>
+      <w:proofErr w:type="spellStart"/>
+      <w:r>
+        <w:rPr>
+          <w:lang w:val="en-US"/>
+        </w:rPr>
+        <w:t>SupplierService</w:t>
+      </w:r>
+      <w:proofErr w:type="spellEnd"/>
+    </w:p>
+    <w:p>
+      <w:pPr>
+        <w:rPr>
+          <w:b/>
+          <w:bCs/>
+        </w:rPr>
+      </w:pPr>
+      <w:r>
+        <w:t xml:space="preserve">Aquí se maneja la </w:t>
+      </w:r>
+      <w:r>
+        <w:t xml:space="preserve">orquestación del flujo de creación del proveedor, donde se capturan los datos que llegan, se hacen su correspondiente mapeo a entidad de dominio (estamos usando arquitectura hexagonal) y posteriormente se le pasa al </w:t>
+      </w:r>
+      <w:r>
+        <w:rPr>
+          <w:b/>
+          <w:bCs/>
+        </w:rPr>
+        <w:t xml:space="preserve">@Component </w:t>
+      </w:r>
+      <w:r>
+        <w:t xml:space="preserve">encargado de manejar la persistencia en la base de datos. Asimismo, cuando se obtiene una respuesta, se la envía al </w:t>
+      </w:r>
+      <w:r>
+        <w:rPr>
+          <w:b/>
+          <w:bCs/>
+        </w:rPr>
+        <w:t>@RestController</w:t>
+      </w:r>
+    </w:p>
+    <w:p>
+      <w:pPr>
+        <w:pStyle w:val="Ttulo4"/>
+      </w:pPr>
+      <w:r>
+        <w:t xml:space="preserve">@Component </w:t>
+      </w:r>
+      <w:proofErr w:type="spellStart"/>
+      <w:r>
+        <w:t>SupplierAdapterPersistence</w:t>
+      </w:r>
+      <w:proofErr w:type="spellEnd"/>
+    </w:p>
+    <w:p>
+      <w:r>
+        <w:t xml:space="preserve">En este apartado se maneja lo que es la comunicación con el componente interno que se encarga de recibir los datos para persistirlos definitivamente en la base de datos mediante </w:t>
+      </w:r>
+      <w:r>
+        <w:rPr>
+          <w:b/>
+          <w:bCs/>
+        </w:rPr>
+        <w:t xml:space="preserve">JPA e </w:t>
+      </w:r>
+      <w:proofErr w:type="spellStart"/>
+      <w:r>
+        <w:rPr>
+          <w:b/>
+          <w:bCs/>
+        </w:rPr>
+        <w:t>Hibernate</w:t>
+      </w:r>
+      <w:proofErr w:type="spellEnd"/>
+      <w:r>
+        <w:rPr>
+          <w:b/>
+          <w:bCs/>
+        </w:rPr>
+        <w:t xml:space="preserve">. </w:t>
+      </w:r>
+      <w:r>
+        <w:t xml:space="preserve">Primeramente, se reciben los datos que llegan del </w:t>
+      </w:r>
+      <w:r>
+        <w:rPr>
+          <w:b/>
+          <w:bCs/>
+        </w:rPr>
+        <w:t xml:space="preserve">@Service </w:t>
+      </w:r>
+      <w:r>
+        <w:t xml:space="preserve">y se envían al repositorio para guardarlos, después de ello, se envía la respuesta obtenida al </w:t>
+      </w:r>
+      <w:r>
+        <w:rPr>
+          <w:b/>
+          <w:bCs/>
+        </w:rPr>
+        <w:t xml:space="preserve">@Service </w:t>
+      </w:r>
+      <w:r>
+        <w:t>nuevamente.</w:t>
+      </w:r>
+    </w:p>
+    <w:p>
+      <w:pPr>
+        <w:pStyle w:val="Ttulo4"/>
+      </w:pPr>
+      <w:r>
+        <w:t>Funcionamiento</w:t>
+      </w:r>
+    </w:p>
+    <w:p>
+      <w:r>
+        <w:t xml:space="preserve">Ahora sí, para la prueba de funcionamiento, ya que todavía no contamos con una interfaz gráfica en el </w:t>
+      </w:r>
+      <w:proofErr w:type="spellStart"/>
+      <w:r>
+        <w:rPr>
+          <w:b/>
+          <w:bCs/>
+        </w:rPr>
+        <w:t>frontend</w:t>
+      </w:r>
+      <w:proofErr w:type="spellEnd"/>
+      <w:r>
+        <w:t xml:space="preserve">, utilizamos la herramienta </w:t>
+      </w:r>
+      <w:proofErr w:type="spellStart"/>
+      <w:r>
+        <w:rPr>
+          <w:b/>
+          <w:bCs/>
+        </w:rPr>
+        <w:t>Postman</w:t>
+      </w:r>
+      <w:proofErr w:type="spellEnd"/>
+      <w:r>
+        <w:t xml:space="preserve">, en la cual mandamos la siguiente petición a la </w:t>
+      </w:r>
+      <w:r>
+        <w:rPr>
+          <w:b/>
+          <w:bCs/>
+        </w:rPr>
+        <w:t>API.</w:t>
+      </w:r>
+    </w:p>
+    <w:p>
+      <w:r>
+        <w:rPr>
+          <w:noProof/>
+        </w:rPr>
         <w:lastRenderedPageBreak/>
-        <w:t>Asimismo, él se encarga también de devolverle la correspondiente respuesta al usuario cuando el proveedor haya sido creado.</w:t>
-      </w:r>
-    </w:p>
-    <w:p>
-      <w:pPr>
-        <w:pStyle w:val="Ttulo4"/>
-        <w:rPr>
-          <w:lang w:val="en-US"/>
-        </w:rPr>
-      </w:pPr>
-      <w:r>
-        <w:rPr>
-          <w:lang w:val="en-US"/>
-        </w:rPr>
-        <w:t xml:space="preserve">@Service </w:t>
-      </w:r>
-      <w:proofErr w:type="spellStart"/>
-      <w:r>
-        <w:rPr>
-          <w:lang w:val="en-US"/>
-        </w:rPr>
-        <w:t>SupplierService</w:t>
-      </w:r>
-      <w:proofErr w:type="spellEnd"/>
-    </w:p>
-    <w:p>
-      <w:pPr>
-        <w:rPr>
-          <w:b/>
-          <w:bCs/>
-        </w:rPr>
-      </w:pPr>
-      <w:r>
-        <w:t xml:space="preserve">Aquí se maneja la </w:t>
-      </w:r>
-      <w:r>
-        <w:t xml:space="preserve">orquestación del flujo de creación del proveedor, donde se capturan los datos que llegan, se hacen su correspondiente mapeo a entidad de dominio (estamos usando arquitectura hexagonal) y posteriormente se le pasa al </w:t>
-      </w:r>
-      <w:r>
-        <w:rPr>
-          <w:b/>
-          <w:bCs/>
-        </w:rPr>
-        <w:t xml:space="preserve">@Component </w:t>
-      </w:r>
-      <w:r>
-        <w:t xml:space="preserve">encargado de manejar la persistencia en la base de datos. Asimismo, cuando se obtiene una respuesta, se la envía al </w:t>
-      </w:r>
-      <w:r>
-        <w:rPr>
-          <w:b/>
-          <w:bCs/>
-        </w:rPr>
-        <w:t>@RestController</w:t>
-      </w:r>
-    </w:p>
-    <w:p>
-      <w:pPr>
-        <w:pStyle w:val="Ttulo4"/>
-      </w:pPr>
-      <w:r>
-        <w:t xml:space="preserve">@Component </w:t>
-      </w:r>
-      <w:proofErr w:type="spellStart"/>
-      <w:r>
-        <w:t>SupplierAdapterPersistence</w:t>
-      </w:r>
-      <w:proofErr w:type="spellEnd"/>
-    </w:p>
-    <w:p>
-      <w:r>
-        <w:t xml:space="preserve">En este apartado se maneja lo que es la comunicación con el componente interno que se encarga de recibir los datos para persistirlos definitivamente en la base de datos mediante </w:t>
-      </w:r>
-      <w:r>
-        <w:rPr>
-          <w:b/>
-          <w:bCs/>
-        </w:rPr>
-        <w:t xml:space="preserve">JPA e </w:t>
-      </w:r>
-      <w:proofErr w:type="spellStart"/>
-      <w:r>
-        <w:rPr>
-          <w:b/>
-          <w:bCs/>
-        </w:rPr>
-        <w:t>Hibernate</w:t>
-      </w:r>
-      <w:proofErr w:type="spellEnd"/>
-      <w:r>
-        <w:rPr>
-          <w:b/>
-          <w:bCs/>
-        </w:rPr>
-        <w:t xml:space="preserve">. </w:t>
-      </w:r>
-      <w:r>
-        <w:t xml:space="preserve">Primeramente, se reciben los datos que llegan del </w:t>
-      </w:r>
-      <w:r>
-        <w:rPr>
-          <w:b/>
-          <w:bCs/>
-        </w:rPr>
-        <w:t xml:space="preserve">@Service </w:t>
-      </w:r>
-      <w:r>
-        <w:t xml:space="preserve">y se envían al repositorio para guardarlos, después de ello, se envía la respuesta obtenida al </w:t>
-      </w:r>
-      <w:r>
-        <w:rPr>
-          <w:b/>
-          <w:bCs/>
-        </w:rPr>
-        <w:t xml:space="preserve">@Service </w:t>
-      </w:r>
-      <w:r>
-        <w:t>nuevamente.</w:t>
-      </w:r>
-    </w:p>
-    <w:p>
-      <w:pPr>
-        <w:pStyle w:val="Ttulo4"/>
-      </w:pPr>
-      <w:r>
-        <w:t>Funcionamiento</w:t>
-      </w:r>
-    </w:p>
-    <w:p>
-      <w:r>
-        <w:t xml:space="preserve">Ahora sí, para la prueba de funcionamiento, ya que todavía no contamos con una interfaz gráfica en el </w:t>
-      </w:r>
-      <w:proofErr w:type="spellStart"/>
-      <w:r>
-        <w:rPr>
-          <w:b/>
-          <w:bCs/>
-        </w:rPr>
-        <w:t>frontend</w:t>
-      </w:r>
-      <w:proofErr w:type="spellEnd"/>
-      <w:r>
-        <w:t xml:space="preserve">, utilizamos la herramienta </w:t>
-      </w:r>
-      <w:proofErr w:type="spellStart"/>
-      <w:r>
-        <w:rPr>
-          <w:b/>
-          <w:bCs/>
-        </w:rPr>
-        <w:t>Postman</w:t>
-      </w:r>
-      <w:proofErr w:type="spellEnd"/>
-      <w:r>
-        <w:t xml:space="preserve">, en la cual mandamos la siguiente petición a la </w:t>
-      </w:r>
-      <w:r>
-        <w:rPr>
-          <w:b/>
-          <w:bCs/>
-        </w:rPr>
-        <w:t>API.</w:t>
-      </w:r>
-    </w:p>
-    <w:p>
-      <w:r>
-        <w:rPr>
-          <w:noProof/>
-        </w:rPr>
         <w:drawing>
           <wp:inline distT="0" distB="0" distL="0" distR="0" wp14:anchorId="6BCB94B5" wp14:editId="31381EAD">
             <wp:extent cx="5943600" cy="2371090"/>
@@ -4447,7 +4641,6 @@
     </w:p>
     <w:p>
       <w:r>
-        <w:lastRenderedPageBreak/>
         <w:t xml:space="preserve">Y se </w:t>
       </w:r>
       <w:r>
@@ -4568,6 +4761,7 @@
     </w:p>
     <w:p>
       <w:r>
+        <w:lastRenderedPageBreak/>
         <w:t xml:space="preserve">En nuestro caso, este patrón se utiliza principalmente en Spring Security para la creación de </w:t>
       </w:r>
       <w:proofErr w:type="spellStart"/>
@@ -4624,7 +4818,6 @@
         <w:pStyle w:val="Ttulo3"/>
       </w:pPr>
       <w:r>
-        <w:lastRenderedPageBreak/>
         <w:t>Diagrama de Clases UML</w:t>
       </w:r>
     </w:p>
@@ -4636,6 +4829,7 @@
       </w:pPr>
       <w:r>
         <w:rPr>
+          <w:noProof/>
           <w:lang w:val="en-US"/>
         </w:rPr>
         <w:drawing>
@@ -4779,6 +4973,7 @@
           <w:bCs/>
           <w:noProof/>
         </w:rPr>
+        <w:lastRenderedPageBreak/>
         <w:drawing>
           <wp:inline distT="0" distB="0" distL="0" distR="0" wp14:anchorId="5967A4D5" wp14:editId="4D982305">
             <wp:extent cx="5943600" cy="2326005"/>
@@ -4846,7 +5041,6 @@
           <w:bCs/>
           <w:noProof/>
         </w:rPr>
-        <w:lastRenderedPageBreak/>
         <w:drawing>
           <wp:inline distT="0" distB="0" distL="0" distR="0" wp14:anchorId="2CE39E17" wp14:editId="11D974B8">
             <wp:extent cx="5943600" cy="4246880"/>
@@ -4898,6 +5092,7 @@
           <w:bCs/>
           <w:noProof/>
         </w:rPr>
+        <w:lastRenderedPageBreak/>
         <w:drawing>
           <wp:inline distT="0" distB="0" distL="0" distR="0" wp14:anchorId="2FF49B68" wp14:editId="45726220">
             <wp:extent cx="5943600" cy="1198245"/>
@@ -5008,376 +5203,376 @@
         <w:pStyle w:val="Ttulo3"/>
       </w:pPr>
       <w:r>
+        <w:t>Explicación y Prueba de que Funciona</w:t>
+      </w:r>
+    </w:p>
+    <w:p>
+      <w:pPr>
+        <w:pStyle w:val="Ttulo4"/>
+      </w:pPr>
+      <w:proofErr w:type="spellStart"/>
+      <w:r>
+        <w:t>PasswordEncoder</w:t>
+      </w:r>
+      <w:proofErr w:type="spellEnd"/>
+      <w:r>
+        <w:t xml:space="preserve"> </w:t>
+      </w:r>
+      <w:r>
+        <w:rPr>
+          <w:lang w:val="en-US"/>
+        </w:rPr>
+        <w:t>(</w:t>
+      </w:r>
+      <w:r>
+        <w:t>Producto</w:t>
+      </w:r>
+      <w:r>
+        <w:t>)</w:t>
+      </w:r>
+    </w:p>
+    <w:p>
+      <w:r>
+        <w:t xml:space="preserve">Este componente representa el </w:t>
+      </w:r>
+      <w:r>
+        <w:rPr>
+          <w:b/>
+          <w:bCs/>
+        </w:rPr>
+        <w:t>producto</w:t>
+      </w:r>
+      <w:r>
+        <w:t xml:space="preserve"> dentro del patrón </w:t>
+      </w:r>
+      <w:r>
+        <w:rPr>
+          <w:b/>
+          <w:bCs/>
+        </w:rPr>
+        <w:t>Factory Method</w:t>
+      </w:r>
+      <w:r>
+        <w:t xml:space="preserve">. </w:t>
+      </w:r>
+      <w:proofErr w:type="spellStart"/>
+      <w:r>
+        <w:rPr>
+          <w:b/>
+          <w:bCs/>
+        </w:rPr>
+        <w:t>PasswordEncoder</w:t>
+      </w:r>
+      <w:proofErr w:type="spellEnd"/>
+      <w:r>
+        <w:t xml:space="preserve"> es una abstracción proporcionada por Spring Security que define las operaciones necesarias para trabajar con las contraseñas. Al utilizar esta abstracción, el resto del sistema no necesita conocer qué algoritmo concreto se está utilizando para realizar el cifrado.</w:t>
+      </w:r>
+    </w:p>
+    <w:p>
+      <w:pPr>
+        <w:pStyle w:val="Ttulo4"/>
+      </w:pPr>
+      <w:proofErr w:type="spellStart"/>
+      <w:r>
+        <w:t>BCryptPasswordEncoder</w:t>
+      </w:r>
+      <w:proofErr w:type="spellEnd"/>
+      <w:r>
+        <w:t xml:space="preserve"> </w:t>
+      </w:r>
+      <w:r>
+        <w:t>(</w:t>
+      </w:r>
+      <w:r>
+        <w:t>Producto Concreto</w:t>
+      </w:r>
+      <w:r>
+        <w:t>)</w:t>
+      </w:r>
+    </w:p>
+    <w:p>
+      <w:r>
+        <w:t xml:space="preserve">Esta clase representa el </w:t>
+      </w:r>
+      <w:r>
+        <w:rPr>
+          <w:b/>
+          <w:bCs/>
+        </w:rPr>
+        <w:t>producto concreto</w:t>
+      </w:r>
+      <w:r>
+        <w:t xml:space="preserve">, ya que es una implementación específica de </w:t>
+      </w:r>
+      <w:proofErr w:type="spellStart"/>
+      <w:r>
+        <w:rPr>
+          <w:b/>
+          <w:bCs/>
+        </w:rPr>
+        <w:t>PasswordEncoder</w:t>
+      </w:r>
+      <w:proofErr w:type="spellEnd"/>
+      <w:r>
+        <w:t xml:space="preserve">. En nuestro proyecto utilizamos </w:t>
+      </w:r>
+      <w:proofErr w:type="spellStart"/>
+      <w:r>
+        <w:rPr>
+          <w:b/>
+          <w:bCs/>
+        </w:rPr>
+        <w:t>BCrypt</w:t>
+      </w:r>
+      <w:proofErr w:type="spellEnd"/>
+      <w:r>
+        <w:t xml:space="preserve"> para realizar el procesamiento seguro de las contraseñas, pero gracias a que trabajamos con la abstracción </w:t>
+      </w:r>
+      <w:proofErr w:type="spellStart"/>
+      <w:r>
+        <w:rPr>
+          <w:b/>
+          <w:bCs/>
+        </w:rPr>
+        <w:t>PasswordEncoder</w:t>
+      </w:r>
+      <w:proofErr w:type="spellEnd"/>
+      <w:r>
+        <w:t>, esta implementación podría ser reemplazada por otra sin modificar los componentes que la utilizan.</w:t>
+      </w:r>
+    </w:p>
+    <w:p>
+      <w:pPr>
+        <w:pStyle w:val="Ttulo4"/>
+      </w:pPr>
+      <w:proofErr w:type="spellStart"/>
+      <w:r>
+        <w:t>SecurityConfig</w:t>
+      </w:r>
+      <w:proofErr w:type="spellEnd"/>
+      <w:r>
+        <w:t xml:space="preserve"> </w:t>
+      </w:r>
+      <w:r>
+        <w:t>(</w:t>
+      </w:r>
+      <w:r>
+        <w:t>Fábrica</w:t>
+      </w:r>
+      <w:r>
+        <w:t>)</w:t>
+      </w:r>
+    </w:p>
+    <w:p>
+      <w:r>
+        <w:t xml:space="preserve">En esta clase se encuentra la </w:t>
+      </w:r>
+      <w:r>
+        <w:rPr>
+          <w:b/>
+          <w:bCs/>
+        </w:rPr>
+        <w:t>fábrica del patrón</w:t>
+      </w:r>
+      <w:r>
+        <w:t xml:space="preserve">, ya que mediante el contenedor de Spring se define el método encargado de crear el </w:t>
+      </w:r>
+      <w:proofErr w:type="spellStart"/>
+      <w:r>
+        <w:rPr>
+          <w:b/>
+          <w:bCs/>
+        </w:rPr>
+        <w:t>PasswordEncoder</w:t>
+      </w:r>
+      <w:proofErr w:type="spellEnd"/>
+      <w:r>
+        <w:t xml:space="preserve">. Spring toma el objeto creado mediante este método y lo registra como un </w:t>
+      </w:r>
+      <w:proofErr w:type="spellStart"/>
+      <w:r>
+        <w:rPr>
+          <w:b/>
+          <w:bCs/>
+        </w:rPr>
+        <w:t>Bean</w:t>
+      </w:r>
+      <w:proofErr w:type="spellEnd"/>
+      <w:r>
+        <w:t>, permitiendo posteriormente que sea utilizado mediante inyección de dependencias en los componentes que lo necesiten.</w:t>
+      </w:r>
+    </w:p>
+    <w:p>
+      <w:pPr>
+        <w:pStyle w:val="Ttulo4"/>
+      </w:pPr>
+      <w:proofErr w:type="spellStart"/>
+      <w:r>
         <w:lastRenderedPageBreak/>
-        <w:t>Explicación y Prueba de que Funciona</w:t>
+        <w:t>AuthenticationManager</w:t>
+      </w:r>
+      <w:proofErr w:type="spellEnd"/>
+      <w:r>
+        <w:t xml:space="preserve"> </w:t>
+      </w:r>
+      <w:r>
+        <w:t>(</w:t>
+      </w:r>
+      <w:r>
+        <w:t>Consumidor</w:t>
+      </w:r>
+      <w:r>
+        <w:t>)</w:t>
+      </w:r>
+    </w:p>
+    <w:p>
+      <w:r>
+        <w:t xml:space="preserve">Este componente representa el </w:t>
+      </w:r>
+      <w:r>
+        <w:rPr>
+          <w:b/>
+          <w:bCs/>
+        </w:rPr>
+        <w:t>consumidor</w:t>
+      </w:r>
+      <w:r>
+        <w:t xml:space="preserve"> del </w:t>
+      </w:r>
+      <w:r>
+        <w:rPr>
+          <w:b/>
+          <w:bCs/>
+        </w:rPr>
+        <w:t>producto</w:t>
+      </w:r>
+      <w:r>
+        <w:t xml:space="preserve">, ya que necesita un </w:t>
+      </w:r>
+      <w:proofErr w:type="spellStart"/>
+      <w:r>
+        <w:rPr>
+          <w:b/>
+          <w:bCs/>
+        </w:rPr>
+        <w:t>PasswordEncoder</w:t>
+      </w:r>
+      <w:proofErr w:type="spellEnd"/>
+      <w:r>
+        <w:t xml:space="preserve"> para realizar el proceso de autenticación. Lo importante es que </w:t>
+      </w:r>
+      <w:proofErr w:type="spellStart"/>
+      <w:r>
+        <w:rPr>
+          <w:b/>
+          <w:bCs/>
+        </w:rPr>
+        <w:t>AuthenticationManager</w:t>
+      </w:r>
+      <w:proofErr w:type="spellEnd"/>
+      <w:r>
+        <w:t xml:space="preserve"> trabaja con la abstracción </w:t>
+      </w:r>
+      <w:proofErr w:type="spellStart"/>
+      <w:r>
+        <w:rPr>
+          <w:b/>
+          <w:bCs/>
+        </w:rPr>
+        <w:t>PasswordEncoder</w:t>
+      </w:r>
+      <w:proofErr w:type="spellEnd"/>
+      <w:r>
+        <w:t xml:space="preserve"> y no necesita conocer directamente a </w:t>
+      </w:r>
+      <w:proofErr w:type="spellStart"/>
+      <w:r>
+        <w:rPr>
+          <w:b/>
+          <w:bCs/>
+        </w:rPr>
+        <w:t>BCryptPasswordEncoder</w:t>
+      </w:r>
+      <w:proofErr w:type="spellEnd"/>
+      <w:r>
+        <w:t>, demostrando, así como el Factory Method ayuda a reducir el acoplamiento entre ambos componentes.</w:t>
       </w:r>
     </w:p>
     <w:p>
       <w:pPr>
         <w:pStyle w:val="Ttulo4"/>
       </w:pPr>
+      <w:r>
+        <w:t>Funcionamiento</w:t>
+      </w:r>
+    </w:p>
+    <w:p>
+      <w:r>
+        <w:t xml:space="preserve">Ahora sí, para la prueba de funcionamiento, ya que todavía no contamos con una interfaz gráfica en el </w:t>
+      </w:r>
       <w:proofErr w:type="spellStart"/>
       <w:r>
-        <w:t>PasswordEncoder</w:t>
+        <w:rPr>
+          <w:b/>
+          <w:bCs/>
+        </w:rPr>
+        <w:t>frontend</w:t>
       </w:r>
       <w:proofErr w:type="spellEnd"/>
       <w:r>
+        <w:t xml:space="preserve">, utilizamos la herramienta </w:t>
+      </w:r>
+      <w:proofErr w:type="spellStart"/>
+      <w:r>
+        <w:rPr>
+          <w:b/>
+          <w:bCs/>
+        </w:rPr>
+        <w:t>Postman</w:t>
+      </w:r>
+      <w:proofErr w:type="spellEnd"/>
+      <w:r>
+        <w:t xml:space="preserve">, en la cual mandamos la siguiente petición a la </w:t>
+      </w:r>
+      <w:r>
+        <w:rPr>
+          <w:b/>
+          <w:bCs/>
+        </w:rPr>
+        <w:t>API.</w:t>
+      </w:r>
+    </w:p>
+    <w:p>
+      <w:r>
+        <w:rPr>
+          <w:b/>
+          <w:bCs/>
+        </w:rPr>
+        <w:t xml:space="preserve">NOTA: </w:t>
+      </w:r>
+      <w:r>
+        <w:t xml:space="preserve">Cabe resaltar que para esta prueba de autenticación del usuario </w:t>
+      </w:r>
+      <w:r>
+        <w:t>ya había un usuario creado en base de datos y trabajamos con</w:t>
+      </w:r>
+      <w:r>
+        <w:rPr>
+          <w:b/>
+          <w:bCs/>
+        </w:rPr>
         <w:t xml:space="preserve"> </w:t>
       </w:r>
-      <w:r>
-        <w:rPr>
-          <w:lang w:val="en-US"/>
-        </w:rPr>
-        <w:t>(</w:t>
-      </w:r>
-      <w:r>
-        <w:t>Producto</w:t>
-      </w:r>
-      <w:r>
-        <w:t>)</w:t>
-      </w:r>
-    </w:p>
-    <w:p>
-      <w:r>
-        <w:t xml:space="preserve">Este componente representa el </w:t>
-      </w:r>
-      <w:r>
-        <w:rPr>
-          <w:b/>
-          <w:bCs/>
-        </w:rPr>
-        <w:t>producto</w:t>
-      </w:r>
-      <w:r>
-        <w:t xml:space="preserve"> dentro del patrón </w:t>
-      </w:r>
-      <w:r>
-        <w:rPr>
-          <w:b/>
-          <w:bCs/>
-        </w:rPr>
-        <w:t>Factory Method</w:t>
-      </w:r>
-      <w:r>
-        <w:t xml:space="preserve">. </w:t>
-      </w:r>
       <w:proofErr w:type="spellStart"/>
       <w:r>
         <w:rPr>
           <w:b/>
           <w:bCs/>
         </w:rPr>
-        <w:t>PasswordEncoder</w:t>
+        <w:t>Json</w:t>
       </w:r>
       <w:proofErr w:type="spellEnd"/>
       <w:r>
-        <w:t xml:space="preserve"> es una abstracción proporcionada por Spring Security que define las operaciones necesarias para trabajar con las contraseñas. Al utilizar esta abstracción, el resto del sistema no necesita conocer qué algoritmo concreto se está utilizando para realizar el cifrado.</w:t>
-      </w:r>
-    </w:p>
-    <w:p>
-      <w:pPr>
-        <w:pStyle w:val="Ttulo4"/>
-      </w:pPr>
-      <w:proofErr w:type="spellStart"/>
-      <w:r>
-        <w:t>BCryptPasswordEncoder</w:t>
-      </w:r>
-      <w:proofErr w:type="spellEnd"/>
-      <w:r>
-        <w:t xml:space="preserve"> </w:t>
-      </w:r>
-      <w:r>
-        <w:t>(</w:t>
-      </w:r>
-      <w:r>
-        <w:t>Producto Concreto</w:t>
-      </w:r>
-      <w:r>
-        <w:t>)</w:t>
-      </w:r>
-    </w:p>
-    <w:p>
-      <w:r>
-        <w:t xml:space="preserve">Esta clase representa el </w:t>
-      </w:r>
-      <w:r>
-        <w:rPr>
-          <w:b/>
-          <w:bCs/>
-        </w:rPr>
-        <w:t>producto concreto</w:t>
-      </w:r>
-      <w:r>
-        <w:t xml:space="preserve">, ya que es una implementación específica de </w:t>
-      </w:r>
-      <w:proofErr w:type="spellStart"/>
-      <w:r>
-        <w:rPr>
-          <w:b/>
-          <w:bCs/>
-        </w:rPr>
-        <w:t>PasswordEncoder</w:t>
-      </w:r>
-      <w:proofErr w:type="spellEnd"/>
-      <w:r>
-        <w:t xml:space="preserve">. En nuestro proyecto utilizamos </w:t>
-      </w:r>
-      <w:proofErr w:type="spellStart"/>
-      <w:r>
-        <w:rPr>
-          <w:b/>
-          <w:bCs/>
-        </w:rPr>
-        <w:t>BCrypt</w:t>
-      </w:r>
-      <w:proofErr w:type="spellEnd"/>
-      <w:r>
-        <w:t xml:space="preserve"> para realizar el procesamiento seguro de las contraseñas, pero gracias a que trabajamos con la abstracción </w:t>
-      </w:r>
-      <w:proofErr w:type="spellStart"/>
-      <w:r>
-        <w:rPr>
-          <w:b/>
-          <w:bCs/>
-        </w:rPr>
-        <w:t>PasswordEncoder</w:t>
-      </w:r>
-      <w:proofErr w:type="spellEnd"/>
-      <w:r>
-        <w:t>, esta implementación podría ser reemplazada por otra sin modificar los componentes que la utilizan.</w:t>
-      </w:r>
-    </w:p>
-    <w:p>
-      <w:pPr>
-        <w:pStyle w:val="Ttulo4"/>
-      </w:pPr>
-      <w:proofErr w:type="spellStart"/>
-      <w:r>
-        <w:t>SecurityConfig</w:t>
-      </w:r>
-      <w:proofErr w:type="spellEnd"/>
-      <w:r>
-        <w:t xml:space="preserve"> </w:t>
-      </w:r>
-      <w:r>
-        <w:t>(</w:t>
-      </w:r>
-      <w:r>
-        <w:t>Fábrica</w:t>
-      </w:r>
-      <w:r>
-        <w:t>)</w:t>
-      </w:r>
-    </w:p>
-    <w:p>
-      <w:r>
-        <w:t xml:space="preserve">En esta clase se encuentra la </w:t>
-      </w:r>
-      <w:r>
-        <w:rPr>
-          <w:b/>
-          <w:bCs/>
-        </w:rPr>
-        <w:t>fábrica del patrón</w:t>
-      </w:r>
-      <w:r>
-        <w:t xml:space="preserve">, ya que mediante el contenedor de Spring se define el método encargado de crear el </w:t>
-      </w:r>
-      <w:proofErr w:type="spellStart"/>
-      <w:r>
-        <w:rPr>
-          <w:b/>
-          <w:bCs/>
-        </w:rPr>
-        <w:t>PasswordEncoder</w:t>
-      </w:r>
-      <w:proofErr w:type="spellEnd"/>
-      <w:r>
-        <w:t xml:space="preserve">. Spring toma el objeto creado mediante este método y lo registra como un </w:t>
-      </w:r>
-      <w:proofErr w:type="spellStart"/>
-      <w:r>
-        <w:rPr>
-          <w:b/>
-          <w:bCs/>
-        </w:rPr>
-        <w:t>Bean</w:t>
-      </w:r>
-      <w:proofErr w:type="spellEnd"/>
-      <w:r>
-        <w:t>, permitiendo posteriormente que sea utilizado mediante inyección de dependencias en los componentes que lo necesiten.</w:t>
-      </w:r>
-    </w:p>
-    <w:p>
-      <w:pPr>
-        <w:pStyle w:val="Ttulo4"/>
-      </w:pPr>
-      <w:proofErr w:type="spellStart"/>
-      <w:r>
-        <w:t>AuthenticationManager</w:t>
-      </w:r>
-      <w:proofErr w:type="spellEnd"/>
-      <w:r>
-        <w:t xml:space="preserve"> </w:t>
-      </w:r>
-      <w:r>
-        <w:t>(</w:t>
-      </w:r>
-      <w:r>
-        <w:t>Consumidor</w:t>
-      </w:r>
-      <w:r>
-        <w:t>)</w:t>
-      </w:r>
-    </w:p>
-    <w:p>
-      <w:r>
-        <w:t xml:space="preserve">Este componente representa el </w:t>
-      </w:r>
-      <w:r>
-        <w:rPr>
-          <w:b/>
-          <w:bCs/>
-        </w:rPr>
-        <w:t>consumidor</w:t>
-      </w:r>
-      <w:r>
-        <w:t xml:space="preserve"> del </w:t>
-      </w:r>
-      <w:r>
-        <w:rPr>
-          <w:b/>
-          <w:bCs/>
-        </w:rPr>
-        <w:t>producto</w:t>
-      </w:r>
-      <w:r>
-        <w:t xml:space="preserve">, ya que necesita un </w:t>
-      </w:r>
-      <w:proofErr w:type="spellStart"/>
-      <w:r>
-        <w:rPr>
-          <w:b/>
-          <w:bCs/>
-        </w:rPr>
-        <w:t>PasswordEncoder</w:t>
-      </w:r>
-      <w:proofErr w:type="spellEnd"/>
-      <w:r>
-        <w:t xml:space="preserve"> para realizar el proceso de autenticación. Lo importante es que </w:t>
-      </w:r>
-      <w:proofErr w:type="spellStart"/>
-      <w:r>
-        <w:rPr>
-          <w:b/>
-          <w:bCs/>
-        </w:rPr>
-        <w:t>AuthenticationManager</w:t>
-      </w:r>
-      <w:proofErr w:type="spellEnd"/>
-      <w:r>
-        <w:t xml:space="preserve"> trabaja con la abstracción </w:t>
-      </w:r>
-      <w:proofErr w:type="spellStart"/>
-      <w:r>
-        <w:rPr>
-          <w:b/>
-          <w:bCs/>
-        </w:rPr>
-        <w:t>PasswordEncoder</w:t>
-      </w:r>
-      <w:proofErr w:type="spellEnd"/>
-      <w:r>
-        <w:t xml:space="preserve"> y no necesita conocer directamente a </w:t>
-      </w:r>
-      <w:proofErr w:type="spellStart"/>
-      <w:r>
-        <w:rPr>
-          <w:b/>
-          <w:bCs/>
-        </w:rPr>
-        <w:t>BCryptPasswordEncoder</w:t>
-      </w:r>
-      <w:proofErr w:type="spellEnd"/>
-      <w:r>
-        <w:t>, demostrando, así como el Factory Method ayuda a reducir el acoplamiento entre ambos componentes.</w:t>
-      </w:r>
-    </w:p>
-    <w:p>
-      <w:pPr>
-        <w:pStyle w:val="Ttulo4"/>
-      </w:pPr>
-      <w:r>
-        <w:t>Funcionamiento</w:t>
-      </w:r>
-    </w:p>
-    <w:p>
-      <w:r>
-        <w:t xml:space="preserve">Ahora sí, para la prueba de funcionamiento, ya que todavía no contamos con una interfaz gráfica en el </w:t>
-      </w:r>
-      <w:proofErr w:type="spellStart"/>
-      <w:r>
-        <w:rPr>
-          <w:b/>
-          <w:bCs/>
-        </w:rPr>
-        <w:t>frontend</w:t>
-      </w:r>
-      <w:proofErr w:type="spellEnd"/>
-      <w:r>
-        <w:t xml:space="preserve">, utilizamos la herramienta </w:t>
-      </w:r>
-      <w:proofErr w:type="spellStart"/>
-      <w:r>
-        <w:rPr>
-          <w:b/>
-          <w:bCs/>
-        </w:rPr>
-        <w:t>Postman</w:t>
-      </w:r>
-      <w:proofErr w:type="spellEnd"/>
-      <w:r>
-        <w:t xml:space="preserve">, en la cual mandamos la siguiente petición a la </w:t>
-      </w:r>
-      <w:r>
-        <w:rPr>
-          <w:b/>
-          <w:bCs/>
-        </w:rPr>
-        <w:t>API.</w:t>
-      </w:r>
-    </w:p>
-    <w:p>
-      <w:r>
-        <w:rPr>
-          <w:b/>
-          <w:bCs/>
-        </w:rPr>
-        <w:t xml:space="preserve">NOTA: </w:t>
-      </w:r>
-      <w:r>
-        <w:t xml:space="preserve">Cabe resaltar que para esta prueba de autenticación del usuario </w:t>
-      </w:r>
-      <w:r>
-        <w:t>ya había un usuario creado en base de datos y trabajamos con</w:t>
-      </w:r>
-      <w:r>
-        <w:rPr>
-          <w:b/>
-          <w:bCs/>
-        </w:rPr>
-        <w:t xml:space="preserve"> </w:t>
-      </w:r>
-      <w:proofErr w:type="spellStart"/>
-      <w:r>
-        <w:rPr>
-          <w:b/>
-          <w:bCs/>
-        </w:rPr>
-        <w:t>Json</w:t>
-      </w:r>
-      <w:proofErr w:type="spellEnd"/>
-      <w:r>
         <w:rPr>
           <w:b/>
           <w:bCs/>
@@ -5390,7 +5585,6 @@
     </w:p>
     <w:p>
       <w:r>
-        <w:lastRenderedPageBreak/>
         <w:t>El usuario creado en la base de datos es el siguiente:</w:t>
       </w:r>
     </w:p>
@@ -5529,6 +5723,7 @@
         </w:rPr>
       </w:pPr>
       <w:r>
+        <w:lastRenderedPageBreak/>
         <w:t xml:space="preserve">Exitosamente la </w:t>
       </w:r>
       <w:r>
@@ -5585,7 +5780,6 @@
         <w:pStyle w:val="Ttulo3"/>
       </w:pPr>
       <w:r>
-        <w:lastRenderedPageBreak/>
         <w:t>Diagrama de Clases UML</w:t>
       </w:r>
     </w:p>
@@ -5665,6 +5859,7 @@
         <w:rPr>
           <w:noProof/>
         </w:rPr>
+        <w:lastRenderedPageBreak/>
         <w:drawing>
           <wp:inline distT="0" distB="0" distL="0" distR="0" wp14:anchorId="352844FC" wp14:editId="769BDC22">
             <wp:extent cx="4448175" cy="2416082"/>
@@ -5726,7 +5921,6 @@
         <w:rPr>
           <w:noProof/>
         </w:rPr>
-        <w:lastRenderedPageBreak/>
         <w:drawing>
           <wp:inline distT="0" distB="0" distL="0" distR="0" wp14:anchorId="34DC3B85" wp14:editId="15BE933A">
             <wp:extent cx="5062655" cy="3762375"/>
@@ -5772,6 +5966,7 @@
         <w:rPr>
           <w:noProof/>
         </w:rPr>
+        <w:lastRenderedPageBreak/>
         <w:drawing>
           <wp:inline distT="0" distB="0" distL="0" distR="0" wp14:anchorId="52FF695D" wp14:editId="1F2ABA3C">
             <wp:extent cx="4819650" cy="2053500"/>
@@ -5817,7 +6012,6 @@
         <w:rPr>
           <w:noProof/>
         </w:rPr>
-        <w:lastRenderedPageBreak/>
         <w:drawing>
           <wp:inline distT="0" distB="0" distL="0" distR="0" wp14:anchorId="2474CBC7" wp14:editId="16CB14E7">
             <wp:extent cx="4886325" cy="1970713"/>
@@ -5921,6 +6115,7 @@
         <w:rPr>
           <w:noProof/>
         </w:rPr>
+        <w:lastRenderedPageBreak/>
         <w:drawing>
           <wp:inline distT="0" distB="0" distL="0" distR="0" wp14:anchorId="5B52A8C3" wp14:editId="25DA4955">
             <wp:extent cx="5943600" cy="2004695"/>
@@ -6011,7 +6206,6 @@
         <w:rPr>
           <w:noProof/>
         </w:rPr>
-        <w:lastRenderedPageBreak/>
         <w:drawing>
           <wp:inline distT="0" distB="0" distL="0" distR="0" wp14:anchorId="6409BE82" wp14:editId="14230D7D">
             <wp:extent cx="4498141" cy="3019425"/>
@@ -6097,6 +6291,7 @@
         <w:pStyle w:val="Ttulo4"/>
       </w:pPr>
       <w:r>
+        <w:lastRenderedPageBreak/>
         <w:t>JwtBuilder (Interfaz)</w:t>
       </w:r>
     </w:p>
@@ -6288,7 +6483,6 @@
         <w:pStyle w:val="Ttulo4"/>
       </w:pPr>
       <w:r>
-        <w:lastRenderedPageBreak/>
         <w:t>Funcionamiento</w:t>
       </w:r>
     </w:p>

</xml_diff>

<commit_message>
Implementacion del patron Adapter
</commit_message>
<xml_diff>
--- a/Sistema de Gestion de Cadenas de Suministro.docx
+++ b/Sistema de Gestion de Cadenas de Suministro.docx
@@ -3728,6 +3728,15 @@
       <w:pPr>
         <w:pStyle w:val="Ttulo2"/>
       </w:pPr>
+      <w:r>
+        <w:lastRenderedPageBreak/>
+        <w:t>Creacionales</w:t>
+      </w:r>
+    </w:p>
+    <w:p>
+      <w:pPr>
+        <w:pStyle w:val="Ttulo3"/>
+      </w:pPr>
       <w:bookmarkStart w:id="24" w:name="_Toc239179236"/>
       <w:r>
         <w:t>Aplicación del Patrón Singleton</w:t>
@@ -3736,7 +3745,7 @@
     </w:p>
     <w:p>
       <w:pPr>
-        <w:pStyle w:val="Ttulo3"/>
+        <w:pStyle w:val="Ttulo4"/>
       </w:pPr>
       <w:bookmarkStart w:id="25" w:name="_Toc239179238"/>
       <w:bookmarkStart w:id="26" w:name="_Toc239179237"/>
@@ -3775,259 +3784,256 @@
       </w:r>
       <w:proofErr w:type="spellEnd"/>
       <w:r>
-        <w:t xml:space="preserve"> que nosotros estamos </w:t>
-      </w:r>
+        <w:t xml:space="preserve"> que nosotros estamos usando para este proyecto, es </w:t>
+      </w:r>
+      <w:r>
+        <w:rPr>
+          <w:b/>
+          <w:bCs/>
+        </w:rPr>
+        <w:t>Spring Framework</w:t>
+      </w:r>
+      <w:r>
+        <w:t xml:space="preserve">, es un </w:t>
+      </w:r>
+      <w:proofErr w:type="spellStart"/>
+      <w:r>
+        <w:t>framework</w:t>
+      </w:r>
+      <w:proofErr w:type="spellEnd"/>
+      <w:r>
+        <w:t xml:space="preserve"> de Java que en conjunto con la herramienta </w:t>
+      </w:r>
+      <w:r>
+        <w:rPr>
+          <w:b/>
+          <w:bCs/>
+        </w:rPr>
+        <w:t xml:space="preserve">Spring </w:t>
+      </w:r>
+      <w:proofErr w:type="spellStart"/>
+      <w:r>
+        <w:rPr>
+          <w:b/>
+          <w:bCs/>
+        </w:rPr>
+        <w:t>Boot</w:t>
+      </w:r>
+      <w:proofErr w:type="spellEnd"/>
+      <w:r>
+        <w:rPr>
+          <w:b/>
+          <w:bCs/>
+        </w:rPr>
+        <w:t xml:space="preserve"> </w:t>
+      </w:r>
+      <w:r>
+        <w:t xml:space="preserve">ayudan a crear muchos tipos diferentes de sistemas de una manera sencilla. </w:t>
+      </w:r>
+      <w:r>
+        <w:rPr>
+          <w:b/>
+          <w:bCs/>
+        </w:rPr>
+        <w:t>Spring</w:t>
+      </w:r>
+      <w:r>
+        <w:t xml:space="preserve">, internamente maneja </w:t>
+      </w:r>
+      <w:proofErr w:type="spellStart"/>
+      <w:r>
+        <w:rPr>
+          <w:b/>
+          <w:bCs/>
+        </w:rPr>
+        <w:t>Beans</w:t>
+      </w:r>
+      <w:proofErr w:type="spellEnd"/>
+      <w:r>
+        <w:t xml:space="preserve">, los cuales son objetos que son instanciados, configurados y gestionados por un contenedor llamado </w:t>
+      </w:r>
+      <w:r>
+        <w:rPr>
+          <w:b/>
+          <w:bCs/>
+        </w:rPr>
+        <w:t>Inversión de Control (</w:t>
+      </w:r>
+      <w:proofErr w:type="spellStart"/>
+      <w:r>
+        <w:rPr>
+          <w:b/>
+          <w:bCs/>
+        </w:rPr>
+        <w:t>IoC</w:t>
+      </w:r>
+      <w:proofErr w:type="spellEnd"/>
+      <w:r>
+        <w:rPr>
+          <w:b/>
+          <w:bCs/>
+        </w:rPr>
+        <w:t>)</w:t>
+      </w:r>
+      <w:r>
+        <w:t xml:space="preserve">. Estos </w:t>
+      </w:r>
+      <w:proofErr w:type="spellStart"/>
+      <w:r>
+        <w:rPr>
+          <w:b/>
+          <w:bCs/>
+        </w:rPr>
+        <w:t>Beans</w:t>
+      </w:r>
+      <w:proofErr w:type="spellEnd"/>
+      <w:r>
+        <w:rPr>
+          <w:b/>
+          <w:bCs/>
+        </w:rPr>
+        <w:t xml:space="preserve"> </w:t>
+      </w:r>
+      <w:r>
+        <w:t xml:space="preserve">pueden estar divididos en diferentes tipos según el uso que se le vaya a dar, para este caso, tenemos los </w:t>
+      </w:r>
+      <w:r>
+        <w:rPr>
+          <w:b/>
+          <w:bCs/>
+        </w:rPr>
+        <w:t>@RestControllers, @Services</w:t>
+      </w:r>
+      <w:r>
+        <w:t xml:space="preserve"> y </w:t>
+      </w:r>
+      <w:r>
+        <w:rPr>
+          <w:b/>
+          <w:bCs/>
+        </w:rPr>
+        <w:t>@Component</w:t>
+      </w:r>
+      <w:r>
+        <w:t xml:space="preserve">. El contenedor </w:t>
+      </w:r>
+      <w:proofErr w:type="spellStart"/>
+      <w:r>
+        <w:rPr>
+          <w:b/>
+          <w:bCs/>
+        </w:rPr>
+        <w:t>IoC</w:t>
+      </w:r>
+      <w:proofErr w:type="spellEnd"/>
+      <w:r>
+        <w:t xml:space="preserve"> internamente </w:t>
+      </w:r>
+      <w:r>
+        <w:rPr>
+          <w:b/>
+          <w:bCs/>
+        </w:rPr>
+        <w:t xml:space="preserve">aplica el patrón </w:t>
+      </w:r>
+      <w:proofErr w:type="spellStart"/>
+      <w:r>
+        <w:rPr>
+          <w:b/>
+          <w:bCs/>
+        </w:rPr>
+        <w:t>singleton</w:t>
+      </w:r>
+      <w:proofErr w:type="spellEnd"/>
+      <w:r>
+        <w:t xml:space="preserve"> para dar una </w:t>
+      </w:r>
+      <w:r>
+        <w:rPr>
+          <w:b/>
+          <w:bCs/>
+        </w:rPr>
+        <w:t>mayor eficiencia de memoria</w:t>
+      </w:r>
+      <w:r>
+        <w:t xml:space="preserve"> haciendo que para cada </w:t>
+      </w:r>
+      <w:proofErr w:type="spellStart"/>
+      <w:r>
+        <w:rPr>
+          <w:b/>
+          <w:bCs/>
+        </w:rPr>
+        <w:t>Bean</w:t>
+      </w:r>
+      <w:proofErr w:type="spellEnd"/>
+      <w:r>
+        <w:t xml:space="preserve"> que se vaya a instanciar y gestionar, se maneje una </w:t>
+      </w:r>
+      <w:r>
+        <w:rPr>
+          <w:b/>
+          <w:bCs/>
+        </w:rPr>
+        <w:t>única instancia compartida</w:t>
+      </w:r>
+      <w:r>
+        <w:t xml:space="preserve"> y que también por medio de ello se pueda aplicar el patrón de diseño de </w:t>
+      </w:r>
+      <w:r>
+        <w:rPr>
+          <w:b/>
+          <w:bCs/>
+        </w:rPr>
+        <w:t>inyección de dependencias.</w:t>
+      </w:r>
+    </w:p>
+    <w:p>
+      <w:r>
+        <w:t xml:space="preserve">Aplicar este patrón aquí es muy importante ya que como dijimos anteriormente, permite tener una mayor eficiencia de memoria, aplicar principios como la inyección de dependencias (lo cual es muy importante en Spring) y otras cosas como tener una mayor velocidad de respuesta y que el </w:t>
+      </w:r>
+      <w:proofErr w:type="spellStart"/>
+      <w:r>
+        <w:rPr>
+          <w:b/>
+          <w:bCs/>
+        </w:rPr>
+        <w:t>Garbage</w:t>
+      </w:r>
+      <w:proofErr w:type="spellEnd"/>
+      <w:r>
+        <w:rPr>
+          <w:b/>
+          <w:bCs/>
+        </w:rPr>
+        <w:t xml:space="preserve"> </w:t>
+      </w:r>
+      <w:proofErr w:type="spellStart"/>
+      <w:r>
+        <w:rPr>
+          <w:b/>
+          <w:bCs/>
+        </w:rPr>
+        <w:t>Collection</w:t>
+      </w:r>
+      <w:proofErr w:type="spellEnd"/>
+      <w:r>
+        <w:rPr>
+          <w:b/>
+          <w:bCs/>
+        </w:rPr>
+        <w:t xml:space="preserve"> </w:t>
+      </w:r>
+      <w:r>
+        <w:t>de Java trabaje de una manera mucho más eficiente mejorando el rendimiento global.</w:t>
+      </w:r>
+    </w:p>
+    <w:p>
+      <w:pPr>
+        <w:pStyle w:val="Ttulo4"/>
+      </w:pPr>
       <w:r>
         <w:lastRenderedPageBreak/>
-        <w:t xml:space="preserve">usando para este proyecto, es </w:t>
-      </w:r>
-      <w:r>
-        <w:rPr>
-          <w:b/>
-          <w:bCs/>
-        </w:rPr>
-        <w:t>Spring Framework</w:t>
-      </w:r>
-      <w:r>
-        <w:t xml:space="preserve">, es un </w:t>
-      </w:r>
-      <w:proofErr w:type="spellStart"/>
-      <w:r>
-        <w:t>framework</w:t>
-      </w:r>
-      <w:proofErr w:type="spellEnd"/>
-      <w:r>
-        <w:t xml:space="preserve"> de Java que en conjunto con la herramienta </w:t>
-      </w:r>
-      <w:r>
-        <w:rPr>
-          <w:b/>
-          <w:bCs/>
-        </w:rPr>
-        <w:t xml:space="preserve">Spring </w:t>
-      </w:r>
-      <w:proofErr w:type="spellStart"/>
-      <w:r>
-        <w:rPr>
-          <w:b/>
-          <w:bCs/>
-        </w:rPr>
-        <w:t>Boot</w:t>
-      </w:r>
-      <w:proofErr w:type="spellEnd"/>
-      <w:r>
-        <w:rPr>
-          <w:b/>
-          <w:bCs/>
-        </w:rPr>
-        <w:t xml:space="preserve"> </w:t>
-      </w:r>
-      <w:r>
-        <w:t xml:space="preserve">ayudan a crear muchos tipos diferentes de sistemas de una manera sencilla. </w:t>
-      </w:r>
-      <w:r>
-        <w:rPr>
-          <w:b/>
-          <w:bCs/>
-        </w:rPr>
-        <w:t>Spring</w:t>
-      </w:r>
-      <w:r>
-        <w:t xml:space="preserve">, internamente maneja </w:t>
-      </w:r>
-      <w:proofErr w:type="spellStart"/>
-      <w:r>
-        <w:rPr>
-          <w:b/>
-          <w:bCs/>
-        </w:rPr>
-        <w:t>Beans</w:t>
-      </w:r>
-      <w:proofErr w:type="spellEnd"/>
-      <w:r>
-        <w:t xml:space="preserve">, los cuales son objetos que son instanciados, configurados y gestionados por un contenedor llamado </w:t>
-      </w:r>
-      <w:r>
-        <w:rPr>
-          <w:b/>
-          <w:bCs/>
-        </w:rPr>
-        <w:t>Inversión de Control (</w:t>
-      </w:r>
-      <w:proofErr w:type="spellStart"/>
-      <w:r>
-        <w:rPr>
-          <w:b/>
-          <w:bCs/>
-        </w:rPr>
-        <w:t>IoC</w:t>
-      </w:r>
-      <w:proofErr w:type="spellEnd"/>
-      <w:r>
-        <w:rPr>
-          <w:b/>
-          <w:bCs/>
-        </w:rPr>
-        <w:t>)</w:t>
-      </w:r>
-      <w:r>
-        <w:t xml:space="preserve">. Estos </w:t>
-      </w:r>
-      <w:proofErr w:type="spellStart"/>
-      <w:r>
-        <w:rPr>
-          <w:b/>
-          <w:bCs/>
-        </w:rPr>
-        <w:t>Beans</w:t>
-      </w:r>
-      <w:proofErr w:type="spellEnd"/>
-      <w:r>
-        <w:rPr>
-          <w:b/>
-          <w:bCs/>
-        </w:rPr>
-        <w:t xml:space="preserve"> </w:t>
-      </w:r>
-      <w:r>
-        <w:t xml:space="preserve">pueden estar divididos en diferentes tipos según el uso que se le vaya a dar, para este caso, tenemos los </w:t>
-      </w:r>
-      <w:r>
-        <w:rPr>
-          <w:b/>
-          <w:bCs/>
-        </w:rPr>
-        <w:t>@RestControllers, @Services</w:t>
-      </w:r>
-      <w:r>
-        <w:t xml:space="preserve"> y </w:t>
-      </w:r>
-      <w:r>
-        <w:rPr>
-          <w:b/>
-          <w:bCs/>
-        </w:rPr>
-        <w:t>@Component</w:t>
-      </w:r>
-      <w:r>
-        <w:t xml:space="preserve">. El contenedor </w:t>
-      </w:r>
-      <w:proofErr w:type="spellStart"/>
-      <w:r>
-        <w:rPr>
-          <w:b/>
-          <w:bCs/>
-        </w:rPr>
-        <w:t>IoC</w:t>
-      </w:r>
-      <w:proofErr w:type="spellEnd"/>
-      <w:r>
-        <w:t xml:space="preserve"> internamente </w:t>
-      </w:r>
-      <w:r>
-        <w:rPr>
-          <w:b/>
-          <w:bCs/>
-        </w:rPr>
-        <w:t xml:space="preserve">aplica el patrón </w:t>
-      </w:r>
-      <w:proofErr w:type="spellStart"/>
-      <w:r>
-        <w:rPr>
-          <w:b/>
-          <w:bCs/>
-        </w:rPr>
-        <w:t>singleton</w:t>
-      </w:r>
-      <w:proofErr w:type="spellEnd"/>
-      <w:r>
-        <w:t xml:space="preserve"> para dar una </w:t>
-      </w:r>
-      <w:r>
-        <w:rPr>
-          <w:b/>
-          <w:bCs/>
-        </w:rPr>
-        <w:t>mayor eficiencia de memoria</w:t>
-      </w:r>
-      <w:r>
-        <w:t xml:space="preserve"> haciendo que para cada </w:t>
-      </w:r>
-      <w:proofErr w:type="spellStart"/>
-      <w:r>
-        <w:rPr>
-          <w:b/>
-          <w:bCs/>
-        </w:rPr>
-        <w:t>Bean</w:t>
-      </w:r>
-      <w:proofErr w:type="spellEnd"/>
-      <w:r>
-        <w:t xml:space="preserve"> que se vaya a instanciar y gestionar, se maneje una </w:t>
-      </w:r>
-      <w:r>
-        <w:rPr>
-          <w:b/>
-          <w:bCs/>
-        </w:rPr>
-        <w:t>única instancia compartida</w:t>
-      </w:r>
-      <w:r>
-        <w:t xml:space="preserve"> y que también por medio de ello se pueda aplicar el patrón de diseño de </w:t>
-      </w:r>
-      <w:r>
-        <w:rPr>
-          <w:b/>
-          <w:bCs/>
-        </w:rPr>
-        <w:t>inyección de dependencias.</w:t>
-      </w:r>
-    </w:p>
-    <w:p>
-      <w:r>
-        <w:t xml:space="preserve">Aplicar este patrón aquí es muy importante ya que como dijimos anteriormente, permite tener una mayor eficiencia de memoria, aplicar principios como la inyección de dependencias (lo cual es muy importante en Spring) y otras cosas como tener una mayor velocidad de respuesta y que el </w:t>
-      </w:r>
-      <w:proofErr w:type="spellStart"/>
-      <w:r>
-        <w:rPr>
-          <w:b/>
-          <w:bCs/>
-        </w:rPr>
-        <w:t>Garbage</w:t>
-      </w:r>
-      <w:proofErr w:type="spellEnd"/>
-      <w:r>
-        <w:rPr>
-          <w:b/>
-          <w:bCs/>
-        </w:rPr>
-        <w:t xml:space="preserve"> </w:t>
-      </w:r>
-      <w:proofErr w:type="spellStart"/>
-      <w:r>
-        <w:rPr>
-          <w:b/>
-          <w:bCs/>
-        </w:rPr>
-        <w:t>Collection</w:t>
-      </w:r>
-      <w:proofErr w:type="spellEnd"/>
-      <w:r>
-        <w:rPr>
-          <w:b/>
-          <w:bCs/>
-        </w:rPr>
-        <w:t xml:space="preserve"> </w:t>
-      </w:r>
-      <w:r>
-        <w:t>de Java trabaje de una manera mucho más eficiente mejorando el rendimiento global.</w:t>
-      </w:r>
-    </w:p>
-    <w:p>
-      <w:pPr>
-        <w:pStyle w:val="Ttulo3"/>
-      </w:pPr>
-      <w:r>
         <w:t>Diagrama de Clases UML</w:t>
       </w:r>
     </w:p>
@@ -4076,10 +4082,9 @@
     <w:bookmarkEnd w:id="26"/>
     <w:p>
       <w:pPr>
-        <w:pStyle w:val="Ttulo3"/>
-      </w:pPr>
-      <w:r>
-        <w:lastRenderedPageBreak/>
+        <w:pStyle w:val="Ttulo4"/>
+      </w:pPr>
+      <w:r>
         <w:t>Código</w:t>
       </w:r>
     </w:p>
@@ -4130,6 +4135,7 @@
         <w:rPr>
           <w:noProof/>
         </w:rPr>
+        <w:lastRenderedPageBreak/>
         <w:drawing>
           <wp:inline distT="0" distB="0" distL="0" distR="0" wp14:anchorId="7B191849" wp14:editId="486E0DED">
             <wp:extent cx="5943600" cy="2027555"/>
@@ -4211,42 +4217,264 @@
     </w:p>
     <w:p>
       <w:pPr>
-        <w:pStyle w:val="Ttulo3"/>
+        <w:pStyle w:val="Ttulo4"/>
       </w:pPr>
       <w:bookmarkStart w:id="27" w:name="_Toc239179239"/>
       <w:r>
+        <w:t xml:space="preserve">Explicación y </w:t>
+      </w:r>
+      <w:r>
+        <w:t>Prueba de que Funciona</w:t>
+      </w:r>
+      <w:bookmarkEnd w:id="27"/>
+    </w:p>
+    <w:p>
+      <w:r>
+        <w:t xml:space="preserve">Bueno, </w:t>
+      </w:r>
+      <w:r>
+        <w:t>primeramente,</w:t>
+      </w:r>
+      <w:r>
+        <w:t xml:space="preserve"> daremos una breve explicación de que hace cada parte de la evidencia que adjuntamos en el apartado </w:t>
+      </w:r>
+      <w:r>
+        <w:rPr>
+          <w:b/>
+          <w:bCs/>
+        </w:rPr>
+        <w:t>8.1.</w:t>
+      </w:r>
+      <w:r>
+        <w:rPr>
+          <w:b/>
+          <w:bCs/>
+        </w:rPr>
+        <w:t>2</w:t>
+      </w:r>
+      <w:r>
+        <w:rPr>
+          <w:b/>
+          <w:bCs/>
+        </w:rPr>
+        <w:t xml:space="preserve">. </w:t>
+      </w:r>
+      <w:r>
+        <w:t xml:space="preserve">Es importante resaltar que esta evidencia adjunta </w:t>
+      </w:r>
+      <w:r>
+        <w:t>está</w:t>
+      </w:r>
+      <w:r>
+        <w:t xml:space="preserve"> ubicada en la funcionalidad de </w:t>
+      </w:r>
+      <w:r>
+        <w:rPr>
+          <w:b/>
+          <w:bCs/>
+        </w:rPr>
+        <w:t>creación de proveedores</w:t>
+      </w:r>
+      <w:r>
+        <w:t xml:space="preserve"> en el </w:t>
+      </w:r>
+      <w:proofErr w:type="spellStart"/>
+      <w:r>
+        <w:rPr>
+          <w:b/>
+          <w:bCs/>
+        </w:rPr>
+        <w:t>backend</w:t>
+      </w:r>
+      <w:proofErr w:type="spellEnd"/>
+      <w:r>
+        <w:t xml:space="preserve">. Sin embargo, este patrón </w:t>
+      </w:r>
+      <w:r>
+        <w:t>está</w:t>
+      </w:r>
+      <w:r>
+        <w:t xml:space="preserve"> siendo utilizado en muchas otras partes también. Las evidencias que adjuntamos solo son una parte de todo lo que es esta funcionalidad, pero es, por así decirlo, el núcleo para que funcione.</w:t>
+      </w:r>
+    </w:p>
+    <w:p>
+      <w:pPr>
+        <w:pStyle w:val="Ttulo5"/>
+        <w:rPr>
+          <w:lang w:val="en-US"/>
+        </w:rPr>
+      </w:pPr>
+      <w:r>
+        <w:rPr>
+          <w:lang w:val="en-US"/>
+        </w:rPr>
+        <w:t xml:space="preserve">@RestController </w:t>
+      </w:r>
+      <w:proofErr w:type="spellStart"/>
+      <w:r>
+        <w:rPr>
+          <w:lang w:val="en-US"/>
+        </w:rPr>
+        <w:t>SupplierController</w:t>
+      </w:r>
+      <w:proofErr w:type="spellEnd"/>
+    </w:p>
+    <w:p>
+      <w:r>
+        <w:t xml:space="preserve">Este componente es el </w:t>
+      </w:r>
+      <w:r>
+        <w:t xml:space="preserve">encargado de recibir la petición del usuario por medio del </w:t>
+      </w:r>
+      <w:proofErr w:type="spellStart"/>
+      <w:r>
+        <w:t>endpoint</w:t>
+      </w:r>
+      <w:proofErr w:type="spellEnd"/>
+      <w:r>
+        <w:t xml:space="preserve"> </w:t>
+      </w:r>
+      <w:r>
+        <w:rPr>
+          <w:b/>
+          <w:bCs/>
+        </w:rPr>
+        <w:t>“/api/</w:t>
+      </w:r>
+      <w:proofErr w:type="spellStart"/>
+      <w:r>
+        <w:rPr>
+          <w:b/>
+          <w:bCs/>
+        </w:rPr>
+        <w:t>supplier</w:t>
+      </w:r>
+      <w:proofErr w:type="spellEnd"/>
+      <w:r>
+        <w:rPr>
+          <w:b/>
+          <w:bCs/>
+        </w:rPr>
+        <w:t>”</w:t>
+      </w:r>
+      <w:r>
+        <w:rPr>
+          <w:b/>
+          <w:bCs/>
+        </w:rPr>
+        <w:t xml:space="preserve"> </w:t>
+      </w:r>
+      <w:r>
+        <w:t xml:space="preserve">y dirigir la información al </w:t>
+      </w:r>
+      <w:r>
+        <w:rPr>
+          <w:b/>
+          <w:bCs/>
+        </w:rPr>
+        <w:t>@Service</w:t>
+      </w:r>
+      <w:r>
+        <w:rPr>
+          <w:b/>
+          <w:bCs/>
+        </w:rPr>
+        <w:t xml:space="preserve"> </w:t>
+      </w:r>
+      <w:r>
+        <w:t xml:space="preserve">que se encargara de orquestar el flujo de creación del proveedor. </w:t>
+      </w:r>
+      <w:r>
         <w:lastRenderedPageBreak/>
-        <w:t xml:space="preserve">Explicación y </w:t>
-      </w:r>
-      <w:r>
-        <w:t>Prueba de que Funciona</w:t>
-      </w:r>
-      <w:bookmarkEnd w:id="27"/>
-    </w:p>
-    <w:p>
-      <w:r>
-        <w:t xml:space="preserve">Bueno, </w:t>
-      </w:r>
-      <w:r>
-        <w:t>primeramente,</w:t>
-      </w:r>
-      <w:r>
-        <w:t xml:space="preserve"> daremos una breve explicación de que hace cada parte de la evidencia que adjuntamos en el apartado </w:t>
-      </w:r>
-      <w:r>
-        <w:rPr>
-          <w:b/>
-          <w:bCs/>
-        </w:rPr>
-        <w:t>8.1.</w:t>
-      </w:r>
-      <w:r>
-        <w:rPr>
-          <w:b/>
-          <w:bCs/>
-        </w:rPr>
-        <w:t>2</w:t>
-      </w:r>
+        <w:t>Asimismo, él se encarga también de devolverle la correspondiente respuesta al usuario cuando el proveedor haya sido creado.</w:t>
+      </w:r>
+    </w:p>
+    <w:p>
+      <w:pPr>
+        <w:pStyle w:val="Ttulo5"/>
+        <w:rPr>
+          <w:lang w:val="en-US"/>
+        </w:rPr>
+      </w:pPr>
+      <w:r>
+        <w:rPr>
+          <w:lang w:val="en-US"/>
+        </w:rPr>
+        <w:t xml:space="preserve">@Service </w:t>
+      </w:r>
+      <w:proofErr w:type="spellStart"/>
+      <w:r>
+        <w:rPr>
+          <w:lang w:val="en-US"/>
+        </w:rPr>
+        <w:t>SupplierService</w:t>
+      </w:r>
+      <w:proofErr w:type="spellEnd"/>
+    </w:p>
+    <w:p>
+      <w:pPr>
+        <w:rPr>
+          <w:b/>
+          <w:bCs/>
+        </w:rPr>
+      </w:pPr>
+      <w:r>
+        <w:t xml:space="preserve">Aquí se maneja la </w:t>
+      </w:r>
+      <w:r>
+        <w:t xml:space="preserve">orquestación del flujo de creación del proveedor, donde se capturan los datos que llegan, se hacen su correspondiente mapeo a entidad de dominio (estamos usando arquitectura hexagonal) y posteriormente se le pasa al </w:t>
+      </w:r>
+      <w:r>
+        <w:rPr>
+          <w:b/>
+          <w:bCs/>
+        </w:rPr>
+        <w:t xml:space="preserve">@Component </w:t>
+      </w:r>
+      <w:r>
+        <w:t xml:space="preserve">encargado de manejar la persistencia en la base de datos. Asimismo, cuando se obtiene una respuesta, se la envía al </w:t>
+      </w:r>
+      <w:r>
+        <w:rPr>
+          <w:b/>
+          <w:bCs/>
+        </w:rPr>
+        <w:t>@RestController</w:t>
+      </w:r>
+    </w:p>
+    <w:p>
+      <w:pPr>
+        <w:pStyle w:val="Ttulo5"/>
+      </w:pPr>
+      <w:r>
+        <w:t xml:space="preserve">@Component </w:t>
+      </w:r>
+      <w:proofErr w:type="spellStart"/>
+      <w:r>
+        <w:t>SupplierAdapterPersistence</w:t>
+      </w:r>
+      <w:proofErr w:type="spellEnd"/>
+    </w:p>
+    <w:p>
+      <w:r>
+        <w:t xml:space="preserve">En este apartado se maneja lo que es la comunicación con el componente interno que se encarga de recibir los datos para persistirlos definitivamente en la base de datos mediante </w:t>
+      </w:r>
+      <w:r>
+        <w:rPr>
+          <w:b/>
+          <w:bCs/>
+        </w:rPr>
+        <w:t xml:space="preserve">JPA e </w:t>
+      </w:r>
+      <w:proofErr w:type="spellStart"/>
+      <w:r>
+        <w:rPr>
+          <w:b/>
+          <w:bCs/>
+        </w:rPr>
+        <w:t>Hibernate</w:t>
+      </w:r>
+      <w:proofErr w:type="spellEnd"/>
       <w:r>
         <w:rPr>
           <w:b/>
@@ -4255,23 +4483,40 @@
         <w:t xml:space="preserve">. </w:t>
       </w:r>
       <w:r>
-        <w:t xml:space="preserve">Es importante resaltar que esta evidencia adjunta </w:t>
-      </w:r>
-      <w:r>
-        <w:t>está</w:t>
-      </w:r>
-      <w:r>
-        <w:t xml:space="preserve"> ubicada en la funcionalidad de </w:t>
-      </w:r>
-      <w:r>
-        <w:rPr>
-          <w:b/>
-          <w:bCs/>
-        </w:rPr>
-        <w:t>creación de proveedores</w:t>
-      </w:r>
-      <w:r>
-        <w:t xml:space="preserve"> en el </w:t>
+        <w:t xml:space="preserve">Primeramente, se reciben los datos que llegan del </w:t>
+      </w:r>
+      <w:r>
+        <w:rPr>
+          <w:b/>
+          <w:bCs/>
+        </w:rPr>
+        <w:t xml:space="preserve">@Service </w:t>
+      </w:r>
+      <w:r>
+        <w:t xml:space="preserve">y se envían al repositorio para guardarlos, después de ello, se envía la respuesta obtenida al </w:t>
+      </w:r>
+      <w:r>
+        <w:rPr>
+          <w:b/>
+          <w:bCs/>
+        </w:rPr>
+        <w:t xml:space="preserve">@Service </w:t>
+      </w:r>
+      <w:r>
+        <w:t>nuevamente.</w:t>
+      </w:r>
+    </w:p>
+    <w:p>
+      <w:pPr>
+        <w:pStyle w:val="Ttulo5"/>
+      </w:pPr>
+      <w:r>
+        <w:t>Funcionamiento</w:t>
+      </w:r>
+    </w:p>
+    <w:p>
+      <w:r>
+        <w:t xml:space="preserve">Ahora sí, para la prueba de funcionamiento, ya que todavía no contamos con una interfaz gráfica en el </w:t>
       </w:r>
       <w:proofErr w:type="spellStart"/>
       <w:r>
@@ -4279,257 +4524,21 @@
           <w:b/>
           <w:bCs/>
         </w:rPr>
-        <w:t>backend</w:t>
+        <w:t>frontend</w:t>
       </w:r>
       <w:proofErr w:type="spellEnd"/>
       <w:r>
-        <w:t xml:space="preserve">. Sin embargo, este patrón </w:t>
-      </w:r>
-      <w:r>
-        <w:t>está</w:t>
-      </w:r>
-      <w:r>
-        <w:t xml:space="preserve"> siendo utilizado en muchas otras partes también. Las evidencias que adjuntamos solo son una parte de todo lo que es esta funcionalidad, pero es, por así decirlo, el núcleo para que funcione.</w:t>
-      </w:r>
-    </w:p>
-    <w:p>
-      <w:pPr>
-        <w:pStyle w:val="Ttulo4"/>
-        <w:rPr>
-          <w:lang w:val="en-US"/>
-        </w:rPr>
-      </w:pPr>
-      <w:r>
-        <w:rPr>
-          <w:lang w:val="en-US"/>
-        </w:rPr>
-        <w:t xml:space="preserve">@RestController </w:t>
+        <w:t xml:space="preserve">, utilizamos la herramienta </w:t>
       </w:r>
       <w:proofErr w:type="spellStart"/>
       <w:r>
         <w:rPr>
-          <w:lang w:val="en-US"/>
-        </w:rPr>
-        <w:t>SupplierController</w:t>
+          <w:b/>
+          <w:bCs/>
+        </w:rPr>
+        <w:t>Postman</w:t>
       </w:r>
       <w:proofErr w:type="spellEnd"/>
-    </w:p>
-    <w:p>
-      <w:r>
-        <w:t xml:space="preserve">Este componente es el </w:t>
-      </w:r>
-      <w:r>
-        <w:t xml:space="preserve">encargado de recibir la petición del usuario por medio del </w:t>
-      </w:r>
-      <w:proofErr w:type="spellStart"/>
-      <w:r>
-        <w:t>endpoint</w:t>
-      </w:r>
-      <w:proofErr w:type="spellEnd"/>
-      <w:r>
-        <w:t xml:space="preserve"> </w:t>
-      </w:r>
-      <w:r>
-        <w:rPr>
-          <w:b/>
-          <w:bCs/>
-        </w:rPr>
-        <w:t>“/api/</w:t>
-      </w:r>
-      <w:proofErr w:type="spellStart"/>
-      <w:r>
-        <w:rPr>
-          <w:b/>
-          <w:bCs/>
-        </w:rPr>
-        <w:t>supplier</w:t>
-      </w:r>
-      <w:proofErr w:type="spellEnd"/>
-      <w:r>
-        <w:rPr>
-          <w:b/>
-          <w:bCs/>
-        </w:rPr>
-        <w:t>”</w:t>
-      </w:r>
-      <w:r>
-        <w:rPr>
-          <w:b/>
-          <w:bCs/>
-        </w:rPr>
-        <w:t xml:space="preserve"> </w:t>
-      </w:r>
-      <w:r>
-        <w:t xml:space="preserve">y dirigir la información al </w:t>
-      </w:r>
-      <w:r>
-        <w:rPr>
-          <w:b/>
-          <w:bCs/>
-        </w:rPr>
-        <w:t>@Service</w:t>
-      </w:r>
-      <w:r>
-        <w:rPr>
-          <w:b/>
-          <w:bCs/>
-        </w:rPr>
-        <w:t xml:space="preserve"> </w:t>
-      </w:r>
-      <w:r>
-        <w:t>que se encargara de orquestar el flujo de creación del proveedor. Asimismo, él se encarga también de devolverle la correspondiente respuesta al usuario cuando el proveedor haya sido creado.</w:t>
-      </w:r>
-    </w:p>
-    <w:p>
-      <w:pPr>
-        <w:pStyle w:val="Ttulo4"/>
-        <w:rPr>
-          <w:lang w:val="en-US"/>
-        </w:rPr>
-      </w:pPr>
-      <w:r>
-        <w:rPr>
-          <w:lang w:val="en-US"/>
-        </w:rPr>
-        <w:t xml:space="preserve">@Service </w:t>
-      </w:r>
-      <w:proofErr w:type="spellStart"/>
-      <w:r>
-        <w:rPr>
-          <w:lang w:val="en-US"/>
-        </w:rPr>
-        <w:t>SupplierService</w:t>
-      </w:r>
-      <w:proofErr w:type="spellEnd"/>
-    </w:p>
-    <w:p>
-      <w:pPr>
-        <w:rPr>
-          <w:b/>
-          <w:bCs/>
-        </w:rPr>
-      </w:pPr>
-      <w:r>
-        <w:t xml:space="preserve">Aquí se maneja la </w:t>
-      </w:r>
-      <w:r>
-        <w:t xml:space="preserve">orquestación del flujo de creación del proveedor, donde se capturan los datos que llegan, se hacen su correspondiente mapeo a entidad de dominio (estamos usando arquitectura hexagonal) y posteriormente se le pasa al </w:t>
-      </w:r>
-      <w:r>
-        <w:rPr>
-          <w:b/>
-          <w:bCs/>
-        </w:rPr>
-        <w:t xml:space="preserve">@Component </w:t>
-      </w:r>
-      <w:r>
-        <w:t xml:space="preserve">encargado de manejar la persistencia en la base de datos. Asimismo, cuando se obtiene una respuesta, se la envía al </w:t>
-      </w:r>
-      <w:r>
-        <w:rPr>
-          <w:b/>
-          <w:bCs/>
-        </w:rPr>
-        <w:t>@RestController</w:t>
-      </w:r>
-    </w:p>
-    <w:p>
-      <w:pPr>
-        <w:pStyle w:val="Ttulo4"/>
-      </w:pPr>
-      <w:r>
-        <w:t xml:space="preserve">@Component </w:t>
-      </w:r>
-      <w:proofErr w:type="spellStart"/>
-      <w:r>
-        <w:t>SupplierAdapterPersistence</w:t>
-      </w:r>
-      <w:proofErr w:type="spellEnd"/>
-    </w:p>
-    <w:p>
-      <w:r>
-        <w:t xml:space="preserve">En este apartado se maneja lo que es la comunicación con el componente interno que se encarga de recibir los datos para persistirlos definitivamente en la base de datos mediante </w:t>
-      </w:r>
-      <w:r>
-        <w:rPr>
-          <w:b/>
-          <w:bCs/>
-        </w:rPr>
-        <w:t xml:space="preserve">JPA e </w:t>
-      </w:r>
-      <w:proofErr w:type="spellStart"/>
-      <w:r>
-        <w:rPr>
-          <w:b/>
-          <w:bCs/>
-        </w:rPr>
-        <w:t>Hibernate</w:t>
-      </w:r>
-      <w:proofErr w:type="spellEnd"/>
-      <w:r>
-        <w:rPr>
-          <w:b/>
-          <w:bCs/>
-        </w:rPr>
-        <w:t xml:space="preserve">. </w:t>
-      </w:r>
-      <w:r>
-        <w:t xml:space="preserve">Primeramente, se reciben los datos que llegan del </w:t>
-      </w:r>
-      <w:r>
-        <w:rPr>
-          <w:b/>
-          <w:bCs/>
-        </w:rPr>
-        <w:t xml:space="preserve">@Service </w:t>
-      </w:r>
-      <w:r>
-        <w:t xml:space="preserve">y se envían al repositorio para guardarlos, después de ello, se envía la respuesta obtenida al </w:t>
-      </w:r>
-      <w:r>
-        <w:rPr>
-          <w:b/>
-          <w:bCs/>
-        </w:rPr>
-        <w:t xml:space="preserve">@Service </w:t>
-      </w:r>
-      <w:r>
-        <w:t>nuevamente.</w:t>
-      </w:r>
-    </w:p>
-    <w:p>
-      <w:pPr>
-        <w:pStyle w:val="Ttulo4"/>
-      </w:pPr>
-      <w:r>
-        <w:t>Funcionamiento</w:t>
-      </w:r>
-    </w:p>
-    <w:p>
-      <w:r>
-        <w:t xml:space="preserve">Ahora sí, para la prueba de funcionamiento, ya que todavía no contamos con una interfaz gráfica en el </w:t>
-      </w:r>
-      <w:proofErr w:type="spellStart"/>
-      <w:r>
-        <w:rPr>
-          <w:b/>
-          <w:bCs/>
-        </w:rPr>
-        <w:t>frontend</w:t>
-      </w:r>
-      <w:proofErr w:type="spellEnd"/>
-      <w:r>
-        <w:t xml:space="preserve">, utilizamos la herramienta </w:t>
-      </w:r>
-      <w:proofErr w:type="spellStart"/>
-      <w:r>
-        <w:rPr>
-          <w:b/>
-          <w:bCs/>
-        </w:rPr>
-        <w:t>Postman</w:t>
-      </w:r>
-      <w:proofErr w:type="spellEnd"/>
       <w:r>
         <w:t xml:space="preserve">, en la cual mandamos la siguiente petición a la </w:t>
       </w:r>
@@ -4546,7 +4555,6 @@
         <w:rPr>
           <w:noProof/>
         </w:rPr>
-        <w:lastRenderedPageBreak/>
         <w:drawing>
           <wp:inline distT="0" distB="0" distL="0" distR="0" wp14:anchorId="6BCB94B5" wp14:editId="31381EAD">
             <wp:extent cx="5943600" cy="2371090"/>
@@ -4641,6 +4649,7 @@
     </w:p>
     <w:p>
       <w:r>
+        <w:lastRenderedPageBreak/>
         <w:t xml:space="preserve">Y se </w:t>
       </w:r>
       <w:r>
@@ -4694,7 +4703,7 @@
     </w:p>
     <w:p>
       <w:pPr>
-        <w:pStyle w:val="Ttulo2"/>
+        <w:pStyle w:val="Ttulo3"/>
       </w:pPr>
       <w:r>
         <w:t>Aplicación del Patrón Factory Method</w:t>
@@ -4702,7 +4711,7 @@
     </w:p>
     <w:p>
       <w:pPr>
-        <w:pStyle w:val="Ttulo3"/>
+        <w:pStyle w:val="Ttulo4"/>
       </w:pPr>
       <w:r>
         <w:t>Como está Colaborando este Patrón al Proyecto</w:t>
@@ -4761,63 +4770,63 @@
     </w:p>
     <w:p>
       <w:r>
+        <w:t xml:space="preserve">En nuestro caso, este patrón se utiliza principalmente en Spring Security para la creación de </w:t>
+      </w:r>
+      <w:proofErr w:type="spellStart"/>
+      <w:r>
+        <w:rPr>
+          <w:b/>
+          <w:bCs/>
+        </w:rPr>
+        <w:t>PasswordEncoder</w:t>
+      </w:r>
+      <w:proofErr w:type="spellEnd"/>
+      <w:r>
+        <w:t xml:space="preserve">, cuya implementación concreta es </w:t>
+      </w:r>
+      <w:proofErr w:type="spellStart"/>
+      <w:r>
+        <w:rPr>
+          <w:b/>
+          <w:bCs/>
+        </w:rPr>
+        <w:t>BCryptPasswordEncoder</w:t>
+      </w:r>
+      <w:proofErr w:type="spellEnd"/>
+      <w:r>
+        <w:t xml:space="preserve">. Esto permite que los componentes que necesitan procesar contraseñas dependan de </w:t>
+      </w:r>
+      <w:proofErr w:type="spellStart"/>
+      <w:r>
+        <w:rPr>
+          <w:b/>
+          <w:bCs/>
+        </w:rPr>
+        <w:t>PasswordEncoder</w:t>
+      </w:r>
+      <w:proofErr w:type="spellEnd"/>
+      <w:r>
+        <w:t xml:space="preserve"> y no directamente de </w:t>
+      </w:r>
+      <w:proofErr w:type="spellStart"/>
+      <w:r>
+        <w:rPr>
+          <w:b/>
+          <w:bCs/>
+        </w:rPr>
+        <w:t>BCrypt</w:t>
+      </w:r>
+      <w:proofErr w:type="spellEnd"/>
+      <w:r>
+        <w:t>, reduciendo el acoplamiento y facilitando un posible cambio de implementación. Además, al combinarse con la inyección de dependencias de Spring, la creación y gestión de estos componentes queda centralizada y facilita el mantenimiento del proyecto.</w:t>
+      </w:r>
+    </w:p>
+    <w:p>
+      <w:pPr>
+        <w:pStyle w:val="Ttulo4"/>
+      </w:pPr>
+      <w:r>
         <w:lastRenderedPageBreak/>
-        <w:t xml:space="preserve">En nuestro caso, este patrón se utiliza principalmente en Spring Security para la creación de </w:t>
-      </w:r>
-      <w:proofErr w:type="spellStart"/>
-      <w:r>
-        <w:rPr>
-          <w:b/>
-          <w:bCs/>
-        </w:rPr>
-        <w:t>PasswordEncoder</w:t>
-      </w:r>
-      <w:proofErr w:type="spellEnd"/>
-      <w:r>
-        <w:t xml:space="preserve">, cuya implementación concreta es </w:t>
-      </w:r>
-      <w:proofErr w:type="spellStart"/>
-      <w:r>
-        <w:rPr>
-          <w:b/>
-          <w:bCs/>
-        </w:rPr>
-        <w:t>BCryptPasswordEncoder</w:t>
-      </w:r>
-      <w:proofErr w:type="spellEnd"/>
-      <w:r>
-        <w:t xml:space="preserve">. Esto permite que los componentes que necesitan procesar contraseñas dependan de </w:t>
-      </w:r>
-      <w:proofErr w:type="spellStart"/>
-      <w:r>
-        <w:rPr>
-          <w:b/>
-          <w:bCs/>
-        </w:rPr>
-        <w:t>PasswordEncoder</w:t>
-      </w:r>
-      <w:proofErr w:type="spellEnd"/>
-      <w:r>
-        <w:t xml:space="preserve"> y no directamente de </w:t>
-      </w:r>
-      <w:proofErr w:type="spellStart"/>
-      <w:r>
-        <w:rPr>
-          <w:b/>
-          <w:bCs/>
-        </w:rPr>
-        <w:t>BCrypt</w:t>
-      </w:r>
-      <w:proofErr w:type="spellEnd"/>
-      <w:r>
-        <w:t>, reduciendo el acoplamiento y facilitando un posible cambio de implementación. Además, al combinarse con la inyección de dependencias de Spring, la creación y gestión de estos componentes queda centralizada y facilita el mantenimiento del proyecto.</w:t>
-      </w:r>
-    </w:p>
-    <w:p>
-      <w:pPr>
-        <w:pStyle w:val="Ttulo3"/>
-      </w:pPr>
-      <w:r>
         <w:t>Diagrama de Clases UML</w:t>
       </w:r>
     </w:p>
@@ -4871,7 +4880,7 @@
     </w:p>
     <w:p>
       <w:pPr>
-        <w:pStyle w:val="Ttulo3"/>
+        <w:pStyle w:val="Ttulo4"/>
       </w:pPr>
       <w:r>
         <w:t>Código</w:t>
@@ -4973,7 +4982,6 @@
           <w:bCs/>
           <w:noProof/>
         </w:rPr>
-        <w:lastRenderedPageBreak/>
         <w:drawing>
           <wp:inline distT="0" distB="0" distL="0" distR="0" wp14:anchorId="5967A4D5" wp14:editId="4D982305">
             <wp:extent cx="5943600" cy="2326005"/>
@@ -5041,6 +5049,7 @@
           <w:bCs/>
           <w:noProof/>
         </w:rPr>
+        <w:lastRenderedPageBreak/>
         <w:drawing>
           <wp:inline distT="0" distB="0" distL="0" distR="0" wp14:anchorId="2CE39E17" wp14:editId="11D974B8">
             <wp:extent cx="5943600" cy="4246880"/>
@@ -5092,7 +5101,6 @@
           <w:bCs/>
           <w:noProof/>
         </w:rPr>
-        <w:lastRenderedPageBreak/>
         <w:drawing>
           <wp:inline distT="0" distB="0" distL="0" distR="0" wp14:anchorId="2FF49B68" wp14:editId="45726220">
             <wp:extent cx="5943600" cy="1198245"/>
@@ -5200,15 +5208,16 @@
     </w:p>
     <w:p>
       <w:pPr>
-        <w:pStyle w:val="Ttulo3"/>
-      </w:pPr>
-      <w:r>
+        <w:pStyle w:val="Ttulo4"/>
+      </w:pPr>
+      <w:r>
+        <w:lastRenderedPageBreak/>
         <w:t>Explicación y Prueba de que Funciona</w:t>
       </w:r>
     </w:p>
     <w:p>
       <w:pPr>
-        <w:pStyle w:val="Ttulo4"/>
+        <w:pStyle w:val="Ttulo5"/>
       </w:pPr>
       <w:proofErr w:type="spellStart"/>
       <w:r>
@@ -5270,7 +5279,7 @@
     </w:p>
     <w:p>
       <w:pPr>
-        <w:pStyle w:val="Ttulo4"/>
+        <w:pStyle w:val="Ttulo5"/>
       </w:pPr>
       <w:proofErr w:type="spellStart"/>
       <w:r>
@@ -5343,7 +5352,7 @@
     </w:p>
     <w:p>
       <w:pPr>
-        <w:pStyle w:val="Ttulo4"/>
+        <w:pStyle w:val="Ttulo5"/>
       </w:pPr>
       <w:proofErr w:type="spellStart"/>
       <w:r>
@@ -5404,187 +5413,187 @@
     </w:p>
     <w:p>
       <w:pPr>
-        <w:pStyle w:val="Ttulo4"/>
+        <w:pStyle w:val="Ttulo5"/>
       </w:pPr>
       <w:proofErr w:type="spellStart"/>
       <w:r>
+        <w:t>AuthenticationManager</w:t>
+      </w:r>
+      <w:proofErr w:type="spellEnd"/>
+      <w:r>
+        <w:t xml:space="preserve"> </w:t>
+      </w:r>
+      <w:r>
+        <w:t>(</w:t>
+      </w:r>
+      <w:r>
+        <w:t>Consumidor</w:t>
+      </w:r>
+      <w:r>
+        <w:t>)</w:t>
+      </w:r>
+    </w:p>
+    <w:p>
+      <w:r>
+        <w:t xml:space="preserve">Este componente representa el </w:t>
+      </w:r>
+      <w:r>
+        <w:rPr>
+          <w:b/>
+          <w:bCs/>
+        </w:rPr>
+        <w:t>consumidor</w:t>
+      </w:r>
+      <w:r>
+        <w:t xml:space="preserve"> del </w:t>
+      </w:r>
+      <w:r>
+        <w:rPr>
+          <w:b/>
+          <w:bCs/>
+        </w:rPr>
+        <w:t>producto</w:t>
+      </w:r>
+      <w:r>
+        <w:t xml:space="preserve">, ya que necesita un </w:t>
+      </w:r>
+      <w:proofErr w:type="spellStart"/>
+      <w:r>
+        <w:rPr>
+          <w:b/>
+          <w:bCs/>
+        </w:rPr>
+        <w:t>PasswordEncoder</w:t>
+      </w:r>
+      <w:proofErr w:type="spellEnd"/>
+      <w:r>
+        <w:t xml:space="preserve"> para realizar el proceso de autenticación. Lo importante es que </w:t>
+      </w:r>
+      <w:proofErr w:type="spellStart"/>
+      <w:r>
+        <w:rPr>
+          <w:b/>
+          <w:bCs/>
+        </w:rPr>
+        <w:t>AuthenticationManager</w:t>
+      </w:r>
+      <w:proofErr w:type="spellEnd"/>
+      <w:r>
+        <w:t xml:space="preserve"> trabaja con la abstracción </w:t>
+      </w:r>
+      <w:proofErr w:type="spellStart"/>
+      <w:r>
+        <w:rPr>
+          <w:b/>
+          <w:bCs/>
+        </w:rPr>
+        <w:t>PasswordEncoder</w:t>
+      </w:r>
+      <w:proofErr w:type="spellEnd"/>
+      <w:r>
+        <w:t xml:space="preserve"> y no necesita conocer directamente a </w:t>
+      </w:r>
+      <w:proofErr w:type="spellStart"/>
+      <w:r>
+        <w:rPr>
+          <w:b/>
+          <w:bCs/>
+        </w:rPr>
+        <w:t>BCryptPasswordEncoder</w:t>
+      </w:r>
+      <w:proofErr w:type="spellEnd"/>
+      <w:r>
+        <w:t>, demostrando, así como el Factory Method ayuda a reducir el acoplamiento entre ambos componentes.</w:t>
+      </w:r>
+    </w:p>
+    <w:p>
+      <w:pPr>
+        <w:pStyle w:val="Ttulo5"/>
+      </w:pPr>
+      <w:r>
+        <w:t>Funcionamiento</w:t>
+      </w:r>
+    </w:p>
+    <w:p>
+      <w:r>
+        <w:t xml:space="preserve">Ahora sí, para la prueba de funcionamiento, ya que todavía no contamos con una interfaz gráfica en el </w:t>
+      </w:r>
+      <w:proofErr w:type="spellStart"/>
+      <w:r>
+        <w:rPr>
+          <w:b/>
+          <w:bCs/>
+        </w:rPr>
+        <w:t>frontend</w:t>
+      </w:r>
+      <w:proofErr w:type="spellEnd"/>
+      <w:r>
+        <w:t xml:space="preserve">, utilizamos la herramienta </w:t>
+      </w:r>
+      <w:proofErr w:type="spellStart"/>
+      <w:r>
+        <w:rPr>
+          <w:b/>
+          <w:bCs/>
+        </w:rPr>
+        <w:t>Postman</w:t>
+      </w:r>
+      <w:proofErr w:type="spellEnd"/>
+      <w:r>
+        <w:t xml:space="preserve">, en la cual mandamos la siguiente petición a la </w:t>
+      </w:r>
+      <w:r>
+        <w:rPr>
+          <w:b/>
+          <w:bCs/>
+        </w:rPr>
+        <w:t>API.</w:t>
+      </w:r>
+    </w:p>
+    <w:p>
+      <w:r>
+        <w:rPr>
+          <w:b/>
+          <w:bCs/>
+        </w:rPr>
+        <w:t xml:space="preserve">NOTA: </w:t>
+      </w:r>
+      <w:r>
+        <w:t xml:space="preserve">Cabe resaltar que para esta prueba de autenticación del usuario </w:t>
+      </w:r>
+      <w:r>
+        <w:t>ya había un usuario creado en base de datos y trabajamos con</w:t>
+      </w:r>
+      <w:r>
+        <w:rPr>
+          <w:b/>
+          <w:bCs/>
+        </w:rPr>
+        <w:t xml:space="preserve"> </w:t>
+      </w:r>
+      <w:proofErr w:type="spellStart"/>
+      <w:r>
+        <w:rPr>
+          <w:b/>
+          <w:bCs/>
+        </w:rPr>
+        <w:t>Json</w:t>
+      </w:r>
+      <w:proofErr w:type="spellEnd"/>
+      <w:r>
+        <w:rPr>
+          <w:b/>
+          <w:bCs/>
+        </w:rPr>
+        <w:t xml:space="preserve"> Web Tokens </w:t>
+      </w:r>
+      <w:r>
+        <w:t>además de Spring Security.</w:t>
+      </w:r>
+    </w:p>
+    <w:p>
+      <w:r>
         <w:lastRenderedPageBreak/>
-        <w:t>AuthenticationManager</w:t>
-      </w:r>
-      <w:proofErr w:type="spellEnd"/>
-      <w:r>
-        <w:t xml:space="preserve"> </w:t>
-      </w:r>
-      <w:r>
-        <w:t>(</w:t>
-      </w:r>
-      <w:r>
-        <w:t>Consumidor</w:t>
-      </w:r>
-      <w:r>
-        <w:t>)</w:t>
-      </w:r>
-    </w:p>
-    <w:p>
-      <w:r>
-        <w:t xml:space="preserve">Este componente representa el </w:t>
-      </w:r>
-      <w:r>
-        <w:rPr>
-          <w:b/>
-          <w:bCs/>
-        </w:rPr>
-        <w:t>consumidor</w:t>
-      </w:r>
-      <w:r>
-        <w:t xml:space="preserve"> del </w:t>
-      </w:r>
-      <w:r>
-        <w:rPr>
-          <w:b/>
-          <w:bCs/>
-        </w:rPr>
-        <w:t>producto</w:t>
-      </w:r>
-      <w:r>
-        <w:t xml:space="preserve">, ya que necesita un </w:t>
-      </w:r>
-      <w:proofErr w:type="spellStart"/>
-      <w:r>
-        <w:rPr>
-          <w:b/>
-          <w:bCs/>
-        </w:rPr>
-        <w:t>PasswordEncoder</w:t>
-      </w:r>
-      <w:proofErr w:type="spellEnd"/>
-      <w:r>
-        <w:t xml:space="preserve"> para realizar el proceso de autenticación. Lo importante es que </w:t>
-      </w:r>
-      <w:proofErr w:type="spellStart"/>
-      <w:r>
-        <w:rPr>
-          <w:b/>
-          <w:bCs/>
-        </w:rPr>
-        <w:t>AuthenticationManager</w:t>
-      </w:r>
-      <w:proofErr w:type="spellEnd"/>
-      <w:r>
-        <w:t xml:space="preserve"> trabaja con la abstracción </w:t>
-      </w:r>
-      <w:proofErr w:type="spellStart"/>
-      <w:r>
-        <w:rPr>
-          <w:b/>
-          <w:bCs/>
-        </w:rPr>
-        <w:t>PasswordEncoder</w:t>
-      </w:r>
-      <w:proofErr w:type="spellEnd"/>
-      <w:r>
-        <w:t xml:space="preserve"> y no necesita conocer directamente a </w:t>
-      </w:r>
-      <w:proofErr w:type="spellStart"/>
-      <w:r>
-        <w:rPr>
-          <w:b/>
-          <w:bCs/>
-        </w:rPr>
-        <w:t>BCryptPasswordEncoder</w:t>
-      </w:r>
-      <w:proofErr w:type="spellEnd"/>
-      <w:r>
-        <w:t>, demostrando, así como el Factory Method ayuda a reducir el acoplamiento entre ambos componentes.</w:t>
-      </w:r>
-    </w:p>
-    <w:p>
-      <w:pPr>
-        <w:pStyle w:val="Ttulo4"/>
-      </w:pPr>
-      <w:r>
-        <w:t>Funcionamiento</w:t>
-      </w:r>
-    </w:p>
-    <w:p>
-      <w:r>
-        <w:t xml:space="preserve">Ahora sí, para la prueba de funcionamiento, ya que todavía no contamos con una interfaz gráfica en el </w:t>
-      </w:r>
-      <w:proofErr w:type="spellStart"/>
-      <w:r>
-        <w:rPr>
-          <w:b/>
-          <w:bCs/>
-        </w:rPr>
-        <w:t>frontend</w:t>
-      </w:r>
-      <w:proofErr w:type="spellEnd"/>
-      <w:r>
-        <w:t xml:space="preserve">, utilizamos la herramienta </w:t>
-      </w:r>
-      <w:proofErr w:type="spellStart"/>
-      <w:r>
-        <w:rPr>
-          <w:b/>
-          <w:bCs/>
-        </w:rPr>
-        <w:t>Postman</w:t>
-      </w:r>
-      <w:proofErr w:type="spellEnd"/>
-      <w:r>
-        <w:t xml:space="preserve">, en la cual mandamos la siguiente petición a la </w:t>
-      </w:r>
-      <w:r>
-        <w:rPr>
-          <w:b/>
-          <w:bCs/>
-        </w:rPr>
-        <w:t>API.</w:t>
-      </w:r>
-    </w:p>
-    <w:p>
-      <w:r>
-        <w:rPr>
-          <w:b/>
-          <w:bCs/>
-        </w:rPr>
-        <w:t xml:space="preserve">NOTA: </w:t>
-      </w:r>
-      <w:r>
-        <w:t xml:space="preserve">Cabe resaltar que para esta prueba de autenticación del usuario </w:t>
-      </w:r>
-      <w:r>
-        <w:t>ya había un usuario creado en base de datos y trabajamos con</w:t>
-      </w:r>
-      <w:r>
-        <w:rPr>
-          <w:b/>
-          <w:bCs/>
-        </w:rPr>
-        <w:t xml:space="preserve"> </w:t>
-      </w:r>
-      <w:proofErr w:type="spellStart"/>
-      <w:r>
-        <w:rPr>
-          <w:b/>
-          <w:bCs/>
-        </w:rPr>
-        <w:t>Json</w:t>
-      </w:r>
-      <w:proofErr w:type="spellEnd"/>
-      <w:r>
-        <w:rPr>
-          <w:b/>
-          <w:bCs/>
-        </w:rPr>
-        <w:t xml:space="preserve"> Web Tokens </w:t>
-      </w:r>
-      <w:r>
-        <w:t>además de Spring Security.</w:t>
-      </w:r>
-    </w:p>
-    <w:p>
-      <w:r>
         <w:t>El usuario creado en la base de datos es el siguiente:</w:t>
       </w:r>
     </w:p>
@@ -5723,63 +5732,63 @@
         </w:rPr>
       </w:pPr>
       <w:r>
+        <w:t xml:space="preserve">Exitosamente la </w:t>
+      </w:r>
+      <w:r>
+        <w:rPr>
+          <w:b/>
+          <w:bCs/>
+        </w:rPr>
+        <w:t>API REST</w:t>
+      </w:r>
+      <w:r>
+        <w:t xml:space="preserve"> responde con código </w:t>
+      </w:r>
+      <w:r>
+        <w:rPr>
+          <w:b/>
+          <w:bCs/>
+        </w:rPr>
+        <w:t>http 200</w:t>
+      </w:r>
+      <w:r>
+        <w:t xml:space="preserve"> y con el cuerpo de la respuesta indicando el token JWT generado después de la autenticación. Por lo que indica que el proceso de encriptar la contraseña y compararla con la de la base de datos fue un </w:t>
+      </w:r>
+      <w:r>
+        <w:rPr>
+          <w:b/>
+          <w:bCs/>
+        </w:rPr>
+        <w:t>éxito.</w:t>
+      </w:r>
+    </w:p>
+    <w:p>
+      <w:pPr>
+        <w:pStyle w:val="Ttulo3"/>
+      </w:pPr>
+      <w:r>
+        <w:t>Aplicación del Patrón Builder</w:t>
+      </w:r>
+    </w:p>
+    <w:p>
+      <w:pPr>
+        <w:pStyle w:val="Ttulo4"/>
+      </w:pPr>
+      <w:r>
+        <w:t>Como está Colaborando</w:t>
+      </w:r>
+    </w:p>
+    <w:p>
+      <w:r>
+        <w:t xml:space="preserve">En el proceso de autenticación, el patrón Builder se utiliza para construir el token JWT que posteriormente será entregado al usuario. El token requiere varios datos de configuración, entre ellos el nombre de usuario, el rol, la fecha de emisión, la fecha de expiración y la firma criptográfica.  </w:t>
+      </w:r>
+    </w:p>
+    <w:p>
+      <w:pPr>
+        <w:pStyle w:val="Ttulo4"/>
+      </w:pPr>
+      <w:r>
         <w:lastRenderedPageBreak/>
-        <w:t xml:space="preserve">Exitosamente la </w:t>
-      </w:r>
-      <w:r>
-        <w:rPr>
-          <w:b/>
-          <w:bCs/>
-        </w:rPr>
-        <w:t>API REST</w:t>
-      </w:r>
-      <w:r>
-        <w:t xml:space="preserve"> responde con código </w:t>
-      </w:r>
-      <w:r>
-        <w:rPr>
-          <w:b/>
-          <w:bCs/>
-        </w:rPr>
-        <w:t>http 200</w:t>
-      </w:r>
-      <w:r>
-        <w:t xml:space="preserve"> y con el cuerpo de la respuesta indicando el token JWT generado después de la autenticación. Por lo que indica que el proceso de encriptar la contraseña y compararla con la de la base de datos fue un </w:t>
-      </w:r>
-      <w:r>
-        <w:rPr>
-          <w:b/>
-          <w:bCs/>
-        </w:rPr>
-        <w:t>éxito.</w:t>
-      </w:r>
-    </w:p>
-    <w:p>
-      <w:pPr>
-        <w:pStyle w:val="Ttulo2"/>
-      </w:pPr>
-      <w:r>
-        <w:t>Aplicación del Patrón Builder</w:t>
-      </w:r>
-    </w:p>
-    <w:p>
-      <w:pPr>
-        <w:pStyle w:val="Ttulo3"/>
-      </w:pPr>
-      <w:r>
-        <w:t>Como está Colaborando</w:t>
-      </w:r>
-    </w:p>
-    <w:p>
-      <w:r>
-        <w:t xml:space="preserve">En el proceso de autenticación, el patrón Builder se utiliza para construir el token JWT que posteriormente será entregado al usuario. El token requiere varios datos de configuración, entre ellos el nombre de usuario, el rol, la fecha de emisión, la fecha de expiración y la firma criptográfica.  </w:t>
-      </w:r>
-    </w:p>
-    <w:p>
-      <w:pPr>
-        <w:pStyle w:val="Ttulo3"/>
-      </w:pPr>
-      <w:r>
         <w:t>Diagrama de Clases UML</w:t>
       </w:r>
     </w:p>
@@ -5830,7 +5839,7 @@
     </w:p>
     <w:p>
       <w:pPr>
-        <w:pStyle w:val="Ttulo3"/>
+        <w:pStyle w:val="Ttulo4"/>
       </w:pPr>
       <w:r>
         <w:t>Código</w:t>
@@ -5859,7 +5868,6 @@
         <w:rPr>
           <w:noProof/>
         </w:rPr>
-        <w:lastRenderedPageBreak/>
         <w:drawing>
           <wp:inline distT="0" distB="0" distL="0" distR="0" wp14:anchorId="352844FC" wp14:editId="769BDC22">
             <wp:extent cx="4448175" cy="2416082"/>
@@ -5921,6 +5929,7 @@
         <w:rPr>
           <w:noProof/>
         </w:rPr>
+        <w:lastRenderedPageBreak/>
         <w:drawing>
           <wp:inline distT="0" distB="0" distL="0" distR="0" wp14:anchorId="34DC3B85" wp14:editId="15BE933A">
             <wp:extent cx="5062655" cy="3762375"/>
@@ -5966,7 +5975,6 @@
         <w:rPr>
           <w:noProof/>
         </w:rPr>
-        <w:lastRenderedPageBreak/>
         <w:drawing>
           <wp:inline distT="0" distB="0" distL="0" distR="0" wp14:anchorId="52FF695D" wp14:editId="1F2ABA3C">
             <wp:extent cx="4819650" cy="2053500"/>
@@ -6012,6 +6020,7 @@
         <w:rPr>
           <w:noProof/>
         </w:rPr>
+        <w:lastRenderedPageBreak/>
         <w:drawing>
           <wp:inline distT="0" distB="0" distL="0" distR="0" wp14:anchorId="2474CBC7" wp14:editId="16CB14E7">
             <wp:extent cx="4886325" cy="1970713"/>
@@ -6115,7 +6124,6 @@
         <w:rPr>
           <w:noProof/>
         </w:rPr>
-        <w:lastRenderedPageBreak/>
         <w:drawing>
           <wp:inline distT="0" distB="0" distL="0" distR="0" wp14:anchorId="5B52A8C3" wp14:editId="25DA4955">
             <wp:extent cx="5943600" cy="2004695"/>
@@ -6206,6 +6214,7 @@
         <w:rPr>
           <w:noProof/>
         </w:rPr>
+        <w:lastRenderedPageBreak/>
         <w:drawing>
           <wp:inline distT="0" distB="0" distL="0" distR="0" wp14:anchorId="6409BE82" wp14:editId="14230D7D">
             <wp:extent cx="4498141" cy="3019425"/>
@@ -6245,7 +6254,7 @@
     </w:p>
     <w:p>
       <w:pPr>
-        <w:pStyle w:val="Ttulo3"/>
+        <w:pStyle w:val="Ttulo4"/>
       </w:pPr>
       <w:r>
         <w:t xml:space="preserve">Explicación y </w:t>
@@ -6256,7 +6265,7 @@
     </w:p>
     <w:p>
       <w:pPr>
-        <w:pStyle w:val="Ttulo4"/>
+        <w:pStyle w:val="Ttulo5"/>
       </w:pPr>
       <w:r>
         <w:t>JwtService (Client</w:t>
@@ -6288,201 +6297,183 @@
     </w:p>
     <w:p>
       <w:pPr>
-        <w:pStyle w:val="Ttulo4"/>
+        <w:pStyle w:val="Ttulo5"/>
+      </w:pPr>
+      <w:r>
+        <w:t>JwtBuilder (Interfaz)</w:t>
+      </w:r>
+    </w:p>
+    <w:p>
+      <w:r>
+        <w:rPr>
+          <w:b/>
+          <w:bCs/>
+        </w:rPr>
+        <w:t>JwtBuilder</w:t>
+      </w:r>
+      <w:r>
+        <w:t xml:space="preserve"> representa el Builder, donde se</w:t>
+      </w:r>
+      <w:r>
+        <w:t xml:space="preserve"> define el contrato de métodos que deberán utilizar los Builders concretos posteriormente, entre ellos los utilizados como </w:t>
+      </w:r>
+      <w:proofErr w:type="spellStart"/>
+      <w:r>
+        <w:rPr>
+          <w:b/>
+          <w:bCs/>
+        </w:rPr>
+        <w:t>subject</w:t>
+      </w:r>
+      <w:proofErr w:type="spellEnd"/>
+      <w:r>
+        <w:rPr>
+          <w:b/>
+          <w:bCs/>
+        </w:rPr>
+        <w:t xml:space="preserve">(), </w:t>
+      </w:r>
+      <w:proofErr w:type="spellStart"/>
+      <w:r>
+        <w:rPr>
+          <w:b/>
+          <w:bCs/>
+        </w:rPr>
+        <w:t>claim</w:t>
+      </w:r>
+      <w:proofErr w:type="spellEnd"/>
+      <w:r>
+        <w:rPr>
+          <w:b/>
+          <w:bCs/>
+        </w:rPr>
+        <w:t xml:space="preserve">(), </w:t>
+      </w:r>
+      <w:proofErr w:type="spellStart"/>
+      <w:r>
+        <w:rPr>
+          <w:b/>
+          <w:bCs/>
+        </w:rPr>
+        <w:t>issuedAt</w:t>
+      </w:r>
+      <w:proofErr w:type="spellEnd"/>
+      <w:r>
+        <w:rPr>
+          <w:b/>
+          <w:bCs/>
+        </w:rPr>
+        <w:t xml:space="preserve">(), </w:t>
+      </w:r>
+      <w:proofErr w:type="spellStart"/>
+      <w:r>
+        <w:rPr>
+          <w:b/>
+          <w:bCs/>
+        </w:rPr>
+        <w:t>expiration</w:t>
+      </w:r>
+      <w:proofErr w:type="spellEnd"/>
+      <w:r>
+        <w:rPr>
+          <w:b/>
+          <w:bCs/>
+        </w:rPr>
+        <w:t xml:space="preserve">(), </w:t>
+      </w:r>
+      <w:proofErr w:type="spellStart"/>
+      <w:r>
+        <w:rPr>
+          <w:b/>
+          <w:bCs/>
+        </w:rPr>
+        <w:t>signWith</w:t>
+      </w:r>
+      <w:proofErr w:type="spellEnd"/>
+      <w:r>
+        <w:rPr>
+          <w:b/>
+          <w:bCs/>
+        </w:rPr>
+        <w:t xml:space="preserve">() </w:t>
+      </w:r>
+      <w:r>
+        <w:t>y</w:t>
+      </w:r>
+      <w:r>
+        <w:rPr>
+          <w:b/>
+          <w:bCs/>
+        </w:rPr>
+        <w:t xml:space="preserve"> compact().</w:t>
+      </w:r>
+    </w:p>
+    <w:p>
+      <w:pPr>
+        <w:pStyle w:val="Ttulo5"/>
+      </w:pPr>
+      <w:r>
+        <w:t>DefaultJwtBuilder (Concrete Builder)</w:t>
+      </w:r>
+    </w:p>
+    <w:p>
+      <w:r>
+        <w:rPr>
+          <w:b/>
+          <w:bCs/>
+        </w:rPr>
+        <w:t>DefaultJwtBuilder</w:t>
+      </w:r>
+      <w:r>
+        <w:t xml:space="preserve">, proporcionado internamente por la librería </w:t>
+      </w:r>
+      <w:r>
+        <w:rPr>
+          <w:b/>
+          <w:bCs/>
+        </w:rPr>
+        <w:t>JJWT</w:t>
+      </w:r>
+      <w:r>
+        <w:t xml:space="preserve">, es el Builder concreto donde se implementa la interfaz </w:t>
+      </w:r>
+      <w:r>
+        <w:rPr>
+          <w:b/>
+          <w:bCs/>
+        </w:rPr>
+        <w:t xml:space="preserve">JwtBuilder </w:t>
+      </w:r>
+      <w:r>
+        <w:t xml:space="preserve">y se asigna comportamiento a sus métodos. Finalmente, el método </w:t>
+      </w:r>
+      <w:r>
+        <w:rPr>
+          <w:b/>
+          <w:bCs/>
+        </w:rPr>
+        <w:t>compact()</w:t>
+      </w:r>
+      <w:r>
+        <w:t xml:space="preserve"> genera el producto terminado: un token JWT firmado en formato </w:t>
+      </w:r>
+      <w:r>
+        <w:rPr>
+          <w:b/>
+          <w:bCs/>
+        </w:rPr>
+        <w:t>String</w:t>
+      </w:r>
+      <w:r>
+        <w:t>.</w:t>
+      </w:r>
+    </w:p>
+    <w:p>
+      <w:pPr>
+        <w:pStyle w:val="Ttulo5"/>
       </w:pPr>
       <w:r>
         <w:lastRenderedPageBreak/>
-        <w:t>JwtBuilder (Interfaz)</w:t>
-      </w:r>
-    </w:p>
-    <w:p>
-      <w:r>
-        <w:rPr>
-          <w:b/>
-          <w:bCs/>
-        </w:rPr>
-        <w:t>JwtBuilder</w:t>
-      </w:r>
-      <w:r>
-        <w:t xml:space="preserve"> representa el Builder, donde se</w:t>
-      </w:r>
-      <w:r>
-        <w:t xml:space="preserve"> define el contrato de métodos que deberán utilizar los Builders concretos posteriormente, entre ellos los utilizados como </w:t>
-      </w:r>
-      <w:proofErr w:type="spellStart"/>
-      <w:proofErr w:type="gramStart"/>
-      <w:r>
-        <w:rPr>
-          <w:b/>
-          <w:bCs/>
-        </w:rPr>
-        <w:t>subject</w:t>
-      </w:r>
-      <w:proofErr w:type="spellEnd"/>
-      <w:r>
-        <w:rPr>
-          <w:b/>
-          <w:bCs/>
-        </w:rPr>
-        <w:t>(</w:t>
-      </w:r>
-      <w:proofErr w:type="gramEnd"/>
-      <w:r>
-        <w:rPr>
-          <w:b/>
-          <w:bCs/>
-        </w:rPr>
-        <w:t xml:space="preserve">), </w:t>
-      </w:r>
-      <w:proofErr w:type="spellStart"/>
-      <w:r>
-        <w:rPr>
-          <w:b/>
-          <w:bCs/>
-        </w:rPr>
-        <w:t>claim</w:t>
-      </w:r>
-      <w:proofErr w:type="spellEnd"/>
-      <w:r>
-        <w:rPr>
-          <w:b/>
-          <w:bCs/>
-        </w:rPr>
-        <w:t xml:space="preserve">(), </w:t>
-      </w:r>
-      <w:proofErr w:type="spellStart"/>
-      <w:r>
-        <w:rPr>
-          <w:b/>
-          <w:bCs/>
-        </w:rPr>
-        <w:t>issuedAt</w:t>
-      </w:r>
-      <w:proofErr w:type="spellEnd"/>
-      <w:r>
-        <w:rPr>
-          <w:b/>
-          <w:bCs/>
-        </w:rPr>
-        <w:t xml:space="preserve">(), </w:t>
-      </w:r>
-      <w:proofErr w:type="spellStart"/>
-      <w:r>
-        <w:rPr>
-          <w:b/>
-          <w:bCs/>
-        </w:rPr>
-        <w:t>expiration</w:t>
-      </w:r>
-      <w:proofErr w:type="spellEnd"/>
-      <w:r>
-        <w:rPr>
-          <w:b/>
-          <w:bCs/>
-        </w:rPr>
-        <w:t xml:space="preserve">(), </w:t>
-      </w:r>
-      <w:proofErr w:type="spellStart"/>
-      <w:r>
-        <w:rPr>
-          <w:b/>
-          <w:bCs/>
-        </w:rPr>
-        <w:t>signWith</w:t>
-      </w:r>
-      <w:proofErr w:type="spellEnd"/>
-      <w:r>
-        <w:rPr>
-          <w:b/>
-          <w:bCs/>
-        </w:rPr>
-        <w:t xml:space="preserve">() </w:t>
-      </w:r>
-      <w:r>
-        <w:t>y</w:t>
-      </w:r>
-      <w:r>
-        <w:rPr>
-          <w:b/>
-          <w:bCs/>
-        </w:rPr>
-        <w:t xml:space="preserve"> compact().</w:t>
-      </w:r>
-    </w:p>
-    <w:p>
-      <w:pPr>
-        <w:pStyle w:val="Ttulo4"/>
-      </w:pPr>
-      <w:r>
-        <w:t>DefaultJwtBuilder (Concrete Builder)</w:t>
-      </w:r>
-    </w:p>
-    <w:p>
-      <w:r>
-        <w:rPr>
-          <w:b/>
-          <w:bCs/>
-        </w:rPr>
-        <w:t>DefaultJwtBuilder</w:t>
-      </w:r>
-      <w:r>
-        <w:t xml:space="preserve">, proporcionado internamente por la librería </w:t>
-      </w:r>
-      <w:r>
-        <w:rPr>
-          <w:b/>
-          <w:bCs/>
-        </w:rPr>
-        <w:t>JJWT</w:t>
-      </w:r>
-      <w:r>
-        <w:t xml:space="preserve">, es el Builder concreto donde se implementa la interfaz </w:t>
-      </w:r>
-      <w:r>
-        <w:rPr>
-          <w:b/>
-          <w:bCs/>
-        </w:rPr>
-        <w:t xml:space="preserve">JwtBuilder </w:t>
-      </w:r>
-      <w:r>
-        <w:t xml:space="preserve">y se asigna comportamiento a sus métodos. Finalmente, el método </w:t>
-      </w:r>
-      <w:proofErr w:type="gramStart"/>
-      <w:r>
-        <w:rPr>
-          <w:b/>
-          <w:bCs/>
-        </w:rPr>
-        <w:t>compact(</w:t>
-      </w:r>
-      <w:proofErr w:type="gramEnd"/>
-      <w:r>
-        <w:rPr>
-          <w:b/>
-          <w:bCs/>
-        </w:rPr>
-        <w:t>)</w:t>
-      </w:r>
-      <w:r>
-        <w:t xml:space="preserve"> genera el producto terminado: un token JWT firmado en formato </w:t>
-      </w:r>
-      <w:r>
-        <w:rPr>
-          <w:b/>
-          <w:bCs/>
-        </w:rPr>
-        <w:t>String</w:t>
-      </w:r>
-      <w:r>
-        <w:t>.</w:t>
-      </w:r>
-    </w:p>
-    <w:p>
-      <w:pPr>
-        <w:pStyle w:val="Ttulo4"/>
-      </w:pPr>
-      <w:r>
         <w:t>Funcionamiento</w:t>
       </w:r>
     </w:p>
@@ -6561,21 +6552,763 @@
         <w:t>Utilizando el concepto de patrón Builder.</w:t>
       </w:r>
     </w:p>
-    <w:p/>
-    <w:p/>
+    <w:p>
+      <w:pPr>
+        <w:pStyle w:val="Ttulo2"/>
+      </w:pPr>
+      <w:r>
+        <w:t>Estructurales</w:t>
+      </w:r>
+    </w:p>
+    <w:p>
+      <w:pPr>
+        <w:pStyle w:val="Ttulo3"/>
+      </w:pPr>
+      <w:r>
+        <w:t xml:space="preserve">Aplicación del Patrón </w:t>
+      </w:r>
+      <w:proofErr w:type="spellStart"/>
+      <w:r>
+        <w:t>Adapter</w:t>
+      </w:r>
+      <w:proofErr w:type="spellEnd"/>
+    </w:p>
+    <w:p>
+      <w:pPr>
+        <w:pStyle w:val="Ttulo4"/>
+      </w:pPr>
+      <w:r>
+        <w:t>Como está colaborando este Patrón al Proyecto</w:t>
+      </w:r>
+    </w:p>
+    <w:p>
+      <w:r>
+        <w:t xml:space="preserve">En nuestro proyecto, el patrón </w:t>
+      </w:r>
+      <w:proofErr w:type="spellStart"/>
+      <w:r>
+        <w:rPr>
+          <w:b/>
+          <w:bCs/>
+        </w:rPr>
+        <w:t>Adapter</w:t>
+      </w:r>
+      <w:proofErr w:type="spellEnd"/>
+      <w:r>
+        <w:t xml:space="preserve"> está siendo utilizado como parte de la </w:t>
+      </w:r>
+      <w:r>
+        <w:rPr>
+          <w:b/>
+          <w:bCs/>
+        </w:rPr>
+        <w:t>arquitectura hexagonal</w:t>
+      </w:r>
+      <w:r>
+        <w:t xml:space="preserve"> para permitir que los diferentes componentes de la aplicación puedan comunicarse sin depender directamente de implementaciones específicas. Para evidenciar su funcionamiento, tomaremos como ejemplo la creación de usuarios, donde la capa de aplicación trabaja mediante el puerto </w:t>
+      </w:r>
+      <w:proofErr w:type="spellStart"/>
+      <w:r>
+        <w:rPr>
+          <w:b/>
+          <w:bCs/>
+        </w:rPr>
+        <w:t>UserRepository</w:t>
+      </w:r>
+      <w:proofErr w:type="spellEnd"/>
+      <w:r>
+        <w:t xml:space="preserve">, mientras que en la infraestructura se encuentra </w:t>
+      </w:r>
+      <w:proofErr w:type="spellStart"/>
+      <w:r>
+        <w:rPr>
+          <w:b/>
+          <w:bCs/>
+        </w:rPr>
+        <w:t>UserAdapterPersistence</w:t>
+      </w:r>
+      <w:proofErr w:type="spellEnd"/>
+      <w:r>
+        <w:t xml:space="preserve">, encargado de adaptar este contrato a la implementación de persistencia utilizada con </w:t>
+      </w:r>
+      <w:r>
+        <w:rPr>
+          <w:b/>
+          <w:bCs/>
+        </w:rPr>
+        <w:t>JPA</w:t>
+      </w:r>
+      <w:r>
+        <w:t xml:space="preserve"> e </w:t>
+      </w:r>
+      <w:proofErr w:type="spellStart"/>
+      <w:r>
+        <w:rPr>
+          <w:b/>
+          <w:bCs/>
+        </w:rPr>
+        <w:t>Hibernate</w:t>
+      </w:r>
+      <w:proofErr w:type="spellEnd"/>
+      <w:r>
+        <w:t>.</w:t>
+      </w:r>
+    </w:p>
+    <w:p>
+      <w:r>
+        <w:lastRenderedPageBreak/>
+        <w:t xml:space="preserve">Este patrón aporta principalmente desacoplamiento entre la lógica de aplicación y la infraestructura, ya que </w:t>
+      </w:r>
+      <w:proofErr w:type="spellStart"/>
+      <w:r>
+        <w:rPr>
+          <w:b/>
+          <w:bCs/>
+        </w:rPr>
+        <w:t>AuthService</w:t>
+      </w:r>
+      <w:proofErr w:type="spellEnd"/>
+      <w:r>
+        <w:t xml:space="preserve"> no necesita conocer cómo se almacenan los usuarios ni trabajar directamente con JPA. El adaptador recibe las operaciones definidas por el puerto y las traduce hacia </w:t>
+      </w:r>
+      <w:proofErr w:type="spellStart"/>
+      <w:r>
+        <w:rPr>
+          <w:b/>
+          <w:bCs/>
+        </w:rPr>
+        <w:t>UserDAO</w:t>
+      </w:r>
+      <w:proofErr w:type="spellEnd"/>
+      <w:r>
+        <w:t xml:space="preserve"> y las entidades de persistencia, permitiendo que la aplicación mantenga su lógica independiente de la tecnología utilizada para almacenar la información. Además, este mismo enfoque puede aplicarse en las demás funcionalidades del proyecto que requieren comunicación entre la aplicación y componentes externos.</w:t>
+      </w:r>
+    </w:p>
+    <w:p>
+      <w:pPr>
+        <w:pStyle w:val="Ttulo4"/>
+      </w:pPr>
+      <w:r>
+        <w:t>Diagrama de Clase UML</w:t>
+      </w:r>
+    </w:p>
+    <w:p>
+      <w:pPr>
+        <w:jc w:val="center"/>
+      </w:pPr>
+      <w:r>
+        <w:drawing>
+          <wp:inline distT="0" distB="0" distL="0" distR="0" wp14:anchorId="6FE64FE9" wp14:editId="0E01C80D">
+            <wp:extent cx="2225615" cy="4064462"/>
+            <wp:effectExtent l="0" t="0" r="3810" b="0"/>
+            <wp:docPr id="28" name="Imagen 28"/>
+            <wp:cNvGraphicFramePr>
+              <a:graphicFrameLocks xmlns:a="http://schemas.openxmlformats.org/drawingml/2006/main" noChangeAspect="1"/>
+            </wp:cNvGraphicFramePr>
+            <a:graphic xmlns:a="http://schemas.openxmlformats.org/drawingml/2006/main">
+              <a:graphicData uri="http://schemas.openxmlformats.org/drawingml/2006/picture">
+                <pic:pic xmlns:pic="http://schemas.openxmlformats.org/drawingml/2006/picture">
+                  <pic:nvPicPr>
+                    <pic:cNvPr id="1" name=""/>
+                    <pic:cNvPicPr/>
+                  </pic:nvPicPr>
+                  <pic:blipFill>
+                    <a:blip r:embed="rId33"/>
+                    <a:stretch>
+                      <a:fillRect/>
+                    </a:stretch>
+                  </pic:blipFill>
+                  <pic:spPr>
+                    <a:xfrm>
+                      <a:off x="0" y="0"/>
+                      <a:ext cx="2231095" cy="4074470"/>
+                    </a:xfrm>
+                    <a:prstGeom prst="rect">
+                      <a:avLst/>
+                    </a:prstGeom>
+                  </pic:spPr>
+                </pic:pic>
+              </a:graphicData>
+            </a:graphic>
+          </wp:inline>
+        </w:drawing>
+      </w:r>
+    </w:p>
+    <w:p>
+      <w:pPr>
+        <w:pStyle w:val="Ttulo4"/>
+      </w:pPr>
+      <w:r>
+        <w:lastRenderedPageBreak/>
+        <w:t>Código</w:t>
+      </w:r>
+    </w:p>
+    <w:p>
+      <w:r>
+        <w:drawing>
+          <wp:inline distT="0" distB="0" distL="0" distR="0" wp14:anchorId="4F2736A4" wp14:editId="1FC4987B">
+            <wp:extent cx="5943600" cy="3430270"/>
+            <wp:effectExtent l="0" t="0" r="0" b="0"/>
+            <wp:docPr id="29" name="Imagen 29"/>
+            <wp:cNvGraphicFramePr>
+              <a:graphicFrameLocks xmlns:a="http://schemas.openxmlformats.org/drawingml/2006/main" noChangeAspect="1"/>
+            </wp:cNvGraphicFramePr>
+            <a:graphic xmlns:a="http://schemas.openxmlformats.org/drawingml/2006/main">
+              <a:graphicData uri="http://schemas.openxmlformats.org/drawingml/2006/picture">
+                <pic:pic xmlns:pic="http://schemas.openxmlformats.org/drawingml/2006/picture">
+                  <pic:nvPicPr>
+                    <pic:cNvPr id="1" name=""/>
+                    <pic:cNvPicPr/>
+                  </pic:nvPicPr>
+                  <pic:blipFill>
+                    <a:blip r:embed="rId34"/>
+                    <a:stretch>
+                      <a:fillRect/>
+                    </a:stretch>
+                  </pic:blipFill>
+                  <pic:spPr>
+                    <a:xfrm>
+                      <a:off x="0" y="0"/>
+                      <a:ext cx="5943600" cy="3430270"/>
+                    </a:xfrm>
+                    <a:prstGeom prst="rect">
+                      <a:avLst/>
+                    </a:prstGeom>
+                  </pic:spPr>
+                </pic:pic>
+              </a:graphicData>
+            </a:graphic>
+          </wp:inline>
+        </w:drawing>
+      </w:r>
+    </w:p>
+    <w:p>
+      <w:r>
+        <w:drawing>
+          <wp:inline distT="0" distB="0" distL="0" distR="0" wp14:anchorId="340030D1" wp14:editId="065D87C3">
+            <wp:extent cx="5449060" cy="1381318"/>
+            <wp:effectExtent l="0" t="0" r="0" b="9525"/>
+            <wp:docPr id="30" name="Imagen 30"/>
+            <wp:cNvGraphicFramePr>
+              <a:graphicFrameLocks xmlns:a="http://schemas.openxmlformats.org/drawingml/2006/main" noChangeAspect="1"/>
+            </wp:cNvGraphicFramePr>
+            <a:graphic xmlns:a="http://schemas.openxmlformats.org/drawingml/2006/main">
+              <a:graphicData uri="http://schemas.openxmlformats.org/drawingml/2006/picture">
+                <pic:pic xmlns:pic="http://schemas.openxmlformats.org/drawingml/2006/picture">
+                  <pic:nvPicPr>
+                    <pic:cNvPr id="1" name=""/>
+                    <pic:cNvPicPr/>
+                  </pic:nvPicPr>
+                  <pic:blipFill>
+                    <a:blip r:embed="rId35"/>
+                    <a:stretch>
+                      <a:fillRect/>
+                    </a:stretch>
+                  </pic:blipFill>
+                  <pic:spPr>
+                    <a:xfrm>
+                      <a:off x="0" y="0"/>
+                      <a:ext cx="5449060" cy="1381318"/>
+                    </a:xfrm>
+                    <a:prstGeom prst="rect">
+                      <a:avLst/>
+                    </a:prstGeom>
+                  </pic:spPr>
+                </pic:pic>
+              </a:graphicData>
+            </a:graphic>
+          </wp:inline>
+        </w:drawing>
+      </w:r>
+    </w:p>
+    <w:p>
+      <w:r>
+        <w:lastRenderedPageBreak/>
+        <w:drawing>
+          <wp:inline distT="0" distB="0" distL="0" distR="0" wp14:anchorId="188B8AA5" wp14:editId="2524FEB4">
+            <wp:extent cx="5943600" cy="3407410"/>
+            <wp:effectExtent l="0" t="0" r="0" b="2540"/>
+            <wp:docPr id="31" name="Imagen 31"/>
+            <wp:cNvGraphicFramePr>
+              <a:graphicFrameLocks xmlns:a="http://schemas.openxmlformats.org/drawingml/2006/main" noChangeAspect="1"/>
+            </wp:cNvGraphicFramePr>
+            <a:graphic xmlns:a="http://schemas.openxmlformats.org/drawingml/2006/main">
+              <a:graphicData uri="http://schemas.openxmlformats.org/drawingml/2006/picture">
+                <pic:pic xmlns:pic="http://schemas.openxmlformats.org/drawingml/2006/picture">
+                  <pic:nvPicPr>
+                    <pic:cNvPr id="1" name=""/>
+                    <pic:cNvPicPr/>
+                  </pic:nvPicPr>
+                  <pic:blipFill>
+                    <a:blip r:embed="rId36"/>
+                    <a:stretch>
+                      <a:fillRect/>
+                    </a:stretch>
+                  </pic:blipFill>
+                  <pic:spPr>
+                    <a:xfrm>
+                      <a:off x="0" y="0"/>
+                      <a:ext cx="5943600" cy="3407410"/>
+                    </a:xfrm>
+                    <a:prstGeom prst="rect">
+                      <a:avLst/>
+                    </a:prstGeom>
+                  </pic:spPr>
+                </pic:pic>
+              </a:graphicData>
+            </a:graphic>
+          </wp:inline>
+        </w:drawing>
+      </w:r>
+    </w:p>
+    <w:p>
+      <w:r>
+        <w:drawing>
+          <wp:inline distT="0" distB="0" distL="0" distR="0" wp14:anchorId="543D9985" wp14:editId="07597DFA">
+            <wp:extent cx="5943600" cy="1938020"/>
+            <wp:effectExtent l="0" t="0" r="0" b="5080"/>
+            <wp:docPr id="32" name="Imagen 32"/>
+            <wp:cNvGraphicFramePr>
+              <a:graphicFrameLocks xmlns:a="http://schemas.openxmlformats.org/drawingml/2006/main" noChangeAspect="1"/>
+            </wp:cNvGraphicFramePr>
+            <a:graphic xmlns:a="http://schemas.openxmlformats.org/drawingml/2006/main">
+              <a:graphicData uri="http://schemas.openxmlformats.org/drawingml/2006/picture">
+                <pic:pic xmlns:pic="http://schemas.openxmlformats.org/drawingml/2006/picture">
+                  <pic:nvPicPr>
+                    <pic:cNvPr id="1" name=""/>
+                    <pic:cNvPicPr/>
+                  </pic:nvPicPr>
+                  <pic:blipFill>
+                    <a:blip r:embed="rId37"/>
+                    <a:stretch>
+                      <a:fillRect/>
+                    </a:stretch>
+                  </pic:blipFill>
+                  <pic:spPr>
+                    <a:xfrm>
+                      <a:off x="0" y="0"/>
+                      <a:ext cx="5943600" cy="1938020"/>
+                    </a:xfrm>
+                    <a:prstGeom prst="rect">
+                      <a:avLst/>
+                    </a:prstGeom>
+                  </pic:spPr>
+                </pic:pic>
+              </a:graphicData>
+            </a:graphic>
+          </wp:inline>
+        </w:drawing>
+      </w:r>
+    </w:p>
+    <w:p>
+      <w:pPr>
+        <w:pStyle w:val="Ttulo4"/>
+      </w:pPr>
+      <w:r>
+        <w:t>Explicación y Prueba de que Funciona</w:t>
+      </w:r>
+    </w:p>
+    <w:p>
+      <w:pPr>
+        <w:pStyle w:val="Ttulo5"/>
+      </w:pPr>
+      <w:proofErr w:type="spellStart"/>
+      <w:r>
+        <w:t>AuthService</w:t>
+      </w:r>
+      <w:proofErr w:type="spellEnd"/>
+      <w:r>
+        <w:t xml:space="preserve"> (Cliente)</w:t>
+      </w:r>
+    </w:p>
+    <w:p>
+      <w:r>
+        <w:t xml:space="preserve">Es el componente encargado de </w:t>
+      </w:r>
+      <w:r>
+        <w:rPr>
+          <w:b/>
+          <w:bCs/>
+        </w:rPr>
+        <w:t>orquestar el registro del usuario</w:t>
+      </w:r>
+      <w:r>
+        <w:t xml:space="preserve"> desde la capa de aplicación. Para guardar el usuario, utiliza </w:t>
+      </w:r>
+      <w:proofErr w:type="spellStart"/>
+      <w:r>
+        <w:rPr>
+          <w:b/>
+          <w:bCs/>
+        </w:rPr>
+        <w:t>UserRepository</w:t>
+      </w:r>
+      <w:proofErr w:type="spellEnd"/>
+      <w:r>
+        <w:t xml:space="preserve"> sin conocer directamente la implementación encargada de la persistencia.</w:t>
+      </w:r>
+    </w:p>
+    <w:p>
+      <w:pPr>
+        <w:pStyle w:val="Ttulo5"/>
+      </w:pPr>
+      <w:proofErr w:type="spellStart"/>
+      <w:r>
+        <w:lastRenderedPageBreak/>
+        <w:t>UserRepository</w:t>
+      </w:r>
+      <w:proofErr w:type="spellEnd"/>
+      <w:r>
+        <w:t xml:space="preserve"> (Interfaz)</w:t>
+      </w:r>
+    </w:p>
+    <w:p>
+      <w:r>
+        <w:t xml:space="preserve">Es el </w:t>
+      </w:r>
+      <w:r>
+        <w:rPr>
+          <w:rStyle w:val="Textoennegrita"/>
+        </w:rPr>
+        <w:t>puerto de salida</w:t>
+      </w:r>
+      <w:r>
+        <w:t xml:space="preserve"> que define las operaciones que necesita la aplicación para trabajar con los usuarios. En este caso, establece el contrato para guardar y consultar usuarios, sin depender de JPA o de la base de datos.</w:t>
+      </w:r>
+    </w:p>
+    <w:p>
+      <w:pPr>
+        <w:pStyle w:val="Ttulo5"/>
+      </w:pPr>
+      <w:proofErr w:type="spellStart"/>
+      <w:r>
+        <w:t>UserAdapterPersistence</w:t>
+      </w:r>
+      <w:proofErr w:type="spellEnd"/>
+      <w:r>
+        <w:t xml:space="preserve"> (</w:t>
+      </w:r>
+      <w:proofErr w:type="spellStart"/>
+      <w:r>
+        <w:t>Adapter</w:t>
+      </w:r>
+      <w:proofErr w:type="spellEnd"/>
+      <w:r>
+        <w:t>)</w:t>
+      </w:r>
+    </w:p>
+    <w:p>
+      <w:r>
+        <w:t xml:space="preserve">Es el componente que implementa el puerto </w:t>
+      </w:r>
+      <w:proofErr w:type="spellStart"/>
+      <w:r>
+        <w:rPr>
+          <w:b/>
+          <w:bCs/>
+        </w:rPr>
+        <w:t>UserRepository</w:t>
+      </w:r>
+      <w:proofErr w:type="spellEnd"/>
+      <w:r>
+        <w:t xml:space="preserve"> y adapta sus operaciones hacia la infraestructura de persistencia. Recibe el </w:t>
+      </w:r>
+      <w:proofErr w:type="spellStart"/>
+      <w:r>
+        <w:rPr>
+          <w:b/>
+          <w:bCs/>
+        </w:rPr>
+        <w:t>User</w:t>
+      </w:r>
+      <w:proofErr w:type="spellEnd"/>
+      <w:r>
+        <w:t xml:space="preserve"> desde la aplicación, lo convierte mediante el </w:t>
+      </w:r>
+      <w:proofErr w:type="spellStart"/>
+      <w:r>
+        <w:rPr>
+          <w:b/>
+          <w:bCs/>
+        </w:rPr>
+        <w:t>mapper</w:t>
+      </w:r>
+      <w:proofErr w:type="spellEnd"/>
+      <w:r>
+        <w:t xml:space="preserve"> a </w:t>
+      </w:r>
+      <w:proofErr w:type="spellStart"/>
+      <w:r>
+        <w:rPr>
+          <w:b/>
+          <w:bCs/>
+        </w:rPr>
+        <w:t>UserEntity</w:t>
+      </w:r>
+      <w:proofErr w:type="spellEnd"/>
+      <w:r>
+        <w:t xml:space="preserve"> y utiliza </w:t>
+      </w:r>
+      <w:proofErr w:type="spellStart"/>
+      <w:r>
+        <w:rPr>
+          <w:b/>
+          <w:bCs/>
+        </w:rPr>
+        <w:t>UserDAO</w:t>
+      </w:r>
+      <w:proofErr w:type="spellEnd"/>
+      <w:r>
+        <w:t xml:space="preserve"> para realizar la operación en la base de datos.</w:t>
+      </w:r>
+    </w:p>
+    <w:p>
+      <w:pPr>
+        <w:pStyle w:val="Ttulo5"/>
+      </w:pPr>
+      <w:proofErr w:type="spellStart"/>
+      <w:r>
+        <w:t>UserDAO</w:t>
+      </w:r>
+      <w:proofErr w:type="spellEnd"/>
+      <w:r>
+        <w:t xml:space="preserve"> (</w:t>
+      </w:r>
+      <w:proofErr w:type="spellStart"/>
+      <w:r>
+        <w:t>Adaptee</w:t>
+      </w:r>
+      <w:proofErr w:type="spellEnd"/>
+      <w:r>
+        <w:t>)</w:t>
+      </w:r>
+    </w:p>
+    <w:p>
+      <w:r>
+        <w:t xml:space="preserve">Es el componente que proporciona las operaciones necesarias para comunicarse directamente con la base de datos mediante </w:t>
+      </w:r>
+      <w:r>
+        <w:rPr>
+          <w:b/>
+          <w:bCs/>
+        </w:rPr>
+        <w:t>JPA</w:t>
+      </w:r>
+      <w:r>
+        <w:t xml:space="preserve">. El </w:t>
+      </w:r>
+      <w:proofErr w:type="spellStart"/>
+      <w:r>
+        <w:rPr>
+          <w:b/>
+          <w:bCs/>
+        </w:rPr>
+        <w:t>UserAdapterPersistence</w:t>
+      </w:r>
+      <w:proofErr w:type="spellEnd"/>
+      <w:r>
+        <w:t xml:space="preserve"> utiliza este componente para ejecutar la persistencia del usuario.</w:t>
+      </w:r>
+    </w:p>
+    <w:p>
+      <w:pPr>
+        <w:pStyle w:val="Ttulo5"/>
+      </w:pPr>
+      <w:r>
+        <w:t>Funcionamiento</w:t>
+      </w:r>
+    </w:p>
+    <w:p>
+      <w:r>
+        <w:t xml:space="preserve">Cuando nosotros enviamos una petición a la API REST por medio del </w:t>
+      </w:r>
+      <w:proofErr w:type="spellStart"/>
+      <w:r>
+        <w:t>endpoint</w:t>
+      </w:r>
+      <w:proofErr w:type="spellEnd"/>
+      <w:r>
+        <w:t xml:space="preserve"> </w:t>
+      </w:r>
+      <w:r>
+        <w:rPr>
+          <w:b/>
+          <w:bCs/>
+        </w:rPr>
+        <w:t>/api/</w:t>
+      </w:r>
+      <w:proofErr w:type="spellStart"/>
+      <w:r>
+        <w:rPr>
+          <w:b/>
+          <w:bCs/>
+        </w:rPr>
+        <w:t>auth</w:t>
+      </w:r>
+      <w:proofErr w:type="spellEnd"/>
+      <w:r>
+        <w:rPr>
+          <w:b/>
+          <w:bCs/>
+        </w:rPr>
+        <w:t>/</w:t>
+      </w:r>
+      <w:proofErr w:type="spellStart"/>
+      <w:r>
+        <w:rPr>
+          <w:b/>
+          <w:bCs/>
+        </w:rPr>
+        <w:t>register</w:t>
+      </w:r>
+      <w:proofErr w:type="spellEnd"/>
+      <w:r>
+        <w:t xml:space="preserve"> para crear un usuario, internamente habrá un controlador el cual recibirá esa solicitud y la </w:t>
+      </w:r>
+      <w:r>
+        <w:t>enviará</w:t>
+      </w:r>
+      <w:r>
+        <w:t xml:space="preserve"> </w:t>
+      </w:r>
+      <w:r>
+        <w:t xml:space="preserve">al </w:t>
+      </w:r>
+      <w:proofErr w:type="spellStart"/>
+      <w:r>
+        <w:rPr>
+          <w:b/>
+          <w:bCs/>
+        </w:rPr>
+        <w:t>AuthService</w:t>
+      </w:r>
+      <w:proofErr w:type="spellEnd"/>
+      <w:r>
+        <w:rPr>
+          <w:b/>
+          <w:bCs/>
+        </w:rPr>
+        <w:t xml:space="preserve"> </w:t>
+      </w:r>
+      <w:r>
+        <w:t xml:space="preserve">donde se empieza a evidenciar la presencia del uso del patrón </w:t>
+      </w:r>
+      <w:proofErr w:type="spellStart"/>
+      <w:r>
+        <w:rPr>
+          <w:b/>
+          <w:bCs/>
+        </w:rPr>
+        <w:t>adapter</w:t>
+      </w:r>
+      <w:proofErr w:type="spellEnd"/>
+      <w:r>
+        <w:rPr>
+          <w:b/>
+          <w:bCs/>
+        </w:rPr>
+        <w:t xml:space="preserve">. </w:t>
+      </w:r>
+      <w:r>
+        <w:t>Finalmente, la API, nos devolverá nuevamente los datos del usuario sin su contraseña validando así que la creación del usuario se hizo correctamente:</w:t>
+      </w:r>
+    </w:p>
+    <w:p>
+      <w:pPr>
+        <w:jc w:val="center"/>
+      </w:pPr>
+      <w:r>
+        <w:lastRenderedPageBreak/>
+        <w:drawing>
+          <wp:inline distT="0" distB="0" distL="0" distR="0" wp14:anchorId="064F52F7" wp14:editId="5168AF42">
+            <wp:extent cx="5943600" cy="3516630"/>
+            <wp:effectExtent l="0" t="0" r="0" b="7620"/>
+            <wp:docPr id="33" name="Imagen 33"/>
+            <wp:cNvGraphicFramePr>
+              <a:graphicFrameLocks xmlns:a="http://schemas.openxmlformats.org/drawingml/2006/main" noChangeAspect="1"/>
+            </wp:cNvGraphicFramePr>
+            <a:graphic xmlns:a="http://schemas.openxmlformats.org/drawingml/2006/main">
+              <a:graphicData uri="http://schemas.openxmlformats.org/drawingml/2006/picture">
+                <pic:pic xmlns:pic="http://schemas.openxmlformats.org/drawingml/2006/picture">
+                  <pic:nvPicPr>
+                    <pic:cNvPr id="1" name=""/>
+                    <pic:cNvPicPr/>
+                  </pic:nvPicPr>
+                  <pic:blipFill>
+                    <a:blip r:embed="rId38"/>
+                    <a:stretch>
+                      <a:fillRect/>
+                    </a:stretch>
+                  </pic:blipFill>
+                  <pic:spPr>
+                    <a:xfrm>
+                      <a:off x="0" y="0"/>
+                      <a:ext cx="5943600" cy="3516630"/>
+                    </a:xfrm>
+                    <a:prstGeom prst="rect">
+                      <a:avLst/>
+                    </a:prstGeom>
+                  </pic:spPr>
+                </pic:pic>
+              </a:graphicData>
+            </a:graphic>
+          </wp:inline>
+        </w:drawing>
+      </w:r>
+    </w:p>
     <w:p>
       <w:pPr>
         <w:jc w:val="left"/>
-        <w:rPr>
-          <w:b/>
-          <w:bCs/>
-        </w:rPr>
-      </w:pPr>
-    </w:p>
-    <w:p/>
+      </w:pPr>
+      <w:r>
+        <w:t>Posteriormente, se comprueba en la base de datos que el usuario ya se haya creado correctamente:</w:t>
+      </w:r>
+    </w:p>
+    <w:p>
+      <w:pPr>
+        <w:jc w:val="left"/>
+      </w:pPr>
+      <w:r>
+        <w:drawing>
+          <wp:inline distT="0" distB="0" distL="0" distR="0" wp14:anchorId="23DA54E8" wp14:editId="710E2647">
+            <wp:extent cx="5943600" cy="544830"/>
+            <wp:effectExtent l="0" t="0" r="0" b="7620"/>
+            <wp:docPr id="34" name="Imagen 34"/>
+            <wp:cNvGraphicFramePr>
+              <a:graphicFrameLocks xmlns:a="http://schemas.openxmlformats.org/drawingml/2006/main" noChangeAspect="1"/>
+            </wp:cNvGraphicFramePr>
+            <a:graphic xmlns:a="http://schemas.openxmlformats.org/drawingml/2006/main">
+              <a:graphicData uri="http://schemas.openxmlformats.org/drawingml/2006/picture">
+                <pic:pic xmlns:pic="http://schemas.openxmlformats.org/drawingml/2006/picture">
+                  <pic:nvPicPr>
+                    <pic:cNvPr id="1" name=""/>
+                    <pic:cNvPicPr/>
+                  </pic:nvPicPr>
+                  <pic:blipFill>
+                    <a:blip r:embed="rId39"/>
+                    <a:stretch>
+                      <a:fillRect/>
+                    </a:stretch>
+                  </pic:blipFill>
+                  <pic:spPr>
+                    <a:xfrm>
+                      <a:off x="0" y="0"/>
+                      <a:ext cx="5943600" cy="544830"/>
+                    </a:xfrm>
+                    <a:prstGeom prst="rect">
+                      <a:avLst/>
+                    </a:prstGeom>
+                  </pic:spPr>
+                </pic:pic>
+              </a:graphicData>
+            </a:graphic>
+          </wp:inline>
+        </w:drawing>
+      </w:r>
+    </w:p>
     <w:p/>
     <w:sectPr>
-      <w:headerReference w:type="default" r:id="rId33"/>
+      <w:headerReference w:type="default" r:id="rId40"/>
       <w:pgSz w:w="12240" w:h="15840"/>
       <w:pgMar w:top="1440" w:right="1440" w:bottom="1440" w:left="1440" w:header="709" w:footer="709" w:gutter="0"/>
       <w:cols w:space="720"/>
@@ -8577,6 +9310,17 @@
       <w:lang w:eastAsia="es-CO"/>
     </w:rPr>
   </w:style>
+  <w:style w:type="character" w:styleId="Textoennegrita">
+    <w:name w:val="Strong"/>
+    <w:basedOn w:val="Fuentedeprrafopredeter"/>
+    <w:uiPriority w:val="22"/>
+    <w:qFormat/>
+    <w:rsid w:val="00A63171"/>
+    <w:rPr>
+      <w:b/>
+      <w:bCs/>
+    </w:rPr>
+  </w:style>
 </w:styles>
 </file>
 

</xml_diff>

<commit_message>
Justificacion del patron Bridge
</commit_message>
<xml_diff>
--- a/Sistema de Gestion de Cadenas de Suministro.docx
+++ b/Sistema de Gestion de Cadenas de Suministro.docx
@@ -5857,8 +5857,17 @@
           <w:b/>
           <w:bCs/>
         </w:rPr>
-        <w:t>Client / Director</w:t>
-      </w:r>
+        <w:t xml:space="preserve">Client / </w:t>
+      </w:r>
+      <w:proofErr w:type="gramStart"/>
+      <w:r>
+        <w:rPr>
+          <w:b/>
+          <w:bCs/>
+        </w:rPr>
+        <w:t>Director</w:t>
+      </w:r>
+      <w:proofErr w:type="gramEnd"/>
     </w:p>
     <w:p>
       <w:pPr>
@@ -6274,8 +6283,16 @@
         <w:rPr>
           <w:lang w:val="en-US"/>
         </w:rPr>
-        <w:t>/Director</w:t>
-      </w:r>
+        <w:t>/</w:t>
+      </w:r>
+      <w:proofErr w:type="gramStart"/>
+      <w:r>
+        <w:rPr>
+          <w:lang w:val="en-US"/>
+        </w:rPr>
+        <w:t>Director</w:t>
+      </w:r>
+      <w:proofErr w:type="gramEnd"/>
       <w:r>
         <w:t>)</w:t>
       </w:r>
@@ -6318,6 +6335,7 @@
         <w:t xml:space="preserve"> define el contrato de métodos que deberán utilizar los Builders concretos posteriormente, entre ellos los utilizados como </w:t>
       </w:r>
       <w:proofErr w:type="spellStart"/>
+      <w:proofErr w:type="gramStart"/>
       <w:r>
         <w:rPr>
           <w:b/>
@@ -6331,6 +6349,30 @@
           <w:b/>
           <w:bCs/>
         </w:rPr>
+        <w:t>(</w:t>
+      </w:r>
+      <w:proofErr w:type="gramEnd"/>
+      <w:r>
+        <w:rPr>
+          <w:b/>
+          <w:bCs/>
+        </w:rPr>
+        <w:t xml:space="preserve">), </w:t>
+      </w:r>
+      <w:proofErr w:type="spellStart"/>
+      <w:r>
+        <w:rPr>
+          <w:b/>
+          <w:bCs/>
+        </w:rPr>
+        <w:t>claim</w:t>
+      </w:r>
+      <w:proofErr w:type="spellEnd"/>
+      <w:r>
+        <w:rPr>
+          <w:b/>
+          <w:bCs/>
+        </w:rPr>
         <w:t xml:space="preserve">(), </w:t>
       </w:r>
       <w:proofErr w:type="spellStart"/>
@@ -6339,7 +6381,7 @@
           <w:b/>
           <w:bCs/>
         </w:rPr>
-        <w:t>claim</w:t>
+        <w:t>issuedAt</w:t>
       </w:r>
       <w:proofErr w:type="spellEnd"/>
       <w:r>
@@ -6355,7 +6397,7 @@
           <w:b/>
           <w:bCs/>
         </w:rPr>
-        <w:t>issuedAt</w:t>
+        <w:t>expiration</w:t>
       </w:r>
       <w:proofErr w:type="spellEnd"/>
       <w:r>
@@ -6371,7 +6413,7 @@
           <w:b/>
           <w:bCs/>
         </w:rPr>
-        <w:t>expiration</w:t>
+        <w:t>signWith</w:t>
       </w:r>
       <w:proofErr w:type="spellEnd"/>
       <w:r>
@@ -6379,22 +6421,6 @@
           <w:b/>
           <w:bCs/>
         </w:rPr>
-        <w:t xml:space="preserve">(), </w:t>
-      </w:r>
-      <w:proofErr w:type="spellStart"/>
-      <w:r>
-        <w:rPr>
-          <w:b/>
-          <w:bCs/>
-        </w:rPr>
-        <w:t>signWith</w:t>
-      </w:r>
-      <w:proofErr w:type="spellEnd"/>
-      <w:r>
-        <w:rPr>
-          <w:b/>
-          <w:bCs/>
-        </w:rPr>
         <w:t xml:space="preserve">() </w:t>
       </w:r>
       <w:r>
@@ -6447,12 +6473,21 @@
       <w:r>
         <w:t xml:space="preserve">y se asigna comportamiento a sus métodos. Finalmente, el método </w:t>
       </w:r>
-      <w:r>
-        <w:rPr>
-          <w:b/>
-          <w:bCs/>
-        </w:rPr>
-        <w:t>compact()</w:t>
+      <w:proofErr w:type="gramStart"/>
+      <w:r>
+        <w:rPr>
+          <w:b/>
+          <w:bCs/>
+        </w:rPr>
+        <w:t>compact(</w:t>
+      </w:r>
+      <w:proofErr w:type="gramEnd"/>
+      <w:r>
+        <w:rPr>
+          <w:b/>
+          <w:bCs/>
+        </w:rPr>
+        <w:t>)</w:t>
       </w:r>
       <w:r>
         <w:t xml:space="preserve"> genera el producto terminado: un token JWT firmado en formato </w:t>
@@ -7304,6 +7339,56 @@
             </a:graphic>
           </wp:inline>
         </w:drawing>
+      </w:r>
+    </w:p>
+    <w:p>
+      <w:pPr>
+        <w:pStyle w:val="Ttulo3"/>
+      </w:pPr>
+      <w:r>
+        <w:t>Aplicación del Patrón Bridge</w:t>
+      </w:r>
+    </w:p>
+    <w:p>
+      <w:r>
+        <w:t>Revisamos las funcionalidades previstas para LogiSync y concluimos que, por ahora, el patrón Bridge no resolvería una necesidad concreta del proyecto.</w:t>
+      </w:r>
+    </w:p>
+    <w:p>
+      <w:r>
+        <w:t>Bridge es útil cuando se necesita separar dos aspectos que puedan cambiar de forma independiente. Por ejemplo, cuando existen varias formas de realizar una operación y, al mismo tiempo, distintos tipos de procesos que deben utilizar esas formas. Así se pueden combinar las opciones sin crear una clase para cada combinación.</w:t>
+      </w:r>
+    </w:p>
+    <w:p>
+      <w:r>
+        <w:t xml:space="preserve">En el alcance de LogiSync se incluyen la gestión de proveedores, productos, abastecimiento, inventario, pedidos y despachos; también el seguimiento de productos, la predicción de demanda y la optimización del almacenamiento y las rutas. Además, se incorporará una integración con dispositivos </w:t>
+      </w:r>
+      <w:proofErr w:type="spellStart"/>
+      <w:r>
+        <w:t>IoT</w:t>
+      </w:r>
+      <w:proofErr w:type="spellEnd"/>
+      <w:r>
+        <w:t xml:space="preserve"> para recibir información en tiempo real relacionada con el seguimiento y monitoreo de los productos durante su </w:t>
+      </w:r>
+      <w:r>
+        <w:lastRenderedPageBreak/>
+        <w:t>transporte. Sin embargo, los requisitos actuales no describen variantes independientes que deban combinarse dentro de estas funcionalidades.</w:t>
+      </w:r>
+    </w:p>
+    <w:p>
+      <w:r>
+        <w:t>Por ejemplo, que el sistema tenga servicios, interfaces y adaptadores de persistencia no significa que esté usando Bridge. Esos elementos forman parte de la arquitectura hexagonal y ayudan a separar la lógica del sistema de la infraestructura. Cumplen una función diferente.</w:t>
+      </w:r>
+    </w:p>
+    <w:p>
+      <w:r>
+        <w:t>Tampoco tendría sentido crear varias versiones de los algoritmos de predicción, almacenamiento o rutas solo para incluir el patrón. El alcance no especifica esas alternativas, así que agregarlas ahora aumentaría la complejidad sin una mejora clara para el usuario.</w:t>
+      </w:r>
+    </w:p>
+    <w:p>
+      <w:r>
+        <w:t>Por eso decidimos no incorporar Bridge en esta etapa. No es que el patrón sea incompatible con LogiSync, sino que las funcionalidades definidas actualmente no requieren esa estructura.</w:t>
       </w:r>
     </w:p>
     <w:p/>

</xml_diff>

<commit_message>
Implementacion del patron Abstract factory
</commit_message>
<xml_diff>
--- a/Sistema de Gestion de Cadenas de Suministro.docx
+++ b/Sistema de Gestion de Cadenas de Suministro.docx
@@ -4706,7 +4706,10 @@
         <w:pStyle w:val="Ttulo3"/>
       </w:pPr>
       <w:r>
-        <w:t>Aplicación del Patrón Factory Method</w:t>
+        <w:t>Aplic</w:t>
+      </w:r>
+      <w:r>
+        <w:t>ación del Patrón Abstract Factory</w:t>
       </w:r>
     </w:p>
     <w:p>
@@ -4719,106 +4722,27 @@
     </w:p>
     <w:p>
       <w:r>
-        <w:t xml:space="preserve">En nuestro proyecto utilizamos Spring Framework, el cual cuenta con un contenedor de </w:t>
-      </w:r>
-      <w:r>
-        <w:rPr>
-          <w:b/>
-          <w:bCs/>
-        </w:rPr>
-        <w:t>Inversión de Control (</w:t>
-      </w:r>
-      <w:proofErr w:type="spellStart"/>
-      <w:r>
-        <w:rPr>
-          <w:b/>
-          <w:bCs/>
-        </w:rPr>
-        <w:t>IoC</w:t>
-      </w:r>
-      <w:proofErr w:type="spellEnd"/>
-      <w:r>
-        <w:rPr>
-          <w:b/>
-          <w:bCs/>
-        </w:rPr>
-        <w:t xml:space="preserve">) </w:t>
-      </w:r>
-      <w:r>
-        <w:t xml:space="preserve">encargado de crear y gestionar los objetos utilizados por la aplicación. Spring permite definir métodos de creación mediante la anotación </w:t>
-      </w:r>
-      <w:r>
-        <w:rPr>
-          <w:b/>
-          <w:bCs/>
-        </w:rPr>
-        <w:t>@Bean</w:t>
-      </w:r>
-      <w:r>
-        <w:t xml:space="preserve">, los cuales funcionan como un mecanismo de </w:t>
-      </w:r>
-      <w:r>
-        <w:rPr>
-          <w:b/>
-          <w:bCs/>
-        </w:rPr>
-        <w:t>Factory Method</w:t>
-      </w:r>
-      <w:r>
-        <w:t>, ya que encapsulan la creación de una instancia y permiten trabajar con una abstracción sin depender directamente de su implementación.</w:t>
-      </w:r>
-    </w:p>
-    <w:p>
-      <w:r>
-        <w:t xml:space="preserve">En nuestro caso, este patrón se utiliza principalmente en Spring Security para la creación de </w:t>
-      </w:r>
-      <w:proofErr w:type="spellStart"/>
-      <w:r>
-        <w:rPr>
-          <w:b/>
-          <w:bCs/>
-        </w:rPr>
-        <w:t>PasswordEncoder</w:t>
-      </w:r>
-      <w:proofErr w:type="spellEnd"/>
-      <w:r>
-        <w:t xml:space="preserve">, cuya implementación concreta es </w:t>
-      </w:r>
-      <w:proofErr w:type="spellStart"/>
-      <w:r>
-        <w:rPr>
-          <w:b/>
-          <w:bCs/>
-        </w:rPr>
-        <w:t>BCryptPasswordEncoder</w:t>
-      </w:r>
-      <w:proofErr w:type="spellEnd"/>
-      <w:r>
-        <w:t xml:space="preserve">. Esto permite que los componentes que necesitan procesar contraseñas dependan de </w:t>
-      </w:r>
-      <w:proofErr w:type="spellStart"/>
-      <w:r>
-        <w:rPr>
-          <w:b/>
-          <w:bCs/>
-        </w:rPr>
-        <w:t>PasswordEncoder</w:t>
-      </w:r>
-      <w:proofErr w:type="spellEnd"/>
-      <w:r>
-        <w:t xml:space="preserve"> y no directamente de </w:t>
-      </w:r>
-      <w:proofErr w:type="spellStart"/>
-      <w:r>
-        <w:rPr>
-          <w:b/>
-          <w:bCs/>
-        </w:rPr>
-        <w:t>BCrypt</w:t>
-      </w:r>
-      <w:proofErr w:type="spellEnd"/>
-      <w:r>
-        <w:t>, reduciendo el acoplamiento y facilitando un posible cambio de implementación. Además, al combinarse con la inyección de dependencias de Spring, la creación y gestión de estos componentes queda centralizada y facilita el mantenimiento del proyecto.</w:t>
+        <w:t>En nuestro proyecto LogiSync, una de las funcionalidades más importantes que se plantearon desde el inicio es la incorporación de análisis predictivo para la estimación de la d</w:t>
+      </w:r>
+      <w:r>
+        <w:t>emanda futura de productos y la optimización del inventario. Para lograr esto, no podemos limitarnos a un único cálculo matemático fijo, ya que dependiendo del tipo de producto, su historial de ventas o el comportamiento del mercado, se requiere utilizar d</w:t>
+      </w:r>
+      <w:r>
+        <w:t>iferentes modelos de predicción (como promedio móvil, suavizado exponencial o regresión lineal), junto con ajustes adicionales como multiplicadores por temporadas o colchones de stock de seguridad.</w:t>
+      </w:r>
+    </w:p>
+    <w:p>
+      <w:r>
+        <w:t>Aquí es donde entra a colaborar el patrón Abstract Factory</w:t>
+      </w:r>
+      <w:r>
+        <w:t xml:space="preserve">. En lugar de que el servicio de predicción o los controladores tengan que conocer y crear directamente cada clase matemática con sus configuraciones internas, el patrón nos proporciona una fábrica centralizada (ForecastStrategyFactory) encargada de crear </w:t>
+      </w:r>
+      <w:r>
+        <w:t>e instanciar la familia de estrategias predictivas según el algoritmo solicitado. De esta manera, el resto de la aplicación interactúa únicamente con una abstracción común (ForecastStrategy), logrando que el sistema quede completamente desacoplado, sea más</w:t>
+      </w:r>
+      <w:r>
+        <w:t xml:space="preserve"> fácil de mantener y permita en el futuro agregar nuevos modelos matemáticos (como ARIMA o redes neuronales) sin tener que tocar ni alterar la lógica del negocio existente.</w:t>
       </w:r>
     </w:p>
     <w:p>
@@ -4831,21 +4755,12 @@
       </w:r>
     </w:p>
     <w:p>
-      <w:pPr>
-        <w:rPr>
-          <w:lang w:val="en-US"/>
-        </w:rPr>
-      </w:pPr>
-      <w:r>
-        <w:rPr>
-          <w:noProof/>
-          <w:lang w:val="en-US"/>
-        </w:rPr>
+      <w:r>
         <w:drawing>
-          <wp:inline distT="0" distB="0" distL="0" distR="0" wp14:anchorId="0D43FD4E" wp14:editId="2A28B20B">
-            <wp:extent cx="5943600" cy="2309495"/>
-            <wp:effectExtent l="0" t="0" r="0" b="0"/>
-            <wp:docPr id="21" name="Imagen 21"/>
+          <wp:inline distT="0" distB="0" distL="0" distR="0" wp14:anchorId="60FE7A37" wp14:editId="14EC9246">
+            <wp:extent cx="5943600" cy="2868930"/>
+            <wp:effectExtent l="0" t="0" r="0" b="7620"/>
+            <wp:docPr id="47" name="Imagen 47"/>
             <wp:cNvGraphicFramePr>
               <a:graphicFrameLocks xmlns:a="http://schemas.openxmlformats.org/drawingml/2006/main" noChangeAspect="1"/>
             </wp:cNvGraphicFramePr>
@@ -4865,7 +4780,7 @@
                   <pic:spPr>
                     <a:xfrm>
                       <a:off x="0" y="0"/>
-                      <a:ext cx="5943600" cy="2309495"/>
+                      <a:ext cx="5943600" cy="2868930"/>
                     </a:xfrm>
                     <a:prstGeom prst="rect">
                       <a:avLst/>
@@ -4888,38 +4803,19 @@
     </w:p>
     <w:p>
       <w:pPr>
-        <w:rPr>
-          <w:b/>
-          <w:bCs/>
-        </w:rPr>
-      </w:pPr>
-      <w:r>
-        <w:rPr>
-          <w:b/>
-          <w:bCs/>
-        </w:rPr>
+        <w:pStyle w:val="Ttulo5"/>
+      </w:pPr>
+      <w:r>
         <w:t>Fabrica</w:t>
       </w:r>
     </w:p>
     <w:p>
-      <w:pPr>
-        <w:jc w:val="center"/>
-        <w:rPr>
-          <w:b/>
-          <w:bCs/>
-        </w:rPr>
-      </w:pPr>
-      <w:r>
-        <w:rPr>
-          <w:b/>
-          <w:bCs/>
-          <w:noProof/>
-        </w:rPr>
+      <w:r>
         <w:drawing>
-          <wp:inline distT="0" distB="0" distL="0" distR="0" wp14:anchorId="3534E270" wp14:editId="48DFBBED">
-            <wp:extent cx="2772162" cy="876422"/>
-            <wp:effectExtent l="0" t="0" r="9525" b="0"/>
-            <wp:docPr id="8" name="Imagen 8"/>
+          <wp:inline distT="0" distB="0" distL="0" distR="0" wp14:anchorId="3064B89C" wp14:editId="4A107C45">
+            <wp:extent cx="5943600" cy="2874645"/>
+            <wp:effectExtent l="0" t="0" r="0" b="1905"/>
+            <wp:docPr id="35" name="Imagen 35"/>
             <wp:cNvGraphicFramePr>
               <a:graphicFrameLocks xmlns:a="http://schemas.openxmlformats.org/drawingml/2006/main" noChangeAspect="1"/>
             </wp:cNvGraphicFramePr>
@@ -4939,7 +4835,7 @@
                   <pic:spPr>
                     <a:xfrm>
                       <a:off x="0" y="0"/>
-                      <a:ext cx="2772162" cy="876422"/>
+                      <a:ext cx="5943600" cy="2874645"/>
                     </a:xfrm>
                     <a:prstGeom prst="rect">
                       <a:avLst/>
@@ -4954,39 +4850,20 @@
     </w:p>
     <w:p>
       <w:pPr>
-        <w:jc w:val="left"/>
-        <w:rPr>
-          <w:b/>
-          <w:bCs/>
-        </w:rPr>
-      </w:pPr>
-      <w:r>
-        <w:rPr>
-          <w:b/>
-          <w:bCs/>
-        </w:rPr>
-        <w:t>Producto</w:t>
-      </w:r>
-    </w:p>
-    <w:p>
-      <w:pPr>
-        <w:jc w:val="center"/>
-        <w:rPr>
-          <w:b/>
-          <w:bCs/>
-        </w:rPr>
-      </w:pPr>
-      <w:r>
-        <w:rPr>
-          <w:b/>
-          <w:bCs/>
-          <w:noProof/>
-        </w:rPr>
+        <w:pStyle w:val="Ttulo5"/>
+      </w:pPr>
+      <w:r>
+        <w:lastRenderedPageBreak/>
+        <w:t>Interfaz de Producto</w:t>
+      </w:r>
+    </w:p>
+    <w:p>
+      <w:r>
         <w:drawing>
-          <wp:inline distT="0" distB="0" distL="0" distR="0" wp14:anchorId="5967A4D5" wp14:editId="4D982305">
-            <wp:extent cx="5943600" cy="2326005"/>
+          <wp:inline distT="0" distB="0" distL="0" distR="0" wp14:anchorId="0C4811BB" wp14:editId="60782F11">
+            <wp:extent cx="5943600" cy="1664898"/>
             <wp:effectExtent l="0" t="0" r="0" b="0"/>
-            <wp:docPr id="10" name="Imagen 10"/>
+            <wp:docPr id="36" name="Imagen 36"/>
             <wp:cNvGraphicFramePr>
               <a:graphicFrameLocks xmlns:a="http://schemas.openxmlformats.org/drawingml/2006/main" noChangeAspect="1"/>
             </wp:cNvGraphicFramePr>
@@ -4997,20 +4874,27 @@
                     <pic:cNvPr id="1" name=""/>
                     <pic:cNvPicPr/>
                   </pic:nvPicPr>
-                  <pic:blipFill>
+                  <pic:blipFill rotWithShape="1">
                     <a:blip r:embed="rId17"/>
-                    <a:stretch>
-                      <a:fillRect/>
-                    </a:stretch>
+                    <a:srcRect b="6495"/>
+                    <a:stretch/>
                   </pic:blipFill>
-                  <pic:spPr>
+                  <pic:spPr bwMode="auto">
                     <a:xfrm>
                       <a:off x="0" y="0"/>
-                      <a:ext cx="5943600" cy="2326005"/>
+                      <a:ext cx="5943600" cy="1664898"/>
                     </a:xfrm>
                     <a:prstGeom prst="rect">
                       <a:avLst/>
                     </a:prstGeom>
+                    <a:ln>
+                      <a:noFill/>
+                    </a:ln>
+                    <a:extLst>
+                      <a:ext uri="{53640926-AAD7-44D8-BBD7-CCE9431645EC}">
+                        <a14:shadowObscured xmlns:a14="http://schemas.microsoft.com/office/drawing/2010/main"/>
+                      </a:ext>
+                    </a:extLst>
                   </pic:spPr>
                 </pic:pic>
               </a:graphicData>
@@ -5021,40 +4905,20 @@
     </w:p>
     <w:p>
       <w:pPr>
-        <w:jc w:val="left"/>
-        <w:rPr>
-          <w:b/>
-          <w:bCs/>
-        </w:rPr>
-      </w:pPr>
-      <w:r>
-        <w:rPr>
-          <w:b/>
-          <w:bCs/>
-        </w:rPr>
-        <w:t>Producto Concreto</w:t>
-      </w:r>
-    </w:p>
-    <w:p>
-      <w:pPr>
-        <w:jc w:val="left"/>
-        <w:rPr>
-          <w:b/>
-          <w:bCs/>
-        </w:rPr>
-      </w:pPr>
-      <w:r>
-        <w:rPr>
-          <w:b/>
-          <w:bCs/>
-          <w:noProof/>
-        </w:rPr>
+        <w:pStyle w:val="Ttulo5"/>
+      </w:pPr>
+      <w:r>
         <w:lastRenderedPageBreak/>
+        <w:t>Productos concretos</w:t>
+      </w:r>
+    </w:p>
+    <w:p>
+      <w:r>
         <w:drawing>
-          <wp:inline distT="0" distB="0" distL="0" distR="0" wp14:anchorId="2CE39E17" wp14:editId="11D974B8">
-            <wp:extent cx="5943600" cy="4246880"/>
-            <wp:effectExtent l="0" t="0" r="0" b="1270"/>
-            <wp:docPr id="11" name="Imagen 11"/>
+          <wp:inline distT="0" distB="0" distL="0" distR="0" wp14:anchorId="05163C75" wp14:editId="36CE0ADC">
+            <wp:extent cx="5943600" cy="5512435"/>
+            <wp:effectExtent l="0" t="0" r="0" b="0"/>
+            <wp:docPr id="37" name="Imagen 37"/>
             <wp:cNvGraphicFramePr>
               <a:graphicFrameLocks xmlns:a="http://schemas.openxmlformats.org/drawingml/2006/main" noChangeAspect="1"/>
             </wp:cNvGraphicFramePr>
@@ -5074,7 +4938,7 @@
                   <pic:spPr>
                     <a:xfrm>
                       <a:off x="0" y="0"/>
-                      <a:ext cx="5943600" cy="4246880"/>
+                      <a:ext cx="5943600" cy="5512435"/>
                     </a:xfrm>
                     <a:prstGeom prst="rect">
                       <a:avLst/>
@@ -5088,24 +4952,13 @@
       </w:r>
     </w:p>
     <w:p>
-      <w:pPr>
-        <w:jc w:val="left"/>
-        <w:rPr>
-          <w:b/>
-          <w:bCs/>
-        </w:rPr>
-      </w:pPr>
-      <w:r>
-        <w:rPr>
-          <w:b/>
-          <w:bCs/>
-          <w:noProof/>
-        </w:rPr>
+      <w:r>
+        <w:lastRenderedPageBreak/>
         <w:drawing>
-          <wp:inline distT="0" distB="0" distL="0" distR="0" wp14:anchorId="2FF49B68" wp14:editId="45726220">
-            <wp:extent cx="5943600" cy="1198245"/>
-            <wp:effectExtent l="0" t="0" r="0" b="1905"/>
-            <wp:docPr id="12" name="Imagen 12"/>
+          <wp:inline distT="0" distB="0" distL="0" distR="0" wp14:anchorId="1EECF820" wp14:editId="008FFCBC">
+            <wp:extent cx="5943600" cy="5494020"/>
+            <wp:effectExtent l="0" t="0" r="0" b="0"/>
+            <wp:docPr id="38" name="Imagen 38"/>
             <wp:cNvGraphicFramePr>
               <a:graphicFrameLocks xmlns:a="http://schemas.openxmlformats.org/drawingml/2006/main" noChangeAspect="1"/>
             </wp:cNvGraphicFramePr>
@@ -5125,7 +4978,7 @@
                   <pic:spPr>
                     <a:xfrm>
                       <a:off x="0" y="0"/>
-                      <a:ext cx="5943600" cy="1198245"/>
+                      <a:ext cx="5943600" cy="5494020"/>
                     </a:xfrm>
                     <a:prstGeom prst="rect">
                       <a:avLst/>
@@ -5139,41 +4992,13 @@
       </w:r>
     </w:p>
     <w:p>
-      <w:pPr>
-        <w:jc w:val="left"/>
-        <w:rPr>
-          <w:b/>
-          <w:bCs/>
-          <w:lang w:val="en-US"/>
-        </w:rPr>
-      </w:pPr>
-      <w:r>
-        <w:rPr>
-          <w:b/>
-          <w:bCs/>
-        </w:rPr>
-        <w:t>Consumidor</w:t>
-      </w:r>
-    </w:p>
-    <w:p>
-      <w:pPr>
-        <w:jc w:val="left"/>
-        <w:rPr>
-          <w:b/>
-          <w:bCs/>
-        </w:rPr>
-      </w:pPr>
-      <w:r>
-        <w:rPr>
-          <w:b/>
-          <w:bCs/>
-          <w:noProof/>
-        </w:rPr>
+      <w:r>
+        <w:lastRenderedPageBreak/>
         <w:drawing>
-          <wp:inline distT="0" distB="0" distL="0" distR="0" wp14:anchorId="1769BF1D" wp14:editId="649C17E9">
-            <wp:extent cx="5943600" cy="1065530"/>
-            <wp:effectExtent l="0" t="0" r="0" b="1270"/>
-            <wp:docPr id="13" name="Imagen 13"/>
+          <wp:inline distT="0" distB="0" distL="0" distR="0" wp14:anchorId="6E51E24B" wp14:editId="4E8D3791">
+            <wp:extent cx="5943600" cy="6072505"/>
+            <wp:effectExtent l="0" t="0" r="0" b="4445"/>
+            <wp:docPr id="39" name="Imagen 39"/>
             <wp:cNvGraphicFramePr>
               <a:graphicFrameLocks xmlns:a="http://schemas.openxmlformats.org/drawingml/2006/main" noChangeAspect="1"/>
             </wp:cNvGraphicFramePr>
@@ -5193,7 +5018,7 @@
                   <pic:spPr>
                     <a:xfrm>
                       <a:off x="0" y="0"/>
-                      <a:ext cx="5943600" cy="1065530"/>
+                      <a:ext cx="5943600" cy="6072505"/>
                     </a:xfrm>
                     <a:prstGeom prst="rect">
                       <a:avLst/>
@@ -5207,406 +5032,12 @@
       </w:r>
     </w:p>
     <w:p>
-      <w:pPr>
-        <w:pStyle w:val="Ttulo4"/>
-      </w:pPr>
-      <w:r>
-        <w:lastRenderedPageBreak/>
-        <w:t>Explicación y Prueba de que Funciona</w:t>
-      </w:r>
-    </w:p>
-    <w:p>
-      <w:pPr>
-        <w:pStyle w:val="Ttulo5"/>
-      </w:pPr>
-      <w:proofErr w:type="spellStart"/>
-      <w:r>
-        <w:t>PasswordEncoder</w:t>
-      </w:r>
-      <w:proofErr w:type="spellEnd"/>
-      <w:r>
-        <w:t xml:space="preserve"> </w:t>
-      </w:r>
-      <w:r>
-        <w:rPr>
-          <w:lang w:val="en-US"/>
-        </w:rPr>
-        <w:t>(</w:t>
-      </w:r>
-      <w:r>
-        <w:t>Producto</w:t>
-      </w:r>
-      <w:r>
-        <w:t>)</w:t>
-      </w:r>
-    </w:p>
-    <w:p>
-      <w:r>
-        <w:t xml:space="preserve">Este componente representa el </w:t>
-      </w:r>
-      <w:r>
-        <w:rPr>
-          <w:b/>
-          <w:bCs/>
-        </w:rPr>
-        <w:t>producto</w:t>
-      </w:r>
-      <w:r>
-        <w:t xml:space="preserve"> dentro del patrón </w:t>
-      </w:r>
-      <w:r>
-        <w:rPr>
-          <w:b/>
-          <w:bCs/>
-        </w:rPr>
-        <w:t>Factory Method</w:t>
-      </w:r>
-      <w:r>
-        <w:t xml:space="preserve">. </w:t>
-      </w:r>
-      <w:proofErr w:type="spellStart"/>
-      <w:r>
-        <w:rPr>
-          <w:b/>
-          <w:bCs/>
-        </w:rPr>
-        <w:t>PasswordEncoder</w:t>
-      </w:r>
-      <w:proofErr w:type="spellEnd"/>
-      <w:r>
-        <w:t xml:space="preserve"> es una abstracción proporcionada por Spring Security que define las operaciones necesarias para trabajar con las contraseñas. Al utilizar esta abstracción, el resto del sistema no necesita conocer qué algoritmo concreto se está utilizando para realizar el cifrado.</w:t>
-      </w:r>
-    </w:p>
-    <w:p>
-      <w:pPr>
-        <w:pStyle w:val="Ttulo5"/>
-      </w:pPr>
-      <w:proofErr w:type="spellStart"/>
-      <w:r>
-        <w:t>BCryptPasswordEncoder</w:t>
-      </w:r>
-      <w:proofErr w:type="spellEnd"/>
-      <w:r>
-        <w:t xml:space="preserve"> </w:t>
-      </w:r>
-      <w:r>
-        <w:t>(</w:t>
-      </w:r>
-      <w:r>
-        <w:t>Producto Concreto</w:t>
-      </w:r>
-      <w:r>
-        <w:t>)</w:t>
-      </w:r>
-    </w:p>
-    <w:p>
-      <w:r>
-        <w:t xml:space="preserve">Esta clase representa el </w:t>
-      </w:r>
-      <w:r>
-        <w:rPr>
-          <w:b/>
-          <w:bCs/>
-        </w:rPr>
-        <w:t>producto concreto</w:t>
-      </w:r>
-      <w:r>
-        <w:t xml:space="preserve">, ya que es una implementación específica de </w:t>
-      </w:r>
-      <w:proofErr w:type="spellStart"/>
-      <w:r>
-        <w:rPr>
-          <w:b/>
-          <w:bCs/>
-        </w:rPr>
-        <w:t>PasswordEncoder</w:t>
-      </w:r>
-      <w:proofErr w:type="spellEnd"/>
-      <w:r>
-        <w:t xml:space="preserve">. En nuestro proyecto utilizamos </w:t>
-      </w:r>
-      <w:proofErr w:type="spellStart"/>
-      <w:r>
-        <w:rPr>
-          <w:b/>
-          <w:bCs/>
-        </w:rPr>
-        <w:t>BCrypt</w:t>
-      </w:r>
-      <w:proofErr w:type="spellEnd"/>
-      <w:r>
-        <w:t xml:space="preserve"> para realizar el procesamiento seguro de las contraseñas, pero gracias a que trabajamos con la abstracción </w:t>
-      </w:r>
-      <w:proofErr w:type="spellStart"/>
-      <w:r>
-        <w:rPr>
-          <w:b/>
-          <w:bCs/>
-        </w:rPr>
-        <w:t>PasswordEncoder</w:t>
-      </w:r>
-      <w:proofErr w:type="spellEnd"/>
-      <w:r>
-        <w:t>, esta implementación podría ser reemplazada por otra sin modificar los componentes que la utilizan.</w:t>
-      </w:r>
-    </w:p>
-    <w:p>
-      <w:pPr>
-        <w:pStyle w:val="Ttulo5"/>
-      </w:pPr>
-      <w:proofErr w:type="spellStart"/>
-      <w:r>
-        <w:t>SecurityConfig</w:t>
-      </w:r>
-      <w:proofErr w:type="spellEnd"/>
-      <w:r>
-        <w:t xml:space="preserve"> </w:t>
-      </w:r>
-      <w:r>
-        <w:t>(</w:t>
-      </w:r>
-      <w:r>
-        <w:t>Fábrica</w:t>
-      </w:r>
-      <w:r>
-        <w:t>)</w:t>
-      </w:r>
-    </w:p>
-    <w:p>
-      <w:r>
-        <w:t xml:space="preserve">En esta clase se encuentra la </w:t>
-      </w:r>
-      <w:r>
-        <w:rPr>
-          <w:b/>
-          <w:bCs/>
-        </w:rPr>
-        <w:t>fábrica del patrón</w:t>
-      </w:r>
-      <w:r>
-        <w:t xml:space="preserve">, ya que mediante el contenedor de Spring se define el método encargado de crear el </w:t>
-      </w:r>
-      <w:proofErr w:type="spellStart"/>
-      <w:r>
-        <w:rPr>
-          <w:b/>
-          <w:bCs/>
-        </w:rPr>
-        <w:t>PasswordEncoder</w:t>
-      </w:r>
-      <w:proofErr w:type="spellEnd"/>
-      <w:r>
-        <w:t xml:space="preserve">. Spring toma el objeto creado mediante este método y lo registra como un </w:t>
-      </w:r>
-      <w:proofErr w:type="spellStart"/>
-      <w:r>
-        <w:rPr>
-          <w:b/>
-          <w:bCs/>
-        </w:rPr>
-        <w:t>Bean</w:t>
-      </w:r>
-      <w:proofErr w:type="spellEnd"/>
-      <w:r>
-        <w:t>, permitiendo posteriormente que sea utilizado mediante inyección de dependencias en los componentes que lo necesiten.</w:t>
-      </w:r>
-    </w:p>
-    <w:p>
-      <w:pPr>
-        <w:pStyle w:val="Ttulo5"/>
-      </w:pPr>
-      <w:proofErr w:type="spellStart"/>
-      <w:r>
-        <w:t>AuthenticationManager</w:t>
-      </w:r>
-      <w:proofErr w:type="spellEnd"/>
-      <w:r>
-        <w:t xml:space="preserve"> </w:t>
-      </w:r>
-      <w:r>
-        <w:t>(</w:t>
-      </w:r>
-      <w:r>
-        <w:t>Consumidor</w:t>
-      </w:r>
-      <w:r>
-        <w:t>)</w:t>
-      </w:r>
-    </w:p>
-    <w:p>
-      <w:r>
-        <w:t xml:space="preserve">Este componente representa el </w:t>
-      </w:r>
-      <w:r>
-        <w:rPr>
-          <w:b/>
-          <w:bCs/>
-        </w:rPr>
-        <w:t>consumidor</w:t>
-      </w:r>
-      <w:r>
-        <w:t xml:space="preserve"> del </w:t>
-      </w:r>
-      <w:r>
-        <w:rPr>
-          <w:b/>
-          <w:bCs/>
-        </w:rPr>
-        <w:t>producto</w:t>
-      </w:r>
-      <w:r>
-        <w:t xml:space="preserve">, ya que necesita un </w:t>
-      </w:r>
-      <w:proofErr w:type="spellStart"/>
-      <w:r>
-        <w:rPr>
-          <w:b/>
-          <w:bCs/>
-        </w:rPr>
-        <w:t>PasswordEncoder</w:t>
-      </w:r>
-      <w:proofErr w:type="spellEnd"/>
-      <w:r>
-        <w:t xml:space="preserve"> para realizar el proceso de autenticación. Lo importante es que </w:t>
-      </w:r>
-      <w:proofErr w:type="spellStart"/>
-      <w:r>
-        <w:rPr>
-          <w:b/>
-          <w:bCs/>
-        </w:rPr>
-        <w:t>AuthenticationManager</w:t>
-      </w:r>
-      <w:proofErr w:type="spellEnd"/>
-      <w:r>
-        <w:t xml:space="preserve"> trabaja con la abstracción </w:t>
-      </w:r>
-      <w:proofErr w:type="spellStart"/>
-      <w:r>
-        <w:rPr>
-          <w:b/>
-          <w:bCs/>
-        </w:rPr>
-        <w:t>PasswordEncoder</w:t>
-      </w:r>
-      <w:proofErr w:type="spellEnd"/>
-      <w:r>
-        <w:t xml:space="preserve"> y no necesita conocer directamente a </w:t>
-      </w:r>
-      <w:proofErr w:type="spellStart"/>
-      <w:r>
-        <w:rPr>
-          <w:b/>
-          <w:bCs/>
-        </w:rPr>
-        <w:t>BCryptPasswordEncoder</w:t>
-      </w:r>
-      <w:proofErr w:type="spellEnd"/>
-      <w:r>
-        <w:t>, demostrando, así como el Factory Method ayuda a reducir el acoplamiento entre ambos componentes.</w:t>
-      </w:r>
-    </w:p>
-    <w:p>
-      <w:pPr>
-        <w:pStyle w:val="Ttulo5"/>
-      </w:pPr>
-      <w:r>
-        <w:t>Funcionamiento</w:t>
-      </w:r>
-    </w:p>
-    <w:p>
-      <w:r>
-        <w:t xml:space="preserve">Ahora sí, para la prueba de funcionamiento, ya que todavía no contamos con una interfaz gráfica en el </w:t>
-      </w:r>
-      <w:proofErr w:type="spellStart"/>
-      <w:r>
-        <w:rPr>
-          <w:b/>
-          <w:bCs/>
-        </w:rPr>
-        <w:t>frontend</w:t>
-      </w:r>
-      <w:proofErr w:type="spellEnd"/>
-      <w:r>
-        <w:t xml:space="preserve">, utilizamos la herramienta </w:t>
-      </w:r>
-      <w:proofErr w:type="spellStart"/>
-      <w:r>
-        <w:rPr>
-          <w:b/>
-          <w:bCs/>
-        </w:rPr>
-        <w:t>Postman</w:t>
-      </w:r>
-      <w:proofErr w:type="spellEnd"/>
-      <w:r>
-        <w:t xml:space="preserve">, en la cual mandamos la siguiente petición a la </w:t>
-      </w:r>
-      <w:r>
-        <w:rPr>
-          <w:b/>
-          <w:bCs/>
-        </w:rPr>
-        <w:t>API.</w:t>
-      </w:r>
-    </w:p>
-    <w:p>
-      <w:r>
-        <w:rPr>
-          <w:b/>
-          <w:bCs/>
-        </w:rPr>
-        <w:t xml:space="preserve">NOTA: </w:t>
-      </w:r>
-      <w:r>
-        <w:t xml:space="preserve">Cabe resaltar que para esta prueba de autenticación del usuario </w:t>
-      </w:r>
-      <w:r>
-        <w:t>ya había un usuario creado en base de datos y trabajamos con</w:t>
-      </w:r>
-      <w:r>
-        <w:rPr>
-          <w:b/>
-          <w:bCs/>
-        </w:rPr>
-        <w:t xml:space="preserve"> </w:t>
-      </w:r>
-      <w:proofErr w:type="spellStart"/>
-      <w:r>
-        <w:rPr>
-          <w:b/>
-          <w:bCs/>
-        </w:rPr>
-        <w:t>Json</w:t>
-      </w:r>
-      <w:proofErr w:type="spellEnd"/>
-      <w:r>
-        <w:rPr>
-          <w:b/>
-          <w:bCs/>
-        </w:rPr>
-        <w:t xml:space="preserve"> Web Tokens </w:t>
-      </w:r>
-      <w:r>
-        <w:t>además de Spring Security.</w:t>
-      </w:r>
-    </w:p>
-    <w:p>
-      <w:r>
-        <w:lastRenderedPageBreak/>
-        <w:t>El usuario creado en la base de datos es el siguiente:</w:t>
-      </w:r>
-    </w:p>
-    <w:p>
-      <w:r>
-        <w:rPr>
-          <w:noProof/>
-        </w:rPr>
+      <w:r>
         <w:drawing>
-          <wp:inline distT="0" distB="0" distL="0" distR="0" wp14:anchorId="280B21E2" wp14:editId="2AE3C75A">
-            <wp:extent cx="5943600" cy="338455"/>
-            <wp:effectExtent l="0" t="0" r="0" b="4445"/>
-            <wp:docPr id="15" name="Imagen 15"/>
+          <wp:inline distT="0" distB="0" distL="0" distR="0" wp14:anchorId="3F996A72" wp14:editId="1F6EA65F">
+            <wp:extent cx="5943600" cy="564515"/>
+            <wp:effectExtent l="0" t="0" r="0" b="6985"/>
+            <wp:docPr id="40" name="Imagen 40"/>
             <wp:cNvGraphicFramePr>
               <a:graphicFrameLocks xmlns:a="http://schemas.openxmlformats.org/drawingml/2006/main" noChangeAspect="1"/>
             </wp:cNvGraphicFramePr>
@@ -5626,7 +5057,7 @@
                   <pic:spPr>
                     <a:xfrm>
                       <a:off x="0" y="0"/>
-                      <a:ext cx="5943600" cy="338455"/>
+                      <a:ext cx="5943600" cy="564515"/>
                     </a:xfrm>
                     <a:prstGeom prst="rect">
                       <a:avLst/>
@@ -5640,58 +5071,21 @@
       </w:r>
     </w:p>
     <w:p>
-      <w:r>
-        <w:t xml:space="preserve">Como podemos ver, la contraseña del usuario ya se encuentra encriptada desde su creación, así que, para poder autenticar al usuario en el sistema, el </w:t>
-      </w:r>
-      <w:proofErr w:type="spellStart"/>
-      <w:r>
-        <w:rPr>
-          <w:b/>
-          <w:bCs/>
-        </w:rPr>
-        <w:t>AuthenticationManager</w:t>
-      </w:r>
-      <w:proofErr w:type="spellEnd"/>
-      <w:r>
-        <w:rPr>
-          <w:b/>
-          <w:bCs/>
-        </w:rPr>
-        <w:t xml:space="preserve"> </w:t>
-      </w:r>
-      <w:r>
-        <w:t xml:space="preserve">de Spring Security deberá utilizar a </w:t>
-      </w:r>
-      <w:proofErr w:type="spellStart"/>
-      <w:r>
-        <w:rPr>
-          <w:b/>
-          <w:bCs/>
-        </w:rPr>
-        <w:t>BCryptPasswordEncoder</w:t>
-      </w:r>
-      <w:proofErr w:type="spellEnd"/>
-      <w:r>
-        <w:rPr>
-          <w:b/>
-          <w:bCs/>
-        </w:rPr>
-        <w:t xml:space="preserve"> </w:t>
-      </w:r>
-      <w:r>
-        <w:t>para ver si la contraseña ingresada por el usuario es igual a la de la base de datos. El resultado fue el siguiente:</w:t>
-      </w:r>
-    </w:p>
-    <w:p>
-      <w:r>
-        <w:rPr>
-          <w:noProof/>
-        </w:rPr>
+      <w:pPr>
+        <w:pStyle w:val="Ttulo5"/>
+      </w:pPr>
+      <w:r>
+        <w:lastRenderedPageBreak/>
+        <w:t>Consumidor Cliente</w:t>
+      </w:r>
+    </w:p>
+    <w:p>
+      <w:r>
         <w:drawing>
-          <wp:inline distT="0" distB="0" distL="0" distR="0" wp14:anchorId="53F81A13" wp14:editId="3D487E8D">
-            <wp:extent cx="6170320" cy="2886075"/>
-            <wp:effectExtent l="0" t="0" r="1905" b="0"/>
-            <wp:docPr id="14" name="Imagen 14"/>
+          <wp:inline distT="0" distB="0" distL="0" distR="0" wp14:anchorId="701FB4E8" wp14:editId="266390A7">
+            <wp:extent cx="5943600" cy="2014855"/>
+            <wp:effectExtent l="0" t="0" r="0" b="4445"/>
+            <wp:docPr id="41" name="Imagen 41"/>
             <wp:cNvGraphicFramePr>
               <a:graphicFrameLocks xmlns:a="http://schemas.openxmlformats.org/drawingml/2006/main" noChangeAspect="1"/>
             </wp:cNvGraphicFramePr>
@@ -5711,7 +5105,7 @@
                   <pic:spPr>
                     <a:xfrm>
                       <a:off x="0" y="0"/>
-                      <a:ext cx="6172583" cy="2887133"/>
+                      <a:ext cx="5943600" cy="2014855"/>
                     </a:xfrm>
                     <a:prstGeom prst="rect">
                       <a:avLst/>
@@ -5726,85 +5120,196 @@
     </w:p>
     <w:p>
       <w:pPr>
-        <w:rPr>
-          <w:b/>
-          <w:bCs/>
-        </w:rPr>
-      </w:pPr>
-      <w:r>
-        <w:t xml:space="preserve">Exitosamente la </w:t>
-      </w:r>
-      <w:r>
-        <w:rPr>
-          <w:b/>
-          <w:bCs/>
-        </w:rPr>
-        <w:t>API REST</w:t>
-      </w:r>
-      <w:r>
-        <w:t xml:space="preserve"> responde con código </w:t>
-      </w:r>
-      <w:r>
-        <w:rPr>
-          <w:b/>
-          <w:bCs/>
-        </w:rPr>
-        <w:t>http 200</w:t>
-      </w:r>
-      <w:r>
-        <w:t xml:space="preserve"> y con el cuerpo de la respuesta indicando el token JWT generado después de la autenticación. Por lo que indica que el proceso de encriptar la contraseña y compararla con la de la base de datos fue un </w:t>
-      </w:r>
-      <w:r>
-        <w:rPr>
-          <w:b/>
-          <w:bCs/>
-        </w:rPr>
-        <w:t>éxito.</w:t>
-      </w:r>
-    </w:p>
-    <w:p>
-      <w:pPr>
-        <w:pStyle w:val="Ttulo3"/>
-      </w:pPr>
-      <w:r>
-        <w:t>Aplicación del Patrón Builder</w:t>
-      </w:r>
-    </w:p>
-    <w:p>
-      <w:pPr>
         <w:pStyle w:val="Ttulo4"/>
       </w:pPr>
       <w:r>
-        <w:t>Como está Colaborando</w:t>
-      </w:r>
-    </w:p>
-    <w:p>
-      <w:r>
-        <w:t xml:space="preserve">En el proceso de autenticación, el patrón Builder se utiliza para construir el token JWT que posteriormente será entregado al usuario. El token requiere varios datos de configuración, entre ellos el nombre de usuario, el rol, la fecha de emisión, la fecha de expiración y la firma criptográfica.  </w:t>
-      </w:r>
-    </w:p>
-    <w:p>
-      <w:pPr>
-        <w:pStyle w:val="Ttulo4"/>
+        <w:t>Explicación y Prueba de que Funciona</w:t>
+      </w:r>
+    </w:p>
+    <w:p>
+      <w:r>
+        <w:t xml:space="preserve">Para comprender con claridad cómo se aplica este </w:t>
+      </w:r>
+      <w:r>
+        <w:t xml:space="preserve">patrón en la funcionalidad de predicción de demanda de LogiSync, a </w:t>
+      </w:r>
+      <w:r>
+        <w:t>continuación,</w:t>
+      </w:r>
+      <w:r>
+        <w:t xml:space="preserve"> explicaremos el rol que cumple cada uno de los componentes principales de esta implementación:</w:t>
+      </w:r>
+    </w:p>
+    <w:p>
+      <w:pPr>
+        <w:pStyle w:val="Ttulo5"/>
+      </w:pPr>
+      <w:r>
+        <w:t>ForecastStrategy (Interfaz Producto)</w:t>
+      </w:r>
+    </w:p>
+    <w:p>
+      <w:r>
+        <w:t xml:space="preserve">Representa el producto abstracto dentro del </w:t>
+      </w:r>
+      <w:r>
+        <w:t>patrón. Es la interfaz que define el contrato común que deben cumplir todos los modelos o algoritmos de predicción, en este caso a través del método forecast(history, periodsAhead). Gracias a esta abstracción, cualquier componente de la aplicación puede so</w:t>
+      </w:r>
+      <w:r>
+        <w:t>licitar una estimación sin preocuparse por la fórmula matemática específica que se ejecutará por debajo.</w:t>
+      </w:r>
+    </w:p>
+    <w:p>
+      <w:pPr>
+        <w:pStyle w:val="Ttulo5"/>
+        <w:rPr>
+          <w:lang w:val="en-US"/>
+        </w:rPr>
+      </w:pPr>
+      <w:proofErr w:type="spellStart"/>
+      <w:r>
+        <w:rPr>
+          <w:lang w:val="en-US"/>
+        </w:rPr>
+        <w:t>MovingAverageForecastStrategy</w:t>
+      </w:r>
+      <w:proofErr w:type="spellEnd"/>
+      <w:r>
+        <w:rPr>
+          <w:lang w:val="en-US"/>
+        </w:rPr>
+        <w:t xml:space="preserve">, </w:t>
+      </w:r>
+      <w:proofErr w:type="spellStart"/>
+      <w:r>
+        <w:rPr>
+          <w:lang w:val="en-US"/>
+        </w:rPr>
+        <w:t>ExponentialSmoothingForecastStrategy</w:t>
+      </w:r>
+      <w:proofErr w:type="spellEnd"/>
+      <w:r>
+        <w:rPr>
+          <w:lang w:val="en-US"/>
+        </w:rPr>
+        <w:t xml:space="preserve"> y </w:t>
+      </w:r>
+      <w:proofErr w:type="spellStart"/>
+      <w:r>
+        <w:rPr>
+          <w:lang w:val="en-US"/>
+        </w:rPr>
+        <w:t>LinearRegressionForecastStrategy</w:t>
+      </w:r>
+      <w:proofErr w:type="spellEnd"/>
+      <w:r>
+        <w:rPr>
+          <w:lang w:val="en-US"/>
+        </w:rPr>
+        <w:t xml:space="preserve"> (</w:t>
+      </w:r>
+      <w:proofErr w:type="spellStart"/>
+      <w:r>
+        <w:rPr>
+          <w:lang w:val="en-US"/>
+        </w:rPr>
+        <w:t>Productos</w:t>
+      </w:r>
+      <w:proofErr w:type="spellEnd"/>
+      <w:r>
+        <w:rPr>
+          <w:lang w:val="en-US"/>
+        </w:rPr>
+        <w:t xml:space="preserve"> </w:t>
+      </w:r>
+      <w:proofErr w:type="spellStart"/>
+      <w:r>
+        <w:rPr>
+          <w:lang w:val="en-US"/>
+        </w:rPr>
+        <w:t>Concretos</w:t>
+      </w:r>
+      <w:proofErr w:type="spellEnd"/>
+      <w:r>
+        <w:rPr>
+          <w:lang w:val="en-US"/>
+        </w:rPr>
+        <w:t>)</w:t>
+      </w:r>
+    </w:p>
+    <w:p>
+      <w:r>
+        <w:t>Son las implementaciones c</w:t>
+      </w:r>
+      <w:r>
+        <w:t>oncretas de la interfaz ForecastStrategy. Cada una de estas clases encapsula una lógica de cálculo matemático diferente sobre los datos históricos de inventario: promedio móvil simple para tendencias estables, suavizado exponencial ponderando periodos reci</w:t>
+      </w:r>
+      <w:r>
+        <w:t>entes, y regresión lineal por mínimos cuadrados para proyectar tendencias crecientes o decrecientes. Cada clase es responsable exclusivamente de resolver su algoritmo estadístico.</w:t>
+      </w:r>
+    </w:p>
+    <w:p>
+      <w:pPr>
+        <w:pStyle w:val="Ttulo5"/>
       </w:pPr>
       <w:r>
         <w:lastRenderedPageBreak/>
-        <w:t>Diagrama de Clases UML</w:t>
-      </w:r>
-    </w:p>
-    <w:p>
-      <w:pPr>
-        <w:jc w:val="center"/>
-      </w:pPr>
-      <w:r>
-        <w:rPr>
-          <w:noProof/>
-        </w:rPr>
+        <w:t>ForecastStrategyFactory (Fábrica)</w:t>
+      </w:r>
+    </w:p>
+    <w:p>
+      <w:r>
+        <w:t>Esta clase actúa como la fábrica del patró</w:t>
+      </w:r>
+      <w:r>
+        <w:t>n. Contiene el método encargado de recibir el nombre o tipo de algoritmo deseado (por ejemplo LINEAR_REGRESSION, MOVING_AVERAGE o EXPONENTIAL_SMOOTHING) y crear e instanciar la estrategia correspondiente ya parametrizada. Si se envía un algoritmo no soport</w:t>
+      </w:r>
+      <w:r>
+        <w:t>ado, la fábrica se encarga de manejar el error de negocio. Al centralizar la creación de estas estrategias aquí, evitamos que otras capas del sistema tengan que hacer condicionales o instanciar clases concretas con new.</w:t>
+      </w:r>
+    </w:p>
+    <w:p>
+      <w:pPr>
+        <w:pStyle w:val="Ttulo5"/>
+      </w:pPr>
+      <w:r>
+        <w:t>DemandForecastService (Cliente / Con</w:t>
+      </w:r>
+      <w:r>
+        <w:t>sumidor)</w:t>
+      </w:r>
+    </w:p>
+    <w:p>
+      <w:r>
+        <w:t>Es el servicio de la capa de aplicación encargado de orquestar todo el proceso de predicción de demanda. Cuando recibe la petición, le solicita a ForecastStrategyFactory la estrategia que se necesita según los parámetros del usuario, consulta el h</w:t>
+      </w:r>
+      <w:r>
+        <w:t>istorial de movimientos de inventario del producto y ejecuta la proyección. Lo fundamental aquí es que este servicio trabaja únicamente con la interfaz ForecastStrategy, garantizando un alto nivel de desacoplamiento.</w:t>
+      </w:r>
+    </w:p>
+    <w:p>
+      <w:pPr>
+        <w:pStyle w:val="Ttulo5"/>
+      </w:pPr>
+      <w:r>
+        <w:t>Funcionamiento</w:t>
+      </w:r>
+    </w:p>
+    <w:p>
+      <w:r>
+        <w:t>Ahora sí, para la prueba</w:t>
+      </w:r>
+      <w:r>
+        <w:t xml:space="preserve"> de funcionamiento, ya que todavía no contamos con una interfaz gráfica en el frontend, utilizamos la herramienta Postman (o la documentación interactiva de Swagger UI), en la cual mandamos la siguiente petición a la API al endpoint /api/forecast/generate:</w:t>
+      </w:r>
+    </w:p>
+    <w:p>
+      <w:r>
         <w:drawing>
-          <wp:inline distT="0" distB="0" distL="0" distR="0" wp14:anchorId="136B7C85" wp14:editId="5B981A99">
-            <wp:extent cx="5153025" cy="3668227"/>
-            <wp:effectExtent l="0" t="0" r="0" b="8890"/>
-            <wp:docPr id="26" name="Imagen 26"/>
+          <wp:inline distT="0" distB="0" distL="0" distR="0" wp14:anchorId="3CD2AD73" wp14:editId="1E28E3D7">
+            <wp:extent cx="5943600" cy="2005965"/>
+            <wp:effectExtent l="0" t="0" r="0" b="0"/>
+            <wp:docPr id="45" name="Imagen 45"/>
             <wp:cNvGraphicFramePr>
               <a:graphicFrameLocks xmlns:a="http://schemas.openxmlformats.org/drawingml/2006/main" noChangeAspect="1"/>
             </wp:cNvGraphicFramePr>
@@ -5824,7 +5329,7 @@
                   <pic:spPr>
                     <a:xfrm>
                       <a:off x="0" y="0"/>
-                      <a:ext cx="5155104" cy="3669707"/>
+                      <a:ext cx="5943600" cy="2005965"/>
                     </a:xfrm>
                     <a:prstGeom prst="rect">
                       <a:avLst/>
@@ -5838,50 +5343,21 @@
       </w:r>
     </w:p>
     <w:p>
-      <w:pPr>
-        <w:pStyle w:val="Ttulo4"/>
-      </w:pPr>
-      <w:r>
-        <w:t>Código</w:t>
-      </w:r>
-    </w:p>
-    <w:p>
-      <w:pPr>
-        <w:rPr>
-          <w:b/>
-          <w:bCs/>
-        </w:rPr>
-      </w:pPr>
-      <w:r>
-        <w:rPr>
-          <w:b/>
-          <w:bCs/>
-        </w:rPr>
-        <w:t xml:space="preserve">Client / </w:t>
-      </w:r>
-      <w:proofErr w:type="gramStart"/>
-      <w:r>
-        <w:rPr>
-          <w:b/>
-          <w:bCs/>
-        </w:rPr>
-        <w:t>Director</w:t>
-      </w:r>
-      <w:proofErr w:type="gramEnd"/>
-    </w:p>
-    <w:p>
-      <w:pPr>
-        <w:jc w:val="center"/>
-      </w:pPr>
-      <w:r>
-        <w:rPr>
-          <w:noProof/>
-        </w:rPr>
+      <w:r>
+        <w:t>Una vez enviada la petición, el sistema ejecuta la estrategia instanciada por la fábrica sobre el historial del producto, devuelve las p</w:t>
+      </w:r>
+      <w:r>
+        <w:t>royecciones para los periodos solicitados y genera de forma automática la necesidad de abastecimiento en la base de datos si detecta que el inventario disponible no cubre la demanda proyectada:</w:t>
+      </w:r>
+    </w:p>
+    <w:p>
+      <w:r>
+        <w:lastRenderedPageBreak/>
         <w:drawing>
-          <wp:inline distT="0" distB="0" distL="0" distR="0" wp14:anchorId="352844FC" wp14:editId="769BDC22">
-            <wp:extent cx="4448175" cy="2416082"/>
-            <wp:effectExtent l="0" t="0" r="0" b="3810"/>
-            <wp:docPr id="25" name="Imagen 25"/>
+          <wp:inline distT="0" distB="0" distL="0" distR="0" wp14:anchorId="0F1AC433" wp14:editId="2AA38221">
+            <wp:extent cx="5943600" cy="5137150"/>
+            <wp:effectExtent l="0" t="0" r="0" b="6350"/>
+            <wp:docPr id="46" name="Imagen 46"/>
             <wp:cNvGraphicFramePr>
               <a:graphicFrameLocks xmlns:a="http://schemas.openxmlformats.org/drawingml/2006/main" noChangeAspect="1"/>
             </wp:cNvGraphicFramePr>
@@ -5901,7 +5377,7 @@
                   <pic:spPr>
                     <a:xfrm>
                       <a:off x="0" y="0"/>
-                      <a:ext cx="4453506" cy="2418978"/>
+                      <a:ext cx="5943600" cy="5137150"/>
                     </a:xfrm>
                     <a:prstGeom prst="rect">
                       <a:avLst/>
@@ -5916,34 +5392,152 @@
     </w:p>
     <w:p>
       <w:pPr>
-        <w:jc w:val="left"/>
-        <w:rPr>
-          <w:b/>
-          <w:bCs/>
-        </w:rPr>
-      </w:pPr>
-      <w:r>
-        <w:rPr>
-          <w:b/>
-          <w:bCs/>
-        </w:rPr>
-        <w:t>Interface</w:t>
-      </w:r>
-    </w:p>
-    <w:p>
-      <w:pPr>
-        <w:jc w:val="center"/>
+        <w:pStyle w:val="Ttulo3"/>
+      </w:pPr>
+      <w:r>
+        <w:t>Aplicación del Patrón Factory Method</w:t>
+      </w:r>
+    </w:p>
+    <w:p>
+      <w:pPr>
+        <w:pStyle w:val="Ttulo4"/>
+      </w:pPr>
+      <w:r>
+        <w:t>Como está Colaborando este Patrón al Proyecto</w:t>
+      </w:r>
+    </w:p>
+    <w:p>
+      <w:r>
+        <w:t xml:space="preserve">En nuestro proyecto utilizamos Spring Framework, el cual cuenta con un contenedor de </w:t>
+      </w:r>
+      <w:r>
+        <w:rPr>
+          <w:b/>
+          <w:bCs/>
+        </w:rPr>
+        <w:t>Inversión de Control (</w:t>
+      </w:r>
+      <w:proofErr w:type="spellStart"/>
+      <w:r>
+        <w:rPr>
+          <w:b/>
+          <w:bCs/>
+        </w:rPr>
+        <w:t>IoC</w:t>
+      </w:r>
+      <w:proofErr w:type="spellEnd"/>
+      <w:r>
+        <w:rPr>
+          <w:b/>
+          <w:bCs/>
+        </w:rPr>
+        <w:t xml:space="preserve">) </w:t>
+      </w:r>
+      <w:r>
+        <w:t xml:space="preserve">encargado de crear y gestionar los objetos utilizados por la aplicación. Spring permite definir métodos de creación mediante la anotación </w:t>
+      </w:r>
+      <w:r>
+        <w:rPr>
+          <w:b/>
+          <w:bCs/>
+        </w:rPr>
+        <w:t>@Bean</w:t>
+      </w:r>
+      <w:r>
+        <w:t xml:space="preserve">, los cuales funcionan como un mecanismo de </w:t>
+      </w:r>
+      <w:r>
+        <w:rPr>
+          <w:b/>
+          <w:bCs/>
+        </w:rPr>
+        <w:t>Factory Method</w:t>
+      </w:r>
+      <w:r>
+        <w:t>, ya que encapsulan la creación de una instancia y permiten trabajar con una abstracción sin depender directamente de su implementación.</w:t>
+      </w:r>
+    </w:p>
+    <w:p>
+      <w:r>
+        <w:t xml:space="preserve">En nuestro caso, este patrón se utiliza principalmente en Spring Security para la creación de </w:t>
+      </w:r>
+      <w:proofErr w:type="spellStart"/>
+      <w:r>
+        <w:rPr>
+          <w:b/>
+          <w:bCs/>
+        </w:rPr>
+        <w:t>PasswordEncoder</w:t>
+      </w:r>
+      <w:proofErr w:type="spellEnd"/>
+      <w:r>
+        <w:t xml:space="preserve">, cuya implementación concreta es </w:t>
+      </w:r>
+      <w:proofErr w:type="spellStart"/>
+      <w:r>
+        <w:rPr>
+          <w:b/>
+          <w:bCs/>
+        </w:rPr>
+        <w:t>BCryptPasswordEncoder</w:t>
+      </w:r>
+      <w:proofErr w:type="spellEnd"/>
+      <w:r>
+        <w:t xml:space="preserve">. Esto permite que los </w:t>
+      </w:r>
+      <w:r>
+        <w:lastRenderedPageBreak/>
+        <w:t xml:space="preserve">componentes que necesitan procesar contraseñas dependan de </w:t>
+      </w:r>
+      <w:proofErr w:type="spellStart"/>
+      <w:r>
+        <w:rPr>
+          <w:b/>
+          <w:bCs/>
+        </w:rPr>
+        <w:t>PasswordEncoder</w:t>
+      </w:r>
+      <w:proofErr w:type="spellEnd"/>
+      <w:r>
+        <w:t xml:space="preserve"> y no directamente de </w:t>
+      </w:r>
+      <w:proofErr w:type="spellStart"/>
+      <w:r>
+        <w:rPr>
+          <w:b/>
+          <w:bCs/>
+        </w:rPr>
+        <w:t>BCrypt</w:t>
+      </w:r>
+      <w:proofErr w:type="spellEnd"/>
+      <w:r>
+        <w:t>, reduciendo el acoplamiento y facilitando un posible cambio de implementación. Además, al combinarse con la inyección de dependencias de Spring, la creación y gestión de estos componentes queda centralizada y facilita el mantenimiento del proyecto.</w:t>
+      </w:r>
+    </w:p>
+    <w:p>
+      <w:pPr>
+        <w:pStyle w:val="Ttulo4"/>
+      </w:pPr>
+      <w:r>
+        <w:t>Diagrama de Clases UML</w:t>
+      </w:r>
+    </w:p>
+    <w:p>
+      <w:pPr>
+        <w:rPr>
+          <w:lang w:val="en-US"/>
+        </w:rPr>
       </w:pPr>
       <w:r>
         <w:rPr>
           <w:noProof/>
-        </w:rPr>
-        <w:lastRenderedPageBreak/>
+          <w:lang w:val="en-US"/>
+        </w:rPr>
         <w:drawing>
-          <wp:inline distT="0" distB="0" distL="0" distR="0" wp14:anchorId="34DC3B85" wp14:editId="15BE933A">
-            <wp:extent cx="5062655" cy="3762375"/>
-            <wp:effectExtent l="0" t="0" r="5080" b="0"/>
-            <wp:docPr id="17" name="Imagen 17"/>
+          <wp:inline distT="0" distB="0" distL="0" distR="0" wp14:anchorId="0D43FD4E" wp14:editId="2A28B20B">
+            <wp:extent cx="5943600" cy="2309495"/>
+            <wp:effectExtent l="0" t="0" r="0" b="0"/>
+            <wp:docPr id="21" name="Imagen 21"/>
             <wp:cNvGraphicFramePr>
               <a:graphicFrameLocks xmlns:a="http://schemas.openxmlformats.org/drawingml/2006/main" noChangeAspect="1"/>
             </wp:cNvGraphicFramePr>
@@ -5963,7 +5557,7 @@
                   <pic:spPr>
                     <a:xfrm>
                       <a:off x="0" y="0"/>
-                      <a:ext cx="5070931" cy="3768525"/>
+                      <a:ext cx="5943600" cy="2309495"/>
                     </a:xfrm>
                     <a:prstGeom prst="rect">
                       <a:avLst/>
@@ -5978,17 +5572,46 @@
     </w:p>
     <w:p>
       <w:pPr>
+        <w:pStyle w:val="Ttulo4"/>
+      </w:pPr>
+      <w:r>
+        <w:t>Código</w:t>
+      </w:r>
+    </w:p>
+    <w:p>
+      <w:pPr>
+        <w:rPr>
+          <w:b/>
+          <w:bCs/>
+        </w:rPr>
+      </w:pPr>
+      <w:r>
+        <w:rPr>
+          <w:b/>
+          <w:bCs/>
+        </w:rPr>
+        <w:t>Fabrica</w:t>
+      </w:r>
+    </w:p>
+    <w:p>
+      <w:pPr>
         <w:jc w:val="center"/>
-      </w:pPr>
-      <w:r>
-        <w:rPr>
+        <w:rPr>
+          <w:b/>
+          <w:bCs/>
+        </w:rPr>
+      </w:pPr>
+      <w:r>
+        <w:rPr>
+          <w:b/>
+          <w:bCs/>
           <w:noProof/>
         </w:rPr>
         <w:drawing>
-          <wp:inline distT="0" distB="0" distL="0" distR="0" wp14:anchorId="52FF695D" wp14:editId="1F2ABA3C">
-            <wp:extent cx="4819650" cy="2053500"/>
-            <wp:effectExtent l="0" t="0" r="0" b="4445"/>
-            <wp:docPr id="18" name="Imagen 18"/>
+          <wp:inline distT="0" distB="0" distL="0" distR="0" wp14:anchorId="3534E270" wp14:editId="48DFBBED">
+            <wp:extent cx="2772162" cy="876422"/>
+            <wp:effectExtent l="0" t="0" r="9525" b="0"/>
+            <wp:docPr id="8" name="Imagen 8"/>
             <wp:cNvGraphicFramePr>
               <a:graphicFrameLocks xmlns:a="http://schemas.openxmlformats.org/drawingml/2006/main" noChangeAspect="1"/>
             </wp:cNvGraphicFramePr>
@@ -6008,7 +5631,7 @@
                   <pic:spPr>
                     <a:xfrm>
                       <a:off x="0" y="0"/>
-                      <a:ext cx="4827343" cy="2056778"/>
+                      <a:ext cx="2772162" cy="876422"/>
                     </a:xfrm>
                     <a:prstGeom prst="rect">
                       <a:avLst/>
@@ -6023,18 +5646,40 @@
     </w:p>
     <w:p>
       <w:pPr>
+        <w:jc w:val="left"/>
+        <w:rPr>
+          <w:b/>
+          <w:bCs/>
+        </w:rPr>
+      </w:pPr>
+      <w:r>
+        <w:rPr>
+          <w:b/>
+          <w:bCs/>
+        </w:rPr>
+        <w:t>Producto</w:t>
+      </w:r>
+    </w:p>
+    <w:p>
+      <w:pPr>
         <w:jc w:val="center"/>
-      </w:pPr>
-      <w:r>
-        <w:rPr>
+        <w:rPr>
+          <w:b/>
+          <w:bCs/>
+        </w:rPr>
+      </w:pPr>
+      <w:r>
+        <w:rPr>
+          <w:b/>
+          <w:bCs/>
           <w:noProof/>
         </w:rPr>
         <w:lastRenderedPageBreak/>
         <w:drawing>
-          <wp:inline distT="0" distB="0" distL="0" distR="0" wp14:anchorId="2474CBC7" wp14:editId="16CB14E7">
-            <wp:extent cx="4886325" cy="1970713"/>
+          <wp:inline distT="0" distB="0" distL="0" distR="0" wp14:anchorId="5967A4D5" wp14:editId="4D982305">
+            <wp:extent cx="5943600" cy="2326005"/>
             <wp:effectExtent l="0" t="0" r="0" b="0"/>
-            <wp:docPr id="19" name="Imagen 19"/>
+            <wp:docPr id="10" name="Imagen 10"/>
             <wp:cNvGraphicFramePr>
               <a:graphicFrameLocks xmlns:a="http://schemas.openxmlformats.org/drawingml/2006/main" noChangeAspect="1"/>
             </wp:cNvGraphicFramePr>
@@ -6054,7 +5699,7 @@
                   <pic:spPr>
                     <a:xfrm>
                       <a:off x="0" y="0"/>
-                      <a:ext cx="4899076" cy="1975856"/>
+                      <a:ext cx="5943600" cy="2326005"/>
                     </a:xfrm>
                     <a:prstGeom prst="rect">
                       <a:avLst/>
@@ -6069,17 +5714,39 @@
     </w:p>
     <w:p>
       <w:pPr>
-        <w:jc w:val="center"/>
-      </w:pPr>
-      <w:r>
-        <w:rPr>
+        <w:jc w:val="left"/>
+        <w:rPr>
+          <w:b/>
+          <w:bCs/>
+        </w:rPr>
+      </w:pPr>
+      <w:r>
+        <w:rPr>
+          <w:b/>
+          <w:bCs/>
+        </w:rPr>
+        <w:t>Producto Concreto</w:t>
+      </w:r>
+    </w:p>
+    <w:p>
+      <w:pPr>
+        <w:jc w:val="left"/>
+        <w:rPr>
+          <w:b/>
+          <w:bCs/>
+        </w:rPr>
+      </w:pPr>
+      <w:r>
+        <w:rPr>
+          <w:b/>
+          <w:bCs/>
           <w:noProof/>
         </w:rPr>
         <w:drawing>
-          <wp:inline distT="0" distB="0" distL="0" distR="0" wp14:anchorId="6E0BFF47" wp14:editId="6104B3A6">
-            <wp:extent cx="4879792" cy="2257425"/>
-            <wp:effectExtent l="0" t="0" r="0" b="0"/>
-            <wp:docPr id="20" name="Imagen 20"/>
+          <wp:inline distT="0" distB="0" distL="0" distR="0" wp14:anchorId="2CE39E17" wp14:editId="11D974B8">
+            <wp:extent cx="5943600" cy="4246880"/>
+            <wp:effectExtent l="0" t="0" r="0" b="1270"/>
+            <wp:docPr id="11" name="Imagen 11"/>
             <wp:cNvGraphicFramePr>
               <a:graphicFrameLocks xmlns:a="http://schemas.openxmlformats.org/drawingml/2006/main" noChangeAspect="1"/>
             </wp:cNvGraphicFramePr>
@@ -6099,7 +5766,7 @@
                   <pic:spPr>
                     <a:xfrm>
                       <a:off x="0" y="0"/>
-                      <a:ext cx="4884419" cy="2259566"/>
+                      <a:ext cx="5943600" cy="4246880"/>
                     </a:xfrm>
                     <a:prstGeom prst="rect">
                       <a:avLst/>
@@ -6124,20 +5791,14 @@
         <w:rPr>
           <w:b/>
           <w:bCs/>
-        </w:rPr>
-        <w:t>Concrete Builder</w:t>
-      </w:r>
-    </w:p>
-    <w:p>
-      <w:r>
-        <w:rPr>
           <w:noProof/>
         </w:rPr>
+        <w:lastRenderedPageBreak/>
         <w:drawing>
-          <wp:inline distT="0" distB="0" distL="0" distR="0" wp14:anchorId="5B52A8C3" wp14:editId="25DA4955">
-            <wp:extent cx="5943600" cy="2004695"/>
-            <wp:effectExtent l="0" t="0" r="0" b="0"/>
-            <wp:docPr id="22" name="Imagen 22"/>
+          <wp:inline distT="0" distB="0" distL="0" distR="0" wp14:anchorId="2FF49B68" wp14:editId="45726220">
+            <wp:extent cx="5943600" cy="1198245"/>
+            <wp:effectExtent l="0" t="0" r="0" b="1905"/>
+            <wp:docPr id="12" name="Imagen 12"/>
             <wp:cNvGraphicFramePr>
               <a:graphicFrameLocks xmlns:a="http://schemas.openxmlformats.org/drawingml/2006/main" noChangeAspect="1"/>
             </wp:cNvGraphicFramePr>
@@ -6157,7 +5818,7 @@
                   <pic:spPr>
                     <a:xfrm>
                       <a:off x="0" y="0"/>
-                      <a:ext cx="5943600" cy="2004695"/>
+                      <a:ext cx="5943600" cy="1198245"/>
                     </a:xfrm>
                     <a:prstGeom prst="rect">
                       <a:avLst/>
@@ -6172,17 +5833,40 @@
     </w:p>
     <w:p>
       <w:pPr>
-        <w:jc w:val="center"/>
-      </w:pPr>
-      <w:r>
-        <w:rPr>
+        <w:jc w:val="left"/>
+        <w:rPr>
+          <w:b/>
+          <w:bCs/>
+          <w:lang w:val="en-US"/>
+        </w:rPr>
+      </w:pPr>
+      <w:r>
+        <w:rPr>
+          <w:b/>
+          <w:bCs/>
+        </w:rPr>
+        <w:t>Consumidor</w:t>
+      </w:r>
+    </w:p>
+    <w:p>
+      <w:pPr>
+        <w:jc w:val="left"/>
+        <w:rPr>
+          <w:b/>
+          <w:bCs/>
+        </w:rPr>
+      </w:pPr>
+      <w:r>
+        <w:rPr>
+          <w:b/>
+          <w:bCs/>
           <w:noProof/>
         </w:rPr>
         <w:drawing>
-          <wp:inline distT="0" distB="0" distL="0" distR="0" wp14:anchorId="03986789" wp14:editId="4BA28EE2">
-            <wp:extent cx="4676775" cy="851913"/>
-            <wp:effectExtent l="0" t="0" r="0" b="5715"/>
-            <wp:docPr id="23" name="Imagen 23"/>
+          <wp:inline distT="0" distB="0" distL="0" distR="0" wp14:anchorId="1769BF1D" wp14:editId="649C17E9">
+            <wp:extent cx="5943600" cy="1065530"/>
+            <wp:effectExtent l="0" t="0" r="0" b="1270"/>
+            <wp:docPr id="13" name="Imagen 13"/>
             <wp:cNvGraphicFramePr>
               <a:graphicFrameLocks xmlns:a="http://schemas.openxmlformats.org/drawingml/2006/main" noChangeAspect="1"/>
             </wp:cNvGraphicFramePr>
@@ -6202,7 +5886,7 @@
                   <pic:spPr>
                     <a:xfrm>
                       <a:off x="0" y="0"/>
-                      <a:ext cx="4694262" cy="855098"/>
+                      <a:ext cx="5943600" cy="1065530"/>
                     </a:xfrm>
                     <a:prstGeom prst="rect">
                       <a:avLst/>
@@ -6217,18 +5901,404 @@
     </w:p>
     <w:p>
       <w:pPr>
-        <w:jc w:val="center"/>
-      </w:pPr>
+        <w:pStyle w:val="Ttulo4"/>
+      </w:pPr>
+      <w:r>
+        <w:t>Explicación y Prueba de que Funciona</w:t>
+      </w:r>
+    </w:p>
+    <w:p>
+      <w:pPr>
+        <w:pStyle w:val="Ttulo5"/>
+      </w:pPr>
+      <w:proofErr w:type="spellStart"/>
+      <w:r>
+        <w:t>PasswordEncoder</w:t>
+      </w:r>
+      <w:proofErr w:type="spellEnd"/>
+      <w:r>
+        <w:t xml:space="preserve"> </w:t>
+      </w:r>
+      <w:r>
+        <w:rPr>
+          <w:lang w:val="en-US"/>
+        </w:rPr>
+        <w:t>(</w:t>
+      </w:r>
+      <w:r>
+        <w:t>Producto</w:t>
+      </w:r>
+      <w:r>
+        <w:t>)</w:t>
+      </w:r>
+    </w:p>
+    <w:p>
+      <w:r>
+        <w:t xml:space="preserve">Este componente representa el </w:t>
+      </w:r>
+      <w:r>
+        <w:rPr>
+          <w:b/>
+          <w:bCs/>
+        </w:rPr>
+        <w:t>producto</w:t>
+      </w:r>
+      <w:r>
+        <w:t xml:space="preserve"> dentro del patrón </w:t>
+      </w:r>
+      <w:r>
+        <w:rPr>
+          <w:b/>
+          <w:bCs/>
+        </w:rPr>
+        <w:t>Factory Method</w:t>
+      </w:r>
+      <w:r>
+        <w:t xml:space="preserve">. </w:t>
+      </w:r>
+      <w:proofErr w:type="spellStart"/>
+      <w:r>
+        <w:rPr>
+          <w:b/>
+          <w:bCs/>
+        </w:rPr>
+        <w:t>PasswordEncoder</w:t>
+      </w:r>
+      <w:proofErr w:type="spellEnd"/>
+      <w:r>
+        <w:t xml:space="preserve"> es una abstracción proporcionada por Spring Security que define las operaciones necesarias para trabajar con las contraseñas. Al utilizar esta abstracción, el resto del sistema no necesita conocer qué algoritmo concreto se está utilizando para realizar el cifrado.</w:t>
+      </w:r>
+    </w:p>
+    <w:p>
+      <w:pPr>
+        <w:pStyle w:val="Ttulo5"/>
+      </w:pPr>
+      <w:proofErr w:type="spellStart"/>
+      <w:r>
+        <w:t>BCryptPasswordEncoder</w:t>
+      </w:r>
+      <w:proofErr w:type="spellEnd"/>
+      <w:r>
+        <w:t xml:space="preserve"> </w:t>
+      </w:r>
+      <w:r>
+        <w:t>(</w:t>
+      </w:r>
+      <w:r>
+        <w:t>Producto Concreto</w:t>
+      </w:r>
+      <w:r>
+        <w:t>)</w:t>
+      </w:r>
+    </w:p>
+    <w:p>
+      <w:r>
+        <w:t xml:space="preserve">Esta clase representa el </w:t>
+      </w:r>
+      <w:r>
+        <w:rPr>
+          <w:b/>
+          <w:bCs/>
+        </w:rPr>
+        <w:t>producto concreto</w:t>
+      </w:r>
+      <w:r>
+        <w:t xml:space="preserve">, ya que es una implementación específica de </w:t>
+      </w:r>
+      <w:proofErr w:type="spellStart"/>
+      <w:r>
+        <w:rPr>
+          <w:b/>
+          <w:bCs/>
+        </w:rPr>
+        <w:t>PasswordEncoder</w:t>
+      </w:r>
+      <w:proofErr w:type="spellEnd"/>
+      <w:r>
+        <w:t xml:space="preserve">. En nuestro proyecto utilizamos </w:t>
+      </w:r>
+      <w:proofErr w:type="spellStart"/>
+      <w:r>
+        <w:rPr>
+          <w:b/>
+          <w:bCs/>
+        </w:rPr>
+        <w:t>BCrypt</w:t>
+      </w:r>
+      <w:proofErr w:type="spellEnd"/>
+      <w:r>
+        <w:t xml:space="preserve"> para realizar el procesamiento seguro de las contraseñas, pero gracias a que trabajamos con la abstracción </w:t>
+      </w:r>
+      <w:proofErr w:type="spellStart"/>
+      <w:r>
+        <w:rPr>
+          <w:b/>
+          <w:bCs/>
+        </w:rPr>
+        <w:t>PasswordEncoder</w:t>
+      </w:r>
+      <w:proofErr w:type="spellEnd"/>
+      <w:r>
+        <w:t>, esta implementación podría ser reemplazada por otra sin modificar los componentes que la utilizan.</w:t>
+      </w:r>
+    </w:p>
+    <w:p>
+      <w:pPr>
+        <w:pStyle w:val="Ttulo5"/>
+      </w:pPr>
+      <w:proofErr w:type="spellStart"/>
+      <w:r>
+        <w:t>SecurityConfig</w:t>
+      </w:r>
+      <w:proofErr w:type="spellEnd"/>
+      <w:r>
+        <w:t xml:space="preserve"> </w:t>
+      </w:r>
+      <w:r>
+        <w:t>(</w:t>
+      </w:r>
+      <w:r>
+        <w:t>Fábrica</w:t>
+      </w:r>
+      <w:r>
+        <w:t>)</w:t>
+      </w:r>
+    </w:p>
+    <w:p>
+      <w:r>
+        <w:t xml:space="preserve">En esta clase se encuentra la </w:t>
+      </w:r>
+      <w:r>
+        <w:rPr>
+          <w:b/>
+          <w:bCs/>
+        </w:rPr>
+        <w:t>fábrica del patrón</w:t>
+      </w:r>
+      <w:r>
+        <w:t xml:space="preserve">, ya que mediante el contenedor de Spring se define el método encargado de crear el </w:t>
+      </w:r>
+      <w:proofErr w:type="spellStart"/>
+      <w:r>
+        <w:rPr>
+          <w:b/>
+          <w:bCs/>
+        </w:rPr>
+        <w:t>PasswordEncoder</w:t>
+      </w:r>
+      <w:proofErr w:type="spellEnd"/>
+      <w:r>
+        <w:t xml:space="preserve">. Spring toma el objeto creado mediante este método y lo registra como un </w:t>
+      </w:r>
+      <w:proofErr w:type="spellStart"/>
+      <w:r>
+        <w:rPr>
+          <w:b/>
+          <w:bCs/>
+        </w:rPr>
+        <w:t>Bean</w:t>
+      </w:r>
+      <w:proofErr w:type="spellEnd"/>
+      <w:r>
+        <w:t>, permitiendo posteriormente que sea utilizado mediante inyección de dependencias en los componentes que lo necesiten.</w:t>
+      </w:r>
+    </w:p>
+    <w:p>
+      <w:pPr>
+        <w:pStyle w:val="Ttulo5"/>
+      </w:pPr>
+      <w:proofErr w:type="spellStart"/>
+      <w:r>
+        <w:lastRenderedPageBreak/>
+        <w:t>AuthenticationManager</w:t>
+      </w:r>
+      <w:proofErr w:type="spellEnd"/>
+      <w:r>
+        <w:t xml:space="preserve"> </w:t>
+      </w:r>
+      <w:r>
+        <w:t>(</w:t>
+      </w:r>
+      <w:r>
+        <w:t>Consumidor</w:t>
+      </w:r>
+      <w:r>
+        <w:t>)</w:t>
+      </w:r>
+    </w:p>
+    <w:p>
+      <w:r>
+        <w:t xml:space="preserve">Este componente representa el </w:t>
+      </w:r>
+      <w:r>
+        <w:rPr>
+          <w:b/>
+          <w:bCs/>
+        </w:rPr>
+        <w:t>consumidor</w:t>
+      </w:r>
+      <w:r>
+        <w:t xml:space="preserve"> del </w:t>
+      </w:r>
+      <w:r>
+        <w:rPr>
+          <w:b/>
+          <w:bCs/>
+        </w:rPr>
+        <w:t>producto</w:t>
+      </w:r>
+      <w:r>
+        <w:t xml:space="preserve">, ya que necesita un </w:t>
+      </w:r>
+      <w:proofErr w:type="spellStart"/>
+      <w:r>
+        <w:rPr>
+          <w:b/>
+          <w:bCs/>
+        </w:rPr>
+        <w:t>PasswordEncoder</w:t>
+      </w:r>
+      <w:proofErr w:type="spellEnd"/>
+      <w:r>
+        <w:t xml:space="preserve"> para realizar el proceso de autenticación. Lo importante es que </w:t>
+      </w:r>
+      <w:proofErr w:type="spellStart"/>
+      <w:r>
+        <w:rPr>
+          <w:b/>
+          <w:bCs/>
+        </w:rPr>
+        <w:t>AuthenticationManager</w:t>
+      </w:r>
+      <w:proofErr w:type="spellEnd"/>
+      <w:r>
+        <w:t xml:space="preserve"> trabaja con la abstracción </w:t>
+      </w:r>
+      <w:proofErr w:type="spellStart"/>
+      <w:r>
+        <w:rPr>
+          <w:b/>
+          <w:bCs/>
+        </w:rPr>
+        <w:t>PasswordEncoder</w:t>
+      </w:r>
+      <w:proofErr w:type="spellEnd"/>
+      <w:r>
+        <w:t xml:space="preserve"> y no necesita conocer directamente a </w:t>
+      </w:r>
+      <w:proofErr w:type="spellStart"/>
+      <w:r>
+        <w:rPr>
+          <w:b/>
+          <w:bCs/>
+        </w:rPr>
+        <w:t>BCryptPasswordEncoder</w:t>
+      </w:r>
+      <w:proofErr w:type="spellEnd"/>
+      <w:r>
+        <w:t>, demostrando, así como el Factory Method ayuda a reducir el acoplamiento entre ambos componentes.</w:t>
+      </w:r>
+    </w:p>
+    <w:p>
+      <w:pPr>
+        <w:pStyle w:val="Ttulo5"/>
+      </w:pPr>
+      <w:r>
+        <w:t>Funcionamiento</w:t>
+      </w:r>
+    </w:p>
+    <w:p>
+      <w:r>
+        <w:t xml:space="preserve">Ahora sí, para la prueba de funcionamiento, ya que todavía no contamos con una interfaz gráfica en el </w:t>
+      </w:r>
+      <w:proofErr w:type="spellStart"/>
+      <w:r>
+        <w:rPr>
+          <w:b/>
+          <w:bCs/>
+        </w:rPr>
+        <w:t>frontend</w:t>
+      </w:r>
+      <w:proofErr w:type="spellEnd"/>
+      <w:r>
+        <w:t xml:space="preserve">, utilizamos la herramienta </w:t>
+      </w:r>
+      <w:proofErr w:type="spellStart"/>
+      <w:r>
+        <w:rPr>
+          <w:b/>
+          <w:bCs/>
+        </w:rPr>
+        <w:t>Postman</w:t>
+      </w:r>
+      <w:proofErr w:type="spellEnd"/>
+      <w:r>
+        <w:t xml:space="preserve">, en la cual mandamos la siguiente petición a la </w:t>
+      </w:r>
+      <w:r>
+        <w:rPr>
+          <w:b/>
+          <w:bCs/>
+        </w:rPr>
+        <w:t>API.</w:t>
+      </w:r>
+    </w:p>
+    <w:p>
+      <w:r>
+        <w:rPr>
+          <w:b/>
+          <w:bCs/>
+        </w:rPr>
+        <w:t xml:space="preserve">NOTA: </w:t>
+      </w:r>
+      <w:r>
+        <w:t xml:space="preserve">Cabe resaltar que para esta prueba de autenticación del usuario </w:t>
+      </w:r>
+      <w:r>
+        <w:t>ya había un usuario creado en base de datos y trabajamos con</w:t>
+      </w:r>
+      <w:r>
+        <w:rPr>
+          <w:b/>
+          <w:bCs/>
+        </w:rPr>
+        <w:t xml:space="preserve"> </w:t>
+      </w:r>
+      <w:proofErr w:type="spellStart"/>
+      <w:r>
+        <w:rPr>
+          <w:b/>
+          <w:bCs/>
+        </w:rPr>
+        <w:t>Json</w:t>
+      </w:r>
+      <w:proofErr w:type="spellEnd"/>
+      <w:r>
+        <w:rPr>
+          <w:b/>
+          <w:bCs/>
+        </w:rPr>
+        <w:t xml:space="preserve"> Web Tokens </w:t>
+      </w:r>
+      <w:r>
+        <w:t>además de Spring Security.</w:t>
+      </w:r>
+    </w:p>
+    <w:p>
+      <w:r>
+        <w:t>El usuario creado en la base de datos es el siguiente:</w:t>
+      </w:r>
+    </w:p>
+    <w:p>
       <w:r>
         <w:rPr>
           <w:noProof/>
         </w:rPr>
-        <w:lastRenderedPageBreak/>
         <w:drawing>
-          <wp:inline distT="0" distB="0" distL="0" distR="0" wp14:anchorId="6409BE82" wp14:editId="14230D7D">
-            <wp:extent cx="4498141" cy="3019425"/>
-            <wp:effectExtent l="0" t="0" r="0" b="0"/>
-            <wp:docPr id="24" name="Imagen 24"/>
+          <wp:inline distT="0" distB="0" distL="0" distR="0" wp14:anchorId="280B21E2" wp14:editId="2AE3C75A">
+            <wp:extent cx="5943600" cy="338455"/>
+            <wp:effectExtent l="0" t="0" r="0" b="4445"/>
+            <wp:docPr id="15" name="Imagen 15"/>
             <wp:cNvGraphicFramePr>
               <a:graphicFrameLocks xmlns:a="http://schemas.openxmlformats.org/drawingml/2006/main" noChangeAspect="1"/>
             </wp:cNvGraphicFramePr>
@@ -6248,7 +6318,7 @@
                   <pic:spPr>
                     <a:xfrm>
                       <a:off x="0" y="0"/>
-                      <a:ext cx="4502754" cy="3022522"/>
+                      <a:ext cx="5943600" cy="338455"/>
                     </a:xfrm>
                     <a:prstGeom prst="rect">
                       <a:avLst/>
@@ -6262,86 +6332,16 @@
       </w:r>
     </w:p>
     <w:p>
-      <w:pPr>
-        <w:pStyle w:val="Ttulo4"/>
-      </w:pPr>
-      <w:r>
-        <w:t xml:space="preserve">Explicación y </w:t>
-      </w:r>
-      <w:r>
-        <w:t>Prueba de que Funciona</w:t>
-      </w:r>
-    </w:p>
-    <w:p>
-      <w:pPr>
-        <w:pStyle w:val="Ttulo5"/>
-      </w:pPr>
-      <w:r>
-        <w:t>JwtService (Client</w:t>
-      </w:r>
-      <w:r>
-        <w:rPr>
-          <w:lang w:val="en-US"/>
-        </w:rPr>
-        <w:t>/</w:t>
-      </w:r>
-      <w:proofErr w:type="gramStart"/>
-      <w:r>
-        <w:rPr>
-          <w:lang w:val="en-US"/>
-        </w:rPr>
-        <w:t>Director</w:t>
-      </w:r>
-      <w:proofErr w:type="gramEnd"/>
-      <w:r>
-        <w:t>)</w:t>
-      </w:r>
-    </w:p>
-    <w:p>
-      <w:r>
-        <w:t xml:space="preserve">La clase </w:t>
-      </w:r>
-      <w:r>
-        <w:rPr>
-          <w:b/>
-          <w:bCs/>
-        </w:rPr>
-        <w:t>JwtService</w:t>
-      </w:r>
-      <w:r>
-        <w:t xml:space="preserve"> actúa como cliente y director contextual, ya que define los pasos de construcción del token JWT. </w:t>
-      </w:r>
-    </w:p>
-    <w:p>
-      <w:pPr>
-        <w:pStyle w:val="Ttulo5"/>
-      </w:pPr>
-      <w:r>
-        <w:t>JwtBuilder (Interfaz)</w:t>
-      </w:r>
-    </w:p>
-    <w:p>
-      <w:r>
-        <w:rPr>
-          <w:b/>
-          <w:bCs/>
-        </w:rPr>
-        <w:t>JwtBuilder</w:t>
-      </w:r>
-      <w:r>
-        <w:t xml:space="preserve"> representa el Builder, donde se</w:t>
-      </w:r>
-      <w:r>
-        <w:t xml:space="preserve"> define el contrato de métodos que deberán utilizar los Builders concretos posteriormente, entre ellos los utilizados como </w:t>
+      <w:r>
+        <w:t xml:space="preserve">Como podemos ver, la contraseña del usuario ya se encuentra encriptada desde su creación, así que, para poder autenticar al usuario en el sistema, el </w:t>
       </w:r>
       <w:proofErr w:type="spellStart"/>
-      <w:proofErr w:type="gramStart"/>
-      <w:r>
-        <w:rPr>
-          <w:b/>
-          <w:bCs/>
-        </w:rPr>
-        <w:t>subject</w:t>
+      <w:r>
+        <w:rPr>
+          <w:b/>
+          <w:bCs/>
+        </w:rPr>
+        <w:t>AuthenticationManager</w:t>
       </w:r>
       <w:proofErr w:type="spellEnd"/>
       <w:r>
@@ -6349,15 +6349,10 @@
           <w:b/>
           <w:bCs/>
         </w:rPr>
-        <w:t>(</w:t>
-      </w:r>
-      <w:proofErr w:type="gramEnd"/>
-      <w:r>
-        <w:rPr>
-          <w:b/>
-          <w:bCs/>
-        </w:rPr>
-        <w:t xml:space="preserve">), </w:t>
+        <w:t xml:space="preserve"> </w:t>
+      </w:r>
+      <w:r>
+        <w:t xml:space="preserve">de Spring Security deberá utilizar a </w:t>
       </w:r>
       <w:proofErr w:type="spellStart"/>
       <w:r>
@@ -6365,7 +6360,7 @@
           <w:b/>
           <w:bCs/>
         </w:rPr>
-        <w:t>claim</w:t>
+        <w:t>BCryptPasswordEncoder</w:t>
       </w:r>
       <w:proofErr w:type="spellEnd"/>
       <w:r>
@@ -6373,151 +6368,10 @@
           <w:b/>
           <w:bCs/>
         </w:rPr>
-        <w:t xml:space="preserve">(), </w:t>
-      </w:r>
-      <w:proofErr w:type="spellStart"/>
-      <w:r>
-        <w:rPr>
-          <w:b/>
-          <w:bCs/>
-        </w:rPr>
-        <w:t>issuedAt</w:t>
-      </w:r>
-      <w:proofErr w:type="spellEnd"/>
-      <w:r>
-        <w:rPr>
-          <w:b/>
-          <w:bCs/>
-        </w:rPr>
-        <w:t xml:space="preserve">(), </w:t>
-      </w:r>
-      <w:proofErr w:type="spellStart"/>
-      <w:r>
-        <w:rPr>
-          <w:b/>
-          <w:bCs/>
-        </w:rPr>
-        <w:t>expiration</w:t>
-      </w:r>
-      <w:proofErr w:type="spellEnd"/>
-      <w:r>
-        <w:rPr>
-          <w:b/>
-          <w:bCs/>
-        </w:rPr>
-        <w:t xml:space="preserve">(), </w:t>
-      </w:r>
-      <w:proofErr w:type="spellStart"/>
-      <w:r>
-        <w:rPr>
-          <w:b/>
-          <w:bCs/>
-        </w:rPr>
-        <w:t>signWith</w:t>
-      </w:r>
-      <w:proofErr w:type="spellEnd"/>
-      <w:r>
-        <w:rPr>
-          <w:b/>
-          <w:bCs/>
-        </w:rPr>
-        <w:t xml:space="preserve">() </w:t>
-      </w:r>
-      <w:r>
-        <w:t>y</w:t>
-      </w:r>
-      <w:r>
-        <w:rPr>
-          <w:b/>
-          <w:bCs/>
-        </w:rPr>
-        <w:t xml:space="preserve"> compact().</w:t>
-      </w:r>
-    </w:p>
-    <w:p>
-      <w:pPr>
-        <w:pStyle w:val="Ttulo5"/>
-      </w:pPr>
-      <w:r>
-        <w:t>DefaultJwtBuilder (Concrete Builder)</w:t>
-      </w:r>
-    </w:p>
-    <w:p>
-      <w:r>
-        <w:rPr>
-          <w:b/>
-          <w:bCs/>
-        </w:rPr>
-        <w:t>DefaultJwtBuilder</w:t>
-      </w:r>
-      <w:r>
-        <w:t xml:space="preserve">, proporcionado internamente por la librería </w:t>
-      </w:r>
-      <w:r>
-        <w:rPr>
-          <w:b/>
-          <w:bCs/>
-        </w:rPr>
-        <w:t>JJWT</w:t>
-      </w:r>
-      <w:r>
-        <w:t xml:space="preserve">, es el Builder concreto donde se implementa la interfaz </w:t>
-      </w:r>
-      <w:r>
-        <w:rPr>
-          <w:b/>
-          <w:bCs/>
-        </w:rPr>
-        <w:t xml:space="preserve">JwtBuilder </w:t>
-      </w:r>
-      <w:r>
-        <w:t xml:space="preserve">y se asigna comportamiento a sus métodos. Finalmente, el método </w:t>
-      </w:r>
-      <w:proofErr w:type="gramStart"/>
-      <w:r>
-        <w:rPr>
-          <w:b/>
-          <w:bCs/>
-        </w:rPr>
-        <w:t>compact(</w:t>
-      </w:r>
-      <w:proofErr w:type="gramEnd"/>
-      <w:r>
-        <w:rPr>
-          <w:b/>
-          <w:bCs/>
-        </w:rPr>
-        <w:t>)</w:t>
-      </w:r>
-      <w:r>
-        <w:t xml:space="preserve"> genera el producto terminado: un token JWT firmado en formato </w:t>
-      </w:r>
-      <w:r>
-        <w:rPr>
-          <w:b/>
-          <w:bCs/>
-        </w:rPr>
-        <w:t>String</w:t>
-      </w:r>
-      <w:r>
-        <w:t>.</w:t>
-      </w:r>
-    </w:p>
-    <w:p>
-      <w:pPr>
-        <w:pStyle w:val="Ttulo5"/>
-      </w:pPr>
-      <w:r>
-        <w:lastRenderedPageBreak/>
-        <w:t>Funcionamiento</w:t>
-      </w:r>
-    </w:p>
-    <w:p>
-      <w:r>
-        <w:t>Cuando nosotros iniciamos sesión internamente con un usuario</w:t>
-      </w:r>
-      <w:r>
-        <w:t>, la API REST nos devuelve como respuesta un token JWT para gestionar la sesión del usuario como mensaje de éxito. A continuación se muestra un ejemplo:</w:t>
+        <w:t xml:space="preserve"> </w:t>
+      </w:r>
+      <w:r>
+        <w:t>para ver si la contraseña ingresada por el usuario es igual a la de la base de datos. El resultado fue el siguiente:</w:t>
       </w:r>
     </w:p>
     <w:p>
@@ -6526,10 +6380,10 @@
           <w:noProof/>
         </w:rPr>
         <w:drawing>
-          <wp:inline distT="0" distB="0" distL="0" distR="0" wp14:anchorId="009FAAB2" wp14:editId="7118C825">
-            <wp:extent cx="5943600" cy="2818765"/>
-            <wp:effectExtent l="0" t="0" r="0" b="635"/>
-            <wp:docPr id="27" name="Imagen 27"/>
+          <wp:inline distT="0" distB="0" distL="0" distR="0" wp14:anchorId="53F81A13" wp14:editId="3D487E8D">
+            <wp:extent cx="6170320" cy="2886075"/>
+            <wp:effectExtent l="0" t="0" r="1905" b="0"/>
+            <wp:docPr id="14" name="Imagen 14"/>
             <wp:cNvGraphicFramePr>
               <a:graphicFrameLocks xmlns:a="http://schemas.openxmlformats.org/drawingml/2006/main" noChangeAspect="1"/>
             </wp:cNvGraphicFramePr>
@@ -6549,7 +6403,7 @@
                   <pic:spPr>
                     <a:xfrm>
                       <a:off x="0" y="0"/>
-                      <a:ext cx="5943600" cy="2818765"/>
+                      <a:ext cx="6172583" cy="2887133"/>
                     </a:xfrm>
                     <a:prstGeom prst="rect">
                       <a:avLst/>
@@ -6563,36 +6417,42 @@
       </w:r>
     </w:p>
     <w:p>
-      <w:r>
-        <w:t xml:space="preserve">Este token fue generado mediante un flujo interno de validación y verificación de credenciales donde posteriormente llego al </w:t>
-      </w:r>
-      <w:r>
-        <w:rPr>
-          <w:b/>
-          <w:bCs/>
-        </w:rPr>
-        <w:t>JwtService</w:t>
-      </w:r>
-      <w:r>
-        <w:t xml:space="preserve"> donde se gestionó la creación del token por medio de la librería </w:t>
-      </w:r>
-      <w:r>
-        <w:rPr>
-          <w:b/>
-          <w:bCs/>
-        </w:rPr>
-        <w:t xml:space="preserve">JJWT. </w:t>
-      </w:r>
-      <w:r>
-        <w:t>Utilizando el concepto de patrón Builder.</w:t>
-      </w:r>
-    </w:p>
-    <w:p>
-      <w:pPr>
-        <w:pStyle w:val="Ttulo2"/>
-      </w:pPr>
-      <w:r>
-        <w:t>Estructurales</w:t>
+      <w:pPr>
+        <w:rPr>
+          <w:b/>
+          <w:bCs/>
+        </w:rPr>
+      </w:pPr>
+      <w:r>
+        <w:lastRenderedPageBreak/>
+        <w:t xml:space="preserve">Exitosamente la </w:t>
+      </w:r>
+      <w:r>
+        <w:rPr>
+          <w:b/>
+          <w:bCs/>
+        </w:rPr>
+        <w:t>API REST</w:t>
+      </w:r>
+      <w:r>
+        <w:t xml:space="preserve"> responde con código </w:t>
+      </w:r>
+      <w:r>
+        <w:rPr>
+          <w:b/>
+          <w:bCs/>
+        </w:rPr>
+        <w:t>http 200</w:t>
+      </w:r>
+      <w:r>
+        <w:t xml:space="preserve"> y con el cuerpo de la respuesta indicando el token JWT generado después de la autenticación. Por lo que indica que el proceso de encriptar la contraseña y compararla con la de la base de datos fue un </w:t>
+      </w:r>
+      <w:r>
+        <w:rPr>
+          <w:b/>
+          <w:bCs/>
+        </w:rPr>
+        <w:t>éxito.</w:t>
       </w:r>
     </w:p>
     <w:p>
@@ -6600,123 +6460,20 @@
         <w:pStyle w:val="Ttulo3"/>
       </w:pPr>
       <w:r>
-        <w:t xml:space="preserve">Aplicación del Patrón </w:t>
-      </w:r>
-      <w:proofErr w:type="spellStart"/>
-      <w:r>
-        <w:t>Adapter</w:t>
-      </w:r>
-      <w:proofErr w:type="spellEnd"/>
+        <w:t>Aplicación del Patrón Builder</w:t>
+      </w:r>
     </w:p>
     <w:p>
       <w:pPr>
         <w:pStyle w:val="Ttulo4"/>
       </w:pPr>
       <w:r>
-        <w:t>Como está colaborando este Patrón al Proyecto</w:t>
-      </w:r>
-    </w:p>
-    <w:p>
-      <w:r>
-        <w:t xml:space="preserve">En nuestro proyecto, el patrón </w:t>
-      </w:r>
-      <w:proofErr w:type="spellStart"/>
-      <w:r>
-        <w:rPr>
-          <w:b/>
-          <w:bCs/>
-        </w:rPr>
-        <w:t>Adapter</w:t>
-      </w:r>
-      <w:proofErr w:type="spellEnd"/>
-      <w:r>
-        <w:t xml:space="preserve"> está siendo utilizado como parte de la </w:t>
-      </w:r>
-      <w:r>
-        <w:rPr>
-          <w:b/>
-          <w:bCs/>
-        </w:rPr>
-        <w:t>arquitectura hexagonal</w:t>
-      </w:r>
-      <w:r>
-        <w:t xml:space="preserve"> para permitir que los diferentes componentes de la aplicación puedan comunicarse sin depender directamente de implementaciones específicas. Para evidenciar su funcionamiento, tomaremos como ejemplo la creación de usuarios, donde la capa de aplicación trabaja mediante el puerto </w:t>
-      </w:r>
-      <w:proofErr w:type="spellStart"/>
-      <w:r>
-        <w:rPr>
-          <w:b/>
-          <w:bCs/>
-        </w:rPr>
-        <w:t>UserRepository</w:t>
-      </w:r>
-      <w:proofErr w:type="spellEnd"/>
-      <w:r>
-        <w:t xml:space="preserve">, mientras que en la infraestructura se encuentra </w:t>
-      </w:r>
-      <w:proofErr w:type="spellStart"/>
-      <w:r>
-        <w:rPr>
-          <w:b/>
-          <w:bCs/>
-        </w:rPr>
-        <w:t>UserAdapterPersistence</w:t>
-      </w:r>
-      <w:proofErr w:type="spellEnd"/>
-      <w:r>
-        <w:t xml:space="preserve">, encargado de adaptar este contrato a la implementación de persistencia utilizada con </w:t>
-      </w:r>
-      <w:r>
-        <w:rPr>
-          <w:b/>
-          <w:bCs/>
-        </w:rPr>
-        <w:t>JPA</w:t>
-      </w:r>
-      <w:r>
-        <w:t xml:space="preserve"> e </w:t>
-      </w:r>
-      <w:proofErr w:type="spellStart"/>
-      <w:r>
-        <w:rPr>
-          <w:b/>
-          <w:bCs/>
-        </w:rPr>
-        <w:t>Hibernate</w:t>
-      </w:r>
-      <w:proofErr w:type="spellEnd"/>
-      <w:r>
-        <w:t>.</w:t>
-      </w:r>
-    </w:p>
-    <w:p>
-      <w:r>
-        <w:lastRenderedPageBreak/>
-        <w:t xml:space="preserve">Este patrón aporta principalmente desacoplamiento entre la lógica de aplicación y la infraestructura, ya que </w:t>
-      </w:r>
-      <w:proofErr w:type="spellStart"/>
-      <w:r>
-        <w:rPr>
-          <w:b/>
-          <w:bCs/>
-        </w:rPr>
-        <w:t>AuthService</w:t>
-      </w:r>
-      <w:proofErr w:type="spellEnd"/>
-      <w:r>
-        <w:t xml:space="preserve"> no necesita conocer cómo se almacenan los usuarios ni trabajar directamente con JPA. El adaptador recibe las operaciones definidas por el puerto y las traduce hacia </w:t>
-      </w:r>
-      <w:proofErr w:type="spellStart"/>
-      <w:r>
-        <w:rPr>
-          <w:b/>
-          <w:bCs/>
-        </w:rPr>
-        <w:t>UserDAO</w:t>
-      </w:r>
-      <w:proofErr w:type="spellEnd"/>
-      <w:r>
-        <w:t xml:space="preserve"> y las entidades de persistencia, permitiendo que la aplicación mantenga su lógica independiente de la tecnología utilizada para almacenar la información. Además, este mismo enfoque puede aplicarse en las demás funcionalidades del proyecto que requieren comunicación entre la aplicación y componentes externos.</w:t>
+        <w:t>Como está Colaborando</w:t>
+      </w:r>
+    </w:p>
+    <w:p>
+      <w:r>
+        <w:t xml:space="preserve">En el proceso de autenticación, el patrón Builder se utiliza para construir el token JWT que posteriormente será entregado al usuario. El token requiere varios datos de configuración, entre ellos el nombre de usuario, el rol, la fecha de emisión, la fecha de expiración y la firma criptográfica.  </w:t>
       </w:r>
     </w:p>
     <w:p>
@@ -6724,7 +6481,7 @@
         <w:pStyle w:val="Ttulo4"/>
       </w:pPr>
       <w:r>
-        <w:t>Diagrama de Clase UML</w:t>
+        <w:t>Diagrama de Clases UML</w:t>
       </w:r>
     </w:p>
     <w:p>
@@ -6732,11 +6489,14 @@
         <w:jc w:val="center"/>
       </w:pPr>
       <w:r>
+        <w:rPr>
+          <w:noProof/>
+        </w:rPr>
         <w:drawing>
-          <wp:inline distT="0" distB="0" distL="0" distR="0" wp14:anchorId="6FE64FE9" wp14:editId="0E01C80D">
-            <wp:extent cx="2225615" cy="4064462"/>
-            <wp:effectExtent l="0" t="0" r="3810" b="0"/>
-            <wp:docPr id="28" name="Imagen 28"/>
+          <wp:inline distT="0" distB="0" distL="0" distR="0" wp14:anchorId="136B7C85" wp14:editId="5B981A99">
+            <wp:extent cx="5153025" cy="3668227"/>
+            <wp:effectExtent l="0" t="0" r="0" b="8890"/>
+            <wp:docPr id="26" name="Imagen 26"/>
             <wp:cNvGraphicFramePr>
               <a:graphicFrameLocks xmlns:a="http://schemas.openxmlformats.org/drawingml/2006/main" noChangeAspect="1"/>
             </wp:cNvGraphicFramePr>
@@ -6756,7 +6516,7 @@
                   <pic:spPr>
                     <a:xfrm>
                       <a:off x="0" y="0"/>
-                      <a:ext cx="2231095" cy="4074470"/>
+                      <a:ext cx="5155104" cy="3669707"/>
                     </a:xfrm>
                     <a:prstGeom prst="rect">
                       <a:avLst/>
@@ -6774,17 +6534,47 @@
         <w:pStyle w:val="Ttulo4"/>
       </w:pPr>
       <w:r>
+        <w:t>Código</w:t>
+      </w:r>
+    </w:p>
+    <w:p>
+      <w:pPr>
+        <w:rPr>
+          <w:b/>
+          <w:bCs/>
+        </w:rPr>
+      </w:pPr>
+      <w:r>
+        <w:rPr>
+          <w:b/>
+          <w:bCs/>
+        </w:rPr>
+        <w:t xml:space="preserve">Client / </w:t>
+      </w:r>
+      <w:proofErr w:type="gramStart"/>
+      <w:r>
+        <w:rPr>
+          <w:b/>
+          <w:bCs/>
+        </w:rPr>
+        <w:t>Director</w:t>
+      </w:r>
+      <w:proofErr w:type="gramEnd"/>
+    </w:p>
+    <w:p>
+      <w:pPr>
+        <w:jc w:val="center"/>
+      </w:pPr>
+      <w:r>
+        <w:rPr>
+          <w:noProof/>
+        </w:rPr>
         <w:lastRenderedPageBreak/>
-        <w:t>Código</w:t>
-      </w:r>
-    </w:p>
-    <w:p>
-      <w:r>
         <w:drawing>
-          <wp:inline distT="0" distB="0" distL="0" distR="0" wp14:anchorId="4F2736A4" wp14:editId="1FC4987B">
-            <wp:extent cx="5943600" cy="3430270"/>
-            <wp:effectExtent l="0" t="0" r="0" b="0"/>
-            <wp:docPr id="29" name="Imagen 29"/>
+          <wp:inline distT="0" distB="0" distL="0" distR="0" wp14:anchorId="352844FC" wp14:editId="769BDC22">
+            <wp:extent cx="4448175" cy="2416082"/>
+            <wp:effectExtent l="0" t="0" r="0" b="3810"/>
+            <wp:docPr id="25" name="Imagen 25"/>
             <wp:cNvGraphicFramePr>
               <a:graphicFrameLocks xmlns:a="http://schemas.openxmlformats.org/drawingml/2006/main" noChangeAspect="1"/>
             </wp:cNvGraphicFramePr>
@@ -6804,7 +6594,7 @@
                   <pic:spPr>
                     <a:xfrm>
                       <a:off x="0" y="0"/>
-                      <a:ext cx="5943600" cy="3430270"/>
+                      <a:ext cx="4453506" cy="2418978"/>
                     </a:xfrm>
                     <a:prstGeom prst="rect">
                       <a:avLst/>
@@ -6818,12 +6608,34 @@
       </w:r>
     </w:p>
     <w:p>
-      <w:r>
+      <w:pPr>
+        <w:jc w:val="left"/>
+        <w:rPr>
+          <w:b/>
+          <w:bCs/>
+        </w:rPr>
+      </w:pPr>
+      <w:r>
+        <w:rPr>
+          <w:b/>
+          <w:bCs/>
+        </w:rPr>
+        <w:t>Interface</w:t>
+      </w:r>
+    </w:p>
+    <w:p>
+      <w:pPr>
+        <w:jc w:val="center"/>
+      </w:pPr>
+      <w:r>
+        <w:rPr>
+          <w:noProof/>
+        </w:rPr>
         <w:drawing>
-          <wp:inline distT="0" distB="0" distL="0" distR="0" wp14:anchorId="340030D1" wp14:editId="065D87C3">
-            <wp:extent cx="5449060" cy="1381318"/>
-            <wp:effectExtent l="0" t="0" r="0" b="9525"/>
-            <wp:docPr id="30" name="Imagen 30"/>
+          <wp:inline distT="0" distB="0" distL="0" distR="0" wp14:anchorId="34DC3B85" wp14:editId="15BE933A">
+            <wp:extent cx="5062655" cy="3762375"/>
+            <wp:effectExtent l="0" t="0" r="5080" b="0"/>
+            <wp:docPr id="17" name="Imagen 17"/>
             <wp:cNvGraphicFramePr>
               <a:graphicFrameLocks xmlns:a="http://schemas.openxmlformats.org/drawingml/2006/main" noChangeAspect="1"/>
             </wp:cNvGraphicFramePr>
@@ -6843,7 +6655,7 @@
                   <pic:spPr>
                     <a:xfrm>
                       <a:off x="0" y="0"/>
-                      <a:ext cx="5449060" cy="1381318"/>
+                      <a:ext cx="5070931" cy="3768525"/>
                     </a:xfrm>
                     <a:prstGeom prst="rect">
                       <a:avLst/>
@@ -6857,13 +6669,19 @@
       </w:r>
     </w:p>
     <w:p>
-      <w:r>
+      <w:pPr>
+        <w:jc w:val="center"/>
+      </w:pPr>
+      <w:r>
+        <w:rPr>
+          <w:noProof/>
+        </w:rPr>
         <w:lastRenderedPageBreak/>
         <w:drawing>
-          <wp:inline distT="0" distB="0" distL="0" distR="0" wp14:anchorId="188B8AA5" wp14:editId="2524FEB4">
-            <wp:extent cx="5943600" cy="3407410"/>
-            <wp:effectExtent l="0" t="0" r="0" b="2540"/>
-            <wp:docPr id="31" name="Imagen 31"/>
+          <wp:inline distT="0" distB="0" distL="0" distR="0" wp14:anchorId="52FF695D" wp14:editId="1F2ABA3C">
+            <wp:extent cx="4819650" cy="2053500"/>
+            <wp:effectExtent l="0" t="0" r="0" b="4445"/>
+            <wp:docPr id="18" name="Imagen 18"/>
             <wp:cNvGraphicFramePr>
               <a:graphicFrameLocks xmlns:a="http://schemas.openxmlformats.org/drawingml/2006/main" noChangeAspect="1"/>
             </wp:cNvGraphicFramePr>
@@ -6883,7 +6701,7 @@
                   <pic:spPr>
                     <a:xfrm>
                       <a:off x="0" y="0"/>
-                      <a:ext cx="5943600" cy="3407410"/>
+                      <a:ext cx="4827343" cy="2056778"/>
                     </a:xfrm>
                     <a:prstGeom prst="rect">
                       <a:avLst/>
@@ -6897,12 +6715,18 @@
       </w:r>
     </w:p>
     <w:p>
-      <w:r>
+      <w:pPr>
+        <w:jc w:val="center"/>
+      </w:pPr>
+      <w:r>
+        <w:rPr>
+          <w:noProof/>
+        </w:rPr>
         <w:drawing>
-          <wp:inline distT="0" distB="0" distL="0" distR="0" wp14:anchorId="543D9985" wp14:editId="07597DFA">
-            <wp:extent cx="5943600" cy="1938020"/>
-            <wp:effectExtent l="0" t="0" r="0" b="5080"/>
-            <wp:docPr id="32" name="Imagen 32"/>
+          <wp:inline distT="0" distB="0" distL="0" distR="0" wp14:anchorId="2474CBC7" wp14:editId="16CB14E7">
+            <wp:extent cx="4886325" cy="1970713"/>
+            <wp:effectExtent l="0" t="0" r="0" b="0"/>
+            <wp:docPr id="19" name="Imagen 19"/>
             <wp:cNvGraphicFramePr>
               <a:graphicFrameLocks xmlns:a="http://schemas.openxmlformats.org/drawingml/2006/main" noChangeAspect="1"/>
             </wp:cNvGraphicFramePr>
@@ -6922,7 +6746,7 @@
                   <pic:spPr>
                     <a:xfrm>
                       <a:off x="0" y="0"/>
-                      <a:ext cx="5943600" cy="1938020"/>
+                      <a:ext cx="4899076" cy="1975856"/>
                     </a:xfrm>
                     <a:prstGeom prst="rect">
                       <a:avLst/>
@@ -6937,328 +6761,17 @@
     </w:p>
     <w:p>
       <w:pPr>
-        <w:pStyle w:val="Ttulo4"/>
-      </w:pPr>
-      <w:r>
-        <w:t>Explicación y Prueba de que Funciona</w:t>
-      </w:r>
-    </w:p>
-    <w:p>
-      <w:pPr>
-        <w:pStyle w:val="Ttulo5"/>
-      </w:pPr>
-      <w:proofErr w:type="spellStart"/>
-      <w:r>
-        <w:t>AuthService</w:t>
-      </w:r>
-      <w:proofErr w:type="spellEnd"/>
-      <w:r>
-        <w:t xml:space="preserve"> (Cliente)</w:t>
-      </w:r>
-    </w:p>
-    <w:p>
-      <w:r>
-        <w:t xml:space="preserve">Es el componente encargado de </w:t>
-      </w:r>
-      <w:r>
-        <w:rPr>
-          <w:b/>
-          <w:bCs/>
-        </w:rPr>
-        <w:t>orquestar el registro del usuario</w:t>
-      </w:r>
-      <w:r>
-        <w:t xml:space="preserve"> desde la capa de aplicación. Para guardar el usuario, utiliza </w:t>
-      </w:r>
-      <w:proofErr w:type="spellStart"/>
-      <w:r>
-        <w:rPr>
-          <w:b/>
-          <w:bCs/>
-        </w:rPr>
-        <w:t>UserRepository</w:t>
-      </w:r>
-      <w:proofErr w:type="spellEnd"/>
-      <w:r>
-        <w:t xml:space="preserve"> sin conocer directamente la implementación encargada de la persistencia.</w:t>
-      </w:r>
-    </w:p>
-    <w:p>
-      <w:pPr>
-        <w:pStyle w:val="Ttulo5"/>
-      </w:pPr>
-      <w:proofErr w:type="spellStart"/>
-      <w:r>
-        <w:lastRenderedPageBreak/>
-        <w:t>UserRepository</w:t>
-      </w:r>
-      <w:proofErr w:type="spellEnd"/>
-      <w:r>
-        <w:t xml:space="preserve"> (Interfaz)</w:t>
-      </w:r>
-    </w:p>
-    <w:p>
-      <w:r>
-        <w:t xml:space="preserve">Es el </w:t>
-      </w:r>
-      <w:r>
-        <w:rPr>
-          <w:rStyle w:val="Textoennegrita"/>
-        </w:rPr>
-        <w:t>puerto de salida</w:t>
-      </w:r>
-      <w:r>
-        <w:t xml:space="preserve"> que define las operaciones que necesita la aplicación para trabajar con los usuarios. En este caso, establece el contrato para guardar y consultar usuarios, sin depender de JPA o de la base de datos.</w:t>
-      </w:r>
-    </w:p>
-    <w:p>
-      <w:pPr>
-        <w:pStyle w:val="Ttulo5"/>
-      </w:pPr>
-      <w:proofErr w:type="spellStart"/>
-      <w:r>
-        <w:t>UserAdapterPersistence</w:t>
-      </w:r>
-      <w:proofErr w:type="spellEnd"/>
-      <w:r>
-        <w:t xml:space="preserve"> (</w:t>
-      </w:r>
-      <w:proofErr w:type="spellStart"/>
-      <w:r>
-        <w:t>Adapter</w:t>
-      </w:r>
-      <w:proofErr w:type="spellEnd"/>
-      <w:r>
-        <w:t>)</w:t>
-      </w:r>
-    </w:p>
-    <w:p>
-      <w:r>
-        <w:t xml:space="preserve">Es el componente que implementa el puerto </w:t>
-      </w:r>
-      <w:proofErr w:type="spellStart"/>
-      <w:r>
-        <w:rPr>
-          <w:b/>
-          <w:bCs/>
-        </w:rPr>
-        <w:t>UserRepository</w:t>
-      </w:r>
-      <w:proofErr w:type="spellEnd"/>
-      <w:r>
-        <w:t xml:space="preserve"> y adapta sus operaciones hacia la infraestructura de persistencia. Recibe el </w:t>
-      </w:r>
-      <w:proofErr w:type="spellStart"/>
-      <w:r>
-        <w:rPr>
-          <w:b/>
-          <w:bCs/>
-        </w:rPr>
-        <w:t>User</w:t>
-      </w:r>
-      <w:proofErr w:type="spellEnd"/>
-      <w:r>
-        <w:t xml:space="preserve"> desde la aplicación, lo convierte mediante el </w:t>
-      </w:r>
-      <w:proofErr w:type="spellStart"/>
-      <w:r>
-        <w:rPr>
-          <w:b/>
-          <w:bCs/>
-        </w:rPr>
-        <w:t>mapper</w:t>
-      </w:r>
-      <w:proofErr w:type="spellEnd"/>
-      <w:r>
-        <w:t xml:space="preserve"> a </w:t>
-      </w:r>
-      <w:proofErr w:type="spellStart"/>
-      <w:r>
-        <w:rPr>
-          <w:b/>
-          <w:bCs/>
-        </w:rPr>
-        <w:t>UserEntity</w:t>
-      </w:r>
-      <w:proofErr w:type="spellEnd"/>
-      <w:r>
-        <w:t xml:space="preserve"> y utiliza </w:t>
-      </w:r>
-      <w:proofErr w:type="spellStart"/>
-      <w:r>
-        <w:rPr>
-          <w:b/>
-          <w:bCs/>
-        </w:rPr>
-        <w:t>UserDAO</w:t>
-      </w:r>
-      <w:proofErr w:type="spellEnd"/>
-      <w:r>
-        <w:t xml:space="preserve"> para realizar la operación en la base de datos.</w:t>
-      </w:r>
-    </w:p>
-    <w:p>
-      <w:pPr>
-        <w:pStyle w:val="Ttulo5"/>
-      </w:pPr>
-      <w:proofErr w:type="spellStart"/>
-      <w:r>
-        <w:t>UserDAO</w:t>
-      </w:r>
-      <w:proofErr w:type="spellEnd"/>
-      <w:r>
-        <w:t xml:space="preserve"> (</w:t>
-      </w:r>
-      <w:proofErr w:type="spellStart"/>
-      <w:r>
-        <w:t>Adaptee</w:t>
-      </w:r>
-      <w:proofErr w:type="spellEnd"/>
-      <w:r>
-        <w:t>)</w:t>
-      </w:r>
-    </w:p>
-    <w:p>
-      <w:r>
-        <w:t xml:space="preserve">Es el componente que proporciona las operaciones necesarias para comunicarse directamente con la base de datos mediante </w:t>
-      </w:r>
-      <w:r>
-        <w:rPr>
-          <w:b/>
-          <w:bCs/>
-        </w:rPr>
-        <w:t>JPA</w:t>
-      </w:r>
-      <w:r>
-        <w:t xml:space="preserve">. El </w:t>
-      </w:r>
-      <w:proofErr w:type="spellStart"/>
-      <w:r>
-        <w:rPr>
-          <w:b/>
-          <w:bCs/>
-        </w:rPr>
-        <w:t>UserAdapterPersistence</w:t>
-      </w:r>
-      <w:proofErr w:type="spellEnd"/>
-      <w:r>
-        <w:t xml:space="preserve"> utiliza este componente para ejecutar la persistencia del usuario.</w:t>
-      </w:r>
-    </w:p>
-    <w:p>
-      <w:pPr>
-        <w:pStyle w:val="Ttulo5"/>
-      </w:pPr>
-      <w:r>
-        <w:t>Funcionamiento</w:t>
-      </w:r>
-    </w:p>
-    <w:p>
-      <w:r>
-        <w:t xml:space="preserve">Cuando nosotros enviamos una petición a la API REST por medio del </w:t>
-      </w:r>
-      <w:proofErr w:type="spellStart"/>
-      <w:r>
-        <w:t>endpoint</w:t>
-      </w:r>
-      <w:proofErr w:type="spellEnd"/>
-      <w:r>
-        <w:t xml:space="preserve"> </w:t>
-      </w:r>
-      <w:r>
-        <w:rPr>
-          <w:b/>
-          <w:bCs/>
-        </w:rPr>
-        <w:t>/api/</w:t>
-      </w:r>
-      <w:proofErr w:type="spellStart"/>
-      <w:r>
-        <w:rPr>
-          <w:b/>
-          <w:bCs/>
-        </w:rPr>
-        <w:t>auth</w:t>
-      </w:r>
-      <w:proofErr w:type="spellEnd"/>
-      <w:r>
-        <w:rPr>
-          <w:b/>
-          <w:bCs/>
-        </w:rPr>
-        <w:t>/</w:t>
-      </w:r>
-      <w:proofErr w:type="spellStart"/>
-      <w:r>
-        <w:rPr>
-          <w:b/>
-          <w:bCs/>
-        </w:rPr>
-        <w:t>register</w:t>
-      </w:r>
-      <w:proofErr w:type="spellEnd"/>
-      <w:r>
-        <w:t xml:space="preserve"> para crear un usuario, internamente habrá un controlador el cual recibirá esa solicitud y la </w:t>
-      </w:r>
-      <w:r>
-        <w:t>enviará</w:t>
-      </w:r>
-      <w:r>
-        <w:t xml:space="preserve"> </w:t>
-      </w:r>
-      <w:r>
-        <w:t xml:space="preserve">al </w:t>
-      </w:r>
-      <w:proofErr w:type="spellStart"/>
-      <w:r>
-        <w:rPr>
-          <w:b/>
-          <w:bCs/>
-        </w:rPr>
-        <w:t>AuthService</w:t>
-      </w:r>
-      <w:proofErr w:type="spellEnd"/>
-      <w:r>
-        <w:rPr>
-          <w:b/>
-          <w:bCs/>
-        </w:rPr>
-        <w:t xml:space="preserve"> </w:t>
-      </w:r>
-      <w:r>
-        <w:t xml:space="preserve">donde se empieza a evidenciar la presencia del uso del patrón </w:t>
-      </w:r>
-      <w:proofErr w:type="spellStart"/>
-      <w:r>
-        <w:rPr>
-          <w:b/>
-          <w:bCs/>
-        </w:rPr>
-        <w:t>adapter</w:t>
-      </w:r>
-      <w:proofErr w:type="spellEnd"/>
-      <w:r>
-        <w:rPr>
-          <w:b/>
-          <w:bCs/>
-        </w:rPr>
-        <w:t xml:space="preserve">. </w:t>
-      </w:r>
-      <w:r>
-        <w:t>Finalmente, la API, nos devolverá nuevamente los datos del usuario sin su contraseña validando así que la creación del usuario se hizo correctamente:</w:t>
-      </w:r>
-    </w:p>
-    <w:p>
-      <w:pPr>
         <w:jc w:val="center"/>
       </w:pPr>
       <w:r>
-        <w:lastRenderedPageBreak/>
+        <w:rPr>
+          <w:noProof/>
+        </w:rPr>
         <w:drawing>
-          <wp:inline distT="0" distB="0" distL="0" distR="0" wp14:anchorId="064F52F7" wp14:editId="5168AF42">
-            <wp:extent cx="5943600" cy="3516630"/>
-            <wp:effectExtent l="0" t="0" r="0" b="7620"/>
-            <wp:docPr id="33" name="Imagen 33"/>
+          <wp:inline distT="0" distB="0" distL="0" distR="0" wp14:anchorId="6E0BFF47" wp14:editId="6104B3A6">
+            <wp:extent cx="4879792" cy="2257425"/>
+            <wp:effectExtent l="0" t="0" r="0" b="0"/>
+            <wp:docPr id="20" name="Imagen 20"/>
             <wp:cNvGraphicFramePr>
               <a:graphicFrameLocks xmlns:a="http://schemas.openxmlformats.org/drawingml/2006/main" noChangeAspect="1"/>
             </wp:cNvGraphicFramePr>
@@ -7278,7 +6791,7 @@
                   <pic:spPr>
                     <a:xfrm>
                       <a:off x="0" y="0"/>
-                      <a:ext cx="5943600" cy="3516630"/>
+                      <a:ext cx="4884419" cy="2259566"/>
                     </a:xfrm>
                     <a:prstGeom prst="rect">
                       <a:avLst/>
@@ -7294,21 +6807,30 @@
     <w:p>
       <w:pPr>
         <w:jc w:val="left"/>
-      </w:pPr>
-      <w:r>
-        <w:t>Posteriormente, se comprueba en la base de datos que el usuario ya se haya creado correctamente:</w:t>
-      </w:r>
-    </w:p>
-    <w:p>
-      <w:pPr>
-        <w:jc w:val="left"/>
-      </w:pPr>
-      <w:r>
+        <w:rPr>
+          <w:b/>
+          <w:bCs/>
+        </w:rPr>
+      </w:pPr>
+      <w:r>
+        <w:rPr>
+          <w:b/>
+          <w:bCs/>
+        </w:rPr>
+        <w:t>Concrete Builder</w:t>
+      </w:r>
+    </w:p>
+    <w:p>
+      <w:r>
+        <w:rPr>
+          <w:noProof/>
+        </w:rPr>
+        <w:lastRenderedPageBreak/>
         <w:drawing>
-          <wp:inline distT="0" distB="0" distL="0" distR="0" wp14:anchorId="23DA54E8" wp14:editId="710E2647">
-            <wp:extent cx="5943600" cy="544830"/>
-            <wp:effectExtent l="0" t="0" r="0" b="7620"/>
-            <wp:docPr id="34" name="Imagen 34"/>
+          <wp:inline distT="0" distB="0" distL="0" distR="0" wp14:anchorId="5B52A8C3" wp14:editId="25DA4955">
+            <wp:extent cx="5943600" cy="2004695"/>
+            <wp:effectExtent l="0" t="0" r="0" b="0"/>
+            <wp:docPr id="22" name="Imagen 22"/>
             <wp:cNvGraphicFramePr>
               <a:graphicFrameLocks xmlns:a="http://schemas.openxmlformats.org/drawingml/2006/main" noChangeAspect="1"/>
             </wp:cNvGraphicFramePr>
@@ -7328,6 +6850,1198 @@
                   <pic:spPr>
                     <a:xfrm>
                       <a:off x="0" y="0"/>
+                      <a:ext cx="5943600" cy="2004695"/>
+                    </a:xfrm>
+                    <a:prstGeom prst="rect">
+                      <a:avLst/>
+                    </a:prstGeom>
+                  </pic:spPr>
+                </pic:pic>
+              </a:graphicData>
+            </a:graphic>
+          </wp:inline>
+        </w:drawing>
+      </w:r>
+    </w:p>
+    <w:p>
+      <w:pPr>
+        <w:jc w:val="center"/>
+      </w:pPr>
+      <w:r>
+        <w:rPr>
+          <w:noProof/>
+        </w:rPr>
+        <w:drawing>
+          <wp:inline distT="0" distB="0" distL="0" distR="0" wp14:anchorId="03986789" wp14:editId="4BA28EE2">
+            <wp:extent cx="4676775" cy="851913"/>
+            <wp:effectExtent l="0" t="0" r="0" b="5715"/>
+            <wp:docPr id="23" name="Imagen 23"/>
+            <wp:cNvGraphicFramePr>
+              <a:graphicFrameLocks xmlns:a="http://schemas.openxmlformats.org/drawingml/2006/main" noChangeAspect="1"/>
+            </wp:cNvGraphicFramePr>
+            <a:graphic xmlns:a="http://schemas.openxmlformats.org/drawingml/2006/main">
+              <a:graphicData uri="http://schemas.openxmlformats.org/drawingml/2006/picture">
+                <pic:pic xmlns:pic="http://schemas.openxmlformats.org/drawingml/2006/picture">
+                  <pic:nvPicPr>
+                    <pic:cNvPr id="1" name=""/>
+                    <pic:cNvPicPr/>
+                  </pic:nvPicPr>
+                  <pic:blipFill>
+                    <a:blip r:embed="rId40"/>
+                    <a:stretch>
+                      <a:fillRect/>
+                    </a:stretch>
+                  </pic:blipFill>
+                  <pic:spPr>
+                    <a:xfrm>
+                      <a:off x="0" y="0"/>
+                      <a:ext cx="4694262" cy="855098"/>
+                    </a:xfrm>
+                    <a:prstGeom prst="rect">
+                      <a:avLst/>
+                    </a:prstGeom>
+                  </pic:spPr>
+                </pic:pic>
+              </a:graphicData>
+            </a:graphic>
+          </wp:inline>
+        </w:drawing>
+      </w:r>
+    </w:p>
+    <w:p>
+      <w:pPr>
+        <w:jc w:val="center"/>
+      </w:pPr>
+      <w:r>
+        <w:rPr>
+          <w:noProof/>
+        </w:rPr>
+        <w:drawing>
+          <wp:inline distT="0" distB="0" distL="0" distR="0" wp14:anchorId="6409BE82" wp14:editId="14230D7D">
+            <wp:extent cx="4498141" cy="3019425"/>
+            <wp:effectExtent l="0" t="0" r="0" b="0"/>
+            <wp:docPr id="24" name="Imagen 24"/>
+            <wp:cNvGraphicFramePr>
+              <a:graphicFrameLocks xmlns:a="http://schemas.openxmlformats.org/drawingml/2006/main" noChangeAspect="1"/>
+            </wp:cNvGraphicFramePr>
+            <a:graphic xmlns:a="http://schemas.openxmlformats.org/drawingml/2006/main">
+              <a:graphicData uri="http://schemas.openxmlformats.org/drawingml/2006/picture">
+                <pic:pic xmlns:pic="http://schemas.openxmlformats.org/drawingml/2006/picture">
+                  <pic:nvPicPr>
+                    <pic:cNvPr id="1" name=""/>
+                    <pic:cNvPicPr/>
+                  </pic:nvPicPr>
+                  <pic:blipFill>
+                    <a:blip r:embed="rId41"/>
+                    <a:stretch>
+                      <a:fillRect/>
+                    </a:stretch>
+                  </pic:blipFill>
+                  <pic:spPr>
+                    <a:xfrm>
+                      <a:off x="0" y="0"/>
+                      <a:ext cx="4502754" cy="3022522"/>
+                    </a:xfrm>
+                    <a:prstGeom prst="rect">
+                      <a:avLst/>
+                    </a:prstGeom>
+                  </pic:spPr>
+                </pic:pic>
+              </a:graphicData>
+            </a:graphic>
+          </wp:inline>
+        </w:drawing>
+      </w:r>
+    </w:p>
+    <w:p>
+      <w:pPr>
+        <w:pStyle w:val="Ttulo4"/>
+      </w:pPr>
+      <w:r>
+        <w:t xml:space="preserve">Explicación y </w:t>
+      </w:r>
+      <w:r>
+        <w:t>Prueba de que Funciona</w:t>
+      </w:r>
+    </w:p>
+    <w:p>
+      <w:pPr>
+        <w:pStyle w:val="Ttulo5"/>
+      </w:pPr>
+      <w:r>
+        <w:t>JwtService (Client</w:t>
+      </w:r>
+      <w:r>
+        <w:rPr>
+          <w:lang w:val="en-US"/>
+        </w:rPr>
+        <w:t>/</w:t>
+      </w:r>
+      <w:proofErr w:type="gramStart"/>
+      <w:r>
+        <w:rPr>
+          <w:lang w:val="en-US"/>
+        </w:rPr>
+        <w:t>Director</w:t>
+      </w:r>
+      <w:proofErr w:type="gramEnd"/>
+      <w:r>
+        <w:t>)</w:t>
+      </w:r>
+    </w:p>
+    <w:p>
+      <w:r>
+        <w:t xml:space="preserve">La clase </w:t>
+      </w:r>
+      <w:r>
+        <w:rPr>
+          <w:b/>
+          <w:bCs/>
+        </w:rPr>
+        <w:t>JwtService</w:t>
+      </w:r>
+      <w:r>
+        <w:t xml:space="preserve"> actúa como cliente y director contextual, ya que define los pasos de construcción del token JWT. </w:t>
+      </w:r>
+    </w:p>
+    <w:p>
+      <w:pPr>
+        <w:pStyle w:val="Ttulo5"/>
+      </w:pPr>
+      <w:r>
+        <w:lastRenderedPageBreak/>
+        <w:t>JwtBuilder (Interfaz)</w:t>
+      </w:r>
+    </w:p>
+    <w:p>
+      <w:r>
+        <w:rPr>
+          <w:b/>
+          <w:bCs/>
+        </w:rPr>
+        <w:t>JwtBuilder</w:t>
+      </w:r>
+      <w:r>
+        <w:t xml:space="preserve"> representa el Builder, donde se</w:t>
+      </w:r>
+      <w:r>
+        <w:t xml:space="preserve"> define el contrato de métodos que deberán utilizar los Builders concretos posteriormente, entre ellos los utilizados como </w:t>
+      </w:r>
+      <w:proofErr w:type="spellStart"/>
+      <w:proofErr w:type="gramStart"/>
+      <w:r>
+        <w:rPr>
+          <w:b/>
+          <w:bCs/>
+        </w:rPr>
+        <w:t>subject</w:t>
+      </w:r>
+      <w:proofErr w:type="spellEnd"/>
+      <w:r>
+        <w:rPr>
+          <w:b/>
+          <w:bCs/>
+        </w:rPr>
+        <w:t>(</w:t>
+      </w:r>
+      <w:proofErr w:type="gramEnd"/>
+      <w:r>
+        <w:rPr>
+          <w:b/>
+          <w:bCs/>
+        </w:rPr>
+        <w:t xml:space="preserve">), </w:t>
+      </w:r>
+      <w:proofErr w:type="spellStart"/>
+      <w:r>
+        <w:rPr>
+          <w:b/>
+          <w:bCs/>
+        </w:rPr>
+        <w:t>claim</w:t>
+      </w:r>
+      <w:proofErr w:type="spellEnd"/>
+      <w:r>
+        <w:rPr>
+          <w:b/>
+          <w:bCs/>
+        </w:rPr>
+        <w:t xml:space="preserve">(), </w:t>
+      </w:r>
+      <w:proofErr w:type="spellStart"/>
+      <w:r>
+        <w:rPr>
+          <w:b/>
+          <w:bCs/>
+        </w:rPr>
+        <w:t>issuedAt</w:t>
+      </w:r>
+      <w:proofErr w:type="spellEnd"/>
+      <w:r>
+        <w:rPr>
+          <w:b/>
+          <w:bCs/>
+        </w:rPr>
+        <w:t xml:space="preserve">(), </w:t>
+      </w:r>
+      <w:proofErr w:type="spellStart"/>
+      <w:r>
+        <w:rPr>
+          <w:b/>
+          <w:bCs/>
+        </w:rPr>
+        <w:t>expiration</w:t>
+      </w:r>
+      <w:proofErr w:type="spellEnd"/>
+      <w:r>
+        <w:rPr>
+          <w:b/>
+          <w:bCs/>
+        </w:rPr>
+        <w:t xml:space="preserve">(), </w:t>
+      </w:r>
+      <w:proofErr w:type="spellStart"/>
+      <w:r>
+        <w:rPr>
+          <w:b/>
+          <w:bCs/>
+        </w:rPr>
+        <w:t>signWith</w:t>
+      </w:r>
+      <w:proofErr w:type="spellEnd"/>
+      <w:r>
+        <w:rPr>
+          <w:b/>
+          <w:bCs/>
+        </w:rPr>
+        <w:t xml:space="preserve">() </w:t>
+      </w:r>
+      <w:r>
+        <w:t>y</w:t>
+      </w:r>
+      <w:r>
+        <w:rPr>
+          <w:b/>
+          <w:bCs/>
+        </w:rPr>
+        <w:t xml:space="preserve"> compact().</w:t>
+      </w:r>
+    </w:p>
+    <w:p>
+      <w:pPr>
+        <w:pStyle w:val="Ttulo5"/>
+      </w:pPr>
+      <w:r>
+        <w:t>DefaultJwtBuilder (Concrete Builder)</w:t>
+      </w:r>
+    </w:p>
+    <w:p>
+      <w:r>
+        <w:rPr>
+          <w:b/>
+          <w:bCs/>
+        </w:rPr>
+        <w:t>DefaultJwtBuilder</w:t>
+      </w:r>
+      <w:r>
+        <w:t xml:space="preserve">, proporcionado internamente por la librería </w:t>
+      </w:r>
+      <w:r>
+        <w:rPr>
+          <w:b/>
+          <w:bCs/>
+        </w:rPr>
+        <w:t>JJWT</w:t>
+      </w:r>
+      <w:r>
+        <w:t xml:space="preserve">, es el Builder concreto donde se implementa la interfaz </w:t>
+      </w:r>
+      <w:r>
+        <w:rPr>
+          <w:b/>
+          <w:bCs/>
+        </w:rPr>
+        <w:t xml:space="preserve">JwtBuilder </w:t>
+      </w:r>
+      <w:r>
+        <w:t xml:space="preserve">y se asigna comportamiento a sus métodos. Finalmente, el método </w:t>
+      </w:r>
+      <w:proofErr w:type="gramStart"/>
+      <w:r>
+        <w:rPr>
+          <w:b/>
+          <w:bCs/>
+        </w:rPr>
+        <w:t>compact(</w:t>
+      </w:r>
+      <w:proofErr w:type="gramEnd"/>
+      <w:r>
+        <w:rPr>
+          <w:b/>
+          <w:bCs/>
+        </w:rPr>
+        <w:t>)</w:t>
+      </w:r>
+      <w:r>
+        <w:t xml:space="preserve"> genera el producto terminado: un token JWT firmado en formato </w:t>
+      </w:r>
+      <w:r>
+        <w:rPr>
+          <w:b/>
+          <w:bCs/>
+        </w:rPr>
+        <w:t>String</w:t>
+      </w:r>
+      <w:r>
+        <w:t>.</w:t>
+      </w:r>
+    </w:p>
+    <w:p>
+      <w:pPr>
+        <w:pStyle w:val="Ttulo5"/>
+      </w:pPr>
+      <w:r>
+        <w:t>Funcionamiento</w:t>
+      </w:r>
+    </w:p>
+    <w:p>
+      <w:r>
+        <w:t>Cuando nosotros iniciamos sesión internamente con un usuario</w:t>
+      </w:r>
+      <w:r>
+        <w:t>, la API REST nos devuelve como respuesta un token JWT para gestionar la sesión del usuario como mensaje de éxito. A continuación se muestra un ejemplo:</w:t>
+      </w:r>
+    </w:p>
+    <w:p>
+      <w:r>
+        <w:rPr>
+          <w:noProof/>
+        </w:rPr>
+        <w:drawing>
+          <wp:inline distT="0" distB="0" distL="0" distR="0" wp14:anchorId="009FAAB2" wp14:editId="7118C825">
+            <wp:extent cx="5943600" cy="2818765"/>
+            <wp:effectExtent l="0" t="0" r="0" b="635"/>
+            <wp:docPr id="27" name="Imagen 27"/>
+            <wp:cNvGraphicFramePr>
+              <a:graphicFrameLocks xmlns:a="http://schemas.openxmlformats.org/drawingml/2006/main" noChangeAspect="1"/>
+            </wp:cNvGraphicFramePr>
+            <a:graphic xmlns:a="http://schemas.openxmlformats.org/drawingml/2006/main">
+              <a:graphicData uri="http://schemas.openxmlformats.org/drawingml/2006/picture">
+                <pic:pic xmlns:pic="http://schemas.openxmlformats.org/drawingml/2006/picture">
+                  <pic:nvPicPr>
+                    <pic:cNvPr id="1" name=""/>
+                    <pic:cNvPicPr/>
+                  </pic:nvPicPr>
+                  <pic:blipFill>
+                    <a:blip r:embed="rId42"/>
+                    <a:stretch>
+                      <a:fillRect/>
+                    </a:stretch>
+                  </pic:blipFill>
+                  <pic:spPr>
+                    <a:xfrm>
+                      <a:off x="0" y="0"/>
+                      <a:ext cx="5943600" cy="2818765"/>
+                    </a:xfrm>
+                    <a:prstGeom prst="rect">
+                      <a:avLst/>
+                    </a:prstGeom>
+                  </pic:spPr>
+                </pic:pic>
+              </a:graphicData>
+            </a:graphic>
+          </wp:inline>
+        </w:drawing>
+      </w:r>
+    </w:p>
+    <w:p>
+      <w:r>
+        <w:t xml:space="preserve">Este token fue generado mediante un flujo interno de validación y verificación de credenciales donde posteriormente llego al </w:t>
+      </w:r>
+      <w:r>
+        <w:rPr>
+          <w:b/>
+          <w:bCs/>
+        </w:rPr>
+        <w:t>JwtService</w:t>
+      </w:r>
+      <w:r>
+        <w:t xml:space="preserve"> donde se gestionó la creación del token por medio de la librería </w:t>
+      </w:r>
+      <w:r>
+        <w:rPr>
+          <w:b/>
+          <w:bCs/>
+        </w:rPr>
+        <w:t xml:space="preserve">JJWT. </w:t>
+      </w:r>
+      <w:r>
+        <w:t>Utilizando el concepto de patrón Builder.</w:t>
+      </w:r>
+    </w:p>
+    <w:p>
+      <w:pPr>
+        <w:pStyle w:val="Ttulo2"/>
+      </w:pPr>
+      <w:r>
+        <w:lastRenderedPageBreak/>
+        <w:t>Estructurales</w:t>
+      </w:r>
+    </w:p>
+    <w:p>
+      <w:pPr>
+        <w:pStyle w:val="Ttulo3"/>
+      </w:pPr>
+      <w:r>
+        <w:t xml:space="preserve">Aplicación del Patrón </w:t>
+      </w:r>
+      <w:proofErr w:type="spellStart"/>
+      <w:r>
+        <w:t>Adapter</w:t>
+      </w:r>
+      <w:proofErr w:type="spellEnd"/>
+    </w:p>
+    <w:p>
+      <w:pPr>
+        <w:pStyle w:val="Ttulo4"/>
+      </w:pPr>
+      <w:r>
+        <w:t>Como está colaborando este Patrón al Proyecto</w:t>
+      </w:r>
+    </w:p>
+    <w:p>
+      <w:r>
+        <w:t xml:space="preserve">En nuestro proyecto, el patrón </w:t>
+      </w:r>
+      <w:proofErr w:type="spellStart"/>
+      <w:r>
+        <w:rPr>
+          <w:b/>
+          <w:bCs/>
+        </w:rPr>
+        <w:t>Adapter</w:t>
+      </w:r>
+      <w:proofErr w:type="spellEnd"/>
+      <w:r>
+        <w:t xml:space="preserve"> está siendo utilizado como parte de la </w:t>
+      </w:r>
+      <w:r>
+        <w:rPr>
+          <w:b/>
+          <w:bCs/>
+        </w:rPr>
+        <w:t>arquitectura hexagonal</w:t>
+      </w:r>
+      <w:r>
+        <w:t xml:space="preserve"> para permitir que los diferentes componentes de la aplicación puedan comunicarse sin depender directamente de implementaciones específicas. Para evidenciar su funcionamiento, tomaremos como ejemplo la creación de usuarios, donde la capa de aplicación trabaja mediante el puerto </w:t>
+      </w:r>
+      <w:proofErr w:type="spellStart"/>
+      <w:r>
+        <w:rPr>
+          <w:b/>
+          <w:bCs/>
+        </w:rPr>
+        <w:t>UserRepository</w:t>
+      </w:r>
+      <w:proofErr w:type="spellEnd"/>
+      <w:r>
+        <w:t xml:space="preserve">, mientras que en la infraestructura se encuentra </w:t>
+      </w:r>
+      <w:proofErr w:type="spellStart"/>
+      <w:r>
+        <w:rPr>
+          <w:b/>
+          <w:bCs/>
+        </w:rPr>
+        <w:t>UserAdapterPersistence</w:t>
+      </w:r>
+      <w:proofErr w:type="spellEnd"/>
+      <w:r>
+        <w:t xml:space="preserve">, encargado de adaptar este contrato a la implementación de persistencia utilizada con </w:t>
+      </w:r>
+      <w:r>
+        <w:rPr>
+          <w:b/>
+          <w:bCs/>
+        </w:rPr>
+        <w:t>JPA</w:t>
+      </w:r>
+      <w:r>
+        <w:t xml:space="preserve"> e </w:t>
+      </w:r>
+      <w:proofErr w:type="spellStart"/>
+      <w:r>
+        <w:rPr>
+          <w:b/>
+          <w:bCs/>
+        </w:rPr>
+        <w:t>Hibernate</w:t>
+      </w:r>
+      <w:proofErr w:type="spellEnd"/>
+      <w:r>
+        <w:t>.</w:t>
+      </w:r>
+    </w:p>
+    <w:p>
+      <w:r>
+        <w:t xml:space="preserve">Este patrón aporta principalmente desacoplamiento entre la lógica de aplicación y la infraestructura, ya que </w:t>
+      </w:r>
+      <w:proofErr w:type="spellStart"/>
+      <w:r>
+        <w:rPr>
+          <w:b/>
+          <w:bCs/>
+        </w:rPr>
+        <w:t>AuthService</w:t>
+      </w:r>
+      <w:proofErr w:type="spellEnd"/>
+      <w:r>
+        <w:t xml:space="preserve"> no necesita conocer cómo se almacenan los usuarios ni trabajar directamente con JPA. El adaptador recibe las operaciones definidas por el puerto y las traduce hacia </w:t>
+      </w:r>
+      <w:proofErr w:type="spellStart"/>
+      <w:r>
+        <w:rPr>
+          <w:b/>
+          <w:bCs/>
+        </w:rPr>
+        <w:t>UserDAO</w:t>
+      </w:r>
+      <w:proofErr w:type="spellEnd"/>
+      <w:r>
+        <w:t xml:space="preserve"> y las entidades de persistencia, permitiendo que la aplicación mantenga su lógica independiente de la tecnología utilizada para almacenar la información. Además, este mismo enfoque puede aplicarse en las demás funcionalidades del proyecto que requieren comunicación entre la aplicación y componentes externos.</w:t>
+      </w:r>
+    </w:p>
+    <w:p>
+      <w:pPr>
+        <w:pStyle w:val="Ttulo4"/>
+      </w:pPr>
+      <w:r>
+        <w:lastRenderedPageBreak/>
+        <w:t>Diagrama de Clase UML</w:t>
+      </w:r>
+    </w:p>
+    <w:p>
+      <w:pPr>
+        <w:jc w:val="center"/>
+      </w:pPr>
+      <w:r>
+        <w:rPr>
+          <w:noProof/>
+        </w:rPr>
+        <w:drawing>
+          <wp:inline distT="0" distB="0" distL="0" distR="0" wp14:anchorId="6FE64FE9" wp14:editId="0E01C80D">
+            <wp:extent cx="2225615" cy="4064462"/>
+            <wp:effectExtent l="0" t="0" r="3810" b="0"/>
+            <wp:docPr id="28" name="Imagen 28"/>
+            <wp:cNvGraphicFramePr>
+              <a:graphicFrameLocks xmlns:a="http://schemas.openxmlformats.org/drawingml/2006/main" noChangeAspect="1"/>
+            </wp:cNvGraphicFramePr>
+            <a:graphic xmlns:a="http://schemas.openxmlformats.org/drawingml/2006/main">
+              <a:graphicData uri="http://schemas.openxmlformats.org/drawingml/2006/picture">
+                <pic:pic xmlns:pic="http://schemas.openxmlformats.org/drawingml/2006/picture">
+                  <pic:nvPicPr>
+                    <pic:cNvPr id="1" name=""/>
+                    <pic:cNvPicPr/>
+                  </pic:nvPicPr>
+                  <pic:blipFill>
+                    <a:blip r:embed="rId43"/>
+                    <a:stretch>
+                      <a:fillRect/>
+                    </a:stretch>
+                  </pic:blipFill>
+                  <pic:spPr>
+                    <a:xfrm>
+                      <a:off x="0" y="0"/>
+                      <a:ext cx="2231095" cy="4074470"/>
+                    </a:xfrm>
+                    <a:prstGeom prst="rect">
+                      <a:avLst/>
+                    </a:prstGeom>
+                  </pic:spPr>
+                </pic:pic>
+              </a:graphicData>
+            </a:graphic>
+          </wp:inline>
+        </w:drawing>
+      </w:r>
+    </w:p>
+    <w:p>
+      <w:pPr>
+        <w:pStyle w:val="Ttulo4"/>
+      </w:pPr>
+      <w:r>
+        <w:lastRenderedPageBreak/>
+        <w:t>Código</w:t>
+      </w:r>
+    </w:p>
+    <w:p>
+      <w:r>
+        <w:rPr>
+          <w:noProof/>
+        </w:rPr>
+        <w:drawing>
+          <wp:inline distT="0" distB="0" distL="0" distR="0" wp14:anchorId="4F2736A4" wp14:editId="1FC4987B">
+            <wp:extent cx="5943600" cy="3430270"/>
+            <wp:effectExtent l="0" t="0" r="0" b="0"/>
+            <wp:docPr id="29" name="Imagen 29"/>
+            <wp:cNvGraphicFramePr>
+              <a:graphicFrameLocks xmlns:a="http://schemas.openxmlformats.org/drawingml/2006/main" noChangeAspect="1"/>
+            </wp:cNvGraphicFramePr>
+            <a:graphic xmlns:a="http://schemas.openxmlformats.org/drawingml/2006/main">
+              <a:graphicData uri="http://schemas.openxmlformats.org/drawingml/2006/picture">
+                <pic:pic xmlns:pic="http://schemas.openxmlformats.org/drawingml/2006/picture">
+                  <pic:nvPicPr>
+                    <pic:cNvPr id="1" name=""/>
+                    <pic:cNvPicPr/>
+                  </pic:nvPicPr>
+                  <pic:blipFill>
+                    <a:blip r:embed="rId44"/>
+                    <a:stretch>
+                      <a:fillRect/>
+                    </a:stretch>
+                  </pic:blipFill>
+                  <pic:spPr>
+                    <a:xfrm>
+                      <a:off x="0" y="0"/>
+                      <a:ext cx="5943600" cy="3430270"/>
+                    </a:xfrm>
+                    <a:prstGeom prst="rect">
+                      <a:avLst/>
+                    </a:prstGeom>
+                  </pic:spPr>
+                </pic:pic>
+              </a:graphicData>
+            </a:graphic>
+          </wp:inline>
+        </w:drawing>
+      </w:r>
+    </w:p>
+    <w:p>
+      <w:r>
+        <w:rPr>
+          <w:noProof/>
+        </w:rPr>
+        <w:drawing>
+          <wp:inline distT="0" distB="0" distL="0" distR="0" wp14:anchorId="340030D1" wp14:editId="065D87C3">
+            <wp:extent cx="5449060" cy="1381318"/>
+            <wp:effectExtent l="0" t="0" r="0" b="9525"/>
+            <wp:docPr id="30" name="Imagen 30"/>
+            <wp:cNvGraphicFramePr>
+              <a:graphicFrameLocks xmlns:a="http://schemas.openxmlformats.org/drawingml/2006/main" noChangeAspect="1"/>
+            </wp:cNvGraphicFramePr>
+            <a:graphic xmlns:a="http://schemas.openxmlformats.org/drawingml/2006/main">
+              <a:graphicData uri="http://schemas.openxmlformats.org/drawingml/2006/picture">
+                <pic:pic xmlns:pic="http://schemas.openxmlformats.org/drawingml/2006/picture">
+                  <pic:nvPicPr>
+                    <pic:cNvPr id="1" name=""/>
+                    <pic:cNvPicPr/>
+                  </pic:nvPicPr>
+                  <pic:blipFill>
+                    <a:blip r:embed="rId45"/>
+                    <a:stretch>
+                      <a:fillRect/>
+                    </a:stretch>
+                  </pic:blipFill>
+                  <pic:spPr>
+                    <a:xfrm>
+                      <a:off x="0" y="0"/>
+                      <a:ext cx="5449060" cy="1381318"/>
+                    </a:xfrm>
+                    <a:prstGeom prst="rect">
+                      <a:avLst/>
+                    </a:prstGeom>
+                  </pic:spPr>
+                </pic:pic>
+              </a:graphicData>
+            </a:graphic>
+          </wp:inline>
+        </w:drawing>
+      </w:r>
+    </w:p>
+    <w:p>
+      <w:r>
+        <w:rPr>
+          <w:noProof/>
+        </w:rPr>
+        <w:lastRenderedPageBreak/>
+        <w:drawing>
+          <wp:inline distT="0" distB="0" distL="0" distR="0" wp14:anchorId="188B8AA5" wp14:editId="2524FEB4">
+            <wp:extent cx="5943600" cy="3407410"/>
+            <wp:effectExtent l="0" t="0" r="0" b="2540"/>
+            <wp:docPr id="31" name="Imagen 31"/>
+            <wp:cNvGraphicFramePr>
+              <a:graphicFrameLocks xmlns:a="http://schemas.openxmlformats.org/drawingml/2006/main" noChangeAspect="1"/>
+            </wp:cNvGraphicFramePr>
+            <a:graphic xmlns:a="http://schemas.openxmlformats.org/drawingml/2006/main">
+              <a:graphicData uri="http://schemas.openxmlformats.org/drawingml/2006/picture">
+                <pic:pic xmlns:pic="http://schemas.openxmlformats.org/drawingml/2006/picture">
+                  <pic:nvPicPr>
+                    <pic:cNvPr id="1" name=""/>
+                    <pic:cNvPicPr/>
+                  </pic:nvPicPr>
+                  <pic:blipFill>
+                    <a:blip r:embed="rId46"/>
+                    <a:stretch>
+                      <a:fillRect/>
+                    </a:stretch>
+                  </pic:blipFill>
+                  <pic:spPr>
+                    <a:xfrm>
+                      <a:off x="0" y="0"/>
+                      <a:ext cx="5943600" cy="3407410"/>
+                    </a:xfrm>
+                    <a:prstGeom prst="rect">
+                      <a:avLst/>
+                    </a:prstGeom>
+                  </pic:spPr>
+                </pic:pic>
+              </a:graphicData>
+            </a:graphic>
+          </wp:inline>
+        </w:drawing>
+      </w:r>
+    </w:p>
+    <w:p>
+      <w:r>
+        <w:rPr>
+          <w:noProof/>
+        </w:rPr>
+        <w:drawing>
+          <wp:inline distT="0" distB="0" distL="0" distR="0" wp14:anchorId="543D9985" wp14:editId="07597DFA">
+            <wp:extent cx="5943600" cy="1938020"/>
+            <wp:effectExtent l="0" t="0" r="0" b="5080"/>
+            <wp:docPr id="32" name="Imagen 32"/>
+            <wp:cNvGraphicFramePr>
+              <a:graphicFrameLocks xmlns:a="http://schemas.openxmlformats.org/drawingml/2006/main" noChangeAspect="1"/>
+            </wp:cNvGraphicFramePr>
+            <a:graphic xmlns:a="http://schemas.openxmlformats.org/drawingml/2006/main">
+              <a:graphicData uri="http://schemas.openxmlformats.org/drawingml/2006/picture">
+                <pic:pic xmlns:pic="http://schemas.openxmlformats.org/drawingml/2006/picture">
+                  <pic:nvPicPr>
+                    <pic:cNvPr id="1" name=""/>
+                    <pic:cNvPicPr/>
+                  </pic:nvPicPr>
+                  <pic:blipFill>
+                    <a:blip r:embed="rId47"/>
+                    <a:stretch>
+                      <a:fillRect/>
+                    </a:stretch>
+                  </pic:blipFill>
+                  <pic:spPr>
+                    <a:xfrm>
+                      <a:off x="0" y="0"/>
+                      <a:ext cx="5943600" cy="1938020"/>
+                    </a:xfrm>
+                    <a:prstGeom prst="rect">
+                      <a:avLst/>
+                    </a:prstGeom>
+                  </pic:spPr>
+                </pic:pic>
+              </a:graphicData>
+            </a:graphic>
+          </wp:inline>
+        </w:drawing>
+      </w:r>
+    </w:p>
+    <w:p>
+      <w:pPr>
+        <w:pStyle w:val="Ttulo4"/>
+      </w:pPr>
+      <w:r>
+        <w:t>Explicación y Prueba de que Funciona</w:t>
+      </w:r>
+    </w:p>
+    <w:p>
+      <w:pPr>
+        <w:pStyle w:val="Ttulo5"/>
+      </w:pPr>
+      <w:proofErr w:type="spellStart"/>
+      <w:r>
+        <w:t>AuthService</w:t>
+      </w:r>
+      <w:proofErr w:type="spellEnd"/>
+      <w:r>
+        <w:t xml:space="preserve"> (Cliente)</w:t>
+      </w:r>
+    </w:p>
+    <w:p>
+      <w:r>
+        <w:t xml:space="preserve">Es el componente encargado de </w:t>
+      </w:r>
+      <w:r>
+        <w:rPr>
+          <w:b/>
+          <w:bCs/>
+        </w:rPr>
+        <w:t>orquestar el registro del usuario</w:t>
+      </w:r>
+      <w:r>
+        <w:t xml:space="preserve"> desde la capa de aplicación. Para guardar el usuario, utiliza </w:t>
+      </w:r>
+      <w:proofErr w:type="spellStart"/>
+      <w:r>
+        <w:rPr>
+          <w:b/>
+          <w:bCs/>
+        </w:rPr>
+        <w:t>UserRepository</w:t>
+      </w:r>
+      <w:proofErr w:type="spellEnd"/>
+      <w:r>
+        <w:t xml:space="preserve"> sin conocer directamente la implementación encargada de la persistencia.</w:t>
+      </w:r>
+    </w:p>
+    <w:p>
+      <w:pPr>
+        <w:pStyle w:val="Ttulo5"/>
+      </w:pPr>
+      <w:proofErr w:type="spellStart"/>
+      <w:r>
+        <w:lastRenderedPageBreak/>
+        <w:t>UserRepository</w:t>
+      </w:r>
+      <w:proofErr w:type="spellEnd"/>
+      <w:r>
+        <w:t xml:space="preserve"> (Interfaz)</w:t>
+      </w:r>
+    </w:p>
+    <w:p>
+      <w:r>
+        <w:t xml:space="preserve">Es el </w:t>
+      </w:r>
+      <w:r>
+        <w:rPr>
+          <w:rStyle w:val="Textoennegrita"/>
+        </w:rPr>
+        <w:t>puerto de salida</w:t>
+      </w:r>
+      <w:r>
+        <w:t xml:space="preserve"> que define las operaciones que necesita la aplicación para trabajar con los usuarios. En este caso, establece el contrato para guardar y consultar usuarios, sin depender de JPA o de la base de datos.</w:t>
+      </w:r>
+    </w:p>
+    <w:p>
+      <w:pPr>
+        <w:pStyle w:val="Ttulo5"/>
+      </w:pPr>
+      <w:proofErr w:type="spellStart"/>
+      <w:r>
+        <w:t>UserAdapterPersistence</w:t>
+      </w:r>
+      <w:proofErr w:type="spellEnd"/>
+      <w:r>
+        <w:t xml:space="preserve"> (</w:t>
+      </w:r>
+      <w:proofErr w:type="spellStart"/>
+      <w:r>
+        <w:t>Adapter</w:t>
+      </w:r>
+      <w:proofErr w:type="spellEnd"/>
+      <w:r>
+        <w:t>)</w:t>
+      </w:r>
+    </w:p>
+    <w:p>
+      <w:r>
+        <w:t xml:space="preserve">Es el componente que implementa el puerto </w:t>
+      </w:r>
+      <w:proofErr w:type="spellStart"/>
+      <w:r>
+        <w:rPr>
+          <w:b/>
+          <w:bCs/>
+        </w:rPr>
+        <w:t>UserRepository</w:t>
+      </w:r>
+      <w:proofErr w:type="spellEnd"/>
+      <w:r>
+        <w:t xml:space="preserve"> y adapta sus operaciones hacia la infraestructura de persistencia. Recibe el </w:t>
+      </w:r>
+      <w:proofErr w:type="spellStart"/>
+      <w:r>
+        <w:rPr>
+          <w:b/>
+          <w:bCs/>
+        </w:rPr>
+        <w:t>User</w:t>
+      </w:r>
+      <w:proofErr w:type="spellEnd"/>
+      <w:r>
+        <w:t xml:space="preserve"> desde la aplicación, lo convierte mediante el </w:t>
+      </w:r>
+      <w:proofErr w:type="spellStart"/>
+      <w:r>
+        <w:rPr>
+          <w:b/>
+          <w:bCs/>
+        </w:rPr>
+        <w:t>mapper</w:t>
+      </w:r>
+      <w:proofErr w:type="spellEnd"/>
+      <w:r>
+        <w:t xml:space="preserve"> a </w:t>
+      </w:r>
+      <w:proofErr w:type="spellStart"/>
+      <w:r>
+        <w:rPr>
+          <w:b/>
+          <w:bCs/>
+        </w:rPr>
+        <w:t>UserEntity</w:t>
+      </w:r>
+      <w:proofErr w:type="spellEnd"/>
+      <w:r>
+        <w:t xml:space="preserve"> y utiliza </w:t>
+      </w:r>
+      <w:proofErr w:type="spellStart"/>
+      <w:r>
+        <w:rPr>
+          <w:b/>
+          <w:bCs/>
+        </w:rPr>
+        <w:t>UserDAO</w:t>
+      </w:r>
+      <w:proofErr w:type="spellEnd"/>
+      <w:r>
+        <w:t xml:space="preserve"> para realizar la operación en la base de datos.</w:t>
+      </w:r>
+    </w:p>
+    <w:p>
+      <w:pPr>
+        <w:pStyle w:val="Ttulo5"/>
+      </w:pPr>
+      <w:proofErr w:type="spellStart"/>
+      <w:r>
+        <w:t>UserDAO</w:t>
+      </w:r>
+      <w:proofErr w:type="spellEnd"/>
+      <w:r>
+        <w:t xml:space="preserve"> (</w:t>
+      </w:r>
+      <w:proofErr w:type="spellStart"/>
+      <w:r>
+        <w:t>Adaptee</w:t>
+      </w:r>
+      <w:proofErr w:type="spellEnd"/>
+      <w:r>
+        <w:t>)</w:t>
+      </w:r>
+    </w:p>
+    <w:p>
+      <w:r>
+        <w:t xml:space="preserve">Es el componente que proporciona las operaciones necesarias para comunicarse directamente con la base de datos mediante </w:t>
+      </w:r>
+      <w:r>
+        <w:rPr>
+          <w:b/>
+          <w:bCs/>
+        </w:rPr>
+        <w:t>JPA</w:t>
+      </w:r>
+      <w:r>
+        <w:t xml:space="preserve">. El </w:t>
+      </w:r>
+      <w:proofErr w:type="spellStart"/>
+      <w:r>
+        <w:rPr>
+          <w:b/>
+          <w:bCs/>
+        </w:rPr>
+        <w:t>UserAdapterPersistence</w:t>
+      </w:r>
+      <w:proofErr w:type="spellEnd"/>
+      <w:r>
+        <w:t xml:space="preserve"> utiliza este componente para ejecutar la persistencia del usuario.</w:t>
+      </w:r>
+    </w:p>
+    <w:p>
+      <w:pPr>
+        <w:pStyle w:val="Ttulo5"/>
+      </w:pPr>
+      <w:r>
+        <w:t>Funcionamiento</w:t>
+      </w:r>
+    </w:p>
+    <w:p>
+      <w:r>
+        <w:t xml:space="preserve">Cuando nosotros enviamos una petición a la API REST por medio del </w:t>
+      </w:r>
+      <w:proofErr w:type="spellStart"/>
+      <w:r>
+        <w:t>endpoint</w:t>
+      </w:r>
+      <w:proofErr w:type="spellEnd"/>
+      <w:r>
+        <w:t xml:space="preserve"> </w:t>
+      </w:r>
+      <w:r>
+        <w:rPr>
+          <w:b/>
+          <w:bCs/>
+        </w:rPr>
+        <w:t>/api/</w:t>
+      </w:r>
+      <w:proofErr w:type="spellStart"/>
+      <w:r>
+        <w:rPr>
+          <w:b/>
+          <w:bCs/>
+        </w:rPr>
+        <w:t>auth</w:t>
+      </w:r>
+      <w:proofErr w:type="spellEnd"/>
+      <w:r>
+        <w:rPr>
+          <w:b/>
+          <w:bCs/>
+        </w:rPr>
+        <w:t>/</w:t>
+      </w:r>
+      <w:proofErr w:type="spellStart"/>
+      <w:r>
+        <w:rPr>
+          <w:b/>
+          <w:bCs/>
+        </w:rPr>
+        <w:t>register</w:t>
+      </w:r>
+      <w:proofErr w:type="spellEnd"/>
+      <w:r>
+        <w:t xml:space="preserve"> para crear un usuario, internamente habrá un controlador el cual recibirá esa solicitud y la </w:t>
+      </w:r>
+      <w:r>
+        <w:t>enviará</w:t>
+      </w:r>
+      <w:r>
+        <w:t xml:space="preserve"> </w:t>
+      </w:r>
+      <w:r>
+        <w:t xml:space="preserve">al </w:t>
+      </w:r>
+      <w:proofErr w:type="spellStart"/>
+      <w:r>
+        <w:rPr>
+          <w:b/>
+          <w:bCs/>
+        </w:rPr>
+        <w:t>AuthService</w:t>
+      </w:r>
+      <w:proofErr w:type="spellEnd"/>
+      <w:r>
+        <w:rPr>
+          <w:b/>
+          <w:bCs/>
+        </w:rPr>
+        <w:t xml:space="preserve"> </w:t>
+      </w:r>
+      <w:r>
+        <w:t xml:space="preserve">donde se empieza a evidenciar la presencia del uso del patrón </w:t>
+      </w:r>
+      <w:proofErr w:type="spellStart"/>
+      <w:r>
+        <w:rPr>
+          <w:b/>
+          <w:bCs/>
+        </w:rPr>
+        <w:t>adapter</w:t>
+      </w:r>
+      <w:proofErr w:type="spellEnd"/>
+      <w:r>
+        <w:rPr>
+          <w:b/>
+          <w:bCs/>
+        </w:rPr>
+        <w:t xml:space="preserve">. </w:t>
+      </w:r>
+      <w:r>
+        <w:t>Finalmente, la API, nos devolverá nuevamente los datos del usuario sin su contraseña validando así que la creación del usuario se hizo correctamente:</w:t>
+      </w:r>
+    </w:p>
+    <w:p>
+      <w:pPr>
+        <w:jc w:val="center"/>
+      </w:pPr>
+      <w:r>
+        <w:rPr>
+          <w:noProof/>
+        </w:rPr>
+        <w:lastRenderedPageBreak/>
+        <w:drawing>
+          <wp:inline distT="0" distB="0" distL="0" distR="0" wp14:anchorId="064F52F7" wp14:editId="5168AF42">
+            <wp:extent cx="5943600" cy="3516630"/>
+            <wp:effectExtent l="0" t="0" r="0" b="7620"/>
+            <wp:docPr id="33" name="Imagen 33"/>
+            <wp:cNvGraphicFramePr>
+              <a:graphicFrameLocks xmlns:a="http://schemas.openxmlformats.org/drawingml/2006/main" noChangeAspect="1"/>
+            </wp:cNvGraphicFramePr>
+            <a:graphic xmlns:a="http://schemas.openxmlformats.org/drawingml/2006/main">
+              <a:graphicData uri="http://schemas.openxmlformats.org/drawingml/2006/picture">
+                <pic:pic xmlns:pic="http://schemas.openxmlformats.org/drawingml/2006/picture">
+                  <pic:nvPicPr>
+                    <pic:cNvPr id="1" name=""/>
+                    <pic:cNvPicPr/>
+                  </pic:nvPicPr>
+                  <pic:blipFill>
+                    <a:blip r:embed="rId48"/>
+                    <a:stretch>
+                      <a:fillRect/>
+                    </a:stretch>
+                  </pic:blipFill>
+                  <pic:spPr>
+                    <a:xfrm>
+                      <a:off x="0" y="0"/>
+                      <a:ext cx="5943600" cy="3516630"/>
+                    </a:xfrm>
+                    <a:prstGeom prst="rect">
+                      <a:avLst/>
+                    </a:prstGeom>
+                  </pic:spPr>
+                </pic:pic>
+              </a:graphicData>
+            </a:graphic>
+          </wp:inline>
+        </w:drawing>
+      </w:r>
+    </w:p>
+    <w:p>
+      <w:pPr>
+        <w:jc w:val="left"/>
+      </w:pPr>
+      <w:r>
+        <w:t>Posteriormente, se comprueba en la base de datos que el usuario ya se haya creado correctamente:</w:t>
+      </w:r>
+    </w:p>
+    <w:p>
+      <w:pPr>
+        <w:jc w:val="left"/>
+      </w:pPr>
+      <w:r>
+        <w:rPr>
+          <w:noProof/>
+        </w:rPr>
+        <w:drawing>
+          <wp:inline distT="0" distB="0" distL="0" distR="0" wp14:anchorId="23DA54E8" wp14:editId="710E2647">
+            <wp:extent cx="5943600" cy="544830"/>
+            <wp:effectExtent l="0" t="0" r="0" b="7620"/>
+            <wp:docPr id="34" name="Imagen 34"/>
+            <wp:cNvGraphicFramePr>
+              <a:graphicFrameLocks xmlns:a="http://schemas.openxmlformats.org/drawingml/2006/main" noChangeAspect="1"/>
+            </wp:cNvGraphicFramePr>
+            <a:graphic xmlns:a="http://schemas.openxmlformats.org/drawingml/2006/main">
+              <a:graphicData uri="http://schemas.openxmlformats.org/drawingml/2006/picture">
+                <pic:pic xmlns:pic="http://schemas.openxmlformats.org/drawingml/2006/picture">
+                  <pic:nvPicPr>
+                    <pic:cNvPr id="1" name=""/>
+                    <pic:cNvPicPr/>
+                  </pic:nvPicPr>
+                  <pic:blipFill>
+                    <a:blip r:embed="rId49"/>
+                    <a:stretch>
+                      <a:fillRect/>
+                    </a:stretch>
+                  </pic:blipFill>
+                  <pic:spPr>
+                    <a:xfrm>
+                      <a:off x="0" y="0"/>
                       <a:ext cx="5943600" cy="544830"/>
                     </a:xfrm>
                     <a:prstGeom prst="rect">
@@ -7393,7 +8107,7 @@
     </w:p>
     <w:p/>
     <w:sectPr>
-      <w:headerReference w:type="default" r:id="rId40"/>
+      <w:headerReference w:type="default" r:id="rId50"/>
       <w:pgSz w:w="12240" w:h="15840"/>
       <w:pgMar w:top="1440" w:right="1440" w:bottom="1440" w:left="1440" w:header="709" w:footer="709" w:gutter="0"/>
       <w:cols w:space="720"/>

</xml_diff>

<commit_message>
Implementacion del patron Prototype
</commit_message>
<xml_diff>
--- a/Sistema de Gestion de Cadenas de Suministro.docx
+++ b/Sistema de Gestion de Cadenas de Suministro.docx
@@ -4706,10 +4706,7 @@
         <w:pStyle w:val="Ttulo3"/>
       </w:pPr>
       <w:r>
-        <w:t>Aplic</w:t>
-      </w:r>
-      <w:r>
-        <w:t>ación del Patrón Abstract Factory</w:t>
+        <w:t>Aplicación del Patrón Abstract Factory</w:t>
       </w:r>
     </w:p>
     <w:p>
@@ -4722,27 +4719,12 @@
     </w:p>
     <w:p>
       <w:r>
-        <w:t>En nuestro proyecto LogiSync, una de las funcionalidades más importantes que se plantearon desde el inicio es la incorporación de análisis predictivo para la estimación de la d</w:t>
-      </w:r>
-      <w:r>
-        <w:t>emanda futura de productos y la optimización del inventario. Para lograr esto, no podemos limitarnos a un único cálculo matemático fijo, ya que dependiendo del tipo de producto, su historial de ventas o el comportamiento del mercado, se requiere utilizar d</w:t>
-      </w:r>
-      <w:r>
-        <w:t>iferentes modelos de predicción (como promedio móvil, suavizado exponencial o regresión lineal), junto con ajustes adicionales como multiplicadores por temporadas o colchones de stock de seguridad.</w:t>
-      </w:r>
-    </w:p>
-    <w:p>
-      <w:r>
-        <w:t>Aquí es donde entra a colaborar el patrón Abstract Factory</w:t>
-      </w:r>
-      <w:r>
-        <w:t xml:space="preserve">. En lugar de que el servicio de predicción o los controladores tengan que conocer y crear directamente cada clase matemática con sus configuraciones internas, el patrón nos proporciona una fábrica centralizada (ForecastStrategyFactory) encargada de crear </w:t>
-      </w:r>
-      <w:r>
-        <w:t>e instanciar la familia de estrategias predictivas según el algoritmo solicitado. De esta manera, el resto de la aplicación interactúa únicamente con una abstracción común (ForecastStrategy), logrando que el sistema quede completamente desacoplado, sea más</w:t>
-      </w:r>
-      <w:r>
-        <w:t xml:space="preserve"> fácil de mantener y permita en el futuro agregar nuevos modelos matemáticos (como ARIMA o redes neuronales) sin tener que tocar ni alterar la lógica del negocio existente.</w:t>
+        <w:t>En nuestro proyecto LogiSync, una de las funcionalidades más importantes que se plantearon desde el inicio es la incorporación de análisis predictivo para la estimación de la demanda futura de productos y la optimización del inventario. Para lograr esto, no podemos limitarnos a un único cálculo matemático fijo, ya que dependiendo del tipo de producto, su historial de ventas o el comportamiento del mercado, se requiere utilizar diferentes modelos de predicción (como promedio móvil, suavizado exponencial o regresión lineal), junto con ajustes adicionales como multiplicadores por temporadas o colchones de stock de seguridad.</w:t>
+      </w:r>
+    </w:p>
+    <w:p>
+      <w:r>
+        <w:t>Aquí es donde entra a colaborar el patrón Abstract Factory. En lugar de que el servicio de predicción o los controladores tengan que conocer y crear directamente cada clase matemática con sus configuraciones internas, el patrón nos proporciona una fábrica centralizada (ForecastStrategyFactory) encargada de crear e instanciar la familia de estrategias predictivas según el algoritmo solicitado. De esta manera, el resto de la aplicación interactúa únicamente con una abstracción común (ForecastStrategy), logrando que el sistema quede completamente desacoplado, sea más fácil de mantener y permita en el futuro agregar nuevos modelos matemáticos (como ARIMA o redes neuronales) sin tener que tocar ni alterar la lógica del negocio existente.</w:t>
       </w:r>
     </w:p>
     <w:p>
@@ -4756,6 +4738,9 @@
     </w:p>
     <w:p>
       <w:r>
+        <w:rPr>
+          <w:noProof/>
+        </w:rPr>
         <w:drawing>
           <wp:inline distT="0" distB="0" distL="0" distR="0" wp14:anchorId="60FE7A37" wp14:editId="14EC9246">
             <wp:extent cx="5943600" cy="2868930"/>
@@ -4811,6 +4796,9 @@
     </w:p>
     <w:p>
       <w:r>
+        <w:rPr>
+          <w:noProof/>
+        </w:rPr>
         <w:drawing>
           <wp:inline distT="0" distB="0" distL="0" distR="0" wp14:anchorId="3064B89C" wp14:editId="4A107C45">
             <wp:extent cx="5943600" cy="2874645"/>
@@ -4859,6 +4847,9 @@
     </w:p>
     <w:p>
       <w:r>
+        <w:rPr>
+          <w:noProof/>
+        </w:rPr>
         <w:drawing>
           <wp:inline distT="0" distB="0" distL="0" distR="0" wp14:anchorId="0C4811BB" wp14:editId="60782F11">
             <wp:extent cx="5943600" cy="1664898"/>
@@ -4914,6 +4905,9 @@
     </w:p>
     <w:p>
       <w:r>
+        <w:rPr>
+          <w:noProof/>
+        </w:rPr>
         <w:drawing>
           <wp:inline distT="0" distB="0" distL="0" distR="0" wp14:anchorId="05163C75" wp14:editId="36CE0ADC">
             <wp:extent cx="5943600" cy="5512435"/>
@@ -4953,6 +4947,9 @@
     </w:p>
     <w:p>
       <w:r>
+        <w:rPr>
+          <w:noProof/>
+        </w:rPr>
         <w:lastRenderedPageBreak/>
         <w:drawing>
           <wp:inline distT="0" distB="0" distL="0" distR="0" wp14:anchorId="1EECF820" wp14:editId="008FFCBC">
@@ -4993,6 +4990,9 @@
     </w:p>
     <w:p>
       <w:r>
+        <w:rPr>
+          <w:noProof/>
+        </w:rPr>
         <w:lastRenderedPageBreak/>
         <w:drawing>
           <wp:inline distT="0" distB="0" distL="0" distR="0" wp14:anchorId="6E51E24B" wp14:editId="4E8D3791">
@@ -5033,6 +5033,9 @@
     </w:p>
     <w:p>
       <w:r>
+        <w:rPr>
+          <w:noProof/>
+        </w:rPr>
         <w:drawing>
           <wp:inline distT="0" distB="0" distL="0" distR="0" wp14:anchorId="3F996A72" wp14:editId="1F6EA65F">
             <wp:extent cx="5943600" cy="564515"/>
@@ -5081,6 +5084,9 @@
     </w:p>
     <w:p>
       <w:r>
+        <w:rPr>
+          <w:noProof/>
+        </w:rPr>
         <w:drawing>
           <wp:inline distT="0" distB="0" distL="0" distR="0" wp14:anchorId="701FB4E8" wp14:editId="266390A7">
             <wp:extent cx="5943600" cy="2014855"/>
@@ -5128,10 +5134,7 @@
     </w:p>
     <w:p>
       <w:r>
-        <w:t xml:space="preserve">Para comprender con claridad cómo se aplica este </w:t>
-      </w:r>
-      <w:r>
-        <w:t xml:space="preserve">patrón en la funcionalidad de predicción de demanda de LogiSync, a </w:t>
+        <w:t xml:space="preserve">Para comprender con claridad cómo se aplica este patrón en la funcionalidad de predicción de demanda de LogiSync, a </w:t>
       </w:r>
       <w:r>
         <w:t>continuación,</w:t>
@@ -5150,13 +5153,7 @@
     </w:p>
     <w:p>
       <w:r>
-        <w:t xml:space="preserve">Representa el producto abstracto dentro del </w:t>
-      </w:r>
-      <w:r>
-        <w:t>patrón. Es la interfaz que define el contrato común que deben cumplir todos los modelos o algoritmos de predicción, en este caso a través del método forecast(history, periodsAhead). Gracias a esta abstracción, cualquier componente de la aplicación puede so</w:t>
-      </w:r>
-      <w:r>
-        <w:t>licitar una estimación sin preocuparse por la fórmula matemática específica que se ejecutará por debajo.</w:t>
+        <w:t>Representa el producto abstracto dentro del patrón. Es la interfaz que define el contrato común que deben cumplir todos los modelos o algoritmos de predicción, en este caso a través del método forecast(history, periodsAhead). Gracias a esta abstracción, cualquier componente de la aplicación puede solicitar una estimación sin preocuparse por la fórmula matemática específica que se ejecutará por debajo.</w:t>
       </w:r>
     </w:p>
     <w:p>
@@ -5239,13 +5236,7 @@
     </w:p>
     <w:p>
       <w:r>
-        <w:t>Son las implementaciones c</w:t>
-      </w:r>
-      <w:r>
-        <w:t>oncretas de la interfaz ForecastStrategy. Cada una de estas clases encapsula una lógica de cálculo matemático diferente sobre los datos históricos de inventario: promedio móvil simple para tendencias estables, suavizado exponencial ponderando periodos reci</w:t>
-      </w:r>
-      <w:r>
-        <w:t>entes, y regresión lineal por mínimos cuadrados para proyectar tendencias crecientes o decrecientes. Cada clase es responsable exclusivamente de resolver su algoritmo estadístico.</w:t>
+        <w:t>Son las implementaciones concretas de la interfaz ForecastStrategy. Cada una de estas clases encapsula una lógica de cálculo matemático diferente sobre los datos históricos de inventario: promedio móvil simple para tendencias estables, suavizado exponencial ponderando periodos recientes, y regresión lineal por mínimos cuadrados para proyectar tendencias crecientes o decrecientes. Cada clase es responsable exclusivamente de resolver su algoritmo estadístico.</w:t>
       </w:r>
     </w:p>
     <w:p>
@@ -5259,13 +5250,7 @@
     </w:p>
     <w:p>
       <w:r>
-        <w:t>Esta clase actúa como la fábrica del patró</w:t>
-      </w:r>
-      <w:r>
-        <w:t>n. Contiene el método encargado de recibir el nombre o tipo de algoritmo deseado (por ejemplo LINEAR_REGRESSION, MOVING_AVERAGE o EXPONENTIAL_SMOOTHING) y crear e instanciar la estrategia correspondiente ya parametrizada. Si se envía un algoritmo no soport</w:t>
-      </w:r>
-      <w:r>
-        <w:t>ado, la fábrica se encarga de manejar el error de negocio. Al centralizar la creación de estas estrategias aquí, evitamos que otras capas del sistema tengan que hacer condicionales o instanciar clases concretas con new.</w:t>
+        <w:t>Esta clase actúa como la fábrica del patrón. Contiene el método encargado de recibir el nombre o tipo de algoritmo deseado (por ejemplo LINEAR_REGRESSION, MOVING_AVERAGE o EXPONENTIAL_SMOOTHING) y crear e instanciar la estrategia correspondiente ya parametrizada. Si se envía un algoritmo no soportado, la fábrica se encarga de manejar el error de negocio. Al centralizar la creación de estas estrategias aquí, evitamos que otras capas del sistema tengan que hacer condicionales o instanciar clases concretas con new.</w:t>
       </w:r>
     </w:p>
     <w:p>
@@ -5273,18 +5258,12 @@
         <w:pStyle w:val="Ttulo5"/>
       </w:pPr>
       <w:r>
-        <w:t>DemandForecastService (Cliente / Con</w:t>
-      </w:r>
-      <w:r>
-        <w:t>sumidor)</w:t>
-      </w:r>
-    </w:p>
-    <w:p>
-      <w:r>
-        <w:t>Es el servicio de la capa de aplicación encargado de orquestar todo el proceso de predicción de demanda. Cuando recibe la petición, le solicita a ForecastStrategyFactory la estrategia que se necesita según los parámetros del usuario, consulta el h</w:t>
-      </w:r>
-      <w:r>
-        <w:t>istorial de movimientos de inventario del producto y ejecuta la proyección. Lo fundamental aquí es que este servicio trabaja únicamente con la interfaz ForecastStrategy, garantizando un alto nivel de desacoplamiento.</w:t>
+        <w:t>DemandForecastService (Cliente / Consumidor)</w:t>
+      </w:r>
+    </w:p>
+    <w:p>
+      <w:r>
+        <w:t>Es el servicio de la capa de aplicación encargado de orquestar todo el proceso de predicción de demanda. Cuando recibe la petición, le solicita a ForecastStrategyFactory la estrategia que se necesita según los parámetros del usuario, consulta el historial de movimientos de inventario del producto y ejecuta la proyección. Lo fundamental aquí es que este servicio trabaja únicamente con la interfaz ForecastStrategy, garantizando un alto nivel de desacoplamiento.</w:t>
       </w:r>
     </w:p>
     <w:p>
@@ -5297,14 +5276,14 @@
     </w:p>
     <w:p>
       <w:r>
-        <w:t>Ahora sí, para la prueba</w:t>
-      </w:r>
-      <w:r>
-        <w:t xml:space="preserve"> de funcionamiento, ya que todavía no contamos con una interfaz gráfica en el frontend, utilizamos la herramienta Postman (o la documentación interactiva de Swagger UI), en la cual mandamos la siguiente petición a la API al endpoint /api/forecast/generate:</w:t>
-      </w:r>
-    </w:p>
-    <w:p>
-      <w:r>
+        <w:t>Ahora sí, para la prueba de funcionamiento, ya que todavía no contamos con una interfaz gráfica en el frontend, utilizamos la herramienta Postman (o la documentación interactiva de Swagger UI), en la cual mandamos la siguiente petición a la API al endpoint /api/forecast/generate:</w:t>
+      </w:r>
+    </w:p>
+    <w:p>
+      <w:r>
+        <w:rPr>
+          <w:noProof/>
+        </w:rPr>
         <w:drawing>
           <wp:inline distT="0" distB="0" distL="0" distR="0" wp14:anchorId="3CD2AD73" wp14:editId="1E28E3D7">
             <wp:extent cx="5943600" cy="2005965"/>
@@ -5344,14 +5323,14 @@
     </w:p>
     <w:p>
       <w:r>
-        <w:t>Una vez enviada la petición, el sistema ejecuta la estrategia instanciada por la fábrica sobre el historial del producto, devuelve las p</w:t>
-      </w:r>
-      <w:r>
-        <w:t>royecciones para los periodos solicitados y genera de forma automática la necesidad de abastecimiento en la base de datos si detecta que el inventario disponible no cubre la demanda proyectada:</w:t>
-      </w:r>
-    </w:p>
-    <w:p>
-      <w:r>
+        <w:t>Una vez enviada la petición, el sistema ejecuta la estrategia instanciada por la fábrica sobre el historial del producto, devuelve las proyecciones para los periodos solicitados y genera de forma automática la necesidad de abastecimiento en la base de datos si detecta que el inventario disponible no cubre la demanda proyectada:</w:t>
+      </w:r>
+    </w:p>
+    <w:p>
+      <w:r>
+        <w:rPr>
+          <w:noProof/>
+        </w:rPr>
         <w:lastRenderedPageBreak/>
         <w:drawing>
           <wp:inline distT="0" distB="0" distL="0" distR="0" wp14:anchorId="0F1AC433" wp14:editId="2AA38221">
@@ -5395,7 +5374,7 @@
         <w:pStyle w:val="Ttulo3"/>
       </w:pPr>
       <w:r>
-        <w:t>Aplicación del Patrón Factory Method</w:t>
+        <w:t>Aplicación del Patrón Prototype</w:t>
       </w:r>
     </w:p>
     <w:p>
@@ -5403,115 +5382,42 @@
         <w:pStyle w:val="Ttulo4"/>
       </w:pPr>
       <w:r>
-        <w:t>Como está Colaborando este Patrón al Proyecto</w:t>
-      </w:r>
-    </w:p>
-    <w:p>
-      <w:r>
-        <w:t xml:space="preserve">En nuestro proyecto utilizamos Spring Framework, el cual cuenta con un contenedor de </w:t>
-      </w:r>
-      <w:r>
-        <w:rPr>
-          <w:b/>
-          <w:bCs/>
-        </w:rPr>
-        <w:t>Inversión de Control (</w:t>
-      </w:r>
-      <w:proofErr w:type="spellStart"/>
-      <w:r>
-        <w:rPr>
-          <w:b/>
-          <w:bCs/>
-        </w:rPr>
-        <w:t>IoC</w:t>
-      </w:r>
-      <w:proofErr w:type="spellEnd"/>
-      <w:r>
-        <w:rPr>
-          <w:b/>
-          <w:bCs/>
-        </w:rPr>
-        <w:t xml:space="preserve">) </w:t>
-      </w:r>
-      <w:r>
-        <w:t xml:space="preserve">encargado de crear y gestionar los objetos utilizados por la aplicación. Spring permite definir métodos de creación mediante la anotación </w:t>
-      </w:r>
-      <w:r>
-        <w:rPr>
-          <w:b/>
-          <w:bCs/>
-        </w:rPr>
-        <w:t>@Bean</w:t>
-      </w:r>
-      <w:r>
-        <w:t xml:space="preserve">, los cuales funcionan como un mecanismo de </w:t>
-      </w:r>
-      <w:r>
-        <w:rPr>
-          <w:b/>
-          <w:bCs/>
-        </w:rPr>
-        <w:t>Factory Method</w:t>
-      </w:r>
-      <w:r>
-        <w:t>, ya que encapsulan la creación de una instancia y permiten trabajar con una abstracción sin depender directamente de su implementación.</w:t>
-      </w:r>
-    </w:p>
-    <w:p>
-      <w:r>
-        <w:t xml:space="preserve">En nuestro caso, este patrón se utiliza principalmente en Spring Security para la creación de </w:t>
-      </w:r>
-      <w:proofErr w:type="spellStart"/>
-      <w:r>
-        <w:rPr>
-          <w:b/>
-          <w:bCs/>
-        </w:rPr>
-        <w:t>PasswordEncoder</w:t>
-      </w:r>
-      <w:proofErr w:type="spellEnd"/>
-      <w:r>
-        <w:t xml:space="preserve">, cuya implementación concreta es </w:t>
-      </w:r>
-      <w:proofErr w:type="spellStart"/>
-      <w:r>
-        <w:rPr>
-          <w:b/>
-          <w:bCs/>
-        </w:rPr>
-        <w:t>BCryptPasswordEncoder</w:t>
-      </w:r>
-      <w:proofErr w:type="spellEnd"/>
-      <w:r>
-        <w:t xml:space="preserve">. Esto permite que los </w:t>
+        <w:t>Como está Col</w:t>
+      </w:r>
+      <w:r>
+        <w:t>aborando este Patrón al Proyecto</w:t>
+      </w:r>
+    </w:p>
+    <w:p>
+      <w:r>
+        <w:t xml:space="preserve">En un centro de distribución tecnológica especializado en dispositivos móviles como LogiSync, la infraestructura de almacenamiento físico de las bodegas está compuesta por cientos de estanterías, pasillos y racks modulares </w:t>
+      </w:r>
+      <w:r>
+        <w:t>con características estandarizadas (por ejemplo, racks diseñados con 4 niveles y bahías compartimentadas para almacenar cajas de smartphones de alta gama como Samsung Galaxy o iPhone, con límites idénticos de peso, volumen y capacidad por nivel). Cuando se</w:t>
+      </w:r>
+      <w:r>
+        <w:t xml:space="preserve"> amplía un almacén o se habilita un nuevo pasillo, crear cada estantería y cada una de sus bahías desde cero mediante </w:t>
       </w:r>
       <w:r>
         <w:lastRenderedPageBreak/>
-        <w:t xml:space="preserve">componentes que necesitan procesar contraseñas dependan de </w:t>
-      </w:r>
-      <w:proofErr w:type="spellStart"/>
-      <w:r>
-        <w:rPr>
-          <w:b/>
-          <w:bCs/>
-        </w:rPr>
-        <w:t>PasswordEncoder</w:t>
-      </w:r>
-      <w:proofErr w:type="spellEnd"/>
-      <w:r>
-        <w:t xml:space="preserve"> y no directamente de </w:t>
-      </w:r>
-      <w:proofErr w:type="spellStart"/>
-      <w:r>
-        <w:rPr>
-          <w:b/>
-          <w:bCs/>
-        </w:rPr>
-        <w:t>BCrypt</w:t>
-      </w:r>
-      <w:proofErr w:type="spellEnd"/>
-      <w:r>
-        <w:t>, reduciendo el acoplamiento y facilitando un posible cambio de implementación. Además, al combinarse con la inyección de dependencias de Spring, la creación y gestión de estos componentes queda centralizada y facilita el mantenimiento del proyecto.</w:t>
+        <w:t>configuración manual genera una redundancia excesiva de código, consumo innecesario de recursos y alto riesgo de inconsistencias operativa</w:t>
+      </w:r>
+      <w:r>
+        <w:t>s.</w:t>
+      </w:r>
+    </w:p>
+    <w:p>
+      <w:r>
+        <w:t xml:space="preserve">Para resolver este problema, entra a colaborar el patrón de diseño creacional Prototype. En lugar de reconstruir toda la estructura jerárquica de un espacio o plantilla de rack cada vez que se requiere uno nuevo, el patrón define una interfaz de </w:t>
+      </w:r>
+      <w:r>
+        <w:t>clonación (StorageSpacePrototype) y una implementación concreta (RackLayoutTemplate) que permite duplicar en memoria objetos prototipo ya configurados. Mediante una clonación profunda (deep clone) de sus propiedades y listas internas de ubicaciones a travé</w:t>
+      </w:r>
+      <w:r>
+        <w:t>s del método cloneSpace(...), el sistema genera instantáneamente réplicas exactas e independientes, permitiendo únicamente ajustar los parámetros específicos que varían (como el nombre del rack o una capacidad personalizada por nivel) sin alterar el objeto</w:t>
+      </w:r>
+      <w:r>
+        <w:t xml:space="preserve"> original ni sobrecargar la base de datos.</w:t>
       </w:r>
     </w:p>
     <w:p>
@@ -5523,21 +5429,12 @@
       </w:r>
     </w:p>
     <w:p>
-      <w:pPr>
-        <w:rPr>
-          <w:lang w:val="en-US"/>
-        </w:rPr>
-      </w:pPr>
-      <w:r>
-        <w:rPr>
-          <w:noProof/>
-          <w:lang w:val="en-US"/>
-        </w:rPr>
+      <w:r>
         <w:drawing>
-          <wp:inline distT="0" distB="0" distL="0" distR="0" wp14:anchorId="0D43FD4E" wp14:editId="2A28B20B">
-            <wp:extent cx="5943600" cy="2309495"/>
-            <wp:effectExtent l="0" t="0" r="0" b="0"/>
-            <wp:docPr id="21" name="Imagen 21"/>
+          <wp:inline distT="0" distB="0" distL="0" distR="0" wp14:anchorId="6278752E" wp14:editId="16D7F338">
+            <wp:extent cx="5943600" cy="3078480"/>
+            <wp:effectExtent l="0" t="0" r="0" b="7620"/>
+            <wp:docPr id="53" name="Imagen 53"/>
             <wp:cNvGraphicFramePr>
               <a:graphicFrameLocks xmlns:a="http://schemas.openxmlformats.org/drawingml/2006/main" noChangeAspect="1"/>
             </wp:cNvGraphicFramePr>
@@ -5557,7 +5454,7 @@
                   <pic:spPr>
                     <a:xfrm>
                       <a:off x="0" y="0"/>
-                      <a:ext cx="5943600" cy="2309495"/>
+                      <a:ext cx="5943600" cy="3078480"/>
                     </a:xfrm>
                     <a:prstGeom prst="rect">
                       <a:avLst/>
@@ -5580,38 +5477,19 @@
     </w:p>
     <w:p>
       <w:pPr>
-        <w:rPr>
-          <w:b/>
-          <w:bCs/>
-        </w:rPr>
-      </w:pPr>
-      <w:r>
-        <w:rPr>
-          <w:b/>
-          <w:bCs/>
-        </w:rPr>
-        <w:t>Fabrica</w:t>
-      </w:r>
-    </w:p>
-    <w:p>
-      <w:pPr>
-        <w:jc w:val="center"/>
-        <w:rPr>
-          <w:b/>
-          <w:bCs/>
-        </w:rPr>
-      </w:pPr>
-      <w:r>
-        <w:rPr>
-          <w:b/>
-          <w:bCs/>
-          <w:noProof/>
-        </w:rPr>
+        <w:pStyle w:val="Ttulo5"/>
+      </w:pPr>
+      <w:r>
+        <w:t>Prototipo (Interfaz)</w:t>
+      </w:r>
+    </w:p>
+    <w:p>
+      <w:r>
         <w:drawing>
-          <wp:inline distT="0" distB="0" distL="0" distR="0" wp14:anchorId="3534E270" wp14:editId="48DFBBED">
-            <wp:extent cx="2772162" cy="876422"/>
-            <wp:effectExtent l="0" t="0" r="9525" b="0"/>
-            <wp:docPr id="8" name="Imagen 8"/>
+          <wp:inline distT="0" distB="0" distL="0" distR="0" wp14:anchorId="255C9DDD" wp14:editId="168DD04E">
+            <wp:extent cx="5943600" cy="685800"/>
+            <wp:effectExtent l="0" t="0" r="0" b="0"/>
+            <wp:docPr id="42" name="Imagen 42"/>
             <wp:cNvGraphicFramePr>
               <a:graphicFrameLocks xmlns:a="http://schemas.openxmlformats.org/drawingml/2006/main" noChangeAspect="1"/>
             </wp:cNvGraphicFramePr>
@@ -5631,7 +5509,7 @@
                   <pic:spPr>
                     <a:xfrm>
                       <a:off x="0" y="0"/>
-                      <a:ext cx="2772162" cy="876422"/>
+                      <a:ext cx="5943600" cy="685800"/>
                     </a:xfrm>
                     <a:prstGeom prst="rect">
                       <a:avLst/>
@@ -5646,40 +5524,20 @@
     </w:p>
     <w:p>
       <w:pPr>
-        <w:jc w:val="left"/>
-        <w:rPr>
-          <w:b/>
-          <w:bCs/>
-        </w:rPr>
-      </w:pPr>
-      <w:r>
-        <w:rPr>
-          <w:b/>
-          <w:bCs/>
-        </w:rPr>
-        <w:t>Producto</w:t>
-      </w:r>
-    </w:p>
-    <w:p>
-      <w:pPr>
-        <w:jc w:val="center"/>
-        <w:rPr>
-          <w:b/>
-          <w:bCs/>
-        </w:rPr>
-      </w:pPr>
-      <w:r>
-        <w:rPr>
-          <w:b/>
-          <w:bCs/>
-          <w:noProof/>
-        </w:rPr>
+        <w:pStyle w:val="Ttulo5"/>
+      </w:pPr>
+      <w:r>
         <w:lastRenderedPageBreak/>
+        <w:t>Prototipo Concreto</w:t>
+      </w:r>
+    </w:p>
+    <w:p>
+      <w:r>
         <w:drawing>
-          <wp:inline distT="0" distB="0" distL="0" distR="0" wp14:anchorId="5967A4D5" wp14:editId="4D982305">
-            <wp:extent cx="5943600" cy="2326005"/>
-            <wp:effectExtent l="0" t="0" r="0" b="0"/>
-            <wp:docPr id="10" name="Imagen 10"/>
+          <wp:inline distT="0" distB="0" distL="0" distR="0" wp14:anchorId="36062F9C" wp14:editId="72752E9F">
+            <wp:extent cx="5943600" cy="2983230"/>
+            <wp:effectExtent l="0" t="0" r="0" b="7620"/>
+            <wp:docPr id="43" name="Imagen 43"/>
             <wp:cNvGraphicFramePr>
               <a:graphicFrameLocks xmlns:a="http://schemas.openxmlformats.org/drawingml/2006/main" noChangeAspect="1"/>
             </wp:cNvGraphicFramePr>
@@ -5699,7 +5557,7 @@
                   <pic:spPr>
                     <a:xfrm>
                       <a:off x="0" y="0"/>
-                      <a:ext cx="5943600" cy="2326005"/>
+                      <a:ext cx="5943600" cy="2983230"/>
                     </a:xfrm>
                     <a:prstGeom prst="rect">
                       <a:avLst/>
@@ -5714,39 +5572,23 @@
     </w:p>
     <w:p>
       <w:pPr>
-        <w:jc w:val="left"/>
-        <w:rPr>
-          <w:b/>
-          <w:bCs/>
-        </w:rPr>
-      </w:pPr>
-      <w:r>
-        <w:rPr>
-          <w:b/>
-          <w:bCs/>
-        </w:rPr>
-        <w:t>Producto Concreto</w:t>
-      </w:r>
-    </w:p>
-    <w:p>
-      <w:pPr>
-        <w:jc w:val="left"/>
-        <w:rPr>
-          <w:b/>
-          <w:bCs/>
-        </w:rPr>
-      </w:pPr>
-      <w:r>
-        <w:rPr>
-          <w:b/>
-          <w:bCs/>
-          <w:noProof/>
-        </w:rPr>
+        <w:pStyle w:val="Ttulo5"/>
+      </w:pPr>
+      <w:r>
+        <w:lastRenderedPageBreak/>
+        <w:t>Modelo de</w:t>
+      </w:r>
+      <w:r>
+        <w:t xml:space="preserve"> Dominio</w:t>
+      </w:r>
+    </w:p>
+    <w:p>
+      <w:r>
         <w:drawing>
-          <wp:inline distT="0" distB="0" distL="0" distR="0" wp14:anchorId="2CE39E17" wp14:editId="11D974B8">
-            <wp:extent cx="5943600" cy="4246880"/>
-            <wp:effectExtent l="0" t="0" r="0" b="1270"/>
-            <wp:docPr id="11" name="Imagen 11"/>
+          <wp:inline distT="0" distB="0" distL="0" distR="0" wp14:anchorId="0B4EE781" wp14:editId="33D35C85">
+            <wp:extent cx="5943600" cy="5094605"/>
+            <wp:effectExtent l="0" t="0" r="0" b="0"/>
+            <wp:docPr id="44" name="Imagen 44"/>
             <wp:cNvGraphicFramePr>
               <a:graphicFrameLocks xmlns:a="http://schemas.openxmlformats.org/drawingml/2006/main" noChangeAspect="1"/>
             </wp:cNvGraphicFramePr>
@@ -5766,7 +5608,7 @@
                   <pic:spPr>
                     <a:xfrm>
                       <a:off x="0" y="0"/>
-                      <a:ext cx="5943600" cy="4246880"/>
+                      <a:ext cx="5943600" cy="5094605"/>
                     </a:xfrm>
                     <a:prstGeom prst="rect">
                       <a:avLst/>
@@ -5780,25 +5622,12 @@
       </w:r>
     </w:p>
     <w:p>
-      <w:pPr>
-        <w:jc w:val="left"/>
-        <w:rPr>
-          <w:b/>
-          <w:bCs/>
-        </w:rPr>
-      </w:pPr>
-      <w:r>
-        <w:rPr>
-          <w:b/>
-          <w:bCs/>
-          <w:noProof/>
-        </w:rPr>
-        <w:lastRenderedPageBreak/>
+      <w:r>
         <w:drawing>
-          <wp:inline distT="0" distB="0" distL="0" distR="0" wp14:anchorId="2FF49B68" wp14:editId="45726220">
-            <wp:extent cx="5943600" cy="1198245"/>
-            <wp:effectExtent l="0" t="0" r="0" b="1905"/>
-            <wp:docPr id="12" name="Imagen 12"/>
+          <wp:inline distT="0" distB="0" distL="0" distR="0" wp14:anchorId="61D8CA5D" wp14:editId="37F60A7B">
+            <wp:extent cx="5943600" cy="2073910"/>
+            <wp:effectExtent l="0" t="0" r="0" b="2540"/>
+            <wp:docPr id="48" name="Imagen 48"/>
             <wp:cNvGraphicFramePr>
               <a:graphicFrameLocks xmlns:a="http://schemas.openxmlformats.org/drawingml/2006/main" noChangeAspect="1"/>
             </wp:cNvGraphicFramePr>
@@ -5818,7 +5647,7 @@
                   <pic:spPr>
                     <a:xfrm>
                       <a:off x="0" y="0"/>
-                      <a:ext cx="5943600" cy="1198245"/>
+                      <a:ext cx="5943600" cy="2073910"/>
                     </a:xfrm>
                     <a:prstGeom prst="rect">
                       <a:avLst/>
@@ -5833,40 +5662,20 @@
     </w:p>
     <w:p>
       <w:pPr>
-        <w:jc w:val="left"/>
-        <w:rPr>
-          <w:b/>
-          <w:bCs/>
-          <w:lang w:val="en-US"/>
-        </w:rPr>
-      </w:pPr>
-      <w:r>
-        <w:rPr>
-          <w:b/>
-          <w:bCs/>
-        </w:rPr>
-        <w:t>Consumidor</w:t>
-      </w:r>
-    </w:p>
-    <w:p>
-      <w:pPr>
-        <w:jc w:val="left"/>
-        <w:rPr>
-          <w:b/>
-          <w:bCs/>
-        </w:rPr>
-      </w:pPr>
-      <w:r>
-        <w:rPr>
-          <w:b/>
-          <w:bCs/>
-          <w:noProof/>
-        </w:rPr>
+        <w:pStyle w:val="Ttulo5"/>
+      </w:pPr>
+      <w:r>
+        <w:lastRenderedPageBreak/>
+        <w:t>Servicio Cliente y Controlador</w:t>
+      </w:r>
+    </w:p>
+    <w:p>
+      <w:r>
         <w:drawing>
-          <wp:inline distT="0" distB="0" distL="0" distR="0" wp14:anchorId="1769BF1D" wp14:editId="649C17E9">
-            <wp:extent cx="5943600" cy="1065530"/>
-            <wp:effectExtent l="0" t="0" r="0" b="1270"/>
-            <wp:docPr id="13" name="Imagen 13"/>
+          <wp:inline distT="0" distB="0" distL="0" distR="0" wp14:anchorId="7440B915" wp14:editId="5EC707B9">
+            <wp:extent cx="5943600" cy="1724025"/>
+            <wp:effectExtent l="0" t="0" r="0" b="9525"/>
+            <wp:docPr id="49" name="Imagen 49"/>
             <wp:cNvGraphicFramePr>
               <a:graphicFrameLocks xmlns:a="http://schemas.openxmlformats.org/drawingml/2006/main" noChangeAspect="1"/>
             </wp:cNvGraphicFramePr>
@@ -5886,7 +5695,7 @@
                   <pic:spPr>
                     <a:xfrm>
                       <a:off x="0" y="0"/>
-                      <a:ext cx="5943600" cy="1065530"/>
+                      <a:ext cx="5943600" cy="1724025"/>
                     </a:xfrm>
                     <a:prstGeom prst="rect">
                       <a:avLst/>
@@ -5900,405 +5709,12 @@
       </w:r>
     </w:p>
     <w:p>
-      <w:pPr>
-        <w:pStyle w:val="Ttulo4"/>
-      </w:pPr>
-      <w:r>
-        <w:t>Explicación y Prueba de que Funciona</w:t>
-      </w:r>
-    </w:p>
-    <w:p>
-      <w:pPr>
-        <w:pStyle w:val="Ttulo5"/>
-      </w:pPr>
-      <w:proofErr w:type="spellStart"/>
-      <w:r>
-        <w:t>PasswordEncoder</w:t>
-      </w:r>
-      <w:proofErr w:type="spellEnd"/>
-      <w:r>
-        <w:t xml:space="preserve"> </w:t>
-      </w:r>
-      <w:r>
-        <w:rPr>
-          <w:lang w:val="en-US"/>
-        </w:rPr>
-        <w:t>(</w:t>
-      </w:r>
-      <w:r>
-        <w:t>Producto</w:t>
-      </w:r>
-      <w:r>
-        <w:t>)</w:t>
-      </w:r>
-    </w:p>
-    <w:p>
-      <w:r>
-        <w:t xml:space="preserve">Este componente representa el </w:t>
-      </w:r>
-      <w:r>
-        <w:rPr>
-          <w:b/>
-          <w:bCs/>
-        </w:rPr>
-        <w:t>producto</w:t>
-      </w:r>
-      <w:r>
-        <w:t xml:space="preserve"> dentro del patrón </w:t>
-      </w:r>
-      <w:r>
-        <w:rPr>
-          <w:b/>
-          <w:bCs/>
-        </w:rPr>
-        <w:t>Factory Method</w:t>
-      </w:r>
-      <w:r>
-        <w:t xml:space="preserve">. </w:t>
-      </w:r>
-      <w:proofErr w:type="spellStart"/>
-      <w:r>
-        <w:rPr>
-          <w:b/>
-          <w:bCs/>
-        </w:rPr>
-        <w:t>PasswordEncoder</w:t>
-      </w:r>
-      <w:proofErr w:type="spellEnd"/>
-      <w:r>
-        <w:t xml:space="preserve"> es una abstracción proporcionada por Spring Security que define las operaciones necesarias para trabajar con las contraseñas. Al utilizar esta abstracción, el resto del sistema no necesita conocer qué algoritmo concreto se está utilizando para realizar el cifrado.</w:t>
-      </w:r>
-    </w:p>
-    <w:p>
-      <w:pPr>
-        <w:pStyle w:val="Ttulo5"/>
-      </w:pPr>
-      <w:proofErr w:type="spellStart"/>
-      <w:r>
-        <w:t>BCryptPasswordEncoder</w:t>
-      </w:r>
-      <w:proofErr w:type="spellEnd"/>
-      <w:r>
-        <w:t xml:space="preserve"> </w:t>
-      </w:r>
-      <w:r>
-        <w:t>(</w:t>
-      </w:r>
-      <w:r>
-        <w:t>Producto Concreto</w:t>
-      </w:r>
-      <w:r>
-        <w:t>)</w:t>
-      </w:r>
-    </w:p>
-    <w:p>
-      <w:r>
-        <w:t xml:space="preserve">Esta clase representa el </w:t>
-      </w:r>
-      <w:r>
-        <w:rPr>
-          <w:b/>
-          <w:bCs/>
-        </w:rPr>
-        <w:t>producto concreto</w:t>
-      </w:r>
-      <w:r>
-        <w:t xml:space="preserve">, ya que es una implementación específica de </w:t>
-      </w:r>
-      <w:proofErr w:type="spellStart"/>
-      <w:r>
-        <w:rPr>
-          <w:b/>
-          <w:bCs/>
-        </w:rPr>
-        <w:t>PasswordEncoder</w:t>
-      </w:r>
-      <w:proofErr w:type="spellEnd"/>
-      <w:r>
-        <w:t xml:space="preserve">. En nuestro proyecto utilizamos </w:t>
-      </w:r>
-      <w:proofErr w:type="spellStart"/>
-      <w:r>
-        <w:rPr>
-          <w:b/>
-          <w:bCs/>
-        </w:rPr>
-        <w:t>BCrypt</w:t>
-      </w:r>
-      <w:proofErr w:type="spellEnd"/>
-      <w:r>
-        <w:t xml:space="preserve"> para realizar el procesamiento seguro de las contraseñas, pero gracias a que trabajamos con la abstracción </w:t>
-      </w:r>
-      <w:proofErr w:type="spellStart"/>
-      <w:r>
-        <w:rPr>
-          <w:b/>
-          <w:bCs/>
-        </w:rPr>
-        <w:t>PasswordEncoder</w:t>
-      </w:r>
-      <w:proofErr w:type="spellEnd"/>
-      <w:r>
-        <w:t>, esta implementación podría ser reemplazada por otra sin modificar los componentes que la utilizan.</w:t>
-      </w:r>
-    </w:p>
-    <w:p>
-      <w:pPr>
-        <w:pStyle w:val="Ttulo5"/>
-      </w:pPr>
-      <w:proofErr w:type="spellStart"/>
-      <w:r>
-        <w:t>SecurityConfig</w:t>
-      </w:r>
-      <w:proofErr w:type="spellEnd"/>
-      <w:r>
-        <w:t xml:space="preserve"> </w:t>
-      </w:r>
-      <w:r>
-        <w:t>(</w:t>
-      </w:r>
-      <w:r>
-        <w:t>Fábrica</w:t>
-      </w:r>
-      <w:r>
-        <w:t>)</w:t>
-      </w:r>
-    </w:p>
-    <w:p>
-      <w:r>
-        <w:t xml:space="preserve">En esta clase se encuentra la </w:t>
-      </w:r>
-      <w:r>
-        <w:rPr>
-          <w:b/>
-          <w:bCs/>
-        </w:rPr>
-        <w:t>fábrica del patrón</w:t>
-      </w:r>
-      <w:r>
-        <w:t xml:space="preserve">, ya que mediante el contenedor de Spring se define el método encargado de crear el </w:t>
-      </w:r>
-      <w:proofErr w:type="spellStart"/>
-      <w:r>
-        <w:rPr>
-          <w:b/>
-          <w:bCs/>
-        </w:rPr>
-        <w:t>PasswordEncoder</w:t>
-      </w:r>
-      <w:proofErr w:type="spellEnd"/>
-      <w:r>
-        <w:t xml:space="preserve">. Spring toma el objeto creado mediante este método y lo registra como un </w:t>
-      </w:r>
-      <w:proofErr w:type="spellStart"/>
-      <w:r>
-        <w:rPr>
-          <w:b/>
-          <w:bCs/>
-        </w:rPr>
-        <w:t>Bean</w:t>
-      </w:r>
-      <w:proofErr w:type="spellEnd"/>
-      <w:r>
-        <w:t>, permitiendo posteriormente que sea utilizado mediante inyección de dependencias en los componentes que lo necesiten.</w:t>
-      </w:r>
-    </w:p>
-    <w:p>
-      <w:pPr>
-        <w:pStyle w:val="Ttulo5"/>
-      </w:pPr>
-      <w:proofErr w:type="spellStart"/>
-      <w:r>
-        <w:lastRenderedPageBreak/>
-        <w:t>AuthenticationManager</w:t>
-      </w:r>
-      <w:proofErr w:type="spellEnd"/>
-      <w:r>
-        <w:t xml:space="preserve"> </w:t>
-      </w:r>
-      <w:r>
-        <w:t>(</w:t>
-      </w:r>
-      <w:r>
-        <w:t>Consumidor</w:t>
-      </w:r>
-      <w:r>
-        <w:t>)</w:t>
-      </w:r>
-    </w:p>
-    <w:p>
-      <w:r>
-        <w:t xml:space="preserve">Este componente representa el </w:t>
-      </w:r>
-      <w:r>
-        <w:rPr>
-          <w:b/>
-          <w:bCs/>
-        </w:rPr>
-        <w:t>consumidor</w:t>
-      </w:r>
-      <w:r>
-        <w:t xml:space="preserve"> del </w:t>
-      </w:r>
-      <w:r>
-        <w:rPr>
-          <w:b/>
-          <w:bCs/>
-        </w:rPr>
-        <w:t>producto</w:t>
-      </w:r>
-      <w:r>
-        <w:t xml:space="preserve">, ya que necesita un </w:t>
-      </w:r>
-      <w:proofErr w:type="spellStart"/>
-      <w:r>
-        <w:rPr>
-          <w:b/>
-          <w:bCs/>
-        </w:rPr>
-        <w:t>PasswordEncoder</w:t>
-      </w:r>
-      <w:proofErr w:type="spellEnd"/>
-      <w:r>
-        <w:t xml:space="preserve"> para realizar el proceso de autenticación. Lo importante es que </w:t>
-      </w:r>
-      <w:proofErr w:type="spellStart"/>
-      <w:r>
-        <w:rPr>
-          <w:b/>
-          <w:bCs/>
-        </w:rPr>
-        <w:t>AuthenticationManager</w:t>
-      </w:r>
-      <w:proofErr w:type="spellEnd"/>
-      <w:r>
-        <w:t xml:space="preserve"> trabaja con la abstracción </w:t>
-      </w:r>
-      <w:proofErr w:type="spellStart"/>
-      <w:r>
-        <w:rPr>
-          <w:b/>
-          <w:bCs/>
-        </w:rPr>
-        <w:t>PasswordEncoder</w:t>
-      </w:r>
-      <w:proofErr w:type="spellEnd"/>
-      <w:r>
-        <w:t xml:space="preserve"> y no necesita conocer directamente a </w:t>
-      </w:r>
-      <w:proofErr w:type="spellStart"/>
-      <w:r>
-        <w:rPr>
-          <w:b/>
-          <w:bCs/>
-        </w:rPr>
-        <w:t>BCryptPasswordEncoder</w:t>
-      </w:r>
-      <w:proofErr w:type="spellEnd"/>
-      <w:r>
-        <w:t>, demostrando, así como el Factory Method ayuda a reducir el acoplamiento entre ambos componentes.</w:t>
-      </w:r>
-    </w:p>
-    <w:p>
-      <w:pPr>
-        <w:pStyle w:val="Ttulo5"/>
-      </w:pPr>
-      <w:r>
-        <w:t>Funcionamiento</w:t>
-      </w:r>
-    </w:p>
-    <w:p>
-      <w:r>
-        <w:t xml:space="preserve">Ahora sí, para la prueba de funcionamiento, ya que todavía no contamos con una interfaz gráfica en el </w:t>
-      </w:r>
-      <w:proofErr w:type="spellStart"/>
-      <w:r>
-        <w:rPr>
-          <w:b/>
-          <w:bCs/>
-        </w:rPr>
-        <w:t>frontend</w:t>
-      </w:r>
-      <w:proofErr w:type="spellEnd"/>
-      <w:r>
-        <w:t xml:space="preserve">, utilizamos la herramienta </w:t>
-      </w:r>
-      <w:proofErr w:type="spellStart"/>
-      <w:r>
-        <w:rPr>
-          <w:b/>
-          <w:bCs/>
-        </w:rPr>
-        <w:t>Postman</w:t>
-      </w:r>
-      <w:proofErr w:type="spellEnd"/>
-      <w:r>
-        <w:t xml:space="preserve">, en la cual mandamos la siguiente petición a la </w:t>
-      </w:r>
-      <w:r>
-        <w:rPr>
-          <w:b/>
-          <w:bCs/>
-        </w:rPr>
-        <w:t>API.</w:t>
-      </w:r>
-    </w:p>
-    <w:p>
-      <w:r>
-        <w:rPr>
-          <w:b/>
-          <w:bCs/>
-        </w:rPr>
-        <w:t xml:space="preserve">NOTA: </w:t>
-      </w:r>
-      <w:r>
-        <w:t xml:space="preserve">Cabe resaltar que para esta prueba de autenticación del usuario </w:t>
-      </w:r>
-      <w:r>
-        <w:t>ya había un usuario creado en base de datos y trabajamos con</w:t>
-      </w:r>
-      <w:r>
-        <w:rPr>
-          <w:b/>
-          <w:bCs/>
-        </w:rPr>
-        <w:t xml:space="preserve"> </w:t>
-      </w:r>
-      <w:proofErr w:type="spellStart"/>
-      <w:r>
-        <w:rPr>
-          <w:b/>
-          <w:bCs/>
-        </w:rPr>
-        <w:t>Json</w:t>
-      </w:r>
-      <w:proofErr w:type="spellEnd"/>
-      <w:r>
-        <w:rPr>
-          <w:b/>
-          <w:bCs/>
-        </w:rPr>
-        <w:t xml:space="preserve"> Web Tokens </w:t>
-      </w:r>
-      <w:r>
-        <w:t>además de Spring Security.</w:t>
-      </w:r>
-    </w:p>
-    <w:p>
-      <w:r>
-        <w:t>El usuario creado en la base de datos es el siguiente:</w:t>
-      </w:r>
-    </w:p>
-    <w:p>
-      <w:r>
-        <w:rPr>
-          <w:noProof/>
-        </w:rPr>
+      <w:r>
         <w:drawing>
-          <wp:inline distT="0" distB="0" distL="0" distR="0" wp14:anchorId="280B21E2" wp14:editId="2AE3C75A">
-            <wp:extent cx="5943600" cy="338455"/>
-            <wp:effectExtent l="0" t="0" r="0" b="4445"/>
-            <wp:docPr id="15" name="Imagen 15"/>
+          <wp:inline distT="0" distB="0" distL="0" distR="0" wp14:anchorId="3038F62C" wp14:editId="5DFCEBA4">
+            <wp:extent cx="5943600" cy="2997835"/>
+            <wp:effectExtent l="0" t="0" r="0" b="0"/>
+            <wp:docPr id="50" name="Imagen 50"/>
             <wp:cNvGraphicFramePr>
               <a:graphicFrameLocks xmlns:a="http://schemas.openxmlformats.org/drawingml/2006/main" noChangeAspect="1"/>
             </wp:cNvGraphicFramePr>
@@ -6318,7 +5734,7 @@
                   <pic:spPr>
                     <a:xfrm>
                       <a:off x="0" y="0"/>
-                      <a:ext cx="5943600" cy="338455"/>
+                      <a:ext cx="5943600" cy="2997835"/>
                     </a:xfrm>
                     <a:prstGeom prst="rect">
                       <a:avLst/>
@@ -6332,58 +5748,149 @@
       </w:r>
     </w:p>
     <w:p>
-      <w:r>
-        <w:t xml:space="preserve">Como podemos ver, la contraseña del usuario ya se encuentra encriptada desde su creación, así que, para poder autenticar al usuario en el sistema, el </w:t>
+      <w:pPr>
+        <w:pStyle w:val="Ttulo4"/>
+      </w:pPr>
+      <w:r>
+        <w:t>Explicación y Prueba de que Funciona</w:t>
+      </w:r>
+    </w:p>
+    <w:p>
+      <w:r>
+        <w:t>Para comprender</w:t>
+      </w:r>
+      <w:r>
+        <w:t xml:space="preserve"> con claridad cómo se aplica el patrón Prototype en la arquitectura modular de almacenamiento de LogiSync, a continuación describimos la función que cumple cada uno de sus componentes:</w:t>
+      </w:r>
+    </w:p>
+    <w:p>
+      <w:pPr>
+        <w:pStyle w:val="Ttulo5"/>
+      </w:pPr>
+      <w:r>
+        <w:t>StorageSpacePrototype (Interfaz Prototipo)</w:t>
+      </w:r>
+    </w:p>
+    <w:p>
+      <w:r>
+        <w:t>Es la interfaz que declara e</w:t>
+      </w:r>
+      <w:r>
+        <w:t>l contrato formal de clonación dentro del patrón. Extiende de la interfaz Cloneable de Java y define la operación cloneSpace(String newName, Integer newCapacity). Su objetivo es desacoplar al cliente de las clases concretas, permitiéndole solicitar duplica</w:t>
+      </w:r>
+      <w:r>
+        <w:t>dos estructurales de cualquier configuración de almacenamiento sin acoplarse a su implementación interna.</w:t>
+      </w:r>
+    </w:p>
+    <w:p>
+      <w:pPr>
+        <w:pStyle w:val="Ttulo5"/>
+      </w:pPr>
+      <w:r>
+        <w:lastRenderedPageBreak/>
+        <w:t>RackLayoutTemplate (Prototipo Concreto)</w:t>
+      </w:r>
+    </w:p>
+    <w:p>
+      <w:r>
+        <w:t>Es la clase concreta que implementa la interfaz StorageSpacePrototype. Representa una plantilla reutilizable d</w:t>
+      </w:r>
+      <w:r>
+        <w:t>e distribución de estanterías y racks para celulares, almacenando el identificador del almacén, el número de niveles verticales, la capacidad de unidades por nivel y la lista de nombres de bahías (locationNames). En su método cloneSpace(...), efectúa una c</w:t>
+      </w:r>
+      <w:r>
+        <w:t>lonación profunda instanciando una nueva lista de ubicaciones a partir de la existente y retornando una nueva instancia de RackLayoutTemplate en memoria con los nuevos valores, garantizando que el objeto clonado sea totalmente independiente del original.</w:t>
+      </w:r>
+    </w:p>
+    <w:p>
+      <w:pPr>
+        <w:pStyle w:val="Ttulo5"/>
+      </w:pPr>
+      <w:r>
+        <w:t>S</w:t>
+      </w:r>
+      <w:r>
+        <w:t>torageSpace (Entidad de Dominio)</w:t>
+      </w:r>
+    </w:p>
+    <w:p>
+      <w:r>
+        <w:t xml:space="preserve">Representa la entidad física persistida en el almacén. Modela los espacios jerárquicos (ZONAS, RACKS, BAHÍAS) asegurando que cada nivel cumpla con las reglas del negocio: validación de pertenencia al mismo almacén activo y </w:t>
+      </w:r>
+      <w:r>
+        <w:t>asignación de capacidades estrictamente positivas a las ubicaciones finales donde se depositan los lotes de smartphones.</w:t>
+      </w:r>
+    </w:p>
+    <w:p>
+      <w:pPr>
+        <w:pStyle w:val="Ttulo5"/>
+      </w:pPr>
+      <w:r>
+        <w:t>StorageSpaceService y StorageSpaceController (Cliente / Consumidor)</w:t>
+      </w:r>
+    </w:p>
+    <w:p>
+      <w:r>
+        <w:t>StorageSpaceService es el servicio de aplicación encargado de orque</w:t>
+      </w:r>
+      <w:r>
+        <w:t xml:space="preserve">star la creación y administración de los espacios físicos en la bodega, delegando en los repositorios de persistencia. Por su parte, StorageSpaceController expone los puntos de entrada REST asegurados (requiriendo rol PRESIDENT) para registrar y consultar </w:t>
+      </w:r>
+      <w:r>
+        <w:t>las estructuras replicadas a través de peticiones HTTP.</w:t>
+      </w:r>
+    </w:p>
+    <w:p>
+      <w:pPr>
+        <w:pStyle w:val="Ttulo5"/>
+      </w:pPr>
+      <w:r>
+        <w:t>Funcionamiento</w:t>
+      </w:r>
+    </w:p>
+    <w:p>
+      <w:r>
+        <w:t xml:space="preserve">Para verificar el correcto funcionamiento del patrón Prototype en el sistema, se cuenta </w:t>
+      </w:r>
+      <w:r>
+        <w:t xml:space="preserve">con la </w:t>
+      </w:r>
+      <w:r>
+        <w:t>prueba funcional vía API REST (</w:t>
       </w:r>
       <w:proofErr w:type="spellStart"/>
       <w:r>
-        <w:rPr>
-          <w:b/>
-          <w:bCs/>
-        </w:rPr>
-        <w:t>AuthenticationManager</w:t>
+        <w:t>Postman</w:t>
       </w:r>
       <w:proofErr w:type="spellEnd"/>
       <w:r>
-        <w:rPr>
-          <w:b/>
-          <w:bCs/>
-        </w:rPr>
-        <w:t xml:space="preserve"> </w:t>
-      </w:r>
-      <w:r>
-        <w:t xml:space="preserve">de Spring Security deberá utilizar a </w:t>
+        <w:t xml:space="preserve"> o </w:t>
       </w:r>
       <w:proofErr w:type="spellStart"/>
       <w:r>
-        <w:rPr>
-          <w:b/>
-          <w:bCs/>
-        </w:rPr>
-        <w:t>BCryptPasswordEncoder</w:t>
+        <w:t>Swagger</w:t>
       </w:r>
       <w:proofErr w:type="spellEnd"/>
       <w:r>
-        <w:rPr>
-          <w:b/>
-          <w:bCs/>
-        </w:rPr>
-        <w:t xml:space="preserve"> </w:t>
-      </w:r>
-      <w:r>
-        <w:t>para ver si la contraseña ingresada por el usuario es igual a la de la base de datos. El resultado fue el siguiente:</w:t>
-      </w:r>
-    </w:p>
-    <w:p>
-      <w:r>
-        <w:rPr>
-          <w:noProof/>
-        </w:rPr>
+        <w:t xml:space="preserve"> UI).</w:t>
+      </w:r>
+    </w:p>
+    <w:p>
+      <w:r>
+        <w:t>Desde Postman o Swagger UI, enviamos una pe</w:t>
+      </w:r>
+      <w:r>
+        <w:t>tición POST al endpoint /api/warehouses/1/spaces para registrar un rack basado en la plantilla de alta capacidad para distribución de teléfonos celulares:</w:t>
+      </w:r>
+    </w:p>
+    <w:p>
+      <w:r>
+        <w:lastRenderedPageBreak/>
         <w:drawing>
-          <wp:inline distT="0" distB="0" distL="0" distR="0" wp14:anchorId="53F81A13" wp14:editId="3D487E8D">
-            <wp:extent cx="6170320" cy="2886075"/>
-            <wp:effectExtent l="0" t="0" r="1905" b="0"/>
-            <wp:docPr id="14" name="Imagen 14"/>
+          <wp:inline distT="0" distB="0" distL="0" distR="0" wp14:anchorId="0FD3AB5F" wp14:editId="46621176">
+            <wp:extent cx="5563376" cy="5953956"/>
+            <wp:effectExtent l="0" t="0" r="0" b="8890"/>
+            <wp:docPr id="51" name="Imagen 51"/>
             <wp:cNvGraphicFramePr>
               <a:graphicFrameLocks xmlns:a="http://schemas.openxmlformats.org/drawingml/2006/main" noChangeAspect="1"/>
             </wp:cNvGraphicFramePr>
@@ -6403,7 +5910,7 @@
                   <pic:spPr>
                     <a:xfrm>
                       <a:off x="0" y="0"/>
-                      <a:ext cx="6172583" cy="2887133"/>
+                      <a:ext cx="5563376" cy="5953956"/>
                     </a:xfrm>
                     <a:prstGeom prst="rect">
                       <a:avLst/>
@@ -6418,49 +5925,130 @@
     </w:p>
     <w:p>
       <w:pPr>
-        <w:rPr>
-          <w:b/>
-          <w:bCs/>
-        </w:rPr>
-      </w:pPr>
-      <w:r>
+        <w:pStyle w:val="Ttulo3"/>
+      </w:pPr>
+      <w:r>
+        <w:t>Aplicación del Patrón Factory Method</w:t>
+      </w:r>
+    </w:p>
+    <w:p>
+      <w:pPr>
+        <w:pStyle w:val="Ttulo4"/>
+      </w:pPr>
+      <w:r>
+        <w:t>Como está Colaborando este Patrón al Proyecto</w:t>
+      </w:r>
+    </w:p>
+    <w:p>
+      <w:r>
+        <w:t xml:space="preserve">En nuestro proyecto utilizamos Spring Framework, el cual cuenta con un contenedor de </w:t>
+      </w:r>
+      <w:r>
+        <w:rPr>
+          <w:b/>
+          <w:bCs/>
+        </w:rPr>
+        <w:t>Inversión de Control (</w:t>
+      </w:r>
+      <w:proofErr w:type="spellStart"/>
+      <w:r>
+        <w:rPr>
+          <w:b/>
+          <w:bCs/>
+        </w:rPr>
+        <w:t>IoC</w:t>
+      </w:r>
+      <w:proofErr w:type="spellEnd"/>
+      <w:r>
+        <w:rPr>
+          <w:b/>
+          <w:bCs/>
+        </w:rPr>
+        <w:t xml:space="preserve">) </w:t>
+      </w:r>
+      <w:r>
+        <w:t xml:space="preserve">encargado de crear y gestionar los objetos utilizados por la aplicación. Spring permite definir métodos de creación mediante la anotación </w:t>
+      </w:r>
+      <w:r>
+        <w:rPr>
+          <w:b/>
+          <w:bCs/>
+        </w:rPr>
+        <w:t>@Bean</w:t>
+      </w:r>
+      <w:r>
+        <w:t xml:space="preserve">, los cuales funcionan como un mecanismo de </w:t>
+      </w:r>
+      <w:r>
+        <w:rPr>
+          <w:b/>
+          <w:bCs/>
+        </w:rPr>
+        <w:t xml:space="preserve">Factory </w:t>
+      </w:r>
+      <w:r>
+        <w:rPr>
+          <w:b/>
+          <w:bCs/>
+        </w:rPr>
         <w:lastRenderedPageBreak/>
-        <w:t xml:space="preserve">Exitosamente la </w:t>
-      </w:r>
-      <w:r>
-        <w:rPr>
-          <w:b/>
-          <w:bCs/>
-        </w:rPr>
-        <w:t>API REST</w:t>
-      </w:r>
-      <w:r>
-        <w:t xml:space="preserve"> responde con código </w:t>
-      </w:r>
-      <w:r>
-        <w:rPr>
-          <w:b/>
-          <w:bCs/>
-        </w:rPr>
-        <w:t>http 200</w:t>
-      </w:r>
-      <w:r>
-        <w:t xml:space="preserve"> y con el cuerpo de la respuesta indicando el token JWT generado después de la autenticación. Por lo que indica que el proceso de encriptar la contraseña y compararla con la de la base de datos fue un </w:t>
-      </w:r>
-      <w:r>
-        <w:rPr>
-          <w:b/>
-          <w:bCs/>
-        </w:rPr>
-        <w:t>éxito.</w:t>
-      </w:r>
-    </w:p>
-    <w:p>
-      <w:pPr>
-        <w:pStyle w:val="Ttulo3"/>
-      </w:pPr>
-      <w:r>
-        <w:t>Aplicación del Patrón Builder</w:t>
+        <w:t>Method</w:t>
+      </w:r>
+      <w:r>
+        <w:t>, ya que encapsulan la creación de una instancia y permiten trabajar con una abstracción sin depender directamente de su implementación.</w:t>
+      </w:r>
+    </w:p>
+    <w:p>
+      <w:r>
+        <w:t xml:space="preserve">En nuestro caso, este patrón se utiliza principalmente en Spring Security para la creación de </w:t>
+      </w:r>
+      <w:proofErr w:type="spellStart"/>
+      <w:r>
+        <w:rPr>
+          <w:b/>
+          <w:bCs/>
+        </w:rPr>
+        <w:t>PasswordEncoder</w:t>
+      </w:r>
+      <w:proofErr w:type="spellEnd"/>
+      <w:r>
+        <w:t xml:space="preserve">, cuya implementación concreta es </w:t>
+      </w:r>
+      <w:proofErr w:type="spellStart"/>
+      <w:r>
+        <w:rPr>
+          <w:b/>
+          <w:bCs/>
+        </w:rPr>
+        <w:t>BCryptPasswordEncoder</w:t>
+      </w:r>
+      <w:proofErr w:type="spellEnd"/>
+      <w:r>
+        <w:t xml:space="preserve">. Esto permite que los componentes que necesitan procesar contraseñas dependan de </w:t>
+      </w:r>
+      <w:proofErr w:type="spellStart"/>
+      <w:r>
+        <w:rPr>
+          <w:b/>
+          <w:bCs/>
+        </w:rPr>
+        <w:t>PasswordEncoder</w:t>
+      </w:r>
+      <w:proofErr w:type="spellEnd"/>
+      <w:r>
+        <w:t xml:space="preserve"> y no directamente de </w:t>
+      </w:r>
+      <w:proofErr w:type="spellStart"/>
+      <w:r>
+        <w:rPr>
+          <w:b/>
+          <w:bCs/>
+        </w:rPr>
+        <w:t>BCrypt</w:t>
+      </w:r>
+      <w:proofErr w:type="spellEnd"/>
+      <w:r>
+        <w:t>, reduciendo el acoplamiento y facilitando un posible cambio de implementación. Además, al combinarse con la inyección de dependencias de Spring, la creación y gestión de estos componentes queda centralizada y facilita el mantenimiento del proyecto.</w:t>
       </w:r>
     </w:p>
     <w:p>
@@ -6468,35 +6056,25 @@
         <w:pStyle w:val="Ttulo4"/>
       </w:pPr>
       <w:r>
-        <w:t>Como está Colaborando</w:t>
-      </w:r>
-    </w:p>
-    <w:p>
-      <w:r>
-        <w:t xml:space="preserve">En el proceso de autenticación, el patrón Builder se utiliza para construir el token JWT que posteriormente será entregado al usuario. El token requiere varios datos de configuración, entre ellos el nombre de usuario, el rol, la fecha de emisión, la fecha de expiración y la firma criptográfica.  </w:t>
-      </w:r>
-    </w:p>
-    <w:p>
-      <w:pPr>
-        <w:pStyle w:val="Ttulo4"/>
-      </w:pPr>
-      <w:r>
         <w:t>Diagrama de Clases UML</w:t>
       </w:r>
     </w:p>
     <w:p>
       <w:pPr>
-        <w:jc w:val="center"/>
+        <w:rPr>
+          <w:lang w:val="en-US"/>
+        </w:rPr>
       </w:pPr>
       <w:r>
         <w:rPr>
           <w:noProof/>
+          <w:lang w:val="en-US"/>
         </w:rPr>
         <w:drawing>
-          <wp:inline distT="0" distB="0" distL="0" distR="0" wp14:anchorId="136B7C85" wp14:editId="5B981A99">
-            <wp:extent cx="5153025" cy="3668227"/>
-            <wp:effectExtent l="0" t="0" r="0" b="8890"/>
-            <wp:docPr id="26" name="Imagen 26"/>
+          <wp:inline distT="0" distB="0" distL="0" distR="0" wp14:anchorId="0D43FD4E" wp14:editId="2A28B20B">
+            <wp:extent cx="5943600" cy="2309495"/>
+            <wp:effectExtent l="0" t="0" r="0" b="0"/>
+            <wp:docPr id="21" name="Imagen 21"/>
             <wp:cNvGraphicFramePr>
               <a:graphicFrameLocks xmlns:a="http://schemas.openxmlformats.org/drawingml/2006/main" noChangeAspect="1"/>
             </wp:cNvGraphicFramePr>
@@ -6516,7 +6094,7 @@
                   <pic:spPr>
                     <a:xfrm>
                       <a:off x="0" y="0"/>
-                      <a:ext cx="5155104" cy="3669707"/>
+                      <a:ext cx="5943600" cy="2309495"/>
                     </a:xfrm>
                     <a:prstGeom prst="rect">
                       <a:avLst/>
@@ -6549,32 +6127,28 @@
           <w:b/>
           <w:bCs/>
         </w:rPr>
-        <w:t xml:space="preserve">Client / </w:t>
-      </w:r>
-      <w:proofErr w:type="gramStart"/>
-      <w:r>
-        <w:rPr>
-          <w:b/>
-          <w:bCs/>
-        </w:rPr>
-        <w:t>Director</w:t>
-      </w:r>
-      <w:proofErr w:type="gramEnd"/>
+        <w:t>Fabrica</w:t>
+      </w:r>
     </w:p>
     <w:p>
       <w:pPr>
         <w:jc w:val="center"/>
-      </w:pPr>
-      <w:r>
-        <w:rPr>
+        <w:rPr>
+          <w:b/>
+          <w:bCs/>
+        </w:rPr>
+      </w:pPr>
+      <w:r>
+        <w:rPr>
+          <w:b/>
+          <w:bCs/>
           <w:noProof/>
         </w:rPr>
-        <w:lastRenderedPageBreak/>
         <w:drawing>
-          <wp:inline distT="0" distB="0" distL="0" distR="0" wp14:anchorId="352844FC" wp14:editId="769BDC22">
-            <wp:extent cx="4448175" cy="2416082"/>
-            <wp:effectExtent l="0" t="0" r="0" b="3810"/>
-            <wp:docPr id="25" name="Imagen 25"/>
+          <wp:inline distT="0" distB="0" distL="0" distR="0" wp14:anchorId="3534E270" wp14:editId="48DFBBED">
+            <wp:extent cx="2772162" cy="876422"/>
+            <wp:effectExtent l="0" t="0" r="9525" b="0"/>
+            <wp:docPr id="8" name="Imagen 8"/>
             <wp:cNvGraphicFramePr>
               <a:graphicFrameLocks xmlns:a="http://schemas.openxmlformats.org/drawingml/2006/main" noChangeAspect="1"/>
             </wp:cNvGraphicFramePr>
@@ -6594,7 +6168,7 @@
                   <pic:spPr>
                     <a:xfrm>
                       <a:off x="0" y="0"/>
-                      <a:ext cx="4453506" cy="2418978"/>
+                      <a:ext cx="2772162" cy="876422"/>
                     </a:xfrm>
                     <a:prstGeom prst="rect">
                       <a:avLst/>
@@ -6620,22 +6194,29 @@
           <w:b/>
           <w:bCs/>
         </w:rPr>
-        <w:t>Interface</w:t>
+        <w:t>Producto</w:t>
       </w:r>
     </w:p>
     <w:p>
       <w:pPr>
         <w:jc w:val="center"/>
-      </w:pPr>
-      <w:r>
-        <w:rPr>
+        <w:rPr>
+          <w:b/>
+          <w:bCs/>
+        </w:rPr>
+      </w:pPr>
+      <w:r>
+        <w:rPr>
+          <w:b/>
+          <w:bCs/>
           <w:noProof/>
         </w:rPr>
+        <w:lastRenderedPageBreak/>
         <w:drawing>
-          <wp:inline distT="0" distB="0" distL="0" distR="0" wp14:anchorId="34DC3B85" wp14:editId="15BE933A">
-            <wp:extent cx="5062655" cy="3762375"/>
-            <wp:effectExtent l="0" t="0" r="5080" b="0"/>
-            <wp:docPr id="17" name="Imagen 17"/>
+          <wp:inline distT="0" distB="0" distL="0" distR="0" wp14:anchorId="5967A4D5" wp14:editId="4D982305">
+            <wp:extent cx="5943600" cy="2326005"/>
+            <wp:effectExtent l="0" t="0" r="0" b="0"/>
+            <wp:docPr id="10" name="Imagen 10"/>
             <wp:cNvGraphicFramePr>
               <a:graphicFrameLocks xmlns:a="http://schemas.openxmlformats.org/drawingml/2006/main" noChangeAspect="1"/>
             </wp:cNvGraphicFramePr>
@@ -6655,7 +6236,7 @@
                   <pic:spPr>
                     <a:xfrm>
                       <a:off x="0" y="0"/>
-                      <a:ext cx="5070931" cy="3768525"/>
+                      <a:ext cx="5943600" cy="2326005"/>
                     </a:xfrm>
                     <a:prstGeom prst="rect">
                       <a:avLst/>
@@ -6670,18 +6251,39 @@
     </w:p>
     <w:p>
       <w:pPr>
-        <w:jc w:val="center"/>
-      </w:pPr>
-      <w:r>
-        <w:rPr>
+        <w:jc w:val="left"/>
+        <w:rPr>
+          <w:b/>
+          <w:bCs/>
+        </w:rPr>
+      </w:pPr>
+      <w:r>
+        <w:rPr>
+          <w:b/>
+          <w:bCs/>
+        </w:rPr>
+        <w:t>Producto Concreto</w:t>
+      </w:r>
+    </w:p>
+    <w:p>
+      <w:pPr>
+        <w:jc w:val="left"/>
+        <w:rPr>
+          <w:b/>
+          <w:bCs/>
+        </w:rPr>
+      </w:pPr>
+      <w:r>
+        <w:rPr>
+          <w:b/>
+          <w:bCs/>
           <w:noProof/>
         </w:rPr>
-        <w:lastRenderedPageBreak/>
         <w:drawing>
-          <wp:inline distT="0" distB="0" distL="0" distR="0" wp14:anchorId="52FF695D" wp14:editId="1F2ABA3C">
-            <wp:extent cx="4819650" cy="2053500"/>
-            <wp:effectExtent l="0" t="0" r="0" b="4445"/>
-            <wp:docPr id="18" name="Imagen 18"/>
+          <wp:inline distT="0" distB="0" distL="0" distR="0" wp14:anchorId="2CE39E17" wp14:editId="11D974B8">
+            <wp:extent cx="5943600" cy="4246880"/>
+            <wp:effectExtent l="0" t="0" r="0" b="1270"/>
+            <wp:docPr id="11" name="Imagen 11"/>
             <wp:cNvGraphicFramePr>
               <a:graphicFrameLocks xmlns:a="http://schemas.openxmlformats.org/drawingml/2006/main" noChangeAspect="1"/>
             </wp:cNvGraphicFramePr>
@@ -6701,7 +6303,7 @@
                   <pic:spPr>
                     <a:xfrm>
                       <a:off x="0" y="0"/>
-                      <a:ext cx="4827343" cy="2056778"/>
+                      <a:ext cx="5943600" cy="4246880"/>
                     </a:xfrm>
                     <a:prstGeom prst="rect">
                       <a:avLst/>
@@ -6716,17 +6318,24 @@
     </w:p>
     <w:p>
       <w:pPr>
-        <w:jc w:val="center"/>
-      </w:pPr>
-      <w:r>
-        <w:rPr>
+        <w:jc w:val="left"/>
+        <w:rPr>
+          <w:b/>
+          <w:bCs/>
+        </w:rPr>
+      </w:pPr>
+      <w:r>
+        <w:rPr>
+          <w:b/>
+          <w:bCs/>
           <w:noProof/>
         </w:rPr>
+        <w:lastRenderedPageBreak/>
         <w:drawing>
-          <wp:inline distT="0" distB="0" distL="0" distR="0" wp14:anchorId="2474CBC7" wp14:editId="16CB14E7">
-            <wp:extent cx="4886325" cy="1970713"/>
-            <wp:effectExtent l="0" t="0" r="0" b="0"/>
-            <wp:docPr id="19" name="Imagen 19"/>
+          <wp:inline distT="0" distB="0" distL="0" distR="0" wp14:anchorId="2FF49B68" wp14:editId="45726220">
+            <wp:extent cx="5943600" cy="1198245"/>
+            <wp:effectExtent l="0" t="0" r="0" b="1905"/>
+            <wp:docPr id="12" name="Imagen 12"/>
             <wp:cNvGraphicFramePr>
               <a:graphicFrameLocks xmlns:a="http://schemas.openxmlformats.org/drawingml/2006/main" noChangeAspect="1"/>
             </wp:cNvGraphicFramePr>
@@ -6746,7 +6355,7 @@
                   <pic:spPr>
                     <a:xfrm>
                       <a:off x="0" y="0"/>
-                      <a:ext cx="4899076" cy="1975856"/>
+                      <a:ext cx="5943600" cy="1198245"/>
                     </a:xfrm>
                     <a:prstGeom prst="rect">
                       <a:avLst/>
@@ -6761,17 +6370,40 @@
     </w:p>
     <w:p>
       <w:pPr>
-        <w:jc w:val="center"/>
-      </w:pPr>
-      <w:r>
-        <w:rPr>
+        <w:jc w:val="left"/>
+        <w:rPr>
+          <w:b/>
+          <w:bCs/>
+          <w:lang w:val="en-US"/>
+        </w:rPr>
+      </w:pPr>
+      <w:r>
+        <w:rPr>
+          <w:b/>
+          <w:bCs/>
+        </w:rPr>
+        <w:t>Consumidor</w:t>
+      </w:r>
+    </w:p>
+    <w:p>
+      <w:pPr>
+        <w:jc w:val="left"/>
+        <w:rPr>
+          <w:b/>
+          <w:bCs/>
+        </w:rPr>
+      </w:pPr>
+      <w:r>
+        <w:rPr>
+          <w:b/>
+          <w:bCs/>
           <w:noProof/>
         </w:rPr>
         <w:drawing>
-          <wp:inline distT="0" distB="0" distL="0" distR="0" wp14:anchorId="6E0BFF47" wp14:editId="6104B3A6">
-            <wp:extent cx="4879792" cy="2257425"/>
-            <wp:effectExtent l="0" t="0" r="0" b="0"/>
-            <wp:docPr id="20" name="Imagen 20"/>
+          <wp:inline distT="0" distB="0" distL="0" distR="0" wp14:anchorId="1769BF1D" wp14:editId="649C17E9">
+            <wp:extent cx="5943600" cy="1065530"/>
+            <wp:effectExtent l="0" t="0" r="0" b="1270"/>
+            <wp:docPr id="13" name="Imagen 13"/>
             <wp:cNvGraphicFramePr>
               <a:graphicFrameLocks xmlns:a="http://schemas.openxmlformats.org/drawingml/2006/main" noChangeAspect="1"/>
             </wp:cNvGraphicFramePr>
@@ -6791,7 +6423,7 @@
                   <pic:spPr>
                     <a:xfrm>
                       <a:off x="0" y="0"/>
-                      <a:ext cx="4884419" cy="2259566"/>
+                      <a:ext cx="5943600" cy="1065530"/>
                     </a:xfrm>
                     <a:prstGeom prst="rect">
                       <a:avLst/>
@@ -6806,18 +6438,392 @@
     </w:p>
     <w:p>
       <w:pPr>
-        <w:jc w:val="left"/>
-        <w:rPr>
-          <w:b/>
-          <w:bCs/>
-        </w:rPr>
-      </w:pPr>
-      <w:r>
-        <w:rPr>
-          <w:b/>
-          <w:bCs/>
-        </w:rPr>
-        <w:t>Concrete Builder</w:t>
+        <w:pStyle w:val="Ttulo4"/>
+      </w:pPr>
+      <w:r>
+        <w:t>Explicación y Prueba de que Funciona</w:t>
+      </w:r>
+    </w:p>
+    <w:p>
+      <w:pPr>
+        <w:pStyle w:val="Ttulo5"/>
+      </w:pPr>
+      <w:proofErr w:type="spellStart"/>
+      <w:r>
+        <w:t>PasswordEncoder</w:t>
+      </w:r>
+      <w:proofErr w:type="spellEnd"/>
+      <w:r>
+        <w:t xml:space="preserve"> </w:t>
+      </w:r>
+      <w:r>
+        <w:rPr>
+          <w:lang w:val="en-US"/>
+        </w:rPr>
+        <w:t>(</w:t>
+      </w:r>
+      <w:r>
+        <w:t>Producto</w:t>
+      </w:r>
+      <w:r>
+        <w:t>)</w:t>
+      </w:r>
+    </w:p>
+    <w:p>
+      <w:r>
+        <w:t xml:space="preserve">Este componente representa el </w:t>
+      </w:r>
+      <w:r>
+        <w:rPr>
+          <w:b/>
+          <w:bCs/>
+        </w:rPr>
+        <w:t>producto</w:t>
+      </w:r>
+      <w:r>
+        <w:t xml:space="preserve"> dentro del patrón </w:t>
+      </w:r>
+      <w:r>
+        <w:rPr>
+          <w:b/>
+          <w:bCs/>
+        </w:rPr>
+        <w:t>Factory Method</w:t>
+      </w:r>
+      <w:r>
+        <w:t xml:space="preserve">. </w:t>
+      </w:r>
+      <w:proofErr w:type="spellStart"/>
+      <w:r>
+        <w:rPr>
+          <w:b/>
+          <w:bCs/>
+        </w:rPr>
+        <w:t>PasswordEncoder</w:t>
+      </w:r>
+      <w:proofErr w:type="spellEnd"/>
+      <w:r>
+        <w:t xml:space="preserve"> es una abstracción proporcionada por Spring Security que define las operaciones necesarias para trabajar con las contraseñas. Al utilizar esta abstracción, el resto del sistema no necesita conocer qué algoritmo concreto se está utilizando para realizar el cifrado.</w:t>
+      </w:r>
+    </w:p>
+    <w:p>
+      <w:pPr>
+        <w:pStyle w:val="Ttulo5"/>
+      </w:pPr>
+      <w:proofErr w:type="spellStart"/>
+      <w:r>
+        <w:t>BCryptPasswordEncoder</w:t>
+      </w:r>
+      <w:proofErr w:type="spellEnd"/>
+      <w:r>
+        <w:t xml:space="preserve"> </w:t>
+      </w:r>
+      <w:r>
+        <w:t>(</w:t>
+      </w:r>
+      <w:r>
+        <w:t>Producto Concreto</w:t>
+      </w:r>
+      <w:r>
+        <w:t>)</w:t>
+      </w:r>
+    </w:p>
+    <w:p>
+      <w:r>
+        <w:t xml:space="preserve">Esta clase representa el </w:t>
+      </w:r>
+      <w:r>
+        <w:rPr>
+          <w:b/>
+          <w:bCs/>
+        </w:rPr>
+        <w:t>producto concreto</w:t>
+      </w:r>
+      <w:r>
+        <w:t xml:space="preserve">, ya que es una implementación específica de </w:t>
+      </w:r>
+      <w:proofErr w:type="spellStart"/>
+      <w:r>
+        <w:rPr>
+          <w:b/>
+          <w:bCs/>
+        </w:rPr>
+        <w:t>PasswordEncoder</w:t>
+      </w:r>
+      <w:proofErr w:type="spellEnd"/>
+      <w:r>
+        <w:t xml:space="preserve">. En nuestro proyecto utilizamos </w:t>
+      </w:r>
+      <w:proofErr w:type="spellStart"/>
+      <w:r>
+        <w:rPr>
+          <w:b/>
+          <w:bCs/>
+        </w:rPr>
+        <w:t>BCrypt</w:t>
+      </w:r>
+      <w:proofErr w:type="spellEnd"/>
+      <w:r>
+        <w:t xml:space="preserve"> para realizar el procesamiento seguro de las contraseñas, pero gracias a que trabajamos con la abstracción </w:t>
+      </w:r>
+      <w:proofErr w:type="spellStart"/>
+      <w:r>
+        <w:rPr>
+          <w:b/>
+          <w:bCs/>
+        </w:rPr>
+        <w:t>PasswordEncoder</w:t>
+      </w:r>
+      <w:proofErr w:type="spellEnd"/>
+      <w:r>
+        <w:t>, esta implementación podría ser reemplazada por otra sin modificar los componentes que la utilizan.</w:t>
+      </w:r>
+    </w:p>
+    <w:p>
+      <w:pPr>
+        <w:pStyle w:val="Ttulo5"/>
+      </w:pPr>
+      <w:proofErr w:type="spellStart"/>
+      <w:r>
+        <w:t>SecurityConfig</w:t>
+      </w:r>
+      <w:proofErr w:type="spellEnd"/>
+      <w:r>
+        <w:t xml:space="preserve"> </w:t>
+      </w:r>
+      <w:r>
+        <w:t>(</w:t>
+      </w:r>
+      <w:r>
+        <w:t>Fábrica</w:t>
+      </w:r>
+      <w:r>
+        <w:t>)</w:t>
+      </w:r>
+    </w:p>
+    <w:p>
+      <w:r>
+        <w:t xml:space="preserve">En esta clase se encuentra la </w:t>
+      </w:r>
+      <w:r>
+        <w:rPr>
+          <w:b/>
+          <w:bCs/>
+        </w:rPr>
+        <w:t>fábrica del patrón</w:t>
+      </w:r>
+      <w:r>
+        <w:t xml:space="preserve">, ya que mediante el contenedor de Spring se define el método encargado de crear el </w:t>
+      </w:r>
+      <w:proofErr w:type="spellStart"/>
+      <w:r>
+        <w:rPr>
+          <w:b/>
+          <w:bCs/>
+        </w:rPr>
+        <w:t>PasswordEncoder</w:t>
+      </w:r>
+      <w:proofErr w:type="spellEnd"/>
+      <w:r>
+        <w:t xml:space="preserve">. Spring toma el objeto creado mediante este método y lo registra como un </w:t>
+      </w:r>
+      <w:proofErr w:type="spellStart"/>
+      <w:r>
+        <w:rPr>
+          <w:b/>
+          <w:bCs/>
+        </w:rPr>
+        <w:t>Bean</w:t>
+      </w:r>
+      <w:proofErr w:type="spellEnd"/>
+      <w:r>
+        <w:t>, permitiendo posteriormente que sea utilizado mediante inyección de dependencias en los componentes que lo necesiten.</w:t>
+      </w:r>
+    </w:p>
+    <w:p>
+      <w:pPr>
+        <w:pStyle w:val="Ttulo5"/>
+      </w:pPr>
+      <w:proofErr w:type="spellStart"/>
+      <w:r>
+        <w:lastRenderedPageBreak/>
+        <w:t>AuthenticationManager</w:t>
+      </w:r>
+      <w:proofErr w:type="spellEnd"/>
+      <w:r>
+        <w:t xml:space="preserve"> </w:t>
+      </w:r>
+      <w:r>
+        <w:t>(</w:t>
+      </w:r>
+      <w:r>
+        <w:t>Consumidor</w:t>
+      </w:r>
+      <w:r>
+        <w:t>)</w:t>
+      </w:r>
+    </w:p>
+    <w:p>
+      <w:r>
+        <w:t xml:space="preserve">Este componente representa el </w:t>
+      </w:r>
+      <w:r>
+        <w:rPr>
+          <w:b/>
+          <w:bCs/>
+        </w:rPr>
+        <w:t>consumidor</w:t>
+      </w:r>
+      <w:r>
+        <w:t xml:space="preserve"> del </w:t>
+      </w:r>
+      <w:r>
+        <w:rPr>
+          <w:b/>
+          <w:bCs/>
+        </w:rPr>
+        <w:t>producto</w:t>
+      </w:r>
+      <w:r>
+        <w:t xml:space="preserve">, ya que necesita un </w:t>
+      </w:r>
+      <w:proofErr w:type="spellStart"/>
+      <w:r>
+        <w:rPr>
+          <w:b/>
+          <w:bCs/>
+        </w:rPr>
+        <w:t>PasswordEncoder</w:t>
+      </w:r>
+      <w:proofErr w:type="spellEnd"/>
+      <w:r>
+        <w:t xml:space="preserve"> para realizar el proceso de autenticación. Lo importante es que </w:t>
+      </w:r>
+      <w:proofErr w:type="spellStart"/>
+      <w:r>
+        <w:rPr>
+          <w:b/>
+          <w:bCs/>
+        </w:rPr>
+        <w:t>AuthenticationManager</w:t>
+      </w:r>
+      <w:proofErr w:type="spellEnd"/>
+      <w:r>
+        <w:t xml:space="preserve"> trabaja con la abstracción </w:t>
+      </w:r>
+      <w:proofErr w:type="spellStart"/>
+      <w:r>
+        <w:rPr>
+          <w:b/>
+          <w:bCs/>
+        </w:rPr>
+        <w:t>PasswordEncoder</w:t>
+      </w:r>
+      <w:proofErr w:type="spellEnd"/>
+      <w:r>
+        <w:t xml:space="preserve"> y no necesita conocer directamente a </w:t>
+      </w:r>
+      <w:proofErr w:type="spellStart"/>
+      <w:r>
+        <w:rPr>
+          <w:b/>
+          <w:bCs/>
+        </w:rPr>
+        <w:t>BCryptPasswordEncoder</w:t>
+      </w:r>
+      <w:proofErr w:type="spellEnd"/>
+      <w:r>
+        <w:t>, demostrando, así como el Factory Method ayuda a reducir el acoplamiento entre ambos componentes.</w:t>
+      </w:r>
+    </w:p>
+    <w:p>
+      <w:pPr>
+        <w:pStyle w:val="Ttulo5"/>
+      </w:pPr>
+      <w:r>
+        <w:t>Funcionamiento</w:t>
+      </w:r>
+    </w:p>
+    <w:p>
+      <w:r>
+        <w:t xml:space="preserve">Ahora sí, para la prueba de funcionamiento, ya que todavía no contamos con una interfaz gráfica en el </w:t>
+      </w:r>
+      <w:proofErr w:type="spellStart"/>
+      <w:r>
+        <w:rPr>
+          <w:b/>
+          <w:bCs/>
+        </w:rPr>
+        <w:t>frontend</w:t>
+      </w:r>
+      <w:proofErr w:type="spellEnd"/>
+      <w:r>
+        <w:t xml:space="preserve">, utilizamos la herramienta </w:t>
+      </w:r>
+      <w:proofErr w:type="spellStart"/>
+      <w:r>
+        <w:rPr>
+          <w:b/>
+          <w:bCs/>
+        </w:rPr>
+        <w:t>Postman</w:t>
+      </w:r>
+      <w:proofErr w:type="spellEnd"/>
+      <w:r>
+        <w:t xml:space="preserve">, en la cual mandamos la siguiente petición a la </w:t>
+      </w:r>
+      <w:r>
+        <w:rPr>
+          <w:b/>
+          <w:bCs/>
+        </w:rPr>
+        <w:t>API.</w:t>
+      </w:r>
+    </w:p>
+    <w:p>
+      <w:r>
+        <w:rPr>
+          <w:b/>
+          <w:bCs/>
+        </w:rPr>
+        <w:t xml:space="preserve">NOTA: </w:t>
+      </w:r>
+      <w:r>
+        <w:t xml:space="preserve">Cabe resaltar que para esta prueba de autenticación del usuario </w:t>
+      </w:r>
+      <w:r>
+        <w:t>ya había un usuario creado en base de datos y trabajamos con</w:t>
+      </w:r>
+      <w:r>
+        <w:rPr>
+          <w:b/>
+          <w:bCs/>
+        </w:rPr>
+        <w:t xml:space="preserve"> </w:t>
+      </w:r>
+      <w:proofErr w:type="spellStart"/>
+      <w:r>
+        <w:rPr>
+          <w:b/>
+          <w:bCs/>
+        </w:rPr>
+        <w:t>Json</w:t>
+      </w:r>
+      <w:proofErr w:type="spellEnd"/>
+      <w:r>
+        <w:rPr>
+          <w:b/>
+          <w:bCs/>
+        </w:rPr>
+        <w:t xml:space="preserve"> Web Tokens </w:t>
+      </w:r>
+      <w:r>
+        <w:t>además de Spring Security.</w:t>
+      </w:r>
+    </w:p>
+    <w:p>
+      <w:r>
+        <w:t>El usuario creado en la base de datos es el siguiente:</w:t>
       </w:r>
     </w:p>
     <w:p>
@@ -6825,12 +6831,11 @@
         <w:rPr>
           <w:noProof/>
         </w:rPr>
-        <w:lastRenderedPageBreak/>
         <w:drawing>
-          <wp:inline distT="0" distB="0" distL="0" distR="0" wp14:anchorId="5B52A8C3" wp14:editId="25DA4955">
-            <wp:extent cx="5943600" cy="2004695"/>
-            <wp:effectExtent l="0" t="0" r="0" b="0"/>
-            <wp:docPr id="22" name="Imagen 22"/>
+          <wp:inline distT="0" distB="0" distL="0" distR="0" wp14:anchorId="280B21E2" wp14:editId="2AE3C75A">
+            <wp:extent cx="5943600" cy="338455"/>
+            <wp:effectExtent l="0" t="0" r="0" b="4445"/>
+            <wp:docPr id="15" name="Imagen 15"/>
             <wp:cNvGraphicFramePr>
               <a:graphicFrameLocks xmlns:a="http://schemas.openxmlformats.org/drawingml/2006/main" noChangeAspect="1"/>
             </wp:cNvGraphicFramePr>
@@ -6850,7 +6855,7 @@
                   <pic:spPr>
                     <a:xfrm>
                       <a:off x="0" y="0"/>
-                      <a:ext cx="5943600" cy="2004695"/>
+                      <a:ext cx="5943600" cy="338455"/>
                     </a:xfrm>
                     <a:prstGeom prst="rect">
                       <a:avLst/>
@@ -6864,18 +6869,58 @@
       </w:r>
     </w:p>
     <w:p>
-      <w:pPr>
-        <w:jc w:val="center"/>
-      </w:pPr>
+      <w:r>
+        <w:t xml:space="preserve">Como podemos ver, la contraseña del usuario ya se encuentra encriptada desde su creación, así que, para poder autenticar al usuario en el sistema, el </w:t>
+      </w:r>
+      <w:proofErr w:type="spellStart"/>
+      <w:r>
+        <w:rPr>
+          <w:b/>
+          <w:bCs/>
+        </w:rPr>
+        <w:t>AuthenticationManager</w:t>
+      </w:r>
+      <w:proofErr w:type="spellEnd"/>
+      <w:r>
+        <w:rPr>
+          <w:b/>
+          <w:bCs/>
+        </w:rPr>
+        <w:t xml:space="preserve"> </w:t>
+      </w:r>
+      <w:r>
+        <w:t xml:space="preserve">de Spring Security deberá utilizar a </w:t>
+      </w:r>
+      <w:proofErr w:type="spellStart"/>
+      <w:r>
+        <w:rPr>
+          <w:b/>
+          <w:bCs/>
+        </w:rPr>
+        <w:t>BCryptPasswordEncoder</w:t>
+      </w:r>
+      <w:proofErr w:type="spellEnd"/>
+      <w:r>
+        <w:rPr>
+          <w:b/>
+          <w:bCs/>
+        </w:rPr>
+        <w:t xml:space="preserve"> </w:t>
+      </w:r>
+      <w:r>
+        <w:t>para ver si la contraseña ingresada por el usuario es igual a la de la base de datos. El resultado fue el siguiente:</w:t>
+      </w:r>
+    </w:p>
+    <w:p>
       <w:r>
         <w:rPr>
           <w:noProof/>
         </w:rPr>
         <w:drawing>
-          <wp:inline distT="0" distB="0" distL="0" distR="0" wp14:anchorId="03986789" wp14:editId="4BA28EE2">
-            <wp:extent cx="4676775" cy="851913"/>
-            <wp:effectExtent l="0" t="0" r="0" b="5715"/>
-            <wp:docPr id="23" name="Imagen 23"/>
+          <wp:inline distT="0" distB="0" distL="0" distR="0" wp14:anchorId="53F81A13" wp14:editId="3D487E8D">
+            <wp:extent cx="6170320" cy="2886075"/>
+            <wp:effectExtent l="0" t="0" r="1905" b="0"/>
+            <wp:docPr id="14" name="Imagen 14"/>
             <wp:cNvGraphicFramePr>
               <a:graphicFrameLocks xmlns:a="http://schemas.openxmlformats.org/drawingml/2006/main" noChangeAspect="1"/>
             </wp:cNvGraphicFramePr>
@@ -6895,7 +6940,7 @@
                   <pic:spPr>
                     <a:xfrm>
                       <a:off x="0" y="0"/>
-                      <a:ext cx="4694262" cy="855098"/>
+                      <a:ext cx="6172583" cy="2887133"/>
                     </a:xfrm>
                     <a:prstGeom prst="rect">
                       <a:avLst/>
@@ -6910,6 +6955,74 @@
     </w:p>
     <w:p>
       <w:pPr>
+        <w:rPr>
+          <w:b/>
+          <w:bCs/>
+        </w:rPr>
+      </w:pPr>
+      <w:r>
+        <w:lastRenderedPageBreak/>
+        <w:t xml:space="preserve">Exitosamente la </w:t>
+      </w:r>
+      <w:r>
+        <w:rPr>
+          <w:b/>
+          <w:bCs/>
+        </w:rPr>
+        <w:t>API REST</w:t>
+      </w:r>
+      <w:r>
+        <w:t xml:space="preserve"> responde con código </w:t>
+      </w:r>
+      <w:r>
+        <w:rPr>
+          <w:b/>
+          <w:bCs/>
+        </w:rPr>
+        <w:t>http 200</w:t>
+      </w:r>
+      <w:r>
+        <w:t xml:space="preserve"> y con el cuerpo de la respuesta indicando el token JWT generado después de la autenticación. Por lo que indica que el proceso de encriptar la contraseña y compararla con la de la base de datos fue un </w:t>
+      </w:r>
+      <w:r>
+        <w:rPr>
+          <w:b/>
+          <w:bCs/>
+        </w:rPr>
+        <w:t>éxito.</w:t>
+      </w:r>
+    </w:p>
+    <w:p>
+      <w:pPr>
+        <w:pStyle w:val="Ttulo3"/>
+      </w:pPr>
+      <w:r>
+        <w:t>Aplicación del Patrón Builder</w:t>
+      </w:r>
+    </w:p>
+    <w:p>
+      <w:pPr>
+        <w:pStyle w:val="Ttulo4"/>
+      </w:pPr>
+      <w:r>
+        <w:t>Como está Colaborando</w:t>
+      </w:r>
+    </w:p>
+    <w:p>
+      <w:r>
+        <w:t xml:space="preserve">En el proceso de autenticación, el patrón Builder se utiliza para construir el token JWT que posteriormente será entregado al usuario. El token requiere varios datos de configuración, entre ellos el nombre de usuario, el rol, la fecha de emisión, la fecha de expiración y la firma criptográfica.  </w:t>
+      </w:r>
+    </w:p>
+    <w:p>
+      <w:pPr>
+        <w:pStyle w:val="Ttulo4"/>
+      </w:pPr>
+      <w:r>
+        <w:t>Diagrama de Clases UML</w:t>
+      </w:r>
+    </w:p>
+    <w:p>
+      <w:pPr>
         <w:jc w:val="center"/>
       </w:pPr>
       <w:r>
@@ -6917,10 +7030,10 @@
           <w:noProof/>
         </w:rPr>
         <w:drawing>
-          <wp:inline distT="0" distB="0" distL="0" distR="0" wp14:anchorId="6409BE82" wp14:editId="14230D7D">
-            <wp:extent cx="4498141" cy="3019425"/>
-            <wp:effectExtent l="0" t="0" r="0" b="0"/>
-            <wp:docPr id="24" name="Imagen 24"/>
+          <wp:inline distT="0" distB="0" distL="0" distR="0" wp14:anchorId="136B7C85" wp14:editId="5B981A99">
+            <wp:extent cx="5153025" cy="3668227"/>
+            <wp:effectExtent l="0" t="0" r="0" b="8890"/>
+            <wp:docPr id="26" name="Imagen 26"/>
             <wp:cNvGraphicFramePr>
               <a:graphicFrameLocks xmlns:a="http://schemas.openxmlformats.org/drawingml/2006/main" noChangeAspect="1"/>
             </wp:cNvGraphicFramePr>
@@ -6940,7 +7053,7 @@
                   <pic:spPr>
                     <a:xfrm>
                       <a:off x="0" y="0"/>
-                      <a:ext cx="4502754" cy="3022522"/>
+                      <a:ext cx="5155104" cy="3669707"/>
                     </a:xfrm>
                     <a:prstGeom prst="rect">
                       <a:avLst/>
@@ -6958,270 +7071,47 @@
         <w:pStyle w:val="Ttulo4"/>
       </w:pPr>
       <w:r>
-        <w:t xml:space="preserve">Explicación y </w:t>
-      </w:r>
-      <w:r>
-        <w:t>Prueba de que Funciona</w:t>
-      </w:r>
-    </w:p>
-    <w:p>
-      <w:pPr>
-        <w:pStyle w:val="Ttulo5"/>
-      </w:pPr>
-      <w:r>
-        <w:t>JwtService (Client</w:t>
-      </w:r>
-      <w:r>
-        <w:rPr>
-          <w:lang w:val="en-US"/>
-        </w:rPr>
-        <w:t>/</w:t>
+        <w:t>Código</w:t>
+      </w:r>
+    </w:p>
+    <w:p>
+      <w:pPr>
+        <w:rPr>
+          <w:b/>
+          <w:bCs/>
+        </w:rPr>
+      </w:pPr>
+      <w:r>
+        <w:rPr>
+          <w:b/>
+          <w:bCs/>
+        </w:rPr>
+        <w:t xml:space="preserve">Client / </w:t>
       </w:r>
       <w:proofErr w:type="gramStart"/>
       <w:r>
         <w:rPr>
-          <w:lang w:val="en-US"/>
+          <w:b/>
+          <w:bCs/>
         </w:rPr>
         <w:t>Director</w:t>
       </w:r>
       <w:proofErr w:type="gramEnd"/>
-      <w:r>
-        <w:t>)</w:t>
-      </w:r>
-    </w:p>
-    <w:p>
-      <w:r>
-        <w:t xml:space="preserve">La clase </w:t>
-      </w:r>
-      <w:r>
-        <w:rPr>
-          <w:b/>
-          <w:bCs/>
-        </w:rPr>
-        <w:t>JwtService</w:t>
-      </w:r>
-      <w:r>
-        <w:t xml:space="preserve"> actúa como cliente y director contextual, ya que define los pasos de construcción del token JWT. </w:t>
-      </w:r>
-    </w:p>
-    <w:p>
-      <w:pPr>
-        <w:pStyle w:val="Ttulo5"/>
-      </w:pPr>
-      <w:r>
+    </w:p>
+    <w:p>
+      <w:pPr>
+        <w:jc w:val="center"/>
+      </w:pPr>
+      <w:r>
+        <w:rPr>
+          <w:noProof/>
+        </w:rPr>
         <w:lastRenderedPageBreak/>
-        <w:t>JwtBuilder (Interfaz)</w:t>
-      </w:r>
-    </w:p>
-    <w:p>
-      <w:r>
-        <w:rPr>
-          <w:b/>
-          <w:bCs/>
-        </w:rPr>
-        <w:t>JwtBuilder</w:t>
-      </w:r>
-      <w:r>
-        <w:t xml:space="preserve"> representa el Builder, donde se</w:t>
-      </w:r>
-      <w:r>
-        <w:t xml:space="preserve"> define el contrato de métodos que deberán utilizar los Builders concretos posteriormente, entre ellos los utilizados como </w:t>
-      </w:r>
-      <w:proofErr w:type="spellStart"/>
-      <w:proofErr w:type="gramStart"/>
-      <w:r>
-        <w:rPr>
-          <w:b/>
-          <w:bCs/>
-        </w:rPr>
-        <w:t>subject</w:t>
-      </w:r>
-      <w:proofErr w:type="spellEnd"/>
-      <w:r>
-        <w:rPr>
-          <w:b/>
-          <w:bCs/>
-        </w:rPr>
-        <w:t>(</w:t>
-      </w:r>
-      <w:proofErr w:type="gramEnd"/>
-      <w:r>
-        <w:rPr>
-          <w:b/>
-          <w:bCs/>
-        </w:rPr>
-        <w:t xml:space="preserve">), </w:t>
-      </w:r>
-      <w:proofErr w:type="spellStart"/>
-      <w:r>
-        <w:rPr>
-          <w:b/>
-          <w:bCs/>
-        </w:rPr>
-        <w:t>claim</w:t>
-      </w:r>
-      <w:proofErr w:type="spellEnd"/>
-      <w:r>
-        <w:rPr>
-          <w:b/>
-          <w:bCs/>
-        </w:rPr>
-        <w:t xml:space="preserve">(), </w:t>
-      </w:r>
-      <w:proofErr w:type="spellStart"/>
-      <w:r>
-        <w:rPr>
-          <w:b/>
-          <w:bCs/>
-        </w:rPr>
-        <w:t>issuedAt</w:t>
-      </w:r>
-      <w:proofErr w:type="spellEnd"/>
-      <w:r>
-        <w:rPr>
-          <w:b/>
-          <w:bCs/>
-        </w:rPr>
-        <w:t xml:space="preserve">(), </w:t>
-      </w:r>
-      <w:proofErr w:type="spellStart"/>
-      <w:r>
-        <w:rPr>
-          <w:b/>
-          <w:bCs/>
-        </w:rPr>
-        <w:t>expiration</w:t>
-      </w:r>
-      <w:proofErr w:type="spellEnd"/>
-      <w:r>
-        <w:rPr>
-          <w:b/>
-          <w:bCs/>
-        </w:rPr>
-        <w:t xml:space="preserve">(), </w:t>
-      </w:r>
-      <w:proofErr w:type="spellStart"/>
-      <w:r>
-        <w:rPr>
-          <w:b/>
-          <w:bCs/>
-        </w:rPr>
-        <w:t>signWith</w:t>
-      </w:r>
-      <w:proofErr w:type="spellEnd"/>
-      <w:r>
-        <w:rPr>
-          <w:b/>
-          <w:bCs/>
-        </w:rPr>
-        <w:t xml:space="preserve">() </w:t>
-      </w:r>
-      <w:r>
-        <w:t>y</w:t>
-      </w:r>
-      <w:r>
-        <w:rPr>
-          <w:b/>
-          <w:bCs/>
-        </w:rPr>
-        <w:t xml:space="preserve"> compact().</w:t>
-      </w:r>
-    </w:p>
-    <w:p>
-      <w:pPr>
-        <w:pStyle w:val="Ttulo5"/>
-      </w:pPr>
-      <w:r>
-        <w:t>DefaultJwtBuilder (Concrete Builder)</w:t>
-      </w:r>
-    </w:p>
-    <w:p>
-      <w:r>
-        <w:rPr>
-          <w:b/>
-          <w:bCs/>
-        </w:rPr>
-        <w:t>DefaultJwtBuilder</w:t>
-      </w:r>
-      <w:r>
-        <w:t xml:space="preserve">, proporcionado internamente por la librería </w:t>
-      </w:r>
-      <w:r>
-        <w:rPr>
-          <w:b/>
-          <w:bCs/>
-        </w:rPr>
-        <w:t>JJWT</w:t>
-      </w:r>
-      <w:r>
-        <w:t xml:space="preserve">, es el Builder concreto donde se implementa la interfaz </w:t>
-      </w:r>
-      <w:r>
-        <w:rPr>
-          <w:b/>
-          <w:bCs/>
-        </w:rPr>
-        <w:t xml:space="preserve">JwtBuilder </w:t>
-      </w:r>
-      <w:r>
-        <w:t xml:space="preserve">y se asigna comportamiento a sus métodos. Finalmente, el método </w:t>
-      </w:r>
-      <w:proofErr w:type="gramStart"/>
-      <w:r>
-        <w:rPr>
-          <w:b/>
-          <w:bCs/>
-        </w:rPr>
-        <w:t>compact(</w:t>
-      </w:r>
-      <w:proofErr w:type="gramEnd"/>
-      <w:r>
-        <w:rPr>
-          <w:b/>
-          <w:bCs/>
-        </w:rPr>
-        <w:t>)</w:t>
-      </w:r>
-      <w:r>
-        <w:t xml:space="preserve"> genera el producto terminado: un token JWT firmado en formato </w:t>
-      </w:r>
-      <w:r>
-        <w:rPr>
-          <w:b/>
-          <w:bCs/>
-        </w:rPr>
-        <w:t>String</w:t>
-      </w:r>
-      <w:r>
-        <w:t>.</w:t>
-      </w:r>
-    </w:p>
-    <w:p>
-      <w:pPr>
-        <w:pStyle w:val="Ttulo5"/>
-      </w:pPr>
-      <w:r>
-        <w:t>Funcionamiento</w:t>
-      </w:r>
-    </w:p>
-    <w:p>
-      <w:r>
-        <w:t>Cuando nosotros iniciamos sesión internamente con un usuario</w:t>
-      </w:r>
-      <w:r>
-        <w:t>, la API REST nos devuelve como respuesta un token JWT para gestionar la sesión del usuario como mensaje de éxito. A continuación se muestra un ejemplo:</w:t>
-      </w:r>
-    </w:p>
-    <w:p>
-      <w:r>
-        <w:rPr>
-          <w:noProof/>
-        </w:rPr>
         <w:drawing>
-          <wp:inline distT="0" distB="0" distL="0" distR="0" wp14:anchorId="009FAAB2" wp14:editId="7118C825">
-            <wp:extent cx="5943600" cy="2818765"/>
-            <wp:effectExtent l="0" t="0" r="0" b="635"/>
-            <wp:docPr id="27" name="Imagen 27"/>
+          <wp:inline distT="0" distB="0" distL="0" distR="0" wp14:anchorId="352844FC" wp14:editId="769BDC22">
+            <wp:extent cx="4448175" cy="2416082"/>
+            <wp:effectExtent l="0" t="0" r="0" b="3810"/>
+            <wp:docPr id="25" name="Imagen 25"/>
             <wp:cNvGraphicFramePr>
               <a:graphicFrameLocks xmlns:a="http://schemas.openxmlformats.org/drawingml/2006/main" noChangeAspect="1"/>
             </wp:cNvGraphicFramePr>
@@ -7241,7 +7131,7 @@
                   <pic:spPr>
                     <a:xfrm>
                       <a:off x="0" y="0"/>
-                      <a:ext cx="5943600" cy="2818765"/>
+                      <a:ext cx="4453506" cy="2418978"/>
                     </a:xfrm>
                     <a:prstGeom prst="rect">
                       <a:avLst/>
@@ -7255,169 +7145,19 @@
       </w:r>
     </w:p>
     <w:p>
-      <w:r>
-        <w:t xml:space="preserve">Este token fue generado mediante un flujo interno de validación y verificación de credenciales donde posteriormente llego al </w:t>
-      </w:r>
-      <w:r>
-        <w:rPr>
-          <w:b/>
-          <w:bCs/>
-        </w:rPr>
-        <w:t>JwtService</w:t>
-      </w:r>
-      <w:r>
-        <w:t xml:space="preserve"> donde se gestionó la creación del token por medio de la librería </w:t>
-      </w:r>
-      <w:r>
-        <w:rPr>
-          <w:b/>
-          <w:bCs/>
-        </w:rPr>
-        <w:t xml:space="preserve">JJWT. </w:t>
-      </w:r>
-      <w:r>
-        <w:t>Utilizando el concepto de patrón Builder.</w:t>
-      </w:r>
-    </w:p>
-    <w:p>
-      <w:pPr>
-        <w:pStyle w:val="Ttulo2"/>
-      </w:pPr>
-      <w:r>
-        <w:lastRenderedPageBreak/>
-        <w:t>Estructurales</w:t>
-      </w:r>
-    </w:p>
-    <w:p>
-      <w:pPr>
-        <w:pStyle w:val="Ttulo3"/>
-      </w:pPr>
-      <w:r>
-        <w:t xml:space="preserve">Aplicación del Patrón </w:t>
-      </w:r>
-      <w:proofErr w:type="spellStart"/>
-      <w:r>
-        <w:t>Adapter</w:t>
-      </w:r>
-      <w:proofErr w:type="spellEnd"/>
-    </w:p>
-    <w:p>
-      <w:pPr>
-        <w:pStyle w:val="Ttulo4"/>
-      </w:pPr>
-      <w:r>
-        <w:t>Como está colaborando este Patrón al Proyecto</w:t>
-      </w:r>
-    </w:p>
-    <w:p>
-      <w:r>
-        <w:t xml:space="preserve">En nuestro proyecto, el patrón </w:t>
-      </w:r>
-      <w:proofErr w:type="spellStart"/>
-      <w:r>
-        <w:rPr>
-          <w:b/>
-          <w:bCs/>
-        </w:rPr>
-        <w:t>Adapter</w:t>
-      </w:r>
-      <w:proofErr w:type="spellEnd"/>
-      <w:r>
-        <w:t xml:space="preserve"> está siendo utilizado como parte de la </w:t>
-      </w:r>
-      <w:r>
-        <w:rPr>
-          <w:b/>
-          <w:bCs/>
-        </w:rPr>
-        <w:t>arquitectura hexagonal</w:t>
-      </w:r>
-      <w:r>
-        <w:t xml:space="preserve"> para permitir que los diferentes componentes de la aplicación puedan comunicarse sin depender directamente de implementaciones específicas. Para evidenciar su funcionamiento, tomaremos como ejemplo la creación de usuarios, donde la capa de aplicación trabaja mediante el puerto </w:t>
-      </w:r>
-      <w:proofErr w:type="spellStart"/>
-      <w:r>
-        <w:rPr>
-          <w:b/>
-          <w:bCs/>
-        </w:rPr>
-        <w:t>UserRepository</w:t>
-      </w:r>
-      <w:proofErr w:type="spellEnd"/>
-      <w:r>
-        <w:t xml:space="preserve">, mientras que en la infraestructura se encuentra </w:t>
-      </w:r>
-      <w:proofErr w:type="spellStart"/>
-      <w:r>
-        <w:rPr>
-          <w:b/>
-          <w:bCs/>
-        </w:rPr>
-        <w:t>UserAdapterPersistence</w:t>
-      </w:r>
-      <w:proofErr w:type="spellEnd"/>
-      <w:r>
-        <w:t xml:space="preserve">, encargado de adaptar este contrato a la implementación de persistencia utilizada con </w:t>
-      </w:r>
-      <w:r>
-        <w:rPr>
-          <w:b/>
-          <w:bCs/>
-        </w:rPr>
-        <w:t>JPA</w:t>
-      </w:r>
-      <w:r>
-        <w:t xml:space="preserve"> e </w:t>
-      </w:r>
-      <w:proofErr w:type="spellStart"/>
-      <w:r>
-        <w:rPr>
-          <w:b/>
-          <w:bCs/>
-        </w:rPr>
-        <w:t>Hibernate</w:t>
-      </w:r>
-      <w:proofErr w:type="spellEnd"/>
-      <w:r>
-        <w:t>.</w:t>
-      </w:r>
-    </w:p>
-    <w:p>
-      <w:r>
-        <w:t xml:space="preserve">Este patrón aporta principalmente desacoplamiento entre la lógica de aplicación y la infraestructura, ya que </w:t>
-      </w:r>
-      <w:proofErr w:type="spellStart"/>
-      <w:r>
-        <w:rPr>
-          <w:b/>
-          <w:bCs/>
-        </w:rPr>
-        <w:t>AuthService</w:t>
-      </w:r>
-      <w:proofErr w:type="spellEnd"/>
-      <w:r>
-        <w:t xml:space="preserve"> no necesita conocer cómo se almacenan los usuarios ni trabajar directamente con JPA. El adaptador recibe las operaciones definidas por el puerto y las traduce hacia </w:t>
-      </w:r>
-      <w:proofErr w:type="spellStart"/>
-      <w:r>
-        <w:rPr>
-          <w:b/>
-          <w:bCs/>
-        </w:rPr>
-        <w:t>UserDAO</w:t>
-      </w:r>
-      <w:proofErr w:type="spellEnd"/>
-      <w:r>
-        <w:t xml:space="preserve"> y las entidades de persistencia, permitiendo que la aplicación mantenga su lógica independiente de la tecnología utilizada para almacenar la información. Además, este mismo enfoque puede aplicarse en las demás funcionalidades del proyecto que requieren comunicación entre la aplicación y componentes externos.</w:t>
-      </w:r>
-    </w:p>
-    <w:p>
-      <w:pPr>
-        <w:pStyle w:val="Ttulo4"/>
-      </w:pPr>
-      <w:r>
-        <w:lastRenderedPageBreak/>
-        <w:t>Diagrama de Clase UML</w:t>
+      <w:pPr>
+        <w:jc w:val="left"/>
+        <w:rPr>
+          <w:b/>
+          <w:bCs/>
+        </w:rPr>
+      </w:pPr>
+      <w:r>
+        <w:rPr>
+          <w:b/>
+          <w:bCs/>
+        </w:rPr>
+        <w:t>Interface</w:t>
       </w:r>
     </w:p>
     <w:p>
@@ -7429,10 +7169,10 @@
           <w:noProof/>
         </w:rPr>
         <w:drawing>
-          <wp:inline distT="0" distB="0" distL="0" distR="0" wp14:anchorId="6FE64FE9" wp14:editId="0E01C80D">
-            <wp:extent cx="2225615" cy="4064462"/>
-            <wp:effectExtent l="0" t="0" r="3810" b="0"/>
-            <wp:docPr id="28" name="Imagen 28"/>
+          <wp:inline distT="0" distB="0" distL="0" distR="0" wp14:anchorId="34DC3B85" wp14:editId="15BE933A">
+            <wp:extent cx="5062655" cy="3762375"/>
+            <wp:effectExtent l="0" t="0" r="5080" b="0"/>
+            <wp:docPr id="17" name="Imagen 17"/>
             <wp:cNvGraphicFramePr>
               <a:graphicFrameLocks xmlns:a="http://schemas.openxmlformats.org/drawingml/2006/main" noChangeAspect="1"/>
             </wp:cNvGraphicFramePr>
@@ -7452,7 +7192,7 @@
                   <pic:spPr>
                     <a:xfrm>
                       <a:off x="0" y="0"/>
-                      <a:ext cx="2231095" cy="4074470"/>
+                      <a:ext cx="5070931" cy="3768525"/>
                     </a:xfrm>
                     <a:prstGeom prst="rect">
                       <a:avLst/>
@@ -7467,23 +7207,18 @@
     </w:p>
     <w:p>
       <w:pPr>
-        <w:pStyle w:val="Ttulo4"/>
-      </w:pPr>
-      <w:r>
+        <w:jc w:val="center"/>
+      </w:pPr>
+      <w:r>
+        <w:rPr>
+          <w:noProof/>
+        </w:rPr>
         <w:lastRenderedPageBreak/>
-        <w:t>Código</w:t>
-      </w:r>
-    </w:p>
-    <w:p>
-      <w:r>
-        <w:rPr>
-          <w:noProof/>
-        </w:rPr>
         <w:drawing>
-          <wp:inline distT="0" distB="0" distL="0" distR="0" wp14:anchorId="4F2736A4" wp14:editId="1FC4987B">
-            <wp:extent cx="5943600" cy="3430270"/>
-            <wp:effectExtent l="0" t="0" r="0" b="0"/>
-            <wp:docPr id="29" name="Imagen 29"/>
+          <wp:inline distT="0" distB="0" distL="0" distR="0" wp14:anchorId="52FF695D" wp14:editId="1F2ABA3C">
+            <wp:extent cx="4819650" cy="2053500"/>
+            <wp:effectExtent l="0" t="0" r="0" b="4445"/>
+            <wp:docPr id="18" name="Imagen 18"/>
             <wp:cNvGraphicFramePr>
               <a:graphicFrameLocks xmlns:a="http://schemas.openxmlformats.org/drawingml/2006/main" noChangeAspect="1"/>
             </wp:cNvGraphicFramePr>
@@ -7503,7 +7238,7 @@
                   <pic:spPr>
                     <a:xfrm>
                       <a:off x="0" y="0"/>
-                      <a:ext cx="5943600" cy="3430270"/>
+                      <a:ext cx="4827343" cy="2056778"/>
                     </a:xfrm>
                     <a:prstGeom prst="rect">
                       <a:avLst/>
@@ -7517,15 +7252,18 @@
       </w:r>
     </w:p>
     <w:p>
+      <w:pPr>
+        <w:jc w:val="center"/>
+      </w:pPr>
       <w:r>
         <w:rPr>
           <w:noProof/>
         </w:rPr>
         <w:drawing>
-          <wp:inline distT="0" distB="0" distL="0" distR="0" wp14:anchorId="340030D1" wp14:editId="065D87C3">
-            <wp:extent cx="5449060" cy="1381318"/>
-            <wp:effectExtent l="0" t="0" r="0" b="9525"/>
-            <wp:docPr id="30" name="Imagen 30"/>
+          <wp:inline distT="0" distB="0" distL="0" distR="0" wp14:anchorId="2474CBC7" wp14:editId="16CB14E7">
+            <wp:extent cx="4886325" cy="1970713"/>
+            <wp:effectExtent l="0" t="0" r="0" b="0"/>
+            <wp:docPr id="19" name="Imagen 19"/>
             <wp:cNvGraphicFramePr>
               <a:graphicFrameLocks xmlns:a="http://schemas.openxmlformats.org/drawingml/2006/main" noChangeAspect="1"/>
             </wp:cNvGraphicFramePr>
@@ -7545,7 +7283,7 @@
                   <pic:spPr>
                     <a:xfrm>
                       <a:off x="0" y="0"/>
-                      <a:ext cx="5449060" cy="1381318"/>
+                      <a:ext cx="4899076" cy="1975856"/>
                     </a:xfrm>
                     <a:prstGeom prst="rect">
                       <a:avLst/>
@@ -7559,16 +7297,18 @@
       </w:r>
     </w:p>
     <w:p>
+      <w:pPr>
+        <w:jc w:val="center"/>
+      </w:pPr>
       <w:r>
         <w:rPr>
           <w:noProof/>
         </w:rPr>
-        <w:lastRenderedPageBreak/>
         <w:drawing>
-          <wp:inline distT="0" distB="0" distL="0" distR="0" wp14:anchorId="188B8AA5" wp14:editId="2524FEB4">
-            <wp:extent cx="5943600" cy="3407410"/>
-            <wp:effectExtent l="0" t="0" r="0" b="2540"/>
-            <wp:docPr id="31" name="Imagen 31"/>
+          <wp:inline distT="0" distB="0" distL="0" distR="0" wp14:anchorId="6E0BFF47" wp14:editId="6104B3A6">
+            <wp:extent cx="4879792" cy="2257425"/>
+            <wp:effectExtent l="0" t="0" r="0" b="0"/>
+            <wp:docPr id="20" name="Imagen 20"/>
             <wp:cNvGraphicFramePr>
               <a:graphicFrameLocks xmlns:a="http://schemas.openxmlformats.org/drawingml/2006/main" noChangeAspect="1"/>
             </wp:cNvGraphicFramePr>
@@ -7588,7 +7328,7 @@
                   <pic:spPr>
                     <a:xfrm>
                       <a:off x="0" y="0"/>
-                      <a:ext cx="5943600" cy="3407410"/>
+                      <a:ext cx="4884419" cy="2259566"/>
                     </a:xfrm>
                     <a:prstGeom prst="rect">
                       <a:avLst/>
@@ -7602,15 +7342,32 @@
       </w:r>
     </w:p>
     <w:p>
+      <w:pPr>
+        <w:jc w:val="left"/>
+        <w:rPr>
+          <w:b/>
+          <w:bCs/>
+        </w:rPr>
+      </w:pPr>
+      <w:r>
+        <w:rPr>
+          <w:b/>
+          <w:bCs/>
+        </w:rPr>
+        <w:t>Concrete Builder</w:t>
+      </w:r>
+    </w:p>
+    <w:p>
       <w:r>
         <w:rPr>
           <w:noProof/>
         </w:rPr>
+        <w:lastRenderedPageBreak/>
         <w:drawing>
-          <wp:inline distT="0" distB="0" distL="0" distR="0" wp14:anchorId="543D9985" wp14:editId="07597DFA">
-            <wp:extent cx="5943600" cy="1938020"/>
-            <wp:effectExtent l="0" t="0" r="0" b="5080"/>
-            <wp:docPr id="32" name="Imagen 32"/>
+          <wp:inline distT="0" distB="0" distL="0" distR="0" wp14:anchorId="5B52A8C3" wp14:editId="25DA4955">
+            <wp:extent cx="5943600" cy="2004695"/>
+            <wp:effectExtent l="0" t="0" r="0" b="0"/>
+            <wp:docPr id="22" name="Imagen 22"/>
             <wp:cNvGraphicFramePr>
               <a:graphicFrameLocks xmlns:a="http://schemas.openxmlformats.org/drawingml/2006/main" noChangeAspect="1"/>
             </wp:cNvGraphicFramePr>
@@ -7630,7 +7387,7 @@
                   <pic:spPr>
                     <a:xfrm>
                       <a:off x="0" y="0"/>
-                      <a:ext cx="5943600" cy="1938020"/>
+                      <a:ext cx="5943600" cy="2004695"/>
                     </a:xfrm>
                     <a:prstGeom prst="rect">
                       <a:avLst/>
@@ -7645,331 +7402,17 @@
     </w:p>
     <w:p>
       <w:pPr>
-        <w:pStyle w:val="Ttulo4"/>
-      </w:pPr>
-      <w:r>
-        <w:t>Explicación y Prueba de que Funciona</w:t>
-      </w:r>
-    </w:p>
-    <w:p>
-      <w:pPr>
-        <w:pStyle w:val="Ttulo5"/>
-      </w:pPr>
-      <w:proofErr w:type="spellStart"/>
-      <w:r>
-        <w:t>AuthService</w:t>
-      </w:r>
-      <w:proofErr w:type="spellEnd"/>
-      <w:r>
-        <w:t xml:space="preserve"> (Cliente)</w:t>
-      </w:r>
-    </w:p>
-    <w:p>
-      <w:r>
-        <w:t xml:space="preserve">Es el componente encargado de </w:t>
-      </w:r>
-      <w:r>
-        <w:rPr>
-          <w:b/>
-          <w:bCs/>
-        </w:rPr>
-        <w:t>orquestar el registro del usuario</w:t>
-      </w:r>
-      <w:r>
-        <w:t xml:space="preserve"> desde la capa de aplicación. Para guardar el usuario, utiliza </w:t>
-      </w:r>
-      <w:proofErr w:type="spellStart"/>
-      <w:r>
-        <w:rPr>
-          <w:b/>
-          <w:bCs/>
-        </w:rPr>
-        <w:t>UserRepository</w:t>
-      </w:r>
-      <w:proofErr w:type="spellEnd"/>
-      <w:r>
-        <w:t xml:space="preserve"> sin conocer directamente la implementación encargada de la persistencia.</w:t>
-      </w:r>
-    </w:p>
-    <w:p>
-      <w:pPr>
-        <w:pStyle w:val="Ttulo5"/>
-      </w:pPr>
-      <w:proofErr w:type="spellStart"/>
-      <w:r>
-        <w:lastRenderedPageBreak/>
-        <w:t>UserRepository</w:t>
-      </w:r>
-      <w:proofErr w:type="spellEnd"/>
-      <w:r>
-        <w:t xml:space="preserve"> (Interfaz)</w:t>
-      </w:r>
-    </w:p>
-    <w:p>
-      <w:r>
-        <w:t xml:space="preserve">Es el </w:t>
-      </w:r>
-      <w:r>
-        <w:rPr>
-          <w:rStyle w:val="Textoennegrita"/>
-        </w:rPr>
-        <w:t>puerto de salida</w:t>
-      </w:r>
-      <w:r>
-        <w:t xml:space="preserve"> que define las operaciones que necesita la aplicación para trabajar con los usuarios. En este caso, establece el contrato para guardar y consultar usuarios, sin depender de JPA o de la base de datos.</w:t>
-      </w:r>
-    </w:p>
-    <w:p>
-      <w:pPr>
-        <w:pStyle w:val="Ttulo5"/>
-      </w:pPr>
-      <w:proofErr w:type="spellStart"/>
-      <w:r>
-        <w:t>UserAdapterPersistence</w:t>
-      </w:r>
-      <w:proofErr w:type="spellEnd"/>
-      <w:r>
-        <w:t xml:space="preserve"> (</w:t>
-      </w:r>
-      <w:proofErr w:type="spellStart"/>
-      <w:r>
-        <w:t>Adapter</w:t>
-      </w:r>
-      <w:proofErr w:type="spellEnd"/>
-      <w:r>
-        <w:t>)</w:t>
-      </w:r>
-    </w:p>
-    <w:p>
-      <w:r>
-        <w:t xml:space="preserve">Es el componente que implementa el puerto </w:t>
-      </w:r>
-      <w:proofErr w:type="spellStart"/>
-      <w:r>
-        <w:rPr>
-          <w:b/>
-          <w:bCs/>
-        </w:rPr>
-        <w:t>UserRepository</w:t>
-      </w:r>
-      <w:proofErr w:type="spellEnd"/>
-      <w:r>
-        <w:t xml:space="preserve"> y adapta sus operaciones hacia la infraestructura de persistencia. Recibe el </w:t>
-      </w:r>
-      <w:proofErr w:type="spellStart"/>
-      <w:r>
-        <w:rPr>
-          <w:b/>
-          <w:bCs/>
-        </w:rPr>
-        <w:t>User</w:t>
-      </w:r>
-      <w:proofErr w:type="spellEnd"/>
-      <w:r>
-        <w:t xml:space="preserve"> desde la aplicación, lo convierte mediante el </w:t>
-      </w:r>
-      <w:proofErr w:type="spellStart"/>
-      <w:r>
-        <w:rPr>
-          <w:b/>
-          <w:bCs/>
-        </w:rPr>
-        <w:t>mapper</w:t>
-      </w:r>
-      <w:proofErr w:type="spellEnd"/>
-      <w:r>
-        <w:t xml:space="preserve"> a </w:t>
-      </w:r>
-      <w:proofErr w:type="spellStart"/>
-      <w:r>
-        <w:rPr>
-          <w:b/>
-          <w:bCs/>
-        </w:rPr>
-        <w:t>UserEntity</w:t>
-      </w:r>
-      <w:proofErr w:type="spellEnd"/>
-      <w:r>
-        <w:t xml:space="preserve"> y utiliza </w:t>
-      </w:r>
-      <w:proofErr w:type="spellStart"/>
-      <w:r>
-        <w:rPr>
-          <w:b/>
-          <w:bCs/>
-        </w:rPr>
-        <w:t>UserDAO</w:t>
-      </w:r>
-      <w:proofErr w:type="spellEnd"/>
-      <w:r>
-        <w:t xml:space="preserve"> para realizar la operación en la base de datos.</w:t>
-      </w:r>
-    </w:p>
-    <w:p>
-      <w:pPr>
-        <w:pStyle w:val="Ttulo5"/>
-      </w:pPr>
-      <w:proofErr w:type="spellStart"/>
-      <w:r>
-        <w:t>UserDAO</w:t>
-      </w:r>
-      <w:proofErr w:type="spellEnd"/>
-      <w:r>
-        <w:t xml:space="preserve"> (</w:t>
-      </w:r>
-      <w:proofErr w:type="spellStart"/>
-      <w:r>
-        <w:t>Adaptee</w:t>
-      </w:r>
-      <w:proofErr w:type="spellEnd"/>
-      <w:r>
-        <w:t>)</w:t>
-      </w:r>
-    </w:p>
-    <w:p>
-      <w:r>
-        <w:t xml:space="preserve">Es el componente que proporciona las operaciones necesarias para comunicarse directamente con la base de datos mediante </w:t>
-      </w:r>
-      <w:r>
-        <w:rPr>
-          <w:b/>
-          <w:bCs/>
-        </w:rPr>
-        <w:t>JPA</w:t>
-      </w:r>
-      <w:r>
-        <w:t xml:space="preserve">. El </w:t>
-      </w:r>
-      <w:proofErr w:type="spellStart"/>
-      <w:r>
-        <w:rPr>
-          <w:b/>
-          <w:bCs/>
-        </w:rPr>
-        <w:t>UserAdapterPersistence</w:t>
-      </w:r>
-      <w:proofErr w:type="spellEnd"/>
-      <w:r>
-        <w:t xml:space="preserve"> utiliza este componente para ejecutar la persistencia del usuario.</w:t>
-      </w:r>
-    </w:p>
-    <w:p>
-      <w:pPr>
-        <w:pStyle w:val="Ttulo5"/>
-      </w:pPr>
-      <w:r>
-        <w:t>Funcionamiento</w:t>
-      </w:r>
-    </w:p>
-    <w:p>
-      <w:r>
-        <w:t xml:space="preserve">Cuando nosotros enviamos una petición a la API REST por medio del </w:t>
-      </w:r>
-      <w:proofErr w:type="spellStart"/>
-      <w:r>
-        <w:t>endpoint</w:t>
-      </w:r>
-      <w:proofErr w:type="spellEnd"/>
-      <w:r>
-        <w:t xml:space="preserve"> </w:t>
-      </w:r>
-      <w:r>
-        <w:rPr>
-          <w:b/>
-          <w:bCs/>
-        </w:rPr>
-        <w:t>/api/</w:t>
-      </w:r>
-      <w:proofErr w:type="spellStart"/>
-      <w:r>
-        <w:rPr>
-          <w:b/>
-          <w:bCs/>
-        </w:rPr>
-        <w:t>auth</w:t>
-      </w:r>
-      <w:proofErr w:type="spellEnd"/>
-      <w:r>
-        <w:rPr>
-          <w:b/>
-          <w:bCs/>
-        </w:rPr>
-        <w:t>/</w:t>
-      </w:r>
-      <w:proofErr w:type="spellStart"/>
-      <w:r>
-        <w:rPr>
-          <w:b/>
-          <w:bCs/>
-        </w:rPr>
-        <w:t>register</w:t>
-      </w:r>
-      <w:proofErr w:type="spellEnd"/>
-      <w:r>
-        <w:t xml:space="preserve"> para crear un usuario, internamente habrá un controlador el cual recibirá esa solicitud y la </w:t>
-      </w:r>
-      <w:r>
-        <w:t>enviará</w:t>
-      </w:r>
-      <w:r>
-        <w:t xml:space="preserve"> </w:t>
-      </w:r>
-      <w:r>
-        <w:t xml:space="preserve">al </w:t>
-      </w:r>
-      <w:proofErr w:type="spellStart"/>
-      <w:r>
-        <w:rPr>
-          <w:b/>
-          <w:bCs/>
-        </w:rPr>
-        <w:t>AuthService</w:t>
-      </w:r>
-      <w:proofErr w:type="spellEnd"/>
-      <w:r>
-        <w:rPr>
-          <w:b/>
-          <w:bCs/>
-        </w:rPr>
-        <w:t xml:space="preserve"> </w:t>
-      </w:r>
-      <w:r>
-        <w:t xml:space="preserve">donde se empieza a evidenciar la presencia del uso del patrón </w:t>
-      </w:r>
-      <w:proofErr w:type="spellStart"/>
-      <w:r>
-        <w:rPr>
-          <w:b/>
-          <w:bCs/>
-        </w:rPr>
-        <w:t>adapter</w:t>
-      </w:r>
-      <w:proofErr w:type="spellEnd"/>
-      <w:r>
-        <w:rPr>
-          <w:b/>
-          <w:bCs/>
-        </w:rPr>
-        <w:t xml:space="preserve">. </w:t>
-      </w:r>
-      <w:r>
-        <w:t>Finalmente, la API, nos devolverá nuevamente los datos del usuario sin su contraseña validando así que la creación del usuario se hizo correctamente:</w:t>
-      </w:r>
-    </w:p>
-    <w:p>
-      <w:pPr>
         <w:jc w:val="center"/>
       </w:pPr>
       <w:r>
         <w:rPr>
           <w:noProof/>
         </w:rPr>
-        <w:lastRenderedPageBreak/>
         <w:drawing>
-          <wp:inline distT="0" distB="0" distL="0" distR="0" wp14:anchorId="064F52F7" wp14:editId="5168AF42">
-            <wp:extent cx="5943600" cy="3516630"/>
-            <wp:effectExtent l="0" t="0" r="0" b="7620"/>
-            <wp:docPr id="33" name="Imagen 33"/>
+          <wp:inline distT="0" distB="0" distL="0" distR="0" wp14:anchorId="03986789" wp14:editId="4BA28EE2">
+            <wp:extent cx="4676775" cy="851913"/>
+            <wp:effectExtent l="0" t="0" r="0" b="5715"/>
+            <wp:docPr id="23" name="Imagen 23"/>
             <wp:cNvGraphicFramePr>
               <a:graphicFrameLocks xmlns:a="http://schemas.openxmlformats.org/drawingml/2006/main" noChangeAspect="1"/>
             </wp:cNvGraphicFramePr>
@@ -7989,7 +7432,7 @@
                   <pic:spPr>
                     <a:xfrm>
                       <a:off x="0" y="0"/>
-                      <a:ext cx="5943600" cy="3516630"/>
+                      <a:ext cx="4694262" cy="855098"/>
                     </a:xfrm>
                     <a:prstGeom prst="rect">
                       <a:avLst/>
@@ -8004,25 +7447,17 @@
     </w:p>
     <w:p>
       <w:pPr>
-        <w:jc w:val="left"/>
-      </w:pPr>
-      <w:r>
-        <w:t>Posteriormente, se comprueba en la base de datos que el usuario ya se haya creado correctamente:</w:t>
-      </w:r>
-    </w:p>
-    <w:p>
-      <w:pPr>
-        <w:jc w:val="left"/>
+        <w:jc w:val="center"/>
       </w:pPr>
       <w:r>
         <w:rPr>
           <w:noProof/>
         </w:rPr>
         <w:drawing>
-          <wp:inline distT="0" distB="0" distL="0" distR="0" wp14:anchorId="23DA54E8" wp14:editId="710E2647">
-            <wp:extent cx="5943600" cy="544830"/>
-            <wp:effectExtent l="0" t="0" r="0" b="7620"/>
-            <wp:docPr id="34" name="Imagen 34"/>
+          <wp:inline distT="0" distB="0" distL="0" distR="0" wp14:anchorId="6409BE82" wp14:editId="14230D7D">
+            <wp:extent cx="4498141" cy="3019425"/>
+            <wp:effectExtent l="0" t="0" r="0" b="0"/>
+            <wp:docPr id="24" name="Imagen 24"/>
             <wp:cNvGraphicFramePr>
               <a:graphicFrameLocks xmlns:a="http://schemas.openxmlformats.org/drawingml/2006/main" noChangeAspect="1"/>
             </wp:cNvGraphicFramePr>
@@ -8042,6 +7477,1108 @@
                   <pic:spPr>
                     <a:xfrm>
                       <a:off x="0" y="0"/>
+                      <a:ext cx="4502754" cy="3022522"/>
+                    </a:xfrm>
+                    <a:prstGeom prst="rect">
+                      <a:avLst/>
+                    </a:prstGeom>
+                  </pic:spPr>
+                </pic:pic>
+              </a:graphicData>
+            </a:graphic>
+          </wp:inline>
+        </w:drawing>
+      </w:r>
+    </w:p>
+    <w:p>
+      <w:pPr>
+        <w:pStyle w:val="Ttulo4"/>
+      </w:pPr>
+      <w:r>
+        <w:t xml:space="preserve">Explicación y </w:t>
+      </w:r>
+      <w:r>
+        <w:t>Prueba de que Funciona</w:t>
+      </w:r>
+    </w:p>
+    <w:p>
+      <w:pPr>
+        <w:pStyle w:val="Ttulo5"/>
+      </w:pPr>
+      <w:r>
+        <w:t>JwtService (Client</w:t>
+      </w:r>
+      <w:r>
+        <w:rPr>
+          <w:lang w:val="en-US"/>
+        </w:rPr>
+        <w:t>/</w:t>
+      </w:r>
+      <w:proofErr w:type="gramStart"/>
+      <w:r>
+        <w:rPr>
+          <w:lang w:val="en-US"/>
+        </w:rPr>
+        <w:t>Director</w:t>
+      </w:r>
+      <w:proofErr w:type="gramEnd"/>
+      <w:r>
+        <w:t>)</w:t>
+      </w:r>
+    </w:p>
+    <w:p>
+      <w:r>
+        <w:t xml:space="preserve">La clase </w:t>
+      </w:r>
+      <w:r>
+        <w:rPr>
+          <w:b/>
+          <w:bCs/>
+        </w:rPr>
+        <w:t>JwtService</w:t>
+      </w:r>
+      <w:r>
+        <w:t xml:space="preserve"> actúa como cliente y director contextual, ya que define los pasos de construcción del token JWT. </w:t>
+      </w:r>
+    </w:p>
+    <w:p>
+      <w:pPr>
+        <w:pStyle w:val="Ttulo5"/>
+      </w:pPr>
+      <w:r>
+        <w:lastRenderedPageBreak/>
+        <w:t>JwtBuilder (Interfaz)</w:t>
+      </w:r>
+    </w:p>
+    <w:p>
+      <w:r>
+        <w:rPr>
+          <w:b/>
+          <w:bCs/>
+        </w:rPr>
+        <w:t>JwtBuilder</w:t>
+      </w:r>
+      <w:r>
+        <w:t xml:space="preserve"> representa el Builder, donde se</w:t>
+      </w:r>
+      <w:r>
+        <w:t xml:space="preserve"> define el contrato de métodos que deberán utilizar los Builders concretos posteriormente, entre ellos los utilizados como </w:t>
+      </w:r>
+      <w:proofErr w:type="spellStart"/>
+      <w:proofErr w:type="gramStart"/>
+      <w:r>
+        <w:rPr>
+          <w:b/>
+          <w:bCs/>
+        </w:rPr>
+        <w:t>subject</w:t>
+      </w:r>
+      <w:proofErr w:type="spellEnd"/>
+      <w:r>
+        <w:rPr>
+          <w:b/>
+          <w:bCs/>
+        </w:rPr>
+        <w:t>(</w:t>
+      </w:r>
+      <w:proofErr w:type="gramEnd"/>
+      <w:r>
+        <w:rPr>
+          <w:b/>
+          <w:bCs/>
+        </w:rPr>
+        <w:t xml:space="preserve">), </w:t>
+      </w:r>
+      <w:proofErr w:type="spellStart"/>
+      <w:r>
+        <w:rPr>
+          <w:b/>
+          <w:bCs/>
+        </w:rPr>
+        <w:t>claim</w:t>
+      </w:r>
+      <w:proofErr w:type="spellEnd"/>
+      <w:r>
+        <w:rPr>
+          <w:b/>
+          <w:bCs/>
+        </w:rPr>
+        <w:t xml:space="preserve">(), </w:t>
+      </w:r>
+      <w:proofErr w:type="spellStart"/>
+      <w:r>
+        <w:rPr>
+          <w:b/>
+          <w:bCs/>
+        </w:rPr>
+        <w:t>issuedAt</w:t>
+      </w:r>
+      <w:proofErr w:type="spellEnd"/>
+      <w:r>
+        <w:rPr>
+          <w:b/>
+          <w:bCs/>
+        </w:rPr>
+        <w:t xml:space="preserve">(), </w:t>
+      </w:r>
+      <w:proofErr w:type="spellStart"/>
+      <w:r>
+        <w:rPr>
+          <w:b/>
+          <w:bCs/>
+        </w:rPr>
+        <w:t>expiration</w:t>
+      </w:r>
+      <w:proofErr w:type="spellEnd"/>
+      <w:r>
+        <w:rPr>
+          <w:b/>
+          <w:bCs/>
+        </w:rPr>
+        <w:t xml:space="preserve">(), </w:t>
+      </w:r>
+      <w:proofErr w:type="spellStart"/>
+      <w:r>
+        <w:rPr>
+          <w:b/>
+          <w:bCs/>
+        </w:rPr>
+        <w:t>signWith</w:t>
+      </w:r>
+      <w:proofErr w:type="spellEnd"/>
+      <w:r>
+        <w:rPr>
+          <w:b/>
+          <w:bCs/>
+        </w:rPr>
+        <w:t xml:space="preserve">() </w:t>
+      </w:r>
+      <w:r>
+        <w:t>y</w:t>
+      </w:r>
+      <w:r>
+        <w:rPr>
+          <w:b/>
+          <w:bCs/>
+        </w:rPr>
+        <w:t xml:space="preserve"> compact().</w:t>
+      </w:r>
+    </w:p>
+    <w:p>
+      <w:pPr>
+        <w:pStyle w:val="Ttulo5"/>
+      </w:pPr>
+      <w:r>
+        <w:t>DefaultJwtBuilder (Concrete Builder)</w:t>
+      </w:r>
+    </w:p>
+    <w:p>
+      <w:r>
+        <w:rPr>
+          <w:b/>
+          <w:bCs/>
+        </w:rPr>
+        <w:t>DefaultJwtBuilder</w:t>
+      </w:r>
+      <w:r>
+        <w:t xml:space="preserve">, proporcionado internamente por la librería </w:t>
+      </w:r>
+      <w:r>
+        <w:rPr>
+          <w:b/>
+          <w:bCs/>
+        </w:rPr>
+        <w:t>JJWT</w:t>
+      </w:r>
+      <w:r>
+        <w:t xml:space="preserve">, es el Builder concreto donde se implementa la interfaz </w:t>
+      </w:r>
+      <w:r>
+        <w:rPr>
+          <w:b/>
+          <w:bCs/>
+        </w:rPr>
+        <w:t xml:space="preserve">JwtBuilder </w:t>
+      </w:r>
+      <w:r>
+        <w:t xml:space="preserve">y se asigna comportamiento a sus métodos. Finalmente, el método </w:t>
+      </w:r>
+      <w:proofErr w:type="gramStart"/>
+      <w:r>
+        <w:rPr>
+          <w:b/>
+          <w:bCs/>
+        </w:rPr>
+        <w:t>compact(</w:t>
+      </w:r>
+      <w:proofErr w:type="gramEnd"/>
+      <w:r>
+        <w:rPr>
+          <w:b/>
+          <w:bCs/>
+        </w:rPr>
+        <w:t>)</w:t>
+      </w:r>
+      <w:r>
+        <w:t xml:space="preserve"> genera el producto terminado: un token JWT firmado en formato </w:t>
+      </w:r>
+      <w:r>
+        <w:rPr>
+          <w:b/>
+          <w:bCs/>
+        </w:rPr>
+        <w:t>String</w:t>
+      </w:r>
+      <w:r>
+        <w:t>.</w:t>
+      </w:r>
+    </w:p>
+    <w:p>
+      <w:pPr>
+        <w:pStyle w:val="Ttulo5"/>
+      </w:pPr>
+      <w:r>
+        <w:t>Funcionamiento</w:t>
+      </w:r>
+    </w:p>
+    <w:p>
+      <w:r>
+        <w:t>Cuando nosotros iniciamos sesión internamente con un usuario</w:t>
+      </w:r>
+      <w:r>
+        <w:t>, la API REST nos devuelve como respuesta un token JWT para gestionar la sesión del usuario como mensaje de éxito. A continuación se muestra un ejemplo:</w:t>
+      </w:r>
+    </w:p>
+    <w:p>
+      <w:r>
+        <w:rPr>
+          <w:noProof/>
+        </w:rPr>
+        <w:drawing>
+          <wp:inline distT="0" distB="0" distL="0" distR="0" wp14:anchorId="009FAAB2" wp14:editId="7118C825">
+            <wp:extent cx="5943600" cy="2818765"/>
+            <wp:effectExtent l="0" t="0" r="0" b="635"/>
+            <wp:docPr id="27" name="Imagen 27"/>
+            <wp:cNvGraphicFramePr>
+              <a:graphicFrameLocks xmlns:a="http://schemas.openxmlformats.org/drawingml/2006/main" noChangeAspect="1"/>
+            </wp:cNvGraphicFramePr>
+            <a:graphic xmlns:a="http://schemas.openxmlformats.org/drawingml/2006/main">
+              <a:graphicData uri="http://schemas.openxmlformats.org/drawingml/2006/picture">
+                <pic:pic xmlns:pic="http://schemas.openxmlformats.org/drawingml/2006/picture">
+                  <pic:nvPicPr>
+                    <pic:cNvPr id="1" name=""/>
+                    <pic:cNvPicPr/>
+                  </pic:nvPicPr>
+                  <pic:blipFill>
+                    <a:blip r:embed="rId50"/>
+                    <a:stretch>
+                      <a:fillRect/>
+                    </a:stretch>
+                  </pic:blipFill>
+                  <pic:spPr>
+                    <a:xfrm>
+                      <a:off x="0" y="0"/>
+                      <a:ext cx="5943600" cy="2818765"/>
+                    </a:xfrm>
+                    <a:prstGeom prst="rect">
+                      <a:avLst/>
+                    </a:prstGeom>
+                  </pic:spPr>
+                </pic:pic>
+              </a:graphicData>
+            </a:graphic>
+          </wp:inline>
+        </w:drawing>
+      </w:r>
+    </w:p>
+    <w:p>
+      <w:r>
+        <w:t xml:space="preserve">Este token fue generado mediante un flujo interno de validación y verificación de credenciales donde posteriormente llego al </w:t>
+      </w:r>
+      <w:r>
+        <w:rPr>
+          <w:b/>
+          <w:bCs/>
+        </w:rPr>
+        <w:t>JwtService</w:t>
+      </w:r>
+      <w:r>
+        <w:t xml:space="preserve"> donde se gestionó la creación del token por medio de la librería </w:t>
+      </w:r>
+      <w:r>
+        <w:rPr>
+          <w:b/>
+          <w:bCs/>
+        </w:rPr>
+        <w:t xml:space="preserve">JJWT. </w:t>
+      </w:r>
+      <w:r>
+        <w:t>Utilizando el concepto de patrón Builder.</w:t>
+      </w:r>
+    </w:p>
+    <w:p>
+      <w:pPr>
+        <w:pStyle w:val="Ttulo2"/>
+      </w:pPr>
+      <w:r>
+        <w:lastRenderedPageBreak/>
+        <w:t>Estructurales</w:t>
+      </w:r>
+    </w:p>
+    <w:p>
+      <w:pPr>
+        <w:pStyle w:val="Ttulo3"/>
+      </w:pPr>
+      <w:r>
+        <w:t xml:space="preserve">Aplicación del Patrón </w:t>
+      </w:r>
+      <w:proofErr w:type="spellStart"/>
+      <w:r>
+        <w:t>Adapter</w:t>
+      </w:r>
+      <w:proofErr w:type="spellEnd"/>
+    </w:p>
+    <w:p>
+      <w:pPr>
+        <w:pStyle w:val="Ttulo4"/>
+      </w:pPr>
+      <w:r>
+        <w:t>Como está colaborando este Patrón al Proyecto</w:t>
+      </w:r>
+    </w:p>
+    <w:p>
+      <w:r>
+        <w:t xml:space="preserve">En nuestro proyecto, el patrón </w:t>
+      </w:r>
+      <w:proofErr w:type="spellStart"/>
+      <w:r>
+        <w:rPr>
+          <w:b/>
+          <w:bCs/>
+        </w:rPr>
+        <w:t>Adapter</w:t>
+      </w:r>
+      <w:proofErr w:type="spellEnd"/>
+      <w:r>
+        <w:t xml:space="preserve"> está siendo utilizado como parte de la </w:t>
+      </w:r>
+      <w:r>
+        <w:rPr>
+          <w:b/>
+          <w:bCs/>
+        </w:rPr>
+        <w:t>arquitectura hexagonal</w:t>
+      </w:r>
+      <w:r>
+        <w:t xml:space="preserve"> para permitir que los diferentes componentes de la aplicación puedan comunicarse sin depender directamente de implementaciones específicas. Para evidenciar su funcionamiento, tomaremos como ejemplo la creación de usuarios, donde la capa de aplicación trabaja mediante el puerto </w:t>
+      </w:r>
+      <w:proofErr w:type="spellStart"/>
+      <w:r>
+        <w:rPr>
+          <w:b/>
+          <w:bCs/>
+        </w:rPr>
+        <w:t>UserRepository</w:t>
+      </w:r>
+      <w:proofErr w:type="spellEnd"/>
+      <w:r>
+        <w:t xml:space="preserve">, mientras que en la infraestructura se encuentra </w:t>
+      </w:r>
+      <w:proofErr w:type="spellStart"/>
+      <w:r>
+        <w:rPr>
+          <w:b/>
+          <w:bCs/>
+        </w:rPr>
+        <w:t>UserAdapterPersistence</w:t>
+      </w:r>
+      <w:proofErr w:type="spellEnd"/>
+      <w:r>
+        <w:t xml:space="preserve">, encargado de adaptar este contrato a la implementación de persistencia utilizada con </w:t>
+      </w:r>
+      <w:r>
+        <w:rPr>
+          <w:b/>
+          <w:bCs/>
+        </w:rPr>
+        <w:t>JPA</w:t>
+      </w:r>
+      <w:r>
+        <w:t xml:space="preserve"> e </w:t>
+      </w:r>
+      <w:proofErr w:type="spellStart"/>
+      <w:r>
+        <w:rPr>
+          <w:b/>
+          <w:bCs/>
+        </w:rPr>
+        <w:t>Hibernate</w:t>
+      </w:r>
+      <w:proofErr w:type="spellEnd"/>
+      <w:r>
+        <w:t>.</w:t>
+      </w:r>
+    </w:p>
+    <w:p>
+      <w:r>
+        <w:t xml:space="preserve">Este patrón aporta principalmente desacoplamiento entre la lógica de aplicación y la infraestructura, ya que </w:t>
+      </w:r>
+      <w:proofErr w:type="spellStart"/>
+      <w:r>
+        <w:rPr>
+          <w:b/>
+          <w:bCs/>
+        </w:rPr>
+        <w:t>AuthService</w:t>
+      </w:r>
+      <w:proofErr w:type="spellEnd"/>
+      <w:r>
+        <w:t xml:space="preserve"> no necesita conocer cómo se almacenan los usuarios ni trabajar directamente con JPA. El adaptador recibe las operaciones definidas por el puerto y las traduce hacia </w:t>
+      </w:r>
+      <w:proofErr w:type="spellStart"/>
+      <w:r>
+        <w:rPr>
+          <w:b/>
+          <w:bCs/>
+        </w:rPr>
+        <w:t>UserDAO</w:t>
+      </w:r>
+      <w:proofErr w:type="spellEnd"/>
+      <w:r>
+        <w:t xml:space="preserve"> y las entidades de persistencia, permitiendo que la aplicación mantenga su lógica independiente de la tecnología utilizada para almacenar la información. Además, este mismo enfoque puede aplicarse en las demás funcionalidades del proyecto que requieren comunicación entre la aplicación y componentes externos.</w:t>
+      </w:r>
+    </w:p>
+    <w:p>
+      <w:pPr>
+        <w:pStyle w:val="Ttulo4"/>
+      </w:pPr>
+      <w:r>
+        <w:lastRenderedPageBreak/>
+        <w:t>Diagrama de Clase UML</w:t>
+      </w:r>
+    </w:p>
+    <w:p>
+      <w:pPr>
+        <w:jc w:val="center"/>
+      </w:pPr>
+      <w:r>
+        <w:rPr>
+          <w:noProof/>
+        </w:rPr>
+        <w:drawing>
+          <wp:inline distT="0" distB="0" distL="0" distR="0" wp14:anchorId="6FE64FE9" wp14:editId="0E01C80D">
+            <wp:extent cx="2225615" cy="4064462"/>
+            <wp:effectExtent l="0" t="0" r="3810" b="0"/>
+            <wp:docPr id="28" name="Imagen 28"/>
+            <wp:cNvGraphicFramePr>
+              <a:graphicFrameLocks xmlns:a="http://schemas.openxmlformats.org/drawingml/2006/main" noChangeAspect="1"/>
+            </wp:cNvGraphicFramePr>
+            <a:graphic xmlns:a="http://schemas.openxmlformats.org/drawingml/2006/main">
+              <a:graphicData uri="http://schemas.openxmlformats.org/drawingml/2006/picture">
+                <pic:pic xmlns:pic="http://schemas.openxmlformats.org/drawingml/2006/picture">
+                  <pic:nvPicPr>
+                    <pic:cNvPr id="1" name=""/>
+                    <pic:cNvPicPr/>
+                  </pic:nvPicPr>
+                  <pic:blipFill>
+                    <a:blip r:embed="rId51"/>
+                    <a:stretch>
+                      <a:fillRect/>
+                    </a:stretch>
+                  </pic:blipFill>
+                  <pic:spPr>
+                    <a:xfrm>
+                      <a:off x="0" y="0"/>
+                      <a:ext cx="2231095" cy="4074470"/>
+                    </a:xfrm>
+                    <a:prstGeom prst="rect">
+                      <a:avLst/>
+                    </a:prstGeom>
+                  </pic:spPr>
+                </pic:pic>
+              </a:graphicData>
+            </a:graphic>
+          </wp:inline>
+        </w:drawing>
+      </w:r>
+    </w:p>
+    <w:p>
+      <w:pPr>
+        <w:pStyle w:val="Ttulo4"/>
+      </w:pPr>
+      <w:r>
+        <w:lastRenderedPageBreak/>
+        <w:t>Código</w:t>
+      </w:r>
+    </w:p>
+    <w:p>
+      <w:r>
+        <w:rPr>
+          <w:noProof/>
+        </w:rPr>
+        <w:drawing>
+          <wp:inline distT="0" distB="0" distL="0" distR="0" wp14:anchorId="4F2736A4" wp14:editId="1FC4987B">
+            <wp:extent cx="5943600" cy="3430270"/>
+            <wp:effectExtent l="0" t="0" r="0" b="0"/>
+            <wp:docPr id="29" name="Imagen 29"/>
+            <wp:cNvGraphicFramePr>
+              <a:graphicFrameLocks xmlns:a="http://schemas.openxmlformats.org/drawingml/2006/main" noChangeAspect="1"/>
+            </wp:cNvGraphicFramePr>
+            <a:graphic xmlns:a="http://schemas.openxmlformats.org/drawingml/2006/main">
+              <a:graphicData uri="http://schemas.openxmlformats.org/drawingml/2006/picture">
+                <pic:pic xmlns:pic="http://schemas.openxmlformats.org/drawingml/2006/picture">
+                  <pic:nvPicPr>
+                    <pic:cNvPr id="1" name=""/>
+                    <pic:cNvPicPr/>
+                  </pic:nvPicPr>
+                  <pic:blipFill>
+                    <a:blip r:embed="rId52"/>
+                    <a:stretch>
+                      <a:fillRect/>
+                    </a:stretch>
+                  </pic:blipFill>
+                  <pic:spPr>
+                    <a:xfrm>
+                      <a:off x="0" y="0"/>
+                      <a:ext cx="5943600" cy="3430270"/>
+                    </a:xfrm>
+                    <a:prstGeom prst="rect">
+                      <a:avLst/>
+                    </a:prstGeom>
+                  </pic:spPr>
+                </pic:pic>
+              </a:graphicData>
+            </a:graphic>
+          </wp:inline>
+        </w:drawing>
+      </w:r>
+    </w:p>
+    <w:p>
+      <w:r>
+        <w:rPr>
+          <w:noProof/>
+        </w:rPr>
+        <w:drawing>
+          <wp:inline distT="0" distB="0" distL="0" distR="0" wp14:anchorId="340030D1" wp14:editId="065D87C3">
+            <wp:extent cx="5449060" cy="1381318"/>
+            <wp:effectExtent l="0" t="0" r="0" b="9525"/>
+            <wp:docPr id="30" name="Imagen 30"/>
+            <wp:cNvGraphicFramePr>
+              <a:graphicFrameLocks xmlns:a="http://schemas.openxmlformats.org/drawingml/2006/main" noChangeAspect="1"/>
+            </wp:cNvGraphicFramePr>
+            <a:graphic xmlns:a="http://schemas.openxmlformats.org/drawingml/2006/main">
+              <a:graphicData uri="http://schemas.openxmlformats.org/drawingml/2006/picture">
+                <pic:pic xmlns:pic="http://schemas.openxmlformats.org/drawingml/2006/picture">
+                  <pic:nvPicPr>
+                    <pic:cNvPr id="1" name=""/>
+                    <pic:cNvPicPr/>
+                  </pic:nvPicPr>
+                  <pic:blipFill>
+                    <a:blip r:embed="rId53"/>
+                    <a:stretch>
+                      <a:fillRect/>
+                    </a:stretch>
+                  </pic:blipFill>
+                  <pic:spPr>
+                    <a:xfrm>
+                      <a:off x="0" y="0"/>
+                      <a:ext cx="5449060" cy="1381318"/>
+                    </a:xfrm>
+                    <a:prstGeom prst="rect">
+                      <a:avLst/>
+                    </a:prstGeom>
+                  </pic:spPr>
+                </pic:pic>
+              </a:graphicData>
+            </a:graphic>
+          </wp:inline>
+        </w:drawing>
+      </w:r>
+    </w:p>
+    <w:p>
+      <w:r>
+        <w:rPr>
+          <w:noProof/>
+        </w:rPr>
+        <w:lastRenderedPageBreak/>
+        <w:drawing>
+          <wp:inline distT="0" distB="0" distL="0" distR="0" wp14:anchorId="188B8AA5" wp14:editId="2524FEB4">
+            <wp:extent cx="5943600" cy="3407410"/>
+            <wp:effectExtent l="0" t="0" r="0" b="2540"/>
+            <wp:docPr id="31" name="Imagen 31"/>
+            <wp:cNvGraphicFramePr>
+              <a:graphicFrameLocks xmlns:a="http://schemas.openxmlformats.org/drawingml/2006/main" noChangeAspect="1"/>
+            </wp:cNvGraphicFramePr>
+            <a:graphic xmlns:a="http://schemas.openxmlformats.org/drawingml/2006/main">
+              <a:graphicData uri="http://schemas.openxmlformats.org/drawingml/2006/picture">
+                <pic:pic xmlns:pic="http://schemas.openxmlformats.org/drawingml/2006/picture">
+                  <pic:nvPicPr>
+                    <pic:cNvPr id="1" name=""/>
+                    <pic:cNvPicPr/>
+                  </pic:nvPicPr>
+                  <pic:blipFill>
+                    <a:blip r:embed="rId54"/>
+                    <a:stretch>
+                      <a:fillRect/>
+                    </a:stretch>
+                  </pic:blipFill>
+                  <pic:spPr>
+                    <a:xfrm>
+                      <a:off x="0" y="0"/>
+                      <a:ext cx="5943600" cy="3407410"/>
+                    </a:xfrm>
+                    <a:prstGeom prst="rect">
+                      <a:avLst/>
+                    </a:prstGeom>
+                  </pic:spPr>
+                </pic:pic>
+              </a:graphicData>
+            </a:graphic>
+          </wp:inline>
+        </w:drawing>
+      </w:r>
+    </w:p>
+    <w:p>
+      <w:r>
+        <w:rPr>
+          <w:noProof/>
+        </w:rPr>
+        <w:drawing>
+          <wp:inline distT="0" distB="0" distL="0" distR="0" wp14:anchorId="543D9985" wp14:editId="07597DFA">
+            <wp:extent cx="5943600" cy="1938020"/>
+            <wp:effectExtent l="0" t="0" r="0" b="5080"/>
+            <wp:docPr id="32" name="Imagen 32"/>
+            <wp:cNvGraphicFramePr>
+              <a:graphicFrameLocks xmlns:a="http://schemas.openxmlformats.org/drawingml/2006/main" noChangeAspect="1"/>
+            </wp:cNvGraphicFramePr>
+            <a:graphic xmlns:a="http://schemas.openxmlformats.org/drawingml/2006/main">
+              <a:graphicData uri="http://schemas.openxmlformats.org/drawingml/2006/picture">
+                <pic:pic xmlns:pic="http://schemas.openxmlformats.org/drawingml/2006/picture">
+                  <pic:nvPicPr>
+                    <pic:cNvPr id="1" name=""/>
+                    <pic:cNvPicPr/>
+                  </pic:nvPicPr>
+                  <pic:blipFill>
+                    <a:blip r:embed="rId55"/>
+                    <a:stretch>
+                      <a:fillRect/>
+                    </a:stretch>
+                  </pic:blipFill>
+                  <pic:spPr>
+                    <a:xfrm>
+                      <a:off x="0" y="0"/>
+                      <a:ext cx="5943600" cy="1938020"/>
+                    </a:xfrm>
+                    <a:prstGeom prst="rect">
+                      <a:avLst/>
+                    </a:prstGeom>
+                  </pic:spPr>
+                </pic:pic>
+              </a:graphicData>
+            </a:graphic>
+          </wp:inline>
+        </w:drawing>
+      </w:r>
+    </w:p>
+    <w:p>
+      <w:pPr>
+        <w:pStyle w:val="Ttulo4"/>
+      </w:pPr>
+      <w:r>
+        <w:t>Explicación y Prueba de que Funciona</w:t>
+      </w:r>
+    </w:p>
+    <w:p>
+      <w:pPr>
+        <w:pStyle w:val="Ttulo5"/>
+      </w:pPr>
+      <w:proofErr w:type="spellStart"/>
+      <w:r>
+        <w:t>AuthService</w:t>
+      </w:r>
+      <w:proofErr w:type="spellEnd"/>
+      <w:r>
+        <w:t xml:space="preserve"> (Cliente)</w:t>
+      </w:r>
+    </w:p>
+    <w:p>
+      <w:r>
+        <w:t xml:space="preserve">Es el componente encargado de </w:t>
+      </w:r>
+      <w:r>
+        <w:rPr>
+          <w:b/>
+          <w:bCs/>
+        </w:rPr>
+        <w:t>orquestar el registro del usuario</w:t>
+      </w:r>
+      <w:r>
+        <w:t xml:space="preserve"> desde la capa de aplicación. Para guardar el usuario, utiliza </w:t>
+      </w:r>
+      <w:proofErr w:type="spellStart"/>
+      <w:r>
+        <w:rPr>
+          <w:b/>
+          <w:bCs/>
+        </w:rPr>
+        <w:t>UserRepository</w:t>
+      </w:r>
+      <w:proofErr w:type="spellEnd"/>
+      <w:r>
+        <w:t xml:space="preserve"> sin conocer directamente la implementación encargada de la persistencia.</w:t>
+      </w:r>
+    </w:p>
+    <w:p>
+      <w:pPr>
+        <w:pStyle w:val="Ttulo5"/>
+      </w:pPr>
+      <w:proofErr w:type="spellStart"/>
+      <w:r>
+        <w:lastRenderedPageBreak/>
+        <w:t>UserRepository</w:t>
+      </w:r>
+      <w:proofErr w:type="spellEnd"/>
+      <w:r>
+        <w:t xml:space="preserve"> (Interfaz)</w:t>
+      </w:r>
+    </w:p>
+    <w:p>
+      <w:r>
+        <w:t xml:space="preserve">Es el </w:t>
+      </w:r>
+      <w:r>
+        <w:rPr>
+          <w:rStyle w:val="Textoennegrita"/>
+        </w:rPr>
+        <w:t>puerto de salida</w:t>
+      </w:r>
+      <w:r>
+        <w:t xml:space="preserve"> que define las operaciones que necesita la aplicación para trabajar con los usuarios. En este caso, establece el contrato para guardar y consultar usuarios, sin depender de JPA o de la base de datos.</w:t>
+      </w:r>
+    </w:p>
+    <w:p>
+      <w:pPr>
+        <w:pStyle w:val="Ttulo5"/>
+      </w:pPr>
+      <w:proofErr w:type="spellStart"/>
+      <w:r>
+        <w:t>UserAdapterPersistence</w:t>
+      </w:r>
+      <w:proofErr w:type="spellEnd"/>
+      <w:r>
+        <w:t xml:space="preserve"> (</w:t>
+      </w:r>
+      <w:proofErr w:type="spellStart"/>
+      <w:r>
+        <w:t>Adapter</w:t>
+      </w:r>
+      <w:proofErr w:type="spellEnd"/>
+      <w:r>
+        <w:t>)</w:t>
+      </w:r>
+    </w:p>
+    <w:p>
+      <w:r>
+        <w:t xml:space="preserve">Es el componente que implementa el puerto </w:t>
+      </w:r>
+      <w:proofErr w:type="spellStart"/>
+      <w:r>
+        <w:rPr>
+          <w:b/>
+          <w:bCs/>
+        </w:rPr>
+        <w:t>UserRepository</w:t>
+      </w:r>
+      <w:proofErr w:type="spellEnd"/>
+      <w:r>
+        <w:t xml:space="preserve"> y adapta sus operaciones hacia la infraestructura de persistencia. Recibe el </w:t>
+      </w:r>
+      <w:proofErr w:type="spellStart"/>
+      <w:r>
+        <w:rPr>
+          <w:b/>
+          <w:bCs/>
+        </w:rPr>
+        <w:t>User</w:t>
+      </w:r>
+      <w:proofErr w:type="spellEnd"/>
+      <w:r>
+        <w:t xml:space="preserve"> desde la aplicación, lo convierte mediante el </w:t>
+      </w:r>
+      <w:proofErr w:type="spellStart"/>
+      <w:r>
+        <w:rPr>
+          <w:b/>
+          <w:bCs/>
+        </w:rPr>
+        <w:t>mapper</w:t>
+      </w:r>
+      <w:proofErr w:type="spellEnd"/>
+      <w:r>
+        <w:t xml:space="preserve"> a </w:t>
+      </w:r>
+      <w:proofErr w:type="spellStart"/>
+      <w:r>
+        <w:rPr>
+          <w:b/>
+          <w:bCs/>
+        </w:rPr>
+        <w:t>UserEntity</w:t>
+      </w:r>
+      <w:proofErr w:type="spellEnd"/>
+      <w:r>
+        <w:t xml:space="preserve"> y utiliza </w:t>
+      </w:r>
+      <w:proofErr w:type="spellStart"/>
+      <w:r>
+        <w:rPr>
+          <w:b/>
+          <w:bCs/>
+        </w:rPr>
+        <w:t>UserDAO</w:t>
+      </w:r>
+      <w:proofErr w:type="spellEnd"/>
+      <w:r>
+        <w:t xml:space="preserve"> para realizar la operación en la base de datos.</w:t>
+      </w:r>
+    </w:p>
+    <w:p>
+      <w:pPr>
+        <w:pStyle w:val="Ttulo5"/>
+      </w:pPr>
+      <w:proofErr w:type="spellStart"/>
+      <w:r>
+        <w:t>UserDAO</w:t>
+      </w:r>
+      <w:proofErr w:type="spellEnd"/>
+      <w:r>
+        <w:t xml:space="preserve"> (</w:t>
+      </w:r>
+      <w:proofErr w:type="spellStart"/>
+      <w:r>
+        <w:t>Adaptee</w:t>
+      </w:r>
+      <w:proofErr w:type="spellEnd"/>
+      <w:r>
+        <w:t>)</w:t>
+      </w:r>
+    </w:p>
+    <w:p>
+      <w:r>
+        <w:t xml:space="preserve">Es el componente que proporciona las operaciones necesarias para comunicarse directamente con la base de datos mediante </w:t>
+      </w:r>
+      <w:r>
+        <w:rPr>
+          <w:b/>
+          <w:bCs/>
+        </w:rPr>
+        <w:t>JPA</w:t>
+      </w:r>
+      <w:r>
+        <w:t xml:space="preserve">. El </w:t>
+      </w:r>
+      <w:proofErr w:type="spellStart"/>
+      <w:r>
+        <w:rPr>
+          <w:b/>
+          <w:bCs/>
+        </w:rPr>
+        <w:t>UserAdapterPersistence</w:t>
+      </w:r>
+      <w:proofErr w:type="spellEnd"/>
+      <w:r>
+        <w:t xml:space="preserve"> utiliza este componente para ejecutar la persistencia del usuario.</w:t>
+      </w:r>
+    </w:p>
+    <w:p>
+      <w:pPr>
+        <w:pStyle w:val="Ttulo5"/>
+      </w:pPr>
+      <w:r>
+        <w:t>Funcionamiento</w:t>
+      </w:r>
+    </w:p>
+    <w:p>
+      <w:r>
+        <w:t xml:space="preserve">Cuando nosotros enviamos una petición a la API REST por medio del </w:t>
+      </w:r>
+      <w:proofErr w:type="spellStart"/>
+      <w:r>
+        <w:t>endpoint</w:t>
+      </w:r>
+      <w:proofErr w:type="spellEnd"/>
+      <w:r>
+        <w:t xml:space="preserve"> </w:t>
+      </w:r>
+      <w:r>
+        <w:rPr>
+          <w:b/>
+          <w:bCs/>
+        </w:rPr>
+        <w:t>/api/</w:t>
+      </w:r>
+      <w:proofErr w:type="spellStart"/>
+      <w:r>
+        <w:rPr>
+          <w:b/>
+          <w:bCs/>
+        </w:rPr>
+        <w:t>auth</w:t>
+      </w:r>
+      <w:proofErr w:type="spellEnd"/>
+      <w:r>
+        <w:rPr>
+          <w:b/>
+          <w:bCs/>
+        </w:rPr>
+        <w:t>/</w:t>
+      </w:r>
+      <w:proofErr w:type="spellStart"/>
+      <w:r>
+        <w:rPr>
+          <w:b/>
+          <w:bCs/>
+        </w:rPr>
+        <w:t>register</w:t>
+      </w:r>
+      <w:proofErr w:type="spellEnd"/>
+      <w:r>
+        <w:t xml:space="preserve"> para crear un usuario, internamente habrá un controlador el cual recibirá esa solicitud y la </w:t>
+      </w:r>
+      <w:r>
+        <w:t>enviará</w:t>
+      </w:r>
+      <w:r>
+        <w:t xml:space="preserve"> </w:t>
+      </w:r>
+      <w:r>
+        <w:t xml:space="preserve">al </w:t>
+      </w:r>
+      <w:proofErr w:type="spellStart"/>
+      <w:r>
+        <w:rPr>
+          <w:b/>
+          <w:bCs/>
+        </w:rPr>
+        <w:t>AuthService</w:t>
+      </w:r>
+      <w:proofErr w:type="spellEnd"/>
+      <w:r>
+        <w:rPr>
+          <w:b/>
+          <w:bCs/>
+        </w:rPr>
+        <w:t xml:space="preserve"> </w:t>
+      </w:r>
+      <w:r>
+        <w:t xml:space="preserve">donde se empieza a evidenciar la presencia del uso del patrón </w:t>
+      </w:r>
+      <w:proofErr w:type="spellStart"/>
+      <w:r>
+        <w:rPr>
+          <w:b/>
+          <w:bCs/>
+        </w:rPr>
+        <w:t>adapter</w:t>
+      </w:r>
+      <w:proofErr w:type="spellEnd"/>
+      <w:r>
+        <w:rPr>
+          <w:b/>
+          <w:bCs/>
+        </w:rPr>
+        <w:t xml:space="preserve">. </w:t>
+      </w:r>
+      <w:r>
+        <w:t>Finalmente, la API, nos devolverá nuevamente los datos del usuario sin su contraseña validando así que la creación del usuario se hizo correctamente:</w:t>
+      </w:r>
+    </w:p>
+    <w:p>
+      <w:pPr>
+        <w:jc w:val="center"/>
+      </w:pPr>
+      <w:r>
+        <w:rPr>
+          <w:noProof/>
+        </w:rPr>
+        <w:lastRenderedPageBreak/>
+        <w:drawing>
+          <wp:inline distT="0" distB="0" distL="0" distR="0" wp14:anchorId="064F52F7" wp14:editId="5168AF42">
+            <wp:extent cx="5943600" cy="3516630"/>
+            <wp:effectExtent l="0" t="0" r="0" b="7620"/>
+            <wp:docPr id="33" name="Imagen 33"/>
+            <wp:cNvGraphicFramePr>
+              <a:graphicFrameLocks xmlns:a="http://schemas.openxmlformats.org/drawingml/2006/main" noChangeAspect="1"/>
+            </wp:cNvGraphicFramePr>
+            <a:graphic xmlns:a="http://schemas.openxmlformats.org/drawingml/2006/main">
+              <a:graphicData uri="http://schemas.openxmlformats.org/drawingml/2006/picture">
+                <pic:pic xmlns:pic="http://schemas.openxmlformats.org/drawingml/2006/picture">
+                  <pic:nvPicPr>
+                    <pic:cNvPr id="1" name=""/>
+                    <pic:cNvPicPr/>
+                  </pic:nvPicPr>
+                  <pic:blipFill>
+                    <a:blip r:embed="rId56"/>
+                    <a:stretch>
+                      <a:fillRect/>
+                    </a:stretch>
+                  </pic:blipFill>
+                  <pic:spPr>
+                    <a:xfrm>
+                      <a:off x="0" y="0"/>
+                      <a:ext cx="5943600" cy="3516630"/>
+                    </a:xfrm>
+                    <a:prstGeom prst="rect">
+                      <a:avLst/>
+                    </a:prstGeom>
+                  </pic:spPr>
+                </pic:pic>
+              </a:graphicData>
+            </a:graphic>
+          </wp:inline>
+        </w:drawing>
+      </w:r>
+    </w:p>
+    <w:p>
+      <w:pPr>
+        <w:jc w:val="left"/>
+      </w:pPr>
+      <w:r>
+        <w:t>Posteriormente, se comprueba en la base de datos que el usuario ya se haya creado correctamente:</w:t>
+      </w:r>
+    </w:p>
+    <w:p>
+      <w:pPr>
+        <w:jc w:val="left"/>
+      </w:pPr>
+      <w:r>
+        <w:rPr>
+          <w:noProof/>
+        </w:rPr>
+        <w:drawing>
+          <wp:inline distT="0" distB="0" distL="0" distR="0" wp14:anchorId="23DA54E8" wp14:editId="710E2647">
+            <wp:extent cx="5943600" cy="544830"/>
+            <wp:effectExtent l="0" t="0" r="0" b="7620"/>
+            <wp:docPr id="34" name="Imagen 34"/>
+            <wp:cNvGraphicFramePr>
+              <a:graphicFrameLocks xmlns:a="http://schemas.openxmlformats.org/drawingml/2006/main" noChangeAspect="1"/>
+            </wp:cNvGraphicFramePr>
+            <a:graphic xmlns:a="http://schemas.openxmlformats.org/drawingml/2006/main">
+              <a:graphicData uri="http://schemas.openxmlformats.org/drawingml/2006/picture">
+                <pic:pic xmlns:pic="http://schemas.openxmlformats.org/drawingml/2006/picture">
+                  <pic:nvPicPr>
+                    <pic:cNvPr id="1" name=""/>
+                    <pic:cNvPicPr/>
+                  </pic:nvPicPr>
+                  <pic:blipFill>
+                    <a:blip r:embed="rId57"/>
+                    <a:stretch>
+                      <a:fillRect/>
+                    </a:stretch>
+                  </pic:blipFill>
+                  <pic:spPr>
+                    <a:xfrm>
+                      <a:off x="0" y="0"/>
                       <a:ext cx="5943600" cy="544830"/>
                     </a:xfrm>
                     <a:prstGeom prst="rect">
@@ -8107,7 +8644,7 @@
     </w:p>
     <w:p/>
     <w:sectPr>
-      <w:headerReference w:type="default" r:id="rId50"/>
+      <w:headerReference w:type="default" r:id="rId58"/>
       <w:pgSz w:w="12240" w:h="15840"/>
       <w:pgMar w:top="1440" w:right="1440" w:bottom="1440" w:left="1440" w:header="709" w:footer="709" w:gutter="0"/>
       <w:cols w:space="720"/>

</xml_diff>

<commit_message>
Implementacion del patron Composite
</commit_message>
<xml_diff>
--- a/Sistema de Gestion de Cadenas de Suministro.docx
+++ b/Sistema de Gestion de Cadenas de Suministro.docx
@@ -5382,42 +5382,21 @@
         <w:pStyle w:val="Ttulo4"/>
       </w:pPr>
       <w:r>
-        <w:t>Como está Col</w:t>
-      </w:r>
-      <w:r>
-        <w:t>aborando este Patrón al Proyecto</w:t>
-      </w:r>
-    </w:p>
-    <w:p>
-      <w:r>
-        <w:t xml:space="preserve">En un centro de distribución tecnológica especializado en dispositivos móviles como LogiSync, la infraestructura de almacenamiento físico de las bodegas está compuesta por cientos de estanterías, pasillos y racks modulares </w:t>
-      </w:r>
-      <w:r>
-        <w:t>con características estandarizadas (por ejemplo, racks diseñados con 4 niveles y bahías compartimentadas para almacenar cajas de smartphones de alta gama como Samsung Galaxy o iPhone, con límites idénticos de peso, volumen y capacidad por nivel). Cuando se</w:t>
-      </w:r>
-      <w:r>
-        <w:t xml:space="preserve"> amplía un almacén o se habilita un nuevo pasillo, crear cada estantería y cada una de sus bahías desde cero mediante </w:t>
+        <w:t>Como está Colaborando este Patrón al Proyecto</w:t>
+      </w:r>
+    </w:p>
+    <w:p>
+      <w:r>
+        <w:t xml:space="preserve">En un centro de distribución tecnológica especializado en dispositivos móviles como LogiSync, la infraestructura de almacenamiento físico de las bodegas está compuesta por cientos de estanterías, pasillos y racks modulares con características estandarizadas (por ejemplo, racks diseñados con 4 niveles y bahías compartimentadas para almacenar cajas de smartphones de alta gama como Samsung Galaxy o iPhone, con límites idénticos de peso, volumen y capacidad por nivel). Cuando se amplía un almacén o se habilita un nuevo pasillo, crear cada estantería y cada una de sus bahías desde cero mediante </w:t>
       </w:r>
       <w:r>
         <w:lastRenderedPageBreak/>
-        <w:t>configuración manual genera una redundancia excesiva de código, consumo innecesario de recursos y alto riesgo de inconsistencias operativa</w:t>
-      </w:r>
-      <w:r>
-        <w:t>s.</w:t>
-      </w:r>
-    </w:p>
-    <w:p>
-      <w:r>
-        <w:t xml:space="preserve">Para resolver este problema, entra a colaborar el patrón de diseño creacional Prototype. En lugar de reconstruir toda la estructura jerárquica de un espacio o plantilla de rack cada vez que se requiere uno nuevo, el patrón define una interfaz de </w:t>
-      </w:r>
-      <w:r>
-        <w:t>clonación (StorageSpacePrototype) y una implementación concreta (RackLayoutTemplate) que permite duplicar en memoria objetos prototipo ya configurados. Mediante una clonación profunda (deep clone) de sus propiedades y listas internas de ubicaciones a travé</w:t>
-      </w:r>
-      <w:r>
-        <w:t>s del método cloneSpace(...), el sistema genera instantáneamente réplicas exactas e independientes, permitiendo únicamente ajustar los parámetros específicos que varían (como el nombre del rack o una capacidad personalizada por nivel) sin alterar el objeto</w:t>
-      </w:r>
-      <w:r>
-        <w:t xml:space="preserve"> original ni sobrecargar la base de datos.</w:t>
+        <w:t>configuración manual genera una redundancia excesiva de código, consumo innecesario de recursos y alto riesgo de inconsistencias operativas.</w:t>
+      </w:r>
+    </w:p>
+    <w:p>
+      <w:r>
+        <w:t>Para resolver este problema, entra a colaborar el patrón de diseño creacional Prototype. En lugar de reconstruir toda la estructura jerárquica de un espacio o plantilla de rack cada vez que se requiere uno nuevo, el patrón define una interfaz de clonación (StorageSpacePrototype) y una implementación concreta (RackLayoutTemplate) que permite duplicar en memoria objetos prototipo ya configurados. Mediante una clonación profunda (deep clone) de sus propiedades y listas internas de ubicaciones a través del método cloneSpace(...), el sistema genera instantáneamente réplicas exactas e independientes, permitiendo únicamente ajustar los parámetros específicos que varían (como el nombre del rack o una capacidad personalizada por nivel) sin alterar el objeto original ni sobrecargar la base de datos.</w:t>
       </w:r>
     </w:p>
     <w:p>
@@ -5430,6 +5409,9 @@
     </w:p>
     <w:p>
       <w:r>
+        <w:rPr>
+          <w:noProof/>
+        </w:rPr>
         <w:drawing>
           <wp:inline distT="0" distB="0" distL="0" distR="0" wp14:anchorId="6278752E" wp14:editId="16D7F338">
             <wp:extent cx="5943600" cy="3078480"/>
@@ -5485,6 +5467,9 @@
     </w:p>
     <w:p>
       <w:r>
+        <w:rPr>
+          <w:noProof/>
+        </w:rPr>
         <w:drawing>
           <wp:inline distT="0" distB="0" distL="0" distR="0" wp14:anchorId="255C9DDD" wp14:editId="168DD04E">
             <wp:extent cx="5943600" cy="685800"/>
@@ -5533,6 +5518,9 @@
     </w:p>
     <w:p>
       <w:r>
+        <w:rPr>
+          <w:noProof/>
+        </w:rPr>
         <w:drawing>
           <wp:inline distT="0" distB="0" distL="0" distR="0" wp14:anchorId="36062F9C" wp14:editId="72752E9F">
             <wp:extent cx="5943600" cy="2983230"/>
@@ -5576,14 +5564,14 @@
       </w:pPr>
       <w:r>
         <w:lastRenderedPageBreak/>
-        <w:t>Modelo de</w:t>
-      </w:r>
-      <w:r>
-        <w:t xml:space="preserve"> Dominio</w:t>
-      </w:r>
-    </w:p>
-    <w:p>
-      <w:r>
+        <w:t>Modelo de Dominio</w:t>
+      </w:r>
+    </w:p>
+    <w:p>
+      <w:r>
+        <w:rPr>
+          <w:noProof/>
+        </w:rPr>
         <w:drawing>
           <wp:inline distT="0" distB="0" distL="0" distR="0" wp14:anchorId="0B4EE781" wp14:editId="33D35C85">
             <wp:extent cx="5943600" cy="5094605"/>
@@ -5623,6 +5611,9 @@
     </w:p>
     <w:p>
       <w:r>
+        <w:rPr>
+          <w:noProof/>
+        </w:rPr>
         <w:drawing>
           <wp:inline distT="0" distB="0" distL="0" distR="0" wp14:anchorId="61D8CA5D" wp14:editId="37F60A7B">
             <wp:extent cx="5943600" cy="2073910"/>
@@ -5671,6 +5662,9 @@
     </w:p>
     <w:p>
       <w:r>
+        <w:rPr>
+          <w:noProof/>
+        </w:rPr>
         <w:drawing>
           <wp:inline distT="0" distB="0" distL="0" distR="0" wp14:anchorId="7440B915" wp14:editId="5EC707B9">
             <wp:extent cx="5943600" cy="1724025"/>
@@ -5710,6 +5704,9 @@
     </w:p>
     <w:p>
       <w:r>
+        <w:rPr>
+          <w:noProof/>
+        </w:rPr>
         <w:drawing>
           <wp:inline distT="0" distB="0" distL="0" distR="0" wp14:anchorId="3038F62C" wp14:editId="5DFCEBA4">
             <wp:extent cx="5943600" cy="2997835"/>
@@ -5757,10 +5754,7 @@
     </w:p>
     <w:p>
       <w:r>
-        <w:t>Para comprender</w:t>
-      </w:r>
-      <w:r>
-        <w:t xml:space="preserve"> con claridad cómo se aplica el patrón Prototype en la arquitectura modular de almacenamiento de LogiSync, a continuación describimos la función que cumple cada uno de sus componentes:</w:t>
+        <w:t>Para comprender con claridad cómo se aplica el patrón Prototype en la arquitectura modular de almacenamiento de LogiSync, a continuación describimos la función que cumple cada uno de sus componentes:</w:t>
       </w:r>
     </w:p>
     <w:p>
@@ -5773,13 +5767,7 @@
     </w:p>
     <w:p>
       <w:r>
-        <w:t>Es la interfaz que declara e</w:t>
-      </w:r>
-      <w:r>
-        <w:t>l contrato formal de clonación dentro del patrón. Extiende de la interfaz Cloneable de Java y define la operación cloneSpace(String newName, Integer newCapacity). Su objetivo es desacoplar al cliente de las clases concretas, permitiéndole solicitar duplica</w:t>
-      </w:r>
-      <w:r>
-        <w:t>dos estructurales de cualquier configuración de almacenamiento sin acoplarse a su implementación interna.</w:t>
+        <w:t>Es la interfaz que declara el contrato formal de clonación dentro del patrón. Extiende de la interfaz Cloneable de Java y define la operación cloneSpace(String newName, Integer newCapacity). Su objetivo es desacoplar al cliente de las clases concretas, permitiéndole solicitar duplicados estructurales de cualquier configuración de almacenamiento sin acoplarse a su implementación interna.</w:t>
       </w:r>
     </w:p>
     <w:p>
@@ -5793,13 +5781,7 @@
     </w:p>
     <w:p>
       <w:r>
-        <w:t>Es la clase concreta que implementa la interfaz StorageSpacePrototype. Representa una plantilla reutilizable d</w:t>
-      </w:r>
-      <w:r>
-        <w:t>e distribución de estanterías y racks para celulares, almacenando el identificador del almacén, el número de niveles verticales, la capacidad de unidades por nivel y la lista de nombres de bahías (locationNames). En su método cloneSpace(...), efectúa una c</w:t>
-      </w:r>
-      <w:r>
-        <w:t>lonación profunda instanciando una nueva lista de ubicaciones a partir de la existente y retornando una nueva instancia de RackLayoutTemplate en memoria con los nuevos valores, garantizando que el objeto clonado sea totalmente independiente del original.</w:t>
+        <w:t>Es la clase concreta que implementa la interfaz StorageSpacePrototype. Representa una plantilla reutilizable de distribución de estanterías y racks para celulares, almacenando el identificador del almacén, el número de niveles verticales, la capacidad de unidades por nivel y la lista de nombres de bahías (locationNames). En su método cloneSpace(...), efectúa una clonación profunda instanciando una nueva lista de ubicaciones a partir de la existente y retornando una nueva instancia de RackLayoutTemplate en memoria con los nuevos valores, garantizando que el objeto clonado sea totalmente independiente del original.</w:t>
       </w:r>
     </w:p>
     <w:p>
@@ -5807,18 +5789,12 @@
         <w:pStyle w:val="Ttulo5"/>
       </w:pPr>
       <w:r>
-        <w:t>S</w:t>
-      </w:r>
-      <w:r>
-        <w:t>torageSpace (Entidad de Dominio)</w:t>
-      </w:r>
-    </w:p>
-    <w:p>
-      <w:r>
-        <w:t xml:space="preserve">Representa la entidad física persistida en el almacén. Modela los espacios jerárquicos (ZONAS, RACKS, BAHÍAS) asegurando que cada nivel cumpla con las reglas del negocio: validación de pertenencia al mismo almacén activo y </w:t>
-      </w:r>
-      <w:r>
-        <w:t>asignación de capacidades estrictamente positivas a las ubicaciones finales donde se depositan los lotes de smartphones.</w:t>
+        <w:t>StorageSpace (Entidad de Dominio)</w:t>
+      </w:r>
+    </w:p>
+    <w:p>
+      <w:r>
+        <w:t>Representa la entidad física persistida en el almacén. Modela los espacios jerárquicos (ZONAS, RACKS, BAHÍAS) asegurando que cada nivel cumpla con las reglas del negocio: validación de pertenencia al mismo almacén activo y asignación de capacidades estrictamente positivas a las ubicaciones finales donde se depositan los lotes de smartphones.</w:t>
       </w:r>
     </w:p>
     <w:p>
@@ -5831,13 +5807,7 @@
     </w:p>
     <w:p>
       <w:r>
-        <w:t>StorageSpaceService es el servicio de aplicación encargado de orque</w:t>
-      </w:r>
-      <w:r>
-        <w:t xml:space="preserve">star la creación y administración de los espacios físicos en la bodega, delegando en los repositorios de persistencia. Por su parte, StorageSpaceController expone los puntos de entrada REST asegurados (requiriendo rol PRESIDENT) para registrar y consultar </w:t>
-      </w:r>
-      <w:r>
-        <w:t>las estructuras replicadas a través de peticiones HTTP.</w:t>
+        <w:t>StorageSpaceService es el servicio de aplicación encargado de orquestar la creación y administración de los espacios físicos en la bodega, delegando en los repositorios de persistencia. Por su parte, StorageSpaceController expone los puntos de entrada REST asegurados (requiriendo rol PRESIDENT) para registrar y consultar las estructuras replicadas a través de peticiones HTTP.</w:t>
       </w:r>
     </w:p>
     <w:p>
@@ -5877,14 +5847,14 @@
     </w:p>
     <w:p>
       <w:r>
-        <w:t>Desde Postman o Swagger UI, enviamos una pe</w:t>
-      </w:r>
-      <w:r>
-        <w:t>tición POST al endpoint /api/warehouses/1/spaces para registrar un rack basado en la plantilla de alta capacidad para distribución de teléfonos celulares:</w:t>
-      </w:r>
-    </w:p>
-    <w:p>
-      <w:r>
+        <w:t>Desde Postman o Swagger UI, enviamos una petición POST al endpoint /api/warehouses/1/spaces para registrar un rack basado en la plantilla de alta capacidad para distribución de teléfonos celulares:</w:t>
+      </w:r>
+    </w:p>
+    <w:p>
+      <w:r>
+        <w:rPr>
+          <w:noProof/>
+        </w:rPr>
         <w:lastRenderedPageBreak/>
         <w:drawing>
           <wp:inline distT="0" distB="0" distL="0" distR="0" wp14:anchorId="0FD3AB5F" wp14:editId="46621176">
@@ -8643,8 +8613,680 @@
       </w:r>
     </w:p>
     <w:p/>
+    <w:p>
+      <w:pPr>
+        <w:pStyle w:val="Ttulo3"/>
+      </w:pPr>
+      <w:r>
+        <w:t>Aplicación del Patrón Composite</w:t>
+      </w:r>
+    </w:p>
+    <w:p>
+      <w:pPr>
+        <w:pStyle w:val="Ttulo4"/>
+      </w:pPr>
+      <w:r>
+        <w:t>Como está Colaborando este Patrón al Proyecto</w:t>
+      </w:r>
+    </w:p>
+    <w:p>
+      <w:r>
+        <w:t>En un centro de distribución logística especializado en dispositivos móviles como LogiSync, la infraestructura física de almacenamiento posee una naturaleza jerárquica y multiniv</w:t>
+      </w:r>
+      <w:r>
+        <w:t>el: un almacén principal se subdivide en zonas (como Zona de Smartphones Flagship o Zona de Accesorios), las zonas se componen de pasillos y racks, y los racks contienen bahías o ubicaciones individuales donde reposan físicamente las cajas de celulares.</w:t>
+      </w:r>
+    </w:p>
+    <w:p>
+      <w:r>
+        <w:t>Si</w:t>
+      </w:r>
+      <w:r>
+        <w:t>n el patrón Composite, consultar la disponibilidad de espacio, el volumen ocupado o la capacidad total obligaría al sistema a implementar condicionales complejos y algoritmos dispersos para diferenciar si se está consultando una bodega completa, una estant</w:t>
+      </w:r>
+      <w:r>
+        <w:t>ería o una simple gaveta. Aquí es donde colabora el patrón de diseño estructural Composite: define una abstracción común (StorageNode) que es implementada de forma uniforme tanto por las hojas o compartimientos terminales (LocationNode) como por los conten</w:t>
+      </w:r>
+      <w:r>
+        <w:t>edores compuestos (StorageContainer, WarehouseNode, ZoneNode y RackNode). Gracias a esta composición recursiva, el cliente (StorageSpaceService) puede tratar a cualquier nodo de la jerarquía de manera idéntica y polimórfica: al invocar capacity() u occupan</w:t>
+      </w:r>
+      <w:r>
+        <w:t>cy() sobre un rack o una zona completa, el contenedor compuesto suma recursivamente los valores de todos sus hijos sin requerir código duplicado ni dependencias acopladas.</w:t>
+      </w:r>
+    </w:p>
+    <w:p>
+      <w:pPr>
+        <w:pStyle w:val="Ttulo4"/>
+      </w:pPr>
+      <w:r>
+        <w:lastRenderedPageBreak/>
+        <w:t>Diagrama de Clases UML</w:t>
+      </w:r>
+    </w:p>
+    <w:p>
+      <w:r>
+        <w:drawing>
+          <wp:inline distT="0" distB="0" distL="0" distR="0" wp14:anchorId="383CF928" wp14:editId="57D63CED">
+            <wp:extent cx="5943600" cy="3044825"/>
+            <wp:effectExtent l="0" t="0" r="0" b="3175"/>
+            <wp:docPr id="52" name="Imagen 52"/>
+            <wp:cNvGraphicFramePr>
+              <a:graphicFrameLocks xmlns:a="http://schemas.openxmlformats.org/drawingml/2006/main" noChangeAspect="1"/>
+            </wp:cNvGraphicFramePr>
+            <a:graphic xmlns:a="http://schemas.openxmlformats.org/drawingml/2006/main">
+              <a:graphicData uri="http://schemas.openxmlformats.org/drawingml/2006/picture">
+                <pic:pic xmlns:pic="http://schemas.openxmlformats.org/drawingml/2006/picture">
+                  <pic:nvPicPr>
+                    <pic:cNvPr id="1" name=""/>
+                    <pic:cNvPicPr/>
+                  </pic:nvPicPr>
+                  <pic:blipFill>
+                    <a:blip r:embed="rId58"/>
+                    <a:stretch>
+                      <a:fillRect/>
+                    </a:stretch>
+                  </pic:blipFill>
+                  <pic:spPr>
+                    <a:xfrm>
+                      <a:off x="0" y="0"/>
+                      <a:ext cx="5943600" cy="3044825"/>
+                    </a:xfrm>
+                    <a:prstGeom prst="rect">
+                      <a:avLst/>
+                    </a:prstGeom>
+                  </pic:spPr>
+                </pic:pic>
+              </a:graphicData>
+            </a:graphic>
+          </wp:inline>
+        </w:drawing>
+      </w:r>
+    </w:p>
+    <w:p>
+      <w:pPr>
+        <w:pStyle w:val="Ttulo4"/>
+      </w:pPr>
+      <w:r>
+        <w:lastRenderedPageBreak/>
+        <w:t>Código</w:t>
+      </w:r>
+    </w:p>
+    <w:p>
+      <w:pPr>
+        <w:pStyle w:val="Ttulo5"/>
+      </w:pPr>
+      <w:r>
+        <w:t>Co</w:t>
+      </w:r>
+      <w:r>
+        <w:t>mponente (StorageNode)</w:t>
+      </w:r>
+    </w:p>
+    <w:p>
+      <w:r>
+        <w:drawing>
+          <wp:inline distT="0" distB="0" distL="0" distR="0" wp14:anchorId="757BE0A9" wp14:editId="2C66A716">
+            <wp:extent cx="5068007" cy="4534533"/>
+            <wp:effectExtent l="0" t="0" r="0" b="0"/>
+            <wp:docPr id="54" name="Imagen 54"/>
+            <wp:cNvGraphicFramePr>
+              <a:graphicFrameLocks xmlns:a="http://schemas.openxmlformats.org/drawingml/2006/main" noChangeAspect="1"/>
+            </wp:cNvGraphicFramePr>
+            <a:graphic xmlns:a="http://schemas.openxmlformats.org/drawingml/2006/main">
+              <a:graphicData uri="http://schemas.openxmlformats.org/drawingml/2006/picture">
+                <pic:pic xmlns:pic="http://schemas.openxmlformats.org/drawingml/2006/picture">
+                  <pic:nvPicPr>
+                    <pic:cNvPr id="1" name=""/>
+                    <pic:cNvPicPr/>
+                  </pic:nvPicPr>
+                  <pic:blipFill>
+                    <a:blip r:embed="rId59"/>
+                    <a:stretch>
+                      <a:fillRect/>
+                    </a:stretch>
+                  </pic:blipFill>
+                  <pic:spPr>
+                    <a:xfrm>
+                      <a:off x="0" y="0"/>
+                      <a:ext cx="5068007" cy="4534533"/>
+                    </a:xfrm>
+                    <a:prstGeom prst="rect">
+                      <a:avLst/>
+                    </a:prstGeom>
+                  </pic:spPr>
+                </pic:pic>
+              </a:graphicData>
+            </a:graphic>
+          </wp:inline>
+        </w:drawing>
+      </w:r>
+    </w:p>
+    <w:p>
+      <w:pPr>
+        <w:pStyle w:val="Ttulo5"/>
+      </w:pPr>
+      <w:r>
+        <w:lastRenderedPageBreak/>
+        <w:t>Hoja / Leaf (LocationNode)</w:t>
+      </w:r>
+    </w:p>
+    <w:p>
+      <w:r>
+        <w:drawing>
+          <wp:inline distT="0" distB="0" distL="0" distR="0" wp14:anchorId="62D56447" wp14:editId="7FED4C55">
+            <wp:extent cx="5943600" cy="6821170"/>
+            <wp:effectExtent l="0" t="0" r="0" b="0"/>
+            <wp:docPr id="55" name="Imagen 55"/>
+            <wp:cNvGraphicFramePr>
+              <a:graphicFrameLocks xmlns:a="http://schemas.openxmlformats.org/drawingml/2006/main" noChangeAspect="1"/>
+            </wp:cNvGraphicFramePr>
+            <a:graphic xmlns:a="http://schemas.openxmlformats.org/drawingml/2006/main">
+              <a:graphicData uri="http://schemas.openxmlformats.org/drawingml/2006/picture">
+                <pic:pic xmlns:pic="http://schemas.openxmlformats.org/drawingml/2006/picture">
+                  <pic:nvPicPr>
+                    <pic:cNvPr id="1" name=""/>
+                    <pic:cNvPicPr/>
+                  </pic:nvPicPr>
+                  <pic:blipFill>
+                    <a:blip r:embed="rId60"/>
+                    <a:stretch>
+                      <a:fillRect/>
+                    </a:stretch>
+                  </pic:blipFill>
+                  <pic:spPr>
+                    <a:xfrm>
+                      <a:off x="0" y="0"/>
+                      <a:ext cx="5943600" cy="6821170"/>
+                    </a:xfrm>
+                    <a:prstGeom prst="rect">
+                      <a:avLst/>
+                    </a:prstGeom>
+                  </pic:spPr>
+                </pic:pic>
+              </a:graphicData>
+            </a:graphic>
+          </wp:inline>
+        </w:drawing>
+      </w:r>
+    </w:p>
+    <w:p>
+      <w:r>
+        <w:lastRenderedPageBreak/>
+        <w:drawing>
+          <wp:inline distT="0" distB="0" distL="0" distR="0" wp14:anchorId="44412F78" wp14:editId="13C6E2E4">
+            <wp:extent cx="4839375" cy="1952898"/>
+            <wp:effectExtent l="0" t="0" r="0" b="9525"/>
+            <wp:docPr id="56" name="Imagen 56"/>
+            <wp:cNvGraphicFramePr>
+              <a:graphicFrameLocks xmlns:a="http://schemas.openxmlformats.org/drawingml/2006/main" noChangeAspect="1"/>
+            </wp:cNvGraphicFramePr>
+            <a:graphic xmlns:a="http://schemas.openxmlformats.org/drawingml/2006/main">
+              <a:graphicData uri="http://schemas.openxmlformats.org/drawingml/2006/picture">
+                <pic:pic xmlns:pic="http://schemas.openxmlformats.org/drawingml/2006/picture">
+                  <pic:nvPicPr>
+                    <pic:cNvPr id="1" name=""/>
+                    <pic:cNvPicPr/>
+                  </pic:nvPicPr>
+                  <pic:blipFill>
+                    <a:blip r:embed="rId61"/>
+                    <a:stretch>
+                      <a:fillRect/>
+                    </a:stretch>
+                  </pic:blipFill>
+                  <pic:spPr>
+                    <a:xfrm>
+                      <a:off x="0" y="0"/>
+                      <a:ext cx="4839375" cy="1952898"/>
+                    </a:xfrm>
+                    <a:prstGeom prst="rect">
+                      <a:avLst/>
+                    </a:prstGeom>
+                  </pic:spPr>
+                </pic:pic>
+              </a:graphicData>
+            </a:graphic>
+          </wp:inline>
+        </w:drawing>
+      </w:r>
+    </w:p>
+    <w:p>
+      <w:pPr>
+        <w:pStyle w:val="Ttulo5"/>
+      </w:pPr>
+      <w:r>
+        <w:lastRenderedPageBreak/>
+        <w:t>Compuesto / Composite (StorageContainer)</w:t>
+      </w:r>
+    </w:p>
+    <w:p>
+      <w:r>
+        <w:drawing>
+          <wp:inline distT="0" distB="0" distL="0" distR="0" wp14:anchorId="0DB5D0A9" wp14:editId="3DCF3089">
+            <wp:extent cx="5943600" cy="7148830"/>
+            <wp:effectExtent l="0" t="0" r="0" b="0"/>
+            <wp:docPr id="57" name="Imagen 57"/>
+            <wp:cNvGraphicFramePr>
+              <a:graphicFrameLocks xmlns:a="http://schemas.openxmlformats.org/drawingml/2006/main" noChangeAspect="1"/>
+            </wp:cNvGraphicFramePr>
+            <a:graphic xmlns:a="http://schemas.openxmlformats.org/drawingml/2006/main">
+              <a:graphicData uri="http://schemas.openxmlformats.org/drawingml/2006/picture">
+                <pic:pic xmlns:pic="http://schemas.openxmlformats.org/drawingml/2006/picture">
+                  <pic:nvPicPr>
+                    <pic:cNvPr id="1" name=""/>
+                    <pic:cNvPicPr/>
+                  </pic:nvPicPr>
+                  <pic:blipFill>
+                    <a:blip r:embed="rId62"/>
+                    <a:stretch>
+                      <a:fillRect/>
+                    </a:stretch>
+                  </pic:blipFill>
+                  <pic:spPr>
+                    <a:xfrm>
+                      <a:off x="0" y="0"/>
+                      <a:ext cx="5943600" cy="7148830"/>
+                    </a:xfrm>
+                    <a:prstGeom prst="rect">
+                      <a:avLst/>
+                    </a:prstGeom>
+                  </pic:spPr>
+                </pic:pic>
+              </a:graphicData>
+            </a:graphic>
+          </wp:inline>
+        </w:drawing>
+      </w:r>
+    </w:p>
+    <w:p>
+      <w:pPr>
+        <w:pStyle w:val="Ttulo5"/>
+      </w:pPr>
+      <w:r>
+        <w:lastRenderedPageBreak/>
+        <w:t>Consumidor / Cliente (StorageSpaceService)</w:t>
+      </w:r>
+    </w:p>
+    <w:p>
+      <w:r>
+        <w:drawing>
+          <wp:inline distT="0" distB="0" distL="0" distR="0" wp14:anchorId="105696E4" wp14:editId="02FF13E9">
+            <wp:extent cx="5943600" cy="882015"/>
+            <wp:effectExtent l="0" t="0" r="0" b="0"/>
+            <wp:docPr id="58" name="Imagen 58"/>
+            <wp:cNvGraphicFramePr>
+              <a:graphicFrameLocks xmlns:a="http://schemas.openxmlformats.org/drawingml/2006/main" noChangeAspect="1"/>
+            </wp:cNvGraphicFramePr>
+            <a:graphic xmlns:a="http://schemas.openxmlformats.org/drawingml/2006/main">
+              <a:graphicData uri="http://schemas.openxmlformats.org/drawingml/2006/picture">
+                <pic:pic xmlns:pic="http://schemas.openxmlformats.org/drawingml/2006/picture">
+                  <pic:nvPicPr>
+                    <pic:cNvPr id="1" name=""/>
+                    <pic:cNvPicPr/>
+                  </pic:nvPicPr>
+                  <pic:blipFill>
+                    <a:blip r:embed="rId63"/>
+                    <a:stretch>
+                      <a:fillRect/>
+                    </a:stretch>
+                  </pic:blipFill>
+                  <pic:spPr>
+                    <a:xfrm>
+                      <a:off x="0" y="0"/>
+                      <a:ext cx="5943600" cy="882015"/>
+                    </a:xfrm>
+                    <a:prstGeom prst="rect">
+                      <a:avLst/>
+                    </a:prstGeom>
+                  </pic:spPr>
+                </pic:pic>
+              </a:graphicData>
+            </a:graphic>
+          </wp:inline>
+        </w:drawing>
+      </w:r>
+    </w:p>
+    <w:p>
+      <w:r>
+        <w:drawing>
+          <wp:inline distT="0" distB="0" distL="0" distR="0" wp14:anchorId="473CD550" wp14:editId="57DD2038">
+            <wp:extent cx="5943600" cy="1143000"/>
+            <wp:effectExtent l="0" t="0" r="0" b="0"/>
+            <wp:docPr id="59" name="Imagen 59"/>
+            <wp:cNvGraphicFramePr>
+              <a:graphicFrameLocks xmlns:a="http://schemas.openxmlformats.org/drawingml/2006/main" noChangeAspect="1"/>
+            </wp:cNvGraphicFramePr>
+            <a:graphic xmlns:a="http://schemas.openxmlformats.org/drawingml/2006/main">
+              <a:graphicData uri="http://schemas.openxmlformats.org/drawingml/2006/picture">
+                <pic:pic xmlns:pic="http://schemas.openxmlformats.org/drawingml/2006/picture">
+                  <pic:nvPicPr>
+                    <pic:cNvPr id="1" name=""/>
+                    <pic:cNvPicPr/>
+                  </pic:nvPicPr>
+                  <pic:blipFill>
+                    <a:blip r:embed="rId64"/>
+                    <a:stretch>
+                      <a:fillRect/>
+                    </a:stretch>
+                  </pic:blipFill>
+                  <pic:spPr>
+                    <a:xfrm>
+                      <a:off x="0" y="0"/>
+                      <a:ext cx="5943600" cy="1143000"/>
+                    </a:xfrm>
+                    <a:prstGeom prst="rect">
+                      <a:avLst/>
+                    </a:prstGeom>
+                  </pic:spPr>
+                </pic:pic>
+              </a:graphicData>
+            </a:graphic>
+          </wp:inline>
+        </w:drawing>
+      </w:r>
+    </w:p>
+    <w:p>
+      <w:pPr>
+        <w:pStyle w:val="Ttulo4"/>
+      </w:pPr>
+      <w:r>
+        <w:t>Explicación y Prueba de que Funciona</w:t>
+      </w:r>
+    </w:p>
+    <w:p>
+      <w:r>
+        <w:t>Para comprender con claridad cómo se estructura y ejecuta el patrón Composite en la gestión física de bodegas de LogiSync, a continuación describimos la función que cumple cada com</w:t>
+      </w:r>
+      <w:r>
+        <w:t>ponente esencial:</w:t>
+      </w:r>
+    </w:p>
+    <w:p>
+      <w:pPr>
+        <w:pStyle w:val="Ttulo5"/>
+      </w:pPr>
+      <w:r>
+        <w:t>StorageNode (Componente Común)</w:t>
+      </w:r>
+    </w:p>
+    <w:p>
+      <w:r>
+        <w:t>Es la interfaz base del patrón. Define el contrato uniforme que deben cumplir tanto las ubicaciones individuales como los contenedores multinivel. Expone métodos como id(), name(), type(), capacity(), occupa</w:t>
+      </w:r>
+      <w:r>
+        <w:t>ncy(), freeCapacity() y children(), permitiendo que cualquier componente del sistema interactúe con cualquier elemento del almacén sin necesidad de conocer su nivel jerárquico específico.</w:t>
+      </w:r>
+    </w:p>
+    <w:p>
+      <w:pPr>
+        <w:pStyle w:val="Ttulo5"/>
+      </w:pPr>
+      <w:r>
+        <w:t>LocationNode (Hoja / Leaf)</w:t>
+      </w:r>
+    </w:p>
+    <w:p>
+      <w:r>
+        <w:t>Representa los compartimientos terminales</w:t>
+      </w:r>
+      <w:r>
+        <w:t xml:space="preserve"> de almacenamiento (las bahías o gavetas físicas donde se colocan las cajas de teléfonos Samsung, Apple o Xiaomi). Al ser un nodo hoja, no contiene hijos por debajo (su método children() retorna una lista vacía) y calcula su nivel de ocupación en función d</w:t>
+      </w:r>
+      <w:r>
+        <w:t>e la cantidad real de smartphones depositados en ella.</w:t>
+      </w:r>
+    </w:p>
+    <w:p>
+      <w:pPr>
+        <w:pStyle w:val="Ttulo5"/>
+      </w:pPr>
+      <w:r>
+        <w:t>StorageContainer y RackNode (Compuesto / Composite)</w:t>
+      </w:r>
+    </w:p>
+    <w:p>
+      <w:r>
+        <w:t xml:space="preserve">StorageContainer es la clase abstracta que implementa la estructura compuesta del patrón. Mantiene una colección interna de nodos hijos </w:t>
+      </w:r>
+      <w:r>
+        <w:t>(List&lt;StorageNode&gt;) y suministra el método add(StorageNode child) para construir el árbol. Sus métodos capacity() y occupancy() están implementados de manera recursiva mediante programación funcional sobre sus hijos, permitiendo que una zona o rack calcule</w:t>
+      </w:r>
+      <w:r>
+        <w:t xml:space="preserve"> </w:t>
+      </w:r>
+      <w:r>
+        <w:lastRenderedPageBreak/>
+        <w:t>automáticamente su capacidad consolidada sumando los valores de todas sus ubicaciones dependientes. RackNode y ZoneNode son implementaciones concretas que tipifican los diferentes niveles estructurales del centro de distribución.</w:t>
+      </w:r>
+    </w:p>
+    <w:p>
+      <w:pPr>
+        <w:pStyle w:val="Ttulo5"/>
+      </w:pPr>
+      <w:r>
+        <w:t>StorageSpaceService (Clie</w:t>
+      </w:r>
+      <w:r>
+        <w:t>nte / Consumidor)</w:t>
+      </w:r>
+    </w:p>
+    <w:p>
+      <w:r>
+        <w:t>Es el servicio de aplicación que interactúa con la estructura compuesta. A través del caso de uso de consulta de estructura, ensambla el árbol completo del almacén a partir de las entidades persistidas en base de datos y retorna al usuari</w:t>
+      </w:r>
+      <w:r>
+        <w:t>o la jerarquía procesada en una sola llamada uniforme.</w:t>
+      </w:r>
+    </w:p>
+    <w:p>
+      <w:pPr>
+        <w:pStyle w:val="Ttulo5"/>
+      </w:pPr>
+      <w:r>
+        <w:t>Funcionamiento</w:t>
+      </w:r>
+    </w:p>
+    <w:p>
+      <w:r>
+        <w:t>Para comprobar el funcionamiento del patrón Composite en el sistema, realizamos la prueba directamente a través de la herramienta Postman consultando la estructura jerárquica del almacén</w:t>
+      </w:r>
+      <w:r>
+        <w:t xml:space="preserve"> de distribución tecnológica.</w:t>
+      </w:r>
+    </w:p>
+    <w:p>
+      <w:r>
+        <w:t>1. Autenticación y Envío de la Petición: En Postman, realizamos una petición GET al endpoint de estructura del almacén: /api/</w:t>
+      </w:r>
+      <w:proofErr w:type="spellStart"/>
+      <w:r>
+        <w:t>warehouses</w:t>
+      </w:r>
+      <w:proofErr w:type="spellEnd"/>
+      <w:r>
+        <w:t>/1/</w:t>
+      </w:r>
+      <w:proofErr w:type="spellStart"/>
+      <w:r>
+        <w:t>structure</w:t>
+      </w:r>
+      <w:proofErr w:type="spellEnd"/>
+      <w:r>
+        <w:t>.</w:t>
+      </w:r>
+    </w:p>
+    <w:p>
+      <w:r>
+        <w:drawing>
+          <wp:inline distT="0" distB="0" distL="0" distR="0" wp14:anchorId="1978152A" wp14:editId="699904DA">
+            <wp:extent cx="5943600" cy="1914525"/>
+            <wp:effectExtent l="0" t="0" r="0" b="9525"/>
+            <wp:docPr id="60" name="Imagen 60"/>
+            <wp:cNvGraphicFramePr>
+              <a:graphicFrameLocks xmlns:a="http://schemas.openxmlformats.org/drawingml/2006/main" noChangeAspect="1"/>
+            </wp:cNvGraphicFramePr>
+            <a:graphic xmlns:a="http://schemas.openxmlformats.org/drawingml/2006/main">
+              <a:graphicData uri="http://schemas.openxmlformats.org/drawingml/2006/picture">
+                <pic:pic xmlns:pic="http://schemas.openxmlformats.org/drawingml/2006/picture">
+                  <pic:nvPicPr>
+                    <pic:cNvPr id="1" name=""/>
+                    <pic:cNvPicPr/>
+                  </pic:nvPicPr>
+                  <pic:blipFill>
+                    <a:blip r:embed="rId65"/>
+                    <a:stretch>
+                      <a:fillRect/>
+                    </a:stretch>
+                  </pic:blipFill>
+                  <pic:spPr>
+                    <a:xfrm>
+                      <a:off x="0" y="0"/>
+                      <a:ext cx="5943600" cy="1914525"/>
+                    </a:xfrm>
+                    <a:prstGeom prst="rect">
+                      <a:avLst/>
+                    </a:prstGeom>
+                  </pic:spPr>
+                </pic:pic>
+              </a:graphicData>
+            </a:graphic>
+          </wp:inline>
+        </w:drawing>
+      </w:r>
+    </w:p>
+    <w:p>
+      <w:r>
+        <w:t>2. Verificación de la Jerarquía Compuesta en la</w:t>
+      </w:r>
+      <w:r>
+        <w:t xml:space="preserve"> Respuesta JSON: La API responde con un objeto raíz de tipo WAREHOUSE que contiene su capacidad y ocupación total agregada automáticamente a partir de sus zonas hijas (ZONE). A su vez, cada zona contiene sus racks dependientes (RACK), y cada rack contiene </w:t>
+      </w:r>
+      <w:r>
+        <w:t>sus bahías terminales (LOCATION). Esto demuestra cómo el patrón Composite calcula polimórficamente las capacidades y ocupaciones en cada nivel sin intervención manual.</w:t>
+      </w:r>
+    </w:p>
+    <w:p>
+      <w:r>
+        <w:lastRenderedPageBreak/>
+        <w:drawing>
+          <wp:inline distT="0" distB="0" distL="0" distR="0" wp14:anchorId="2702D388" wp14:editId="3279C8EC">
+            <wp:extent cx="5020376" cy="6487430"/>
+            <wp:effectExtent l="0" t="0" r="8890" b="8890"/>
+            <wp:docPr id="61" name="Imagen 61"/>
+            <wp:cNvGraphicFramePr>
+              <a:graphicFrameLocks xmlns:a="http://schemas.openxmlformats.org/drawingml/2006/main" noChangeAspect="1"/>
+            </wp:cNvGraphicFramePr>
+            <a:graphic xmlns:a="http://schemas.openxmlformats.org/drawingml/2006/main">
+              <a:graphicData uri="http://schemas.openxmlformats.org/drawingml/2006/picture">
+                <pic:pic xmlns:pic="http://schemas.openxmlformats.org/drawingml/2006/picture">
+                  <pic:nvPicPr>
+                    <pic:cNvPr id="1" name=""/>
+                    <pic:cNvPicPr/>
+                  </pic:nvPicPr>
+                  <pic:blipFill>
+                    <a:blip r:embed="rId66"/>
+                    <a:stretch>
+                      <a:fillRect/>
+                    </a:stretch>
+                  </pic:blipFill>
+                  <pic:spPr>
+                    <a:xfrm>
+                      <a:off x="0" y="0"/>
+                      <a:ext cx="5020376" cy="6487430"/>
+                    </a:xfrm>
+                    <a:prstGeom prst="rect">
+                      <a:avLst/>
+                    </a:prstGeom>
+                  </pic:spPr>
+                </pic:pic>
+              </a:graphicData>
+            </a:graphic>
+          </wp:inline>
+        </w:drawing>
+      </w:r>
+    </w:p>
+    <w:p>
+      <w:r>
+        <w:lastRenderedPageBreak/>
+        <w:drawing>
+          <wp:inline distT="0" distB="0" distL="0" distR="0" wp14:anchorId="34FE4AF0" wp14:editId="1A8DA2D8">
+            <wp:extent cx="5115639" cy="6239746"/>
+            <wp:effectExtent l="0" t="0" r="8890" b="8890"/>
+            <wp:docPr id="62" name="Imagen 62"/>
+            <wp:cNvGraphicFramePr>
+              <a:graphicFrameLocks xmlns:a="http://schemas.openxmlformats.org/drawingml/2006/main" noChangeAspect="1"/>
+            </wp:cNvGraphicFramePr>
+            <a:graphic xmlns:a="http://schemas.openxmlformats.org/drawingml/2006/main">
+              <a:graphicData uri="http://schemas.openxmlformats.org/drawingml/2006/picture">
+                <pic:pic xmlns:pic="http://schemas.openxmlformats.org/drawingml/2006/picture">
+                  <pic:nvPicPr>
+                    <pic:cNvPr id="1" name=""/>
+                    <pic:cNvPicPr/>
+                  </pic:nvPicPr>
+                  <pic:blipFill>
+                    <a:blip r:embed="rId67"/>
+                    <a:stretch>
+                      <a:fillRect/>
+                    </a:stretch>
+                  </pic:blipFill>
+                  <pic:spPr>
+                    <a:xfrm>
+                      <a:off x="0" y="0"/>
+                      <a:ext cx="5115639" cy="6239746"/>
+                    </a:xfrm>
+                    <a:prstGeom prst="rect">
+                      <a:avLst/>
+                    </a:prstGeom>
+                  </pic:spPr>
+                </pic:pic>
+              </a:graphicData>
+            </a:graphic>
+          </wp:inline>
+        </w:drawing>
+      </w:r>
+    </w:p>
+    <w:p>
+      <w:r>
+        <w:lastRenderedPageBreak/>
+        <w:drawing>
+          <wp:inline distT="0" distB="0" distL="0" distR="0" wp14:anchorId="5357034A" wp14:editId="4C261728">
+            <wp:extent cx="5268060" cy="3658111"/>
+            <wp:effectExtent l="0" t="0" r="0" b="0"/>
+            <wp:docPr id="63" name="Imagen 63"/>
+            <wp:cNvGraphicFramePr>
+              <a:graphicFrameLocks xmlns:a="http://schemas.openxmlformats.org/drawingml/2006/main" noChangeAspect="1"/>
+            </wp:cNvGraphicFramePr>
+            <a:graphic xmlns:a="http://schemas.openxmlformats.org/drawingml/2006/main">
+              <a:graphicData uri="http://schemas.openxmlformats.org/drawingml/2006/picture">
+                <pic:pic xmlns:pic="http://schemas.openxmlformats.org/drawingml/2006/picture">
+                  <pic:nvPicPr>
+                    <pic:cNvPr id="1" name=""/>
+                    <pic:cNvPicPr/>
+                  </pic:nvPicPr>
+                  <pic:blipFill>
+                    <a:blip r:embed="rId68"/>
+                    <a:stretch>
+                      <a:fillRect/>
+                    </a:stretch>
+                  </pic:blipFill>
+                  <pic:spPr>
+                    <a:xfrm>
+                      <a:off x="0" y="0"/>
+                      <a:ext cx="5268060" cy="3658111"/>
+                    </a:xfrm>
+                    <a:prstGeom prst="rect">
+                      <a:avLst/>
+                    </a:prstGeom>
+                  </pic:spPr>
+                </pic:pic>
+              </a:graphicData>
+            </a:graphic>
+          </wp:inline>
+        </w:drawing>
+      </w:r>
+    </w:p>
+    <w:p/>
     <w:sectPr>
-      <w:headerReference w:type="default" r:id="rId58"/>
+      <w:headerReference w:type="default" r:id="rId69"/>
       <w:pgSz w:w="12240" w:h="15840"/>
       <w:pgMar w:top="1440" w:right="1440" w:bottom="1440" w:left="1440" w:header="709" w:footer="709" w:gutter="0"/>
       <w:cols w:space="720"/>

</xml_diff>

<commit_message>
Implementacion del patron Decorator
</commit_message>
<xml_diff>
--- a/Sistema de Gestion de Cadenas de Suministro.docx
+++ b/Sistema de Gestion de Cadenas de Suministro.docx
@@ -8631,27 +8631,12 @@
     </w:p>
     <w:p>
       <w:r>
-        <w:t>En un centro de distribución logística especializado en dispositivos móviles como LogiSync, la infraestructura física de almacenamiento posee una naturaleza jerárquica y multiniv</w:t>
-      </w:r>
-      <w:r>
-        <w:t>el: un almacén principal se subdivide en zonas (como Zona de Smartphones Flagship o Zona de Accesorios), las zonas se componen de pasillos y racks, y los racks contienen bahías o ubicaciones individuales donde reposan físicamente las cajas de celulares.</w:t>
-      </w:r>
-    </w:p>
-    <w:p>
-      <w:r>
-        <w:t>Si</w:t>
-      </w:r>
-      <w:r>
-        <w:t>n el patrón Composite, consultar la disponibilidad de espacio, el volumen ocupado o la capacidad total obligaría al sistema a implementar condicionales complejos y algoritmos dispersos para diferenciar si se está consultando una bodega completa, una estant</w:t>
-      </w:r>
-      <w:r>
-        <w:t>ería o una simple gaveta. Aquí es donde colabora el patrón de diseño estructural Composite: define una abstracción común (StorageNode) que es implementada de forma uniforme tanto por las hojas o compartimientos terminales (LocationNode) como por los conten</w:t>
-      </w:r>
-      <w:r>
-        <w:t>edores compuestos (StorageContainer, WarehouseNode, ZoneNode y RackNode). Gracias a esta composición recursiva, el cliente (StorageSpaceService) puede tratar a cualquier nodo de la jerarquía de manera idéntica y polimórfica: al invocar capacity() u occupan</w:t>
-      </w:r>
-      <w:r>
-        <w:t>cy() sobre un rack o una zona completa, el contenedor compuesto suma recursivamente los valores de todos sus hijos sin requerir código duplicado ni dependencias acopladas.</w:t>
+        <w:t>En un centro de distribución logística especializado en dispositivos móviles como LogiSync, la infraestructura física de almacenamiento posee una naturaleza jerárquica y multinivel: un almacén principal se subdivide en zonas (como Zona de Smartphones Flagship o Zona de Accesorios), las zonas se componen de pasillos y racks, y los racks contienen bahías o ubicaciones individuales donde reposan físicamente las cajas de celulares.</w:t>
+      </w:r>
+    </w:p>
+    <w:p>
+      <w:r>
+        <w:t>Sin el patrón Composite, consultar la disponibilidad de espacio, el volumen ocupado o la capacidad total obligaría al sistema a implementar condicionales complejos y algoritmos dispersos para diferenciar si se está consultando una bodega completa, una estantería o una simple gaveta. Aquí es donde colabora el patrón de diseño estructural Composite: define una abstracción común (StorageNode) que es implementada de forma uniforme tanto por las hojas o compartimientos terminales (LocationNode) como por los contenedores compuestos (StorageContainer, WarehouseNode, ZoneNode y RackNode). Gracias a esta composición recursiva, el cliente (StorageSpaceService) puede tratar a cualquier nodo de la jerarquía de manera idéntica y polimórfica: al invocar capacity() u occupancy() sobre un rack o una zona completa, el contenedor compuesto suma recursivamente los valores de todos sus hijos sin requerir código duplicado ni dependencias acopladas.</w:t>
       </w:r>
     </w:p>
     <w:p>
@@ -8665,6 +8650,9 @@
     </w:p>
     <w:p>
       <w:r>
+        <w:rPr>
+          <w:noProof/>
+        </w:rPr>
         <w:drawing>
           <wp:inline distT="0" distB="0" distL="0" distR="0" wp14:anchorId="383CF928" wp14:editId="57D63CED">
             <wp:extent cx="5943600" cy="3044825"/>
@@ -8716,14 +8704,14 @@
         <w:pStyle w:val="Ttulo5"/>
       </w:pPr>
       <w:r>
-        <w:t>Co</w:t>
-      </w:r>
-      <w:r>
-        <w:t>mponente (StorageNode)</w:t>
-      </w:r>
-    </w:p>
-    <w:p>
-      <w:r>
+        <w:t>Componente (StorageNode)</w:t>
+      </w:r>
+    </w:p>
+    <w:p>
+      <w:r>
+        <w:rPr>
+          <w:noProof/>
+        </w:rPr>
         <w:drawing>
           <wp:inline distT="0" distB="0" distL="0" distR="0" wp14:anchorId="757BE0A9" wp14:editId="2C66A716">
             <wp:extent cx="5068007" cy="4534533"/>
@@ -8772,6 +8760,9 @@
     </w:p>
     <w:p>
       <w:r>
+        <w:rPr>
+          <w:noProof/>
+        </w:rPr>
         <w:drawing>
           <wp:inline distT="0" distB="0" distL="0" distR="0" wp14:anchorId="62D56447" wp14:editId="7FED4C55">
             <wp:extent cx="5943600" cy="6821170"/>
@@ -8811,6 +8802,9 @@
     </w:p>
     <w:p>
       <w:r>
+        <w:rPr>
+          <w:noProof/>
+        </w:rPr>
         <w:lastRenderedPageBreak/>
         <w:drawing>
           <wp:inline distT="0" distB="0" distL="0" distR="0" wp14:anchorId="44412F78" wp14:editId="13C6E2E4">
@@ -8860,6 +8854,9 @@
     </w:p>
     <w:p>
       <w:r>
+        <w:rPr>
+          <w:noProof/>
+        </w:rPr>
         <w:drawing>
           <wp:inline distT="0" distB="0" distL="0" distR="0" wp14:anchorId="0DB5D0A9" wp14:editId="3DCF3089">
             <wp:extent cx="5943600" cy="7148830"/>
@@ -8908,6 +8905,9 @@
     </w:p>
     <w:p>
       <w:r>
+        <w:rPr>
+          <w:noProof/>
+        </w:rPr>
         <w:drawing>
           <wp:inline distT="0" distB="0" distL="0" distR="0" wp14:anchorId="105696E4" wp14:editId="02FF13E9">
             <wp:extent cx="5943600" cy="882015"/>
@@ -8947,6 +8947,9 @@
     </w:p>
     <w:p>
       <w:r>
+        <w:rPr>
+          <w:noProof/>
+        </w:rPr>
         <w:drawing>
           <wp:inline distT="0" distB="0" distL="0" distR="0" wp14:anchorId="473CD550" wp14:editId="57DD2038">
             <wp:extent cx="5943600" cy="1143000"/>
@@ -8994,10 +8997,7 @@
     </w:p>
     <w:p>
       <w:r>
-        <w:t>Para comprender con claridad cómo se estructura y ejecuta el patrón Composite en la gestión física de bodegas de LogiSync, a continuación describimos la función que cumple cada com</w:t>
-      </w:r>
-      <w:r>
-        <w:t>ponente esencial:</w:t>
+        <w:t>Para comprender con claridad cómo se estructura y ejecuta el patrón Composite en la gestión física de bodegas de LogiSync, a continuación describimos la función que cumple cada componente esencial:</w:t>
       </w:r>
     </w:p>
     <w:p>
@@ -9010,10 +9010,7 @@
     </w:p>
     <w:p>
       <w:r>
-        <w:t>Es la interfaz base del patrón. Define el contrato uniforme que deben cumplir tanto las ubicaciones individuales como los contenedores multinivel. Expone métodos como id(), name(), type(), capacity(), occupa</w:t>
-      </w:r>
-      <w:r>
-        <w:t>ncy(), freeCapacity() y children(), permitiendo que cualquier componente del sistema interactúe con cualquier elemento del almacén sin necesidad de conocer su nivel jerárquico específico.</w:t>
+        <w:t>Es la interfaz base del patrón. Define el contrato uniforme que deben cumplir tanto las ubicaciones individuales como los contenedores multinivel. Expone métodos como id(), name(), type(), capacity(), occupancy(), freeCapacity() y children(), permitiendo que cualquier componente del sistema interactúe con cualquier elemento del almacén sin necesidad de conocer su nivel jerárquico específico.</w:t>
       </w:r>
     </w:p>
     <w:p>
@@ -9026,13 +9023,7 @@
     </w:p>
     <w:p>
       <w:r>
-        <w:t>Representa los compartimientos terminales</w:t>
-      </w:r>
-      <w:r>
-        <w:t xml:space="preserve"> de almacenamiento (las bahías o gavetas físicas donde se colocan las cajas de teléfonos Samsung, Apple o Xiaomi). Al ser un nodo hoja, no contiene hijos por debajo (su método children() retorna una lista vacía) y calcula su nivel de ocupación en función d</w:t>
-      </w:r>
-      <w:r>
-        <w:t>e la cantidad real de smartphones depositados en ella.</w:t>
+        <w:t>Representa los compartimientos terminales de almacenamiento (las bahías o gavetas físicas donde se colocan las cajas de teléfonos Samsung, Apple o Xiaomi). Al ser un nodo hoja, no contiene hijos por debajo (su método children() retorna una lista vacía) y calcula su nivel de ocupación en función de la cantidad real de smartphones depositados en ella.</w:t>
       </w:r>
     </w:p>
     <w:p>
@@ -9045,13 +9036,7 @@
     </w:p>
     <w:p>
       <w:r>
-        <w:t xml:space="preserve">StorageContainer es la clase abstracta que implementa la estructura compuesta del patrón. Mantiene una colección interna de nodos hijos </w:t>
-      </w:r>
-      <w:r>
-        <w:t>(List&lt;StorageNode&gt;) y suministra el método add(StorageNode child) para construir el árbol. Sus métodos capacity() y occupancy() están implementados de manera recursiva mediante programación funcional sobre sus hijos, permitiendo que una zona o rack calcule</w:t>
-      </w:r>
-      <w:r>
-        <w:t xml:space="preserve"> </w:t>
+        <w:t xml:space="preserve">StorageContainer es la clase abstracta que implementa la estructura compuesta del patrón. Mantiene una colección interna de nodos hijos (List&lt;StorageNode&gt;) y suministra el método add(StorageNode child) para construir el árbol. Sus métodos capacity() y occupancy() están implementados de manera recursiva mediante programación funcional sobre sus hijos, permitiendo que una zona o rack calcule </w:t>
       </w:r>
       <w:r>
         <w:lastRenderedPageBreak/>
@@ -9063,18 +9048,12 @@
         <w:pStyle w:val="Ttulo5"/>
       </w:pPr>
       <w:r>
-        <w:t>StorageSpaceService (Clie</w:t>
-      </w:r>
-      <w:r>
-        <w:t>nte / Consumidor)</w:t>
-      </w:r>
-    </w:p>
-    <w:p>
-      <w:r>
-        <w:t>Es el servicio de aplicación que interactúa con la estructura compuesta. A través del caso de uso de consulta de estructura, ensambla el árbol completo del almacén a partir de las entidades persistidas en base de datos y retorna al usuari</w:t>
-      </w:r>
-      <w:r>
-        <w:t>o la jerarquía procesada en una sola llamada uniforme.</w:t>
+        <w:t>StorageSpaceService (Cliente / Consumidor)</w:t>
+      </w:r>
+    </w:p>
+    <w:p>
+      <w:r>
+        <w:t>Es el servicio de aplicación que interactúa con la estructura compuesta. A través del caso de uso de consulta de estructura, ensambla el árbol completo del almacén a partir de las entidades persistidas en base de datos y retorna al usuario la jerarquía procesada en una sola llamada uniforme.</w:t>
       </w:r>
     </w:p>
     <w:p>
@@ -9087,10 +9066,7 @@
     </w:p>
     <w:p>
       <w:r>
-        <w:t>Para comprobar el funcionamiento del patrón Composite en el sistema, realizamos la prueba directamente a través de la herramienta Postman consultando la estructura jerárquica del almacén</w:t>
-      </w:r>
-      <w:r>
-        <w:t xml:space="preserve"> de distribución tecnológica.</w:t>
+        <w:t>Para comprobar el funcionamiento del patrón Composite en el sistema, realizamos la prueba directamente a través de la herramienta Postman consultando la estructura jerárquica del almacén de distribución tecnológica.</w:t>
       </w:r>
     </w:p>
     <w:p>
@@ -9116,6 +9092,9 @@
     </w:p>
     <w:p>
       <w:r>
+        <w:rPr>
+          <w:noProof/>
+        </w:rPr>
         <w:drawing>
           <wp:inline distT="0" distB="0" distL="0" distR="0" wp14:anchorId="1978152A" wp14:editId="699904DA">
             <wp:extent cx="5943600" cy="1914525"/>
@@ -9155,17 +9134,14 @@
     </w:p>
     <w:p>
       <w:r>
-        <w:t>2. Verificación de la Jerarquía Compuesta en la</w:t>
-      </w:r>
-      <w:r>
-        <w:t xml:space="preserve"> Respuesta JSON: La API responde con un objeto raíz de tipo WAREHOUSE que contiene su capacidad y ocupación total agregada automáticamente a partir de sus zonas hijas (ZONE). A su vez, cada zona contiene sus racks dependientes (RACK), y cada rack contiene </w:t>
-      </w:r>
-      <w:r>
-        <w:t>sus bahías terminales (LOCATION). Esto demuestra cómo el patrón Composite calcula polimórficamente las capacidades y ocupaciones en cada nivel sin intervención manual.</w:t>
-      </w:r>
-    </w:p>
-    <w:p>
-      <w:r>
+        <w:t>2. Verificación de la Jerarquía Compuesta en la Respuesta JSON: La API responde con un objeto raíz de tipo WAREHOUSE que contiene su capacidad y ocupación total agregada automáticamente a partir de sus zonas hijas (ZONE). A su vez, cada zona contiene sus racks dependientes (RACK), y cada rack contiene sus bahías terminales (LOCATION). Esto demuestra cómo el patrón Composite calcula polimórficamente las capacidades y ocupaciones en cada nivel sin intervención manual.</w:t>
+      </w:r>
+    </w:p>
+    <w:p>
+      <w:r>
+        <w:rPr>
+          <w:noProof/>
+        </w:rPr>
         <w:lastRenderedPageBreak/>
         <w:drawing>
           <wp:inline distT="0" distB="0" distL="0" distR="0" wp14:anchorId="2702D388" wp14:editId="3279C8EC">
@@ -9206,6 +9182,9 @@
     </w:p>
     <w:p>
       <w:r>
+        <w:rPr>
+          <w:noProof/>
+        </w:rPr>
         <w:lastRenderedPageBreak/>
         <w:drawing>
           <wp:inline distT="0" distB="0" distL="0" distR="0" wp14:anchorId="34FE4AF0" wp14:editId="1A8DA2D8">
@@ -9246,6 +9225,9 @@
     </w:p>
     <w:p>
       <w:r>
+        <w:rPr>
+          <w:noProof/>
+        </w:rPr>
         <w:lastRenderedPageBreak/>
         <w:drawing>
           <wp:inline distT="0" distB="0" distL="0" distR="0" wp14:anchorId="5357034A" wp14:editId="4C261728">
@@ -9285,8 +9267,670 @@
       </w:r>
     </w:p>
     <w:p/>
+    <w:p>
+      <w:pPr>
+        <w:pStyle w:val="Ttulo3"/>
+      </w:pPr>
+      <w:r>
+        <w:t>Aplicación del Patrón Decorator</w:t>
+      </w:r>
+    </w:p>
+    <w:p>
+      <w:pPr>
+        <w:pStyle w:val="Ttulo4"/>
+      </w:pPr>
+      <w:r>
+        <w:t>Como está</w:t>
+      </w:r>
+      <w:r>
+        <w:t xml:space="preserve"> Colaborando este Patrón al Proyecto</w:t>
+      </w:r>
+    </w:p>
+    <w:p>
+      <w:r>
+        <w:t>En una empresa de distribución mayorista de celulares y tecnología como LogiSync, la liquidación comercial de los pedidos de venta no se limita a una simple multiplicación fija de cantidad por precio unitario. Dependien</w:t>
+      </w:r>
+      <w:r>
+        <w:t>do de las condiciones del cliente, el volumen de compra y los requerimientos logísticos de entrega, se deben aplicar dinámicamente diversos recargos, beneficios y gravámenes: por ejemplo, descuentos comerciales por volumen en compras mayoristas de smartpho</w:t>
+      </w:r>
+      <w:r>
+        <w:t>nes (lotes superiores a 10 unidades), recargos por despacho express con transporte blindado y empaque anti-impacto para proteger las pantallas de teléfonos de gama alta, e impuestos obligatorios como el IVA (19%).</w:t>
+      </w:r>
+    </w:p>
+    <w:p>
+      <w:r>
+        <w:t>Si intentáramos modelar todas las combinac</w:t>
+      </w:r>
+      <w:r>
+        <w:t>iones posibles mediante herencia tradicional, ocurriría una explosión incontrolable de subclases (PedidoConIva, PedidoExpressConIva, PedidoConDescuentoYExpress, etc.). Para solucionar esto de forma elegante, aplicamos el patrón de diseño estructural Decora</w:t>
+      </w:r>
+      <w:r>
+        <w:t xml:space="preserve">tor. El patrón define una interfaz común (OrderPricingCalculator) y un </w:t>
+      </w:r>
+      <w:r>
+        <w:lastRenderedPageBreak/>
+        <w:t>componente base concreto (BaseOrderPricingCalculator) que calcula el precio neto. A partir de una clase decoradora base (OrderPricingDecorator) que mantiene una referencia envuelta (wra</w:t>
+      </w:r>
+      <w:r>
+        <w:t>ppee), se crean decoradores concretos independientes: VolumeDiscountDecorator, ExpressDeliveryDecorator y TaxDecorator. De esta forma, el sistema puede apilar y combinar en tiempo de ejecución cualquier número de cargos o descuentos comerciales envolviendo</w:t>
+      </w:r>
+      <w:r>
+        <w:t xml:space="preserve"> un calculador dentro de otro de manera transparente y desacoplada, cumpliendo a cabalidad con el principio de Abierto/Cerrado (OCP).</w:t>
+      </w:r>
+    </w:p>
+    <w:p>
+      <w:pPr>
+        <w:pStyle w:val="Ttulo4"/>
+      </w:pPr>
+      <w:r>
+        <w:t>Diagrama de Clases UML</w:t>
+      </w:r>
+    </w:p>
+    <w:p>
+      <w:r>
+        <w:drawing>
+          <wp:inline distT="0" distB="0" distL="0" distR="0" wp14:anchorId="5A163233" wp14:editId="723C68A4">
+            <wp:extent cx="5943600" cy="3302635"/>
+            <wp:effectExtent l="0" t="0" r="0" b="0"/>
+            <wp:docPr id="65" name="Imagen 65"/>
+            <wp:cNvGraphicFramePr>
+              <a:graphicFrameLocks xmlns:a="http://schemas.openxmlformats.org/drawingml/2006/main" noChangeAspect="1"/>
+            </wp:cNvGraphicFramePr>
+            <a:graphic xmlns:a="http://schemas.openxmlformats.org/drawingml/2006/main">
+              <a:graphicData uri="http://schemas.openxmlformats.org/drawingml/2006/picture">
+                <pic:pic xmlns:pic="http://schemas.openxmlformats.org/drawingml/2006/picture">
+                  <pic:nvPicPr>
+                    <pic:cNvPr id="1" name=""/>
+                    <pic:cNvPicPr/>
+                  </pic:nvPicPr>
+                  <pic:blipFill>
+                    <a:blip r:embed="rId69"/>
+                    <a:stretch>
+                      <a:fillRect/>
+                    </a:stretch>
+                  </pic:blipFill>
+                  <pic:spPr>
+                    <a:xfrm>
+                      <a:off x="0" y="0"/>
+                      <a:ext cx="5943600" cy="3302635"/>
+                    </a:xfrm>
+                    <a:prstGeom prst="rect">
+                      <a:avLst/>
+                    </a:prstGeom>
+                  </pic:spPr>
+                </pic:pic>
+              </a:graphicData>
+            </a:graphic>
+          </wp:inline>
+        </w:drawing>
+      </w:r>
+    </w:p>
+    <w:p>
+      <w:pPr>
+        <w:pStyle w:val="Ttulo4"/>
+      </w:pPr>
+      <w:r>
+        <w:t>Código</w:t>
+      </w:r>
+    </w:p>
+    <w:p>
+      <w:pPr>
+        <w:pStyle w:val="Ttulo5"/>
+      </w:pPr>
+      <w:r>
+        <w:t>Componente (OrderPricingCalculator)</w:t>
+      </w:r>
+    </w:p>
+    <w:p>
+      <w:r>
+        <w:drawing>
+          <wp:inline distT="0" distB="0" distL="0" distR="0" wp14:anchorId="271BF2C0" wp14:editId="6752E407">
+            <wp:extent cx="5943600" cy="565785"/>
+            <wp:effectExtent l="0" t="0" r="0" b="5715"/>
+            <wp:docPr id="67" name="Imagen 67"/>
+            <wp:cNvGraphicFramePr>
+              <a:graphicFrameLocks xmlns:a="http://schemas.openxmlformats.org/drawingml/2006/main" noChangeAspect="1"/>
+            </wp:cNvGraphicFramePr>
+            <a:graphic xmlns:a="http://schemas.openxmlformats.org/drawingml/2006/main">
+              <a:graphicData uri="http://schemas.openxmlformats.org/drawingml/2006/picture">
+                <pic:pic xmlns:pic="http://schemas.openxmlformats.org/drawingml/2006/picture">
+                  <pic:nvPicPr>
+                    <pic:cNvPr id="1" name=""/>
+                    <pic:cNvPicPr/>
+                  </pic:nvPicPr>
+                  <pic:blipFill>
+                    <a:blip r:embed="rId70"/>
+                    <a:stretch>
+                      <a:fillRect/>
+                    </a:stretch>
+                  </pic:blipFill>
+                  <pic:spPr>
+                    <a:xfrm>
+                      <a:off x="0" y="0"/>
+                      <a:ext cx="5943600" cy="565785"/>
+                    </a:xfrm>
+                    <a:prstGeom prst="rect">
+                      <a:avLst/>
+                    </a:prstGeom>
+                  </pic:spPr>
+                </pic:pic>
+              </a:graphicData>
+            </a:graphic>
+          </wp:inline>
+        </w:drawing>
+      </w:r>
+    </w:p>
+    <w:p>
+      <w:pPr>
+        <w:pStyle w:val="Ttulo5"/>
+      </w:pPr>
+      <w:r>
+        <w:lastRenderedPageBreak/>
+        <w:t>Componente Concreto (BaseOrderPricingCalculator)</w:t>
+      </w:r>
+    </w:p>
+    <w:p>
+      <w:r>
+        <w:drawing>
+          <wp:inline distT="0" distB="0" distL="0" distR="0" wp14:anchorId="44AA3CF2" wp14:editId="5D5F04F0">
+            <wp:extent cx="5943600" cy="1647825"/>
+            <wp:effectExtent l="0" t="0" r="0" b="9525"/>
+            <wp:docPr id="68" name="Imagen 68"/>
+            <wp:cNvGraphicFramePr>
+              <a:graphicFrameLocks xmlns:a="http://schemas.openxmlformats.org/drawingml/2006/main" noChangeAspect="1"/>
+            </wp:cNvGraphicFramePr>
+            <a:graphic xmlns:a="http://schemas.openxmlformats.org/drawingml/2006/main">
+              <a:graphicData uri="http://schemas.openxmlformats.org/drawingml/2006/picture">
+                <pic:pic xmlns:pic="http://schemas.openxmlformats.org/drawingml/2006/picture">
+                  <pic:nvPicPr>
+                    <pic:cNvPr id="1" name=""/>
+                    <pic:cNvPicPr/>
+                  </pic:nvPicPr>
+                  <pic:blipFill>
+                    <a:blip r:embed="rId71"/>
+                    <a:stretch>
+                      <a:fillRect/>
+                    </a:stretch>
+                  </pic:blipFill>
+                  <pic:spPr>
+                    <a:xfrm>
+                      <a:off x="0" y="0"/>
+                      <a:ext cx="5943600" cy="1647825"/>
+                    </a:xfrm>
+                    <a:prstGeom prst="rect">
+                      <a:avLst/>
+                    </a:prstGeom>
+                  </pic:spPr>
+                </pic:pic>
+              </a:graphicData>
+            </a:graphic>
+          </wp:inline>
+        </w:drawing>
+      </w:r>
+    </w:p>
+    <w:p>
+      <w:pPr>
+        <w:pStyle w:val="Ttulo5"/>
+      </w:pPr>
+      <w:r>
+        <w:t>Decorador Abstracto (OrderPricingDecorator)</w:t>
+      </w:r>
+    </w:p>
+    <w:p>
+      <w:r>
+        <w:drawing>
+          <wp:inline distT="0" distB="0" distL="0" distR="0" wp14:anchorId="37A05A6B" wp14:editId="365A7B51">
+            <wp:extent cx="5943600" cy="2581275"/>
+            <wp:effectExtent l="0" t="0" r="0" b="9525"/>
+            <wp:docPr id="66" name="Imagen 66"/>
+            <wp:cNvGraphicFramePr>
+              <a:graphicFrameLocks xmlns:a="http://schemas.openxmlformats.org/drawingml/2006/main" noChangeAspect="1"/>
+            </wp:cNvGraphicFramePr>
+            <a:graphic xmlns:a="http://schemas.openxmlformats.org/drawingml/2006/main">
+              <a:graphicData uri="http://schemas.openxmlformats.org/drawingml/2006/picture">
+                <pic:pic xmlns:pic="http://schemas.openxmlformats.org/drawingml/2006/picture">
+                  <pic:nvPicPr>
+                    <pic:cNvPr id="1" name=""/>
+                    <pic:cNvPicPr/>
+                  </pic:nvPicPr>
+                  <pic:blipFill>
+                    <a:blip r:embed="rId72"/>
+                    <a:stretch>
+                      <a:fillRect/>
+                    </a:stretch>
+                  </pic:blipFill>
+                  <pic:spPr>
+                    <a:xfrm>
+                      <a:off x="0" y="0"/>
+                      <a:ext cx="5943600" cy="2581275"/>
+                    </a:xfrm>
+                    <a:prstGeom prst="rect">
+                      <a:avLst/>
+                    </a:prstGeom>
+                  </pic:spPr>
+                </pic:pic>
+              </a:graphicData>
+            </a:graphic>
+          </wp:inline>
+        </w:drawing>
+      </w:r>
+    </w:p>
+    <w:p>
+      <w:pPr>
+        <w:pStyle w:val="Ttulo5"/>
+      </w:pPr>
+      <w:r>
+        <w:lastRenderedPageBreak/>
+        <w:t>Decoradore</w:t>
+      </w:r>
+      <w:r>
+        <w:t>s Concretos (VolumeDiscountDecorator, ExpressDeliveryDecorator y TaxDecorator)</w:t>
+      </w:r>
+    </w:p>
+    <w:p>
+      <w:r>
+        <w:drawing>
+          <wp:inline distT="0" distB="0" distL="0" distR="0" wp14:anchorId="06E13B3B" wp14:editId="671FC0A7">
+            <wp:extent cx="5943600" cy="3057525"/>
+            <wp:effectExtent l="0" t="0" r="0" b="9525"/>
+            <wp:docPr id="69" name="Imagen 69"/>
+            <wp:cNvGraphicFramePr>
+              <a:graphicFrameLocks xmlns:a="http://schemas.openxmlformats.org/drawingml/2006/main" noChangeAspect="1"/>
+            </wp:cNvGraphicFramePr>
+            <a:graphic xmlns:a="http://schemas.openxmlformats.org/drawingml/2006/main">
+              <a:graphicData uri="http://schemas.openxmlformats.org/drawingml/2006/picture">
+                <pic:pic xmlns:pic="http://schemas.openxmlformats.org/drawingml/2006/picture">
+                  <pic:nvPicPr>
+                    <pic:cNvPr id="1" name=""/>
+                    <pic:cNvPicPr/>
+                  </pic:nvPicPr>
+                  <pic:blipFill>
+                    <a:blip r:embed="rId73"/>
+                    <a:stretch>
+                      <a:fillRect/>
+                    </a:stretch>
+                  </pic:blipFill>
+                  <pic:spPr>
+                    <a:xfrm>
+                      <a:off x="0" y="0"/>
+                      <a:ext cx="5943600" cy="3057525"/>
+                    </a:xfrm>
+                    <a:prstGeom prst="rect">
+                      <a:avLst/>
+                    </a:prstGeom>
+                  </pic:spPr>
+                </pic:pic>
+              </a:graphicData>
+            </a:graphic>
+          </wp:inline>
+        </w:drawing>
+      </w:r>
+    </w:p>
+    <w:p>
+      <w:r>
+        <w:drawing>
+          <wp:inline distT="0" distB="0" distL="0" distR="0" wp14:anchorId="65BAF585" wp14:editId="0EF255FE">
+            <wp:extent cx="5943600" cy="2145665"/>
+            <wp:effectExtent l="0" t="0" r="0" b="6985"/>
+            <wp:docPr id="70" name="Imagen 70"/>
+            <wp:cNvGraphicFramePr>
+              <a:graphicFrameLocks xmlns:a="http://schemas.openxmlformats.org/drawingml/2006/main" noChangeAspect="1"/>
+            </wp:cNvGraphicFramePr>
+            <a:graphic xmlns:a="http://schemas.openxmlformats.org/drawingml/2006/main">
+              <a:graphicData uri="http://schemas.openxmlformats.org/drawingml/2006/picture">
+                <pic:pic xmlns:pic="http://schemas.openxmlformats.org/drawingml/2006/picture">
+                  <pic:nvPicPr>
+                    <pic:cNvPr id="1" name=""/>
+                    <pic:cNvPicPr/>
+                  </pic:nvPicPr>
+                  <pic:blipFill>
+                    <a:blip r:embed="rId74"/>
+                    <a:stretch>
+                      <a:fillRect/>
+                    </a:stretch>
+                  </pic:blipFill>
+                  <pic:spPr>
+                    <a:xfrm>
+                      <a:off x="0" y="0"/>
+                      <a:ext cx="5943600" cy="2145665"/>
+                    </a:xfrm>
+                    <a:prstGeom prst="rect">
+                      <a:avLst/>
+                    </a:prstGeom>
+                  </pic:spPr>
+                </pic:pic>
+              </a:graphicData>
+            </a:graphic>
+          </wp:inline>
+        </w:drawing>
+      </w:r>
+    </w:p>
+    <w:p>
+      <w:r>
+        <w:lastRenderedPageBreak/>
+        <w:drawing>
+          <wp:inline distT="0" distB="0" distL="0" distR="0" wp14:anchorId="7A0C4CBF" wp14:editId="755711B7">
+            <wp:extent cx="5943600" cy="2616200"/>
+            <wp:effectExtent l="0" t="0" r="0" b="0"/>
+            <wp:docPr id="71" name="Imagen 71"/>
+            <wp:cNvGraphicFramePr>
+              <a:graphicFrameLocks xmlns:a="http://schemas.openxmlformats.org/drawingml/2006/main" noChangeAspect="1"/>
+            </wp:cNvGraphicFramePr>
+            <a:graphic xmlns:a="http://schemas.openxmlformats.org/drawingml/2006/main">
+              <a:graphicData uri="http://schemas.openxmlformats.org/drawingml/2006/picture">
+                <pic:pic xmlns:pic="http://schemas.openxmlformats.org/drawingml/2006/picture">
+                  <pic:nvPicPr>
+                    <pic:cNvPr id="1" name=""/>
+                    <pic:cNvPicPr/>
+                  </pic:nvPicPr>
+                  <pic:blipFill>
+                    <a:blip r:embed="rId75"/>
+                    <a:stretch>
+                      <a:fillRect/>
+                    </a:stretch>
+                  </pic:blipFill>
+                  <pic:spPr>
+                    <a:xfrm>
+                      <a:off x="0" y="0"/>
+                      <a:ext cx="5943600" cy="2616200"/>
+                    </a:xfrm>
+                    <a:prstGeom prst="rect">
+                      <a:avLst/>
+                    </a:prstGeom>
+                  </pic:spPr>
+                </pic:pic>
+              </a:graphicData>
+            </a:graphic>
+          </wp:inline>
+        </w:drawing>
+      </w:r>
+    </w:p>
+    <w:p>
+      <w:pPr>
+        <w:pStyle w:val="Ttulo4"/>
+      </w:pPr>
+      <w:r>
+        <w:t>Explicación y Prueba de que Funciona</w:t>
+      </w:r>
+    </w:p>
+    <w:p>
+      <w:r>
+        <w:t xml:space="preserve">Para comprender con claridad cómo se estructura y ejecuta el patrón Decorator en la liquidación comercial de pedidos </w:t>
+      </w:r>
+      <w:r>
+        <w:t>de LogiSync, a continuación describimos la función que cumple cada uno de sus componentes:</w:t>
+      </w:r>
+    </w:p>
+    <w:p>
+      <w:pPr>
+        <w:pStyle w:val="Ttulo5"/>
+      </w:pPr>
+      <w:r>
+        <w:t>OrderPricingCalculator (Componente Interfaz)</w:t>
+      </w:r>
+    </w:p>
+    <w:p>
+      <w:r>
+        <w:t xml:space="preserve">Es la interfaz base del patrón. Define el contrato uniforme calculateFinalPrice(BigDecimal baseAmount, int </w:t>
+      </w:r>
+      <w:r>
+        <w:t>totalUnits) que deben compartir tanto el calculador base como todos los decoradores que lo envuelvan. Esto asegura que para el consumidor final sea completamente transparente si está tratando con un precio base simple o con una cadena de múltiples decorado</w:t>
+      </w:r>
+      <w:r>
+        <w:t>res apilados.</w:t>
+      </w:r>
+    </w:p>
+    <w:p>
+      <w:pPr>
+        <w:pStyle w:val="Ttulo5"/>
+      </w:pPr>
+      <w:r>
+        <w:t>BaseOrderPricingCalculator (Componente Concreto)</w:t>
+      </w:r>
+    </w:p>
+    <w:p>
+      <w:r>
+        <w:t>Representa el objeto básico al que se le pueden añadir responsabilidades adicionales. Recibe el monto base resultante de multiplicar las unidades físicas de smartphones solicitadas por su preci</w:t>
+      </w:r>
+      <w:r>
+        <w:t>o unitario de catálogo y retorna dicho subtotal sin aplicar ningún tipo de recargo o beneficio.</w:t>
+      </w:r>
+    </w:p>
+    <w:p>
+      <w:pPr>
+        <w:pStyle w:val="Ttulo5"/>
+      </w:pPr>
+      <w:r>
+        <w:t>OrderPricingDecorator (Decorador Base Abstracto)</w:t>
+      </w:r>
+    </w:p>
+    <w:p>
+      <w:r>
+        <w:t>Es la clase estructural que implementa OrderPricingCalculator y mantiene internamente un campo wrappee del mism</w:t>
+      </w:r>
+      <w:r>
+        <w:t xml:space="preserve">o tipo. Su función principal es servir de puente y delegar por defecto la llamada de </w:t>
+      </w:r>
+      <w:r>
+        <w:lastRenderedPageBreak/>
+        <w:t>cálculo al objeto que tiene envuelto, garantizando que el flujo de ejecución pase por toda la cadena de decoradores.</w:t>
+      </w:r>
+    </w:p>
+    <w:p>
+      <w:pPr>
+        <w:pStyle w:val="Ttulo5"/>
+      </w:pPr>
+      <w:r>
+        <w:t>VolumeDiscountDecorator, ExpressDeliveryDecorator y Ta</w:t>
+      </w:r>
+      <w:r>
+        <w:t>xDecorator (Decoradores Concretos)</w:t>
+      </w:r>
+    </w:p>
+    <w:p>
+      <w:r>
+        <w:t>Son las clases que agregan comportamientos específicos antes o después de delegar la llamada a su wrappee:</w:t>
+      </w:r>
+      <w:r>
+        <w:br/>
+        <w:t xml:space="preserve">- </w:t>
+      </w:r>
+      <w:r>
+        <w:rPr>
+          <w:b/>
+          <w:bCs/>
+        </w:rPr>
+        <w:t>VolumeDiscountDecorator</w:t>
+      </w:r>
+      <w:r>
+        <w:t>: Evalúa si la cantidad total de smartphones pedidos alcanza el umbral de venta mayorista</w:t>
+      </w:r>
+      <w:r>
+        <w:t xml:space="preserve"> (por ejemplo, 10 o más unidades) y deduce el porcentaje de descuento pactado (10%).</w:t>
+      </w:r>
+      <w:r>
+        <w:br/>
+        <w:t xml:space="preserve">- </w:t>
+      </w:r>
+      <w:r>
+        <w:rPr>
+          <w:b/>
+          <w:bCs/>
+        </w:rPr>
+        <w:t>ExpressDeliveryDecorator:</w:t>
+      </w:r>
+      <w:r>
+        <w:t xml:space="preserve"> Añade una tarifa plana logística por concepto de despacho </w:t>
+      </w:r>
+      <w:proofErr w:type="spellStart"/>
+      <w:r>
+        <w:t>express</w:t>
+      </w:r>
+      <w:proofErr w:type="spellEnd"/>
+      <w:r>
+        <w:t xml:space="preserve"> y embalaje</w:t>
+      </w:r>
+      <w:r>
+        <w:t xml:space="preserve"> </w:t>
+      </w:r>
+      <w:r>
+        <w:t>reforzado</w:t>
+      </w:r>
+      <w:r>
+        <w:t xml:space="preserve"> </w:t>
+      </w:r>
+      <w:proofErr w:type="spellStart"/>
+      <w:r>
+        <w:t>anti-golpes</w:t>
+      </w:r>
+      <w:proofErr w:type="spellEnd"/>
+      <w:r>
+        <w:t xml:space="preserve"> para celulares.</w:t>
+      </w:r>
+      <w:r>
+        <w:br/>
+        <w:t xml:space="preserve">- </w:t>
+      </w:r>
+      <w:r>
+        <w:rPr>
+          <w:b/>
+          <w:bCs/>
+        </w:rPr>
+        <w:t>TaxDecorator:</w:t>
+      </w:r>
+      <w:r>
+        <w:t xml:space="preserve"> Toma el tota</w:t>
+      </w:r>
+      <w:r>
+        <w:t>l resultante tras descuentos y cargos logísticos, calcula el 19% correspondiente al impuesto sobre las ventas (IVA) y lo suma al valor final facturado.</w:t>
+      </w:r>
+    </w:p>
+    <w:p>
+      <w:pPr>
+        <w:pStyle w:val="Ttulo5"/>
+      </w:pPr>
+      <w:r>
+        <w:t>Funcionamiento</w:t>
+      </w:r>
+    </w:p>
+    <w:p>
+      <w:r>
+        <w:t>Para verificar el funcionamiento del patrón Decorator en el sistema, realizamos la prueba directamente a través de Postman enviando una solic</w:t>
+      </w:r>
+      <w:r>
+        <w:t>itud de registro de pedido con ítems de smartphones de catálogo.</w:t>
+      </w:r>
+    </w:p>
+    <w:p>
+      <w:r>
+        <w:t>En Postman, enviamos una petición POST al endpoint /api/</w:t>
+      </w:r>
+      <w:proofErr w:type="spellStart"/>
+      <w:r>
+        <w:t>orders</w:t>
+      </w:r>
+      <w:proofErr w:type="spellEnd"/>
+      <w:r>
+        <w:t xml:space="preserve"> con el </w:t>
+      </w:r>
+      <w:r>
+        <w:t xml:space="preserve">cuerpo </w:t>
+      </w:r>
+      <w:r>
+        <w:t>en formato JSON especificando la referencia del pedido, datos de entrega del cliente y el lote de teléfonos celulares:</w:t>
+      </w:r>
+    </w:p>
+    <w:p>
+      <w:r>
+        <w:lastRenderedPageBreak/>
+        <w:drawing>
+          <wp:inline distT="0" distB="0" distL="0" distR="0" wp14:anchorId="3D5F642E" wp14:editId="0FB101FF">
+            <wp:extent cx="5943600" cy="3310890"/>
+            <wp:effectExtent l="0" t="0" r="0" b="3810"/>
+            <wp:docPr id="77" name="Imagen 77"/>
+            <wp:cNvGraphicFramePr>
+              <a:graphicFrameLocks xmlns:a="http://schemas.openxmlformats.org/drawingml/2006/main" noChangeAspect="1"/>
+            </wp:cNvGraphicFramePr>
+            <a:graphic xmlns:a="http://schemas.openxmlformats.org/drawingml/2006/main">
+              <a:graphicData uri="http://schemas.openxmlformats.org/drawingml/2006/picture">
+                <pic:pic xmlns:pic="http://schemas.openxmlformats.org/drawingml/2006/picture">
+                  <pic:nvPicPr>
+                    <pic:cNvPr id="1" name=""/>
+                    <pic:cNvPicPr/>
+                  </pic:nvPicPr>
+                  <pic:blipFill>
+                    <a:blip r:embed="rId76"/>
+                    <a:stretch>
+                      <a:fillRect/>
+                    </a:stretch>
+                  </pic:blipFill>
+                  <pic:spPr>
+                    <a:xfrm>
+                      <a:off x="0" y="0"/>
+                      <a:ext cx="5943600" cy="3310890"/>
+                    </a:xfrm>
+                    <a:prstGeom prst="rect">
+                      <a:avLst/>
+                    </a:prstGeom>
+                  </pic:spPr>
+                </pic:pic>
+              </a:graphicData>
+            </a:graphic>
+          </wp:inline>
+        </w:drawing>
+      </w:r>
+    </w:p>
+    <w:p>
+      <w:r>
+        <w:t>La API REST procesa la solicitud, ejecuta las validaciones comerciales y retorna la orden creada con su identificador único y estado inicial, confirmando la liquidación exitosa de la orden bajo las reglas dinámicas del negocio:</w:t>
+      </w:r>
+    </w:p>
+    <w:p>
+      <w:r>
+        <w:lastRenderedPageBreak/>
+        <w:drawing>
+          <wp:inline distT="0" distB="0" distL="0" distR="0" wp14:anchorId="72D014D1" wp14:editId="33BB8712">
+            <wp:extent cx="5620534" cy="4791744"/>
+            <wp:effectExtent l="0" t="0" r="0" b="8890"/>
+            <wp:docPr id="78" name="Imagen 78"/>
+            <wp:cNvGraphicFramePr>
+              <a:graphicFrameLocks xmlns:a="http://schemas.openxmlformats.org/drawingml/2006/main" noChangeAspect="1"/>
+            </wp:cNvGraphicFramePr>
+            <a:graphic xmlns:a="http://schemas.openxmlformats.org/drawingml/2006/main">
+              <a:graphicData uri="http://schemas.openxmlformats.org/drawingml/2006/picture">
+                <pic:pic xmlns:pic="http://schemas.openxmlformats.org/drawingml/2006/picture">
+                  <pic:nvPicPr>
+                    <pic:cNvPr id="1" name=""/>
+                    <pic:cNvPicPr/>
+                  </pic:nvPicPr>
+                  <pic:blipFill>
+                    <a:blip r:embed="rId77"/>
+                    <a:stretch>
+                      <a:fillRect/>
+                    </a:stretch>
+                  </pic:blipFill>
+                  <pic:spPr>
+                    <a:xfrm>
+                      <a:off x="0" y="0"/>
+                      <a:ext cx="5620534" cy="4791744"/>
+                    </a:xfrm>
+                    <a:prstGeom prst="rect">
+                      <a:avLst/>
+                    </a:prstGeom>
+                  </pic:spPr>
+                </pic:pic>
+              </a:graphicData>
+            </a:graphic>
+          </wp:inline>
+        </w:drawing>
+      </w:r>
+    </w:p>
+    <w:p/>
+    <w:p/>
+    <w:p/>
+    <w:p/>
     <w:sectPr>
-      <w:headerReference w:type="default" r:id="rId69"/>
+      <w:headerReference w:type="default" r:id="rId78"/>
       <w:pgSz w:w="12240" w:h="15840"/>
       <w:pgMar w:top="1440" w:right="1440" w:bottom="1440" w:left="1440" w:header="709" w:footer="709" w:gutter="0"/>
       <w:cols w:space="720"/>

</xml_diff>